<commit_message>
Implemented the generation of yuan-1.0.8.exe.
</commit_message>
<xml_diff>
--- a/yuan.docx
+++ b/yuan.docx
@@ -329,7 +329,7 @@
           <w:rFonts w:hint="eastAsia"/>
           <w:szCs w:val="21"/>
         </w:rPr>
-        <w:t>7</w:t>
+        <w:t>8</w:t>
       </w:r>
     </w:p>
     <w:p>
@@ -645,7 +645,7 @@
           <w:sz w:val="28"/>
           <w:szCs w:val="21"/>
         </w:rPr>
-        <w:t>2</w:t>
+        <w:t>3</w:t>
       </w:r>
       <w:r>
         <w:rPr>
@@ -772,7 +772,7 @@
             </w:rPr>
             <w:fldChar w:fldCharType="separate"/>
           </w:r>
-          <w:hyperlink w:anchor="_Toc221692194" w:history="1">
+          <w:hyperlink w:anchor="_Toc225093578" w:history="1">
             <w:r>
               <w:rPr>
                 <w:rStyle w:val="aff4"/>
@@ -847,7 +847,7 @@
                 <w:noProof/>
                 <w:webHidden/>
               </w:rPr>
-              <w:instrText>PAGEREF _Toc221692194 \h</w:instrText>
+              <w:instrText>PAGEREF _Toc225093578 \h</w:instrText>
             </w:r>
             <w:r>
               <w:rPr>
@@ -902,7 +902,7 @@
               <w14:ligatures w14:val="standardContextual"/>
             </w:rPr>
           </w:pPr>
-          <w:hyperlink w:anchor="_Toc221692195" w:history="1">
+          <w:hyperlink w:anchor="_Toc225093579" w:history="1">
             <w:r>
               <w:rPr>
                 <w:rStyle w:val="aff4"/>
@@ -956,7 +956,7 @@
                 <w:noProof/>
                 <w:webHidden/>
               </w:rPr>
-              <w:instrText>PAGEREF _Toc221692195 \h</w:instrText>
+              <w:instrText>PAGEREF _Toc225093579 \h</w:instrText>
             </w:r>
             <w:r>
               <w:rPr>
@@ -1011,7 +1011,7 @@
               <w14:ligatures w14:val="standardContextual"/>
             </w:rPr>
           </w:pPr>
-          <w:hyperlink w:anchor="_Toc221692196" w:history="1">
+          <w:hyperlink w:anchor="_Toc225093580" w:history="1">
             <w:r>
               <w:rPr>
                 <w:rStyle w:val="aff4"/>
@@ -1065,7 +1065,7 @@
                 <w:noProof/>
                 <w:webHidden/>
               </w:rPr>
-              <w:instrText>PAGEREF _Toc221692196 \h</w:instrText>
+              <w:instrText>PAGEREF _Toc225093580 \h</w:instrText>
             </w:r>
             <w:r>
               <w:rPr>
@@ -1126,7 +1126,7 @@
               <w14:ligatures w14:val="standardContextual"/>
             </w:rPr>
           </w:pPr>
-          <w:hyperlink w:anchor="_Toc221692197" w:history="1">
+          <w:hyperlink w:anchor="_Toc225093581" w:history="1">
             <w:r>
               <w:rPr>
                 <w:rStyle w:val="aff4"/>
@@ -1201,7 +1201,7 @@
                 <w:noProof/>
                 <w:webHidden/>
               </w:rPr>
-              <w:instrText>PAGEREF _Toc221692197 \h</w:instrText>
+              <w:instrText>PAGEREF _Toc225093581 \h</w:instrText>
             </w:r>
             <w:r>
               <w:rPr>
@@ -1256,7 +1256,7 @@
               <w14:ligatures w14:val="standardContextual"/>
             </w:rPr>
           </w:pPr>
-          <w:hyperlink w:anchor="_Toc221692198" w:history="1">
+          <w:hyperlink w:anchor="_Toc225093582" w:history="1">
             <w:r>
               <w:rPr>
                 <w:rStyle w:val="aff4"/>
@@ -1310,7 +1310,7 @@
                 <w:noProof/>
                 <w:webHidden/>
               </w:rPr>
-              <w:instrText>PAGEREF _Toc221692198 \h</w:instrText>
+              <w:instrText>PAGEREF _Toc225093582 \h</w:instrText>
             </w:r>
             <w:r>
               <w:rPr>
@@ -1365,7 +1365,7 @@
               <w14:ligatures w14:val="standardContextual"/>
             </w:rPr>
           </w:pPr>
-          <w:hyperlink w:anchor="_Toc221692199" w:history="1">
+          <w:hyperlink w:anchor="_Toc225093583" w:history="1">
             <w:r>
               <w:rPr>
                 <w:rStyle w:val="aff4"/>
@@ -1427,7 +1427,7 @@
                 <w:noProof/>
                 <w:webHidden/>
               </w:rPr>
-              <w:instrText>PAGEREF _Toc221692199 \h</w:instrText>
+              <w:instrText>PAGEREF _Toc225093583 \h</w:instrText>
             </w:r>
             <w:r>
               <w:rPr>
@@ -1482,7 +1482,7 @@
               <w14:ligatures w14:val="standardContextual"/>
             </w:rPr>
           </w:pPr>
-          <w:hyperlink w:anchor="_Toc221692200" w:history="1">
+          <w:hyperlink w:anchor="_Toc225093584" w:history="1">
             <w:r>
               <w:rPr>
                 <w:rStyle w:val="aff4"/>
@@ -1528,7 +1528,7 @@
                 <w:noProof/>
                 <w:webHidden/>
               </w:rPr>
-              <w:instrText>PAGEREF _Toc221692200 \h</w:instrText>
+              <w:instrText>PAGEREF _Toc225093584 \h</w:instrText>
             </w:r>
             <w:r>
               <w:rPr>
@@ -1583,7 +1583,7 @@
               <w14:ligatures w14:val="standardContextual"/>
             </w:rPr>
           </w:pPr>
-          <w:hyperlink w:anchor="_Toc221692201" w:history="1">
+          <w:hyperlink w:anchor="_Toc225093585" w:history="1">
             <w:r>
               <w:rPr>
                 <w:rStyle w:val="aff4"/>
@@ -1629,7 +1629,7 @@
                 <w:noProof/>
                 <w:webHidden/>
               </w:rPr>
-              <w:instrText>PAGEREF _Toc221692201 \h</w:instrText>
+              <w:instrText>PAGEREF _Toc225093585 \h</w:instrText>
             </w:r>
             <w:r>
               <w:rPr>
@@ -1684,7 +1684,7 @@
               <w14:ligatures w14:val="standardContextual"/>
             </w:rPr>
           </w:pPr>
-          <w:hyperlink w:anchor="_Toc221692202" w:history="1">
+          <w:hyperlink w:anchor="_Toc225093586" w:history="1">
             <w:r>
               <w:rPr>
                 <w:rStyle w:val="aff4"/>
@@ -1730,7 +1730,7 @@
                 <w:noProof/>
                 <w:webHidden/>
               </w:rPr>
-              <w:instrText>PAGEREF _Toc221692202 \h</w:instrText>
+              <w:instrText>PAGEREF _Toc225093586 \h</w:instrText>
             </w:r>
             <w:r>
               <w:rPr>
@@ -1791,7 +1791,7 @@
               <w14:ligatures w14:val="standardContextual"/>
             </w:rPr>
           </w:pPr>
-          <w:hyperlink w:anchor="_Toc221692203" w:history="1">
+          <w:hyperlink w:anchor="_Toc225093587" w:history="1">
             <w:r>
               <w:rPr>
                 <w:rStyle w:val="aff4"/>
@@ -1866,7 +1866,7 @@
                 <w:noProof/>
                 <w:webHidden/>
               </w:rPr>
-              <w:instrText>PAGEREF _Toc221692203 \h</w:instrText>
+              <w:instrText>PAGEREF _Toc225093587 \h</w:instrText>
             </w:r>
             <w:r>
               <w:rPr>
@@ -1921,7 +1921,7 @@
               <w14:ligatures w14:val="standardContextual"/>
             </w:rPr>
           </w:pPr>
-          <w:hyperlink w:anchor="_Toc221692204" w:history="1">
+          <w:hyperlink w:anchor="_Toc225093588" w:history="1">
             <w:r>
               <w:rPr>
                 <w:rStyle w:val="aff4"/>
@@ -1975,7 +1975,7 @@
                 <w:noProof/>
                 <w:webHidden/>
               </w:rPr>
-              <w:instrText>PAGEREF _Toc221692204 \h</w:instrText>
+              <w:instrText>PAGEREF _Toc225093588 \h</w:instrText>
             </w:r>
             <w:r>
               <w:rPr>
@@ -2030,7 +2030,7 @@
               <w14:ligatures w14:val="standardContextual"/>
             </w:rPr>
           </w:pPr>
-          <w:hyperlink w:anchor="_Toc221692205" w:history="1">
+          <w:hyperlink w:anchor="_Toc225093589" w:history="1">
             <w:r>
               <w:rPr>
                 <w:rStyle w:val="aff4"/>
@@ -2084,7 +2084,7 @@
                 <w:noProof/>
                 <w:webHidden/>
               </w:rPr>
-              <w:instrText>PAGEREF _Toc221692205 \h</w:instrText>
+              <w:instrText>PAGEREF _Toc225093589 \h</w:instrText>
             </w:r>
             <w:r>
               <w:rPr>
@@ -2139,7 +2139,7 @@
               <w14:ligatures w14:val="standardContextual"/>
             </w:rPr>
           </w:pPr>
-          <w:hyperlink w:anchor="_Toc221692206" w:history="1">
+          <w:hyperlink w:anchor="_Toc225093590" w:history="1">
             <w:r>
               <w:rPr>
                 <w:rStyle w:val="aff4"/>
@@ -2193,7 +2193,7 @@
                 <w:noProof/>
                 <w:webHidden/>
               </w:rPr>
-              <w:instrText>PAGEREF _Toc221692206 \h</w:instrText>
+              <w:instrText>PAGEREF _Toc225093590 \h</w:instrText>
             </w:r>
             <w:r>
               <w:rPr>
@@ -2248,7 +2248,7 @@
               <w14:ligatures w14:val="standardContextual"/>
             </w:rPr>
           </w:pPr>
-          <w:hyperlink w:anchor="_Toc221692207" w:history="1">
+          <w:hyperlink w:anchor="_Toc225093591" w:history="1">
             <w:r>
               <w:rPr>
                 <w:rStyle w:val="aff4"/>
@@ -2302,7 +2302,7 @@
                 <w:noProof/>
                 <w:webHidden/>
               </w:rPr>
-              <w:instrText>PAGEREF _Toc221692207 \h</w:instrText>
+              <w:instrText>PAGEREF _Toc225093591 \h</w:instrText>
             </w:r>
             <w:r>
               <w:rPr>
@@ -2357,7 +2357,7 @@
               <w14:ligatures w14:val="standardContextual"/>
             </w:rPr>
           </w:pPr>
-          <w:hyperlink w:anchor="_Toc221692208" w:history="1">
+          <w:hyperlink w:anchor="_Toc225093592" w:history="1">
             <w:r>
               <w:rPr>
                 <w:rStyle w:val="aff4"/>
@@ -2427,7 +2427,7 @@
                 <w:noProof/>
                 <w:webHidden/>
               </w:rPr>
-              <w:instrText>PAGEREF _Toc221692208 \h</w:instrText>
+              <w:instrText>PAGEREF _Toc225093592 \h</w:instrText>
             </w:r>
             <w:r>
               <w:rPr>
@@ -2482,7 +2482,7 @@
               <w14:ligatures w14:val="standardContextual"/>
             </w:rPr>
           </w:pPr>
-          <w:hyperlink w:anchor="_Toc221692209" w:history="1">
+          <w:hyperlink w:anchor="_Toc225093593" w:history="1">
             <w:r>
               <w:rPr>
                 <w:rStyle w:val="aff4"/>
@@ -2544,7 +2544,7 @@
                 <w:noProof/>
                 <w:webHidden/>
               </w:rPr>
-              <w:instrText>PAGEREF _Toc221692209 \h</w:instrText>
+              <w:instrText>PAGEREF _Toc225093593 \h</w:instrText>
             </w:r>
             <w:r>
               <w:rPr>
@@ -2599,7 +2599,7 @@
               <w14:ligatures w14:val="standardContextual"/>
             </w:rPr>
           </w:pPr>
-          <w:hyperlink w:anchor="_Toc221692210" w:history="1">
+          <w:hyperlink w:anchor="_Toc225093594" w:history="1">
             <w:r>
               <w:rPr>
                 <w:rStyle w:val="aff4"/>
@@ -2614,6 +2614,426 @@
                 <w:rFonts w:hint="eastAsia"/>
                 <w:noProof/>
               </w:rPr>
+              <w:t xml:space="preserve"> Launch4</w:t>
+            </w:r>
+            <w:r>
+              <w:rPr>
+                <w:rStyle w:val="aff4"/>
+                <w:rFonts w:hint="eastAsia"/>
+                <w:noProof/>
+              </w:rPr>
+              <w:t>生成</w:t>
+            </w:r>
+            <w:r>
+              <w:rPr>
+                <w:rStyle w:val="aff4"/>
+                <w:rFonts w:hint="eastAsia"/>
+                <w:noProof/>
+              </w:rPr>
+              <w:t>EXE</w:t>
+            </w:r>
+            <w:r>
+              <w:rPr>
+                <w:rFonts w:hint="eastAsia"/>
+                <w:noProof/>
+                <w:webHidden/>
+              </w:rPr>
+              <w:tab/>
+            </w:r>
+            <w:r>
+              <w:rPr>
+                <w:rFonts w:hint="eastAsia"/>
+                <w:noProof/>
+                <w:webHidden/>
+              </w:rPr>
+              <w:fldChar w:fldCharType="begin"/>
+            </w:r>
+            <w:r>
+              <w:rPr>
+                <w:rFonts w:hint="eastAsia"/>
+                <w:noProof/>
+                <w:webHidden/>
+              </w:rPr>
+              <w:instrText xml:space="preserve"> </w:instrText>
+            </w:r>
+            <w:r>
+              <w:rPr>
+                <w:noProof/>
+                <w:webHidden/>
+              </w:rPr>
+              <w:instrText>PAGEREF _Toc225093594 \h</w:instrText>
+            </w:r>
+            <w:r>
+              <w:rPr>
+                <w:rFonts w:hint="eastAsia"/>
+                <w:noProof/>
+                <w:webHidden/>
+              </w:rPr>
+              <w:instrText xml:space="preserve"> </w:instrText>
+            </w:r>
+            <w:r>
+              <w:rPr>
+                <w:rFonts w:hint="eastAsia"/>
+                <w:noProof/>
+                <w:webHidden/>
+              </w:rPr>
+            </w:r>
+            <w:r>
+              <w:rPr>
+                <w:rFonts w:hint="eastAsia"/>
+                <w:noProof/>
+                <w:webHidden/>
+              </w:rPr>
+              <w:fldChar w:fldCharType="separate"/>
+            </w:r>
+            <w:r>
+              <w:rPr>
+                <w:noProof/>
+                <w:webHidden/>
+              </w:rPr>
+              <w:t>13</w:t>
+            </w:r>
+            <w:r>
+              <w:rPr>
+                <w:rFonts w:hint="eastAsia"/>
+                <w:noProof/>
+                <w:webHidden/>
+              </w:rPr>
+              <w:fldChar w:fldCharType="end"/>
+            </w:r>
+          </w:hyperlink>
+        </w:p>
+        <w:p>
+          <w:pPr>
+            <w:pStyle w:val="TOC3"/>
+            <w:ind w:left="960"/>
+            <w:rPr>
+              <w:rFonts w:asciiTheme="minorHAnsi" w:eastAsiaTheme="minorEastAsia" w:hAnsiTheme="minorHAnsi" w:cstheme="minorBidi" w:hint="eastAsia"/>
+              <w:noProof/>
+              <w:color w:val="auto"/>
+              <w:sz w:val="22"/>
+              <w:szCs w:val="24"/>
+              <w14:ligatures w14:val="standardContextual"/>
+            </w:rPr>
+          </w:pPr>
+          <w:hyperlink w:anchor="_Toc225093595" w:history="1">
+            <w:r>
+              <w:rPr>
+                <w:rStyle w:val="aff4"/>
+                <w:rFonts w:hint="eastAsia"/>
+                <w:noProof/>
+              </w:rPr>
+              <w:t>3.4.1 Launch4j</w:t>
+            </w:r>
+            <w:r>
+              <w:rPr>
+                <w:rStyle w:val="aff4"/>
+                <w:rFonts w:hint="eastAsia"/>
+                <w:noProof/>
+              </w:rPr>
+              <w:t>简介</w:t>
+            </w:r>
+            <w:r>
+              <w:rPr>
+                <w:rFonts w:hint="eastAsia"/>
+                <w:noProof/>
+                <w:webHidden/>
+              </w:rPr>
+              <w:tab/>
+            </w:r>
+            <w:r>
+              <w:rPr>
+                <w:rFonts w:hint="eastAsia"/>
+                <w:noProof/>
+                <w:webHidden/>
+              </w:rPr>
+              <w:fldChar w:fldCharType="begin"/>
+            </w:r>
+            <w:r>
+              <w:rPr>
+                <w:rFonts w:hint="eastAsia"/>
+                <w:noProof/>
+                <w:webHidden/>
+              </w:rPr>
+              <w:instrText xml:space="preserve"> </w:instrText>
+            </w:r>
+            <w:r>
+              <w:rPr>
+                <w:noProof/>
+                <w:webHidden/>
+              </w:rPr>
+              <w:instrText>PAGEREF _Toc225093595 \h</w:instrText>
+            </w:r>
+            <w:r>
+              <w:rPr>
+                <w:rFonts w:hint="eastAsia"/>
+                <w:noProof/>
+                <w:webHidden/>
+              </w:rPr>
+              <w:instrText xml:space="preserve"> </w:instrText>
+            </w:r>
+            <w:r>
+              <w:rPr>
+                <w:rFonts w:hint="eastAsia"/>
+                <w:noProof/>
+                <w:webHidden/>
+              </w:rPr>
+            </w:r>
+            <w:r>
+              <w:rPr>
+                <w:rFonts w:hint="eastAsia"/>
+                <w:noProof/>
+                <w:webHidden/>
+              </w:rPr>
+              <w:fldChar w:fldCharType="separate"/>
+            </w:r>
+            <w:r>
+              <w:rPr>
+                <w:noProof/>
+                <w:webHidden/>
+              </w:rPr>
+              <w:t>13</w:t>
+            </w:r>
+            <w:r>
+              <w:rPr>
+                <w:rFonts w:hint="eastAsia"/>
+                <w:noProof/>
+                <w:webHidden/>
+              </w:rPr>
+              <w:fldChar w:fldCharType="end"/>
+            </w:r>
+          </w:hyperlink>
+        </w:p>
+        <w:p>
+          <w:pPr>
+            <w:pStyle w:val="TOC3"/>
+            <w:ind w:left="960"/>
+            <w:rPr>
+              <w:rFonts w:asciiTheme="minorHAnsi" w:eastAsiaTheme="minorEastAsia" w:hAnsiTheme="minorHAnsi" w:cstheme="minorBidi" w:hint="eastAsia"/>
+              <w:noProof/>
+              <w:color w:val="auto"/>
+              <w:sz w:val="22"/>
+              <w:szCs w:val="24"/>
+              <w14:ligatures w14:val="standardContextual"/>
+            </w:rPr>
+          </w:pPr>
+          <w:hyperlink w:anchor="_Toc225093596" w:history="1">
+            <w:r>
+              <w:rPr>
+                <w:rStyle w:val="aff4"/>
+                <w:rFonts w:hint="eastAsia"/>
+                <w:noProof/>
+              </w:rPr>
+              <w:t xml:space="preserve">3.4.2 </w:t>
+            </w:r>
+            <w:r>
+              <w:rPr>
+                <w:rStyle w:val="aff4"/>
+                <w:rFonts w:hint="eastAsia"/>
+                <w:noProof/>
+              </w:rPr>
+              <w:t>环境准备</w:t>
+            </w:r>
+            <w:r>
+              <w:rPr>
+                <w:rFonts w:hint="eastAsia"/>
+                <w:noProof/>
+                <w:webHidden/>
+              </w:rPr>
+              <w:tab/>
+            </w:r>
+            <w:r>
+              <w:rPr>
+                <w:rFonts w:hint="eastAsia"/>
+                <w:noProof/>
+                <w:webHidden/>
+              </w:rPr>
+              <w:fldChar w:fldCharType="begin"/>
+            </w:r>
+            <w:r>
+              <w:rPr>
+                <w:rFonts w:hint="eastAsia"/>
+                <w:noProof/>
+                <w:webHidden/>
+              </w:rPr>
+              <w:instrText xml:space="preserve"> </w:instrText>
+            </w:r>
+            <w:r>
+              <w:rPr>
+                <w:noProof/>
+                <w:webHidden/>
+              </w:rPr>
+              <w:instrText>PAGEREF _Toc225093596 \h</w:instrText>
+            </w:r>
+            <w:r>
+              <w:rPr>
+                <w:rFonts w:hint="eastAsia"/>
+                <w:noProof/>
+                <w:webHidden/>
+              </w:rPr>
+              <w:instrText xml:space="preserve"> </w:instrText>
+            </w:r>
+            <w:r>
+              <w:rPr>
+                <w:rFonts w:hint="eastAsia"/>
+                <w:noProof/>
+                <w:webHidden/>
+              </w:rPr>
+            </w:r>
+            <w:r>
+              <w:rPr>
+                <w:rFonts w:hint="eastAsia"/>
+                <w:noProof/>
+                <w:webHidden/>
+              </w:rPr>
+              <w:fldChar w:fldCharType="separate"/>
+            </w:r>
+            <w:r>
+              <w:rPr>
+                <w:noProof/>
+                <w:webHidden/>
+              </w:rPr>
+              <w:t>14</w:t>
+            </w:r>
+            <w:r>
+              <w:rPr>
+                <w:rFonts w:hint="eastAsia"/>
+                <w:noProof/>
+                <w:webHidden/>
+              </w:rPr>
+              <w:fldChar w:fldCharType="end"/>
+            </w:r>
+          </w:hyperlink>
+        </w:p>
+        <w:p>
+          <w:pPr>
+            <w:pStyle w:val="TOC3"/>
+            <w:ind w:left="960"/>
+            <w:rPr>
+              <w:rFonts w:asciiTheme="minorHAnsi" w:eastAsiaTheme="minorEastAsia" w:hAnsiTheme="minorHAnsi" w:cstheme="minorBidi" w:hint="eastAsia"/>
+              <w:noProof/>
+              <w:color w:val="auto"/>
+              <w:sz w:val="22"/>
+              <w:szCs w:val="24"/>
+              <w14:ligatures w14:val="standardContextual"/>
+            </w:rPr>
+          </w:pPr>
+          <w:hyperlink w:anchor="_Toc225093597" w:history="1">
+            <w:r>
+              <w:rPr>
+                <w:rStyle w:val="aff4"/>
+                <w:rFonts w:hint="eastAsia"/>
+                <w:noProof/>
+              </w:rPr>
+              <w:t xml:space="preserve">3.4.3 </w:t>
+            </w:r>
+            <w:r>
+              <w:rPr>
+                <w:rStyle w:val="aff4"/>
+                <w:rFonts w:hint="eastAsia"/>
+                <w:noProof/>
+              </w:rPr>
+              <w:t>详细打包步骤</w:t>
+            </w:r>
+            <w:r>
+              <w:rPr>
+                <w:rFonts w:hint="eastAsia"/>
+                <w:noProof/>
+                <w:webHidden/>
+              </w:rPr>
+              <w:tab/>
+            </w:r>
+            <w:r>
+              <w:rPr>
+                <w:rFonts w:hint="eastAsia"/>
+                <w:noProof/>
+                <w:webHidden/>
+              </w:rPr>
+              <w:fldChar w:fldCharType="begin"/>
+            </w:r>
+            <w:r>
+              <w:rPr>
+                <w:rFonts w:hint="eastAsia"/>
+                <w:noProof/>
+                <w:webHidden/>
+              </w:rPr>
+              <w:instrText xml:space="preserve"> </w:instrText>
+            </w:r>
+            <w:r>
+              <w:rPr>
+                <w:noProof/>
+                <w:webHidden/>
+              </w:rPr>
+              <w:instrText>PAGEREF _Toc225093597 \h</w:instrText>
+            </w:r>
+            <w:r>
+              <w:rPr>
+                <w:rFonts w:hint="eastAsia"/>
+                <w:noProof/>
+                <w:webHidden/>
+              </w:rPr>
+              <w:instrText xml:space="preserve"> </w:instrText>
+            </w:r>
+            <w:r>
+              <w:rPr>
+                <w:rFonts w:hint="eastAsia"/>
+                <w:noProof/>
+                <w:webHidden/>
+              </w:rPr>
+            </w:r>
+            <w:r>
+              <w:rPr>
+                <w:rFonts w:hint="eastAsia"/>
+                <w:noProof/>
+                <w:webHidden/>
+              </w:rPr>
+              <w:fldChar w:fldCharType="separate"/>
+            </w:r>
+            <w:r>
+              <w:rPr>
+                <w:noProof/>
+                <w:webHidden/>
+              </w:rPr>
+              <w:t>14</w:t>
+            </w:r>
+            <w:r>
+              <w:rPr>
+                <w:rFonts w:hint="eastAsia"/>
+                <w:noProof/>
+                <w:webHidden/>
+              </w:rPr>
+              <w:fldChar w:fldCharType="end"/>
+            </w:r>
+          </w:hyperlink>
+        </w:p>
+        <w:p>
+          <w:pPr>
+            <w:pStyle w:val="TOC2"/>
+            <w:rPr>
+              <w:rFonts w:asciiTheme="minorHAnsi" w:eastAsiaTheme="minorEastAsia" w:hAnsiTheme="minorHAnsi" w:cstheme="minorBidi" w:hint="eastAsia"/>
+              <w:bCs w:val="0"/>
+              <w:noProof/>
+              <w:color w:val="auto"/>
+              <w:sz w:val="22"/>
+              <w:szCs w:val="24"/>
+              <w14:ligatures w14:val="standardContextual"/>
+            </w:rPr>
+          </w:pPr>
+          <w:hyperlink w:anchor="_Toc225093598" w:history="1">
+            <w:r>
+              <w:rPr>
+                <w:rStyle w:val="aff4"/>
+                <w:rFonts w:hAnsi="黑体" w:hint="eastAsia"/>
+                <w:noProof/>
+              </w:rPr>
+              <w:t>3.5</w:t>
+            </w:r>
+            <w:r>
+              <w:rPr>
+                <w:rStyle w:val="aff4"/>
+                <w:rFonts w:hint="eastAsia"/>
+                <w:noProof/>
+              </w:rPr>
               <w:t xml:space="preserve"> </w:t>
             </w:r>
             <w:r>
@@ -2653,7 +3073,7 @@
                 <w:noProof/>
                 <w:webHidden/>
               </w:rPr>
-              <w:instrText>PAGEREF _Toc221692210 \h</w:instrText>
+              <w:instrText>PAGEREF _Toc225093598 \h</w:instrText>
             </w:r>
             <w:r>
               <w:rPr>
@@ -2683,7 +3103,7 @@
                 <w:noProof/>
                 <w:webHidden/>
               </w:rPr>
-              <w:t>13</w:t>
+              <w:t>15</w:t>
             </w:r>
             <w:r>
               <w:rPr>
@@ -2729,7 +3149,7 @@
         <w:spacing w:before="288" w:after="240"/>
         <w:ind w:left="660" w:right="240"/>
       </w:pPr>
-      <w:bookmarkStart w:id="4" w:name="_Toc221692194"/>
+      <w:bookmarkStart w:id="4" w:name="_Toc225093578"/>
       <w:r>
         <w:rPr>
           <w:rFonts w:hint="eastAsia"/>
@@ -2820,7 +3240,13 @@
         <w:rPr>
           <w:rFonts w:hint="eastAsia"/>
         </w:rPr>
-        <w:t>既可以拆分使用，也可以灵活结合</w:t>
+        <w:t>可以拆分使用，也可以结合</w:t>
+      </w:r>
+      <w:r>
+        <w:rPr>
+          <w:rFonts w:hint="eastAsia"/>
+        </w:rPr>
+        <w:t>使用</w:t>
       </w:r>
       <w:r>
         <w:rPr>
@@ -2848,6 +3274,199 @@
           <w:rFonts w:hint="eastAsia"/>
         </w:rPr>
         <w:t>。</w:t>
+      </w:r>
+      <w:r>
+        <w:t>Yuan</w:t>
+      </w:r>
+      <w:r>
+        <w:rPr>
+          <w:rFonts w:hint="eastAsia"/>
+        </w:rPr>
+        <w:t>当前包括</w:t>
+      </w:r>
+      <w:r>
+        <w:rPr>
+          <w:rFonts w:hint="eastAsia"/>
+        </w:rPr>
+        <w:t>yuan-common</w:t>
+      </w:r>
+      <w:r>
+        <w:rPr>
+          <w:rFonts w:hint="eastAsia"/>
+        </w:rPr>
+        <w:t>和</w:t>
+      </w:r>
+      <w:r>
+        <w:rPr>
+          <w:rFonts w:hint="eastAsia"/>
+        </w:rPr>
+        <w:t>yuan-platform</w:t>
+      </w:r>
+      <w:r>
+        <w:rPr>
+          <w:rFonts w:hint="eastAsia"/>
+        </w:rPr>
+        <w:t>两部分。</w:t>
+      </w:r>
+      <w:r>
+        <w:rPr>
+          <w:rFonts w:hint="eastAsia"/>
+        </w:rPr>
+        <w:t>yuan</w:t>
+      </w:r>
+      <w:r>
+        <w:rPr>
+          <w:rFonts w:hint="eastAsia"/>
+        </w:rPr>
+        <w:t>-common</w:t>
+      </w:r>
+      <w:r>
+        <w:rPr>
+          <w:rFonts w:hint="eastAsia"/>
+        </w:rPr>
+        <w:t>提供通用的接口和工具等内容，可以被扩展插件和</w:t>
+      </w:r>
+      <w:r>
+        <w:rPr>
+          <w:rFonts w:hint="eastAsia"/>
+        </w:rPr>
+        <w:t>yuan-platform</w:t>
+      </w:r>
+      <w:r>
+        <w:rPr>
+          <w:rFonts w:hint="eastAsia"/>
+        </w:rPr>
+        <w:t>使用</w:t>
+      </w:r>
+      <w:r>
+        <w:rPr>
+          <w:rFonts w:hint="eastAsia"/>
+        </w:rPr>
+        <w:t>。</w:t>
+      </w:r>
+      <w:r>
+        <w:rPr>
+          <w:rFonts w:hint="eastAsia"/>
+        </w:rPr>
+        <w:t>yuan</w:t>
+      </w:r>
+      <w:r>
+        <w:rPr>
+          <w:rFonts w:hint="eastAsia"/>
+        </w:rPr>
+        <w:t>-common</w:t>
+      </w:r>
+      <w:r>
+        <w:rPr>
+          <w:rFonts w:hint="eastAsia"/>
+        </w:rPr>
+        <w:t>基于</w:t>
+      </w:r>
+      <w:r>
+        <w:t>Apache 2.0</w:t>
+      </w:r>
+      <w:r>
+        <w:rPr>
+          <w:rFonts w:hint="eastAsia"/>
+        </w:rPr>
+        <w:t>开源。</w:t>
+      </w:r>
+      <w:bookmarkStart w:id="5" w:name="_Hlk218608800"/>
+      <w:r>
+        <w:rPr>
+          <w:rFonts w:hint="eastAsia"/>
+        </w:rPr>
+        <w:t>yuan</w:t>
+      </w:r>
+      <w:bookmarkEnd w:id="5"/>
+      <w:r>
+        <w:rPr>
+          <w:rFonts w:hint="eastAsia"/>
+        </w:rPr>
+        <w:t>-platform</w:t>
+      </w:r>
+      <w:r>
+        <w:rPr>
+          <w:rFonts w:hint="eastAsia"/>
+        </w:rPr>
+        <w:t>是平台主体部分，主要基于</w:t>
+      </w:r>
+      <w:r>
+        <w:t>Apache 2.0</w:t>
+      </w:r>
+      <w:r>
+        <w:rPr>
+          <w:rFonts w:hint="eastAsia"/>
+        </w:rPr>
+        <w:t>开源，其文本编辑</w:t>
+      </w:r>
+      <w:proofErr w:type="spellStart"/>
+      <w:r>
+        <w:t>rsyntaxtextarea</w:t>
+      </w:r>
+      <w:proofErr w:type="spellEnd"/>
+      <w:r>
+        <w:rPr>
+          <w:rFonts w:hint="eastAsia"/>
+        </w:rPr>
+        <w:t>插件，使用的是</w:t>
+      </w:r>
+      <w:r>
+        <w:rPr>
+          <w:rFonts w:hint="eastAsia"/>
+        </w:rPr>
+        <w:t>BSD-3-Clause</w:t>
+      </w:r>
+      <w:r>
+        <w:rPr>
+          <w:rFonts w:hint="eastAsia"/>
+        </w:rPr>
+        <w:t>协议。需要注意的是</w:t>
+      </w:r>
+      <w:r>
+        <w:rPr>
+          <w:rFonts w:hint="eastAsia"/>
+        </w:rPr>
+        <w:t>使</w:t>
+      </w:r>
+      <w:r>
+        <w:rPr>
+          <w:rFonts w:hint="eastAsia"/>
+        </w:rPr>
+        <w:t>用的停靠窗口</w:t>
+      </w:r>
+      <w:r>
+        <w:rPr>
+          <w:rFonts w:hint="eastAsia"/>
+        </w:rPr>
+        <w:t>docking-frames-common</w:t>
+      </w:r>
+      <w:r>
+        <w:rPr>
+          <w:rFonts w:hint="eastAsia"/>
+        </w:rPr>
+        <w:t>和</w:t>
+      </w:r>
+      <w:r>
+        <w:t>docking-frames-core</w:t>
+      </w:r>
+      <w:r>
+        <w:rPr>
+          <w:rFonts w:hint="eastAsia"/>
+        </w:rPr>
+        <w:t>基于</w:t>
+      </w:r>
+      <w:r>
+        <w:rPr>
+          <w:rFonts w:hint="eastAsia"/>
+        </w:rPr>
+        <w:t>LGPL-2.1</w:t>
+      </w:r>
+      <w:r>
+        <w:rPr>
+          <w:rFonts w:hint="eastAsia"/>
+        </w:rPr>
+        <w:t>协议。</w:t>
       </w:r>
     </w:p>
     <w:p>
@@ -2856,19 +3475,28 @@
         <w:ind w:firstLine="480"/>
       </w:pPr>
       <w:r>
+        <w:rPr>
+          <w:rFonts w:hint="eastAsia"/>
+        </w:rPr>
         <w:t>Yuan</w:t>
       </w:r>
       <w:r>
         <w:rPr>
           <w:rFonts w:hint="eastAsia"/>
         </w:rPr>
-        <w:t>当前包括</w:t>
-      </w:r>
-      <w:r>
-        <w:rPr>
-          <w:rFonts w:hint="eastAsia"/>
-        </w:rPr>
-        <w:t>yuan-common</w:t>
+        <w:t>是专门为算法研发、设计、运行、发布和应用而设计，当前</w:t>
+      </w:r>
+      <w:r>
+        <w:rPr>
+          <w:rFonts w:hint="eastAsia"/>
+        </w:rPr>
+        <w:t>支持</w:t>
+      </w:r>
+      <w:r>
+        <w:rPr>
+          <w:rFonts w:hint="eastAsia"/>
+        </w:rPr>
+        <w:t>Java</w:t>
       </w:r>
       <w:r>
         <w:rPr>
@@ -2880,378 +3508,140 @@
         <w:rPr>
           <w:rFonts w:hint="eastAsia"/>
         </w:rPr>
-        <w:t>yuan-platform</w:t>
-      </w:r>
-      <w:r>
-        <w:rPr>
-          <w:rFonts w:hint="eastAsia"/>
-        </w:rPr>
-        <w:t>两部分。</w:t>
-      </w:r>
-      <w:r>
-        <w:rPr>
-          <w:rFonts w:hint="eastAsia"/>
-        </w:rPr>
-        <w:t>yuan</w:t>
-      </w:r>
-      <w:r>
-        <w:rPr>
-          <w:rFonts w:hint="eastAsia"/>
-        </w:rPr>
-        <w:t>-common</w:t>
-      </w:r>
-      <w:r>
-        <w:rPr>
-          <w:rFonts w:hint="eastAsia"/>
-        </w:rPr>
-        <w:t>提供通用的接口和工具等内容，可以被扩展插件和</w:t>
-      </w:r>
-      <w:r>
-        <w:rPr>
-          <w:rFonts w:hint="eastAsia"/>
-        </w:rPr>
-        <w:t>yuan-platform</w:t>
-      </w:r>
-      <w:r>
-        <w:rPr>
-          <w:rFonts w:hint="eastAsia"/>
-        </w:rPr>
-        <w:t>使用</w:t>
+        <w:t>Python</w:t>
+      </w:r>
+      <w:r>
+        <w:rPr>
+          <w:rFonts w:hint="eastAsia"/>
+        </w:rPr>
+        <w:t>编辑和运行</w:t>
+      </w:r>
+      <w:r>
+        <w:rPr>
+          <w:rFonts w:hint="eastAsia"/>
+        </w:rPr>
+        <w:t>，只在</w:t>
+      </w:r>
+      <w:r>
+        <w:rPr>
+          <w:rFonts w:hint="eastAsia"/>
+        </w:rPr>
+        <w:t>W</w:t>
+      </w:r>
+      <w:r>
+        <w:rPr>
+          <w:rFonts w:hint="eastAsia"/>
+        </w:rPr>
+        <w:t>indows</w:t>
+      </w:r>
+      <w:r>
+        <w:rPr>
+          <w:rFonts w:hint="eastAsia"/>
+        </w:rPr>
+        <w:t>操作系统测试过。支持</w:t>
+      </w:r>
+      <w:r>
+        <w:rPr>
+          <w:rFonts w:hint="eastAsia"/>
+        </w:rPr>
+        <w:t>Java</w:t>
+      </w:r>
+      <w:r>
+        <w:rPr>
+          <w:rFonts w:hint="eastAsia"/>
+        </w:rPr>
+        <w:t>标准的</w:t>
+      </w:r>
+      <w:r>
+        <w:rPr>
+          <w:rFonts w:hint="eastAsia"/>
+        </w:rPr>
+        <w:t>Maven</w:t>
+      </w:r>
+      <w:r>
+        <w:rPr>
+          <w:rFonts w:hint="eastAsia"/>
+        </w:rPr>
+        <w:t>项目的编辑、编译、运行、打包、安装到仓库，添加自定义插件等基本的功能。支持</w:t>
+      </w:r>
+      <w:r>
+        <w:rPr>
+          <w:rFonts w:hint="eastAsia"/>
+        </w:rPr>
+        <w:t>Python</w:t>
+      </w:r>
+      <w:r>
+        <w:rPr>
+          <w:rFonts w:hint="eastAsia"/>
+        </w:rPr>
+        <w:t>的编辑、运行等功能。</w:t>
+      </w:r>
+      <w:r>
+        <w:rPr>
+          <w:rFonts w:hint="eastAsia"/>
+        </w:rPr>
+        <w:t>Yuan</w:t>
+      </w:r>
+      <w:r>
+        <w:rPr>
+          <w:rFonts w:hint="eastAsia"/>
+        </w:rPr>
+        <w:t>与</w:t>
+      </w:r>
+      <w:r>
+        <w:rPr>
+          <w:rFonts w:hint="eastAsia"/>
+        </w:rPr>
+        <w:t>AI</w:t>
+      </w:r>
+      <w:r>
+        <w:rPr>
+          <w:rFonts w:hint="eastAsia"/>
+        </w:rPr>
+        <w:t>算法</w:t>
+      </w:r>
+      <w:proofErr w:type="gramStart"/>
+      <w:r>
+        <w:rPr>
+          <w:rFonts w:hint="eastAsia"/>
+        </w:rPr>
+        <w:t>库结合</w:t>
+      </w:r>
+      <w:proofErr w:type="gramEnd"/>
+      <w:r>
+        <w:rPr>
+          <w:rFonts w:hint="eastAsia"/>
+        </w:rPr>
+        <w:t>使用，形成零代码可扩展的</w:t>
+      </w:r>
+      <w:r>
+        <w:rPr>
+          <w:rFonts w:hint="eastAsia"/>
+        </w:rPr>
+        <w:t>AI</w:t>
+      </w:r>
+      <w:r>
+        <w:rPr>
+          <w:rFonts w:hint="eastAsia"/>
+        </w:rPr>
+        <w:t>智能平台</w:t>
       </w:r>
       <w:r>
         <w:rPr>
           <w:rFonts w:hint="eastAsia"/>
         </w:rPr>
         <w:t>。</w:t>
-      </w:r>
-      <w:r>
-        <w:rPr>
-          <w:rFonts w:hint="eastAsia"/>
-        </w:rPr>
-        <w:t>yuan</w:t>
-      </w:r>
-      <w:r>
-        <w:rPr>
-          <w:rFonts w:hint="eastAsia"/>
-        </w:rPr>
-        <w:t>-common</w:t>
-      </w:r>
-      <w:r>
-        <w:rPr>
-          <w:rFonts w:hint="eastAsia"/>
-        </w:rPr>
-        <w:t>基于</w:t>
-      </w:r>
-      <w:r>
-        <w:t>Apache 2.0</w:t>
-      </w:r>
-      <w:r>
-        <w:rPr>
-          <w:rFonts w:hint="eastAsia"/>
-        </w:rPr>
-        <w:t>开源。</w:t>
-      </w:r>
-      <w:bookmarkStart w:id="5" w:name="_Hlk218608800"/>
-      <w:r>
-        <w:rPr>
-          <w:rFonts w:hint="eastAsia"/>
-        </w:rPr>
-        <w:t>yuan</w:t>
-      </w:r>
-      <w:bookmarkEnd w:id="5"/>
-      <w:r>
-        <w:rPr>
-          <w:rFonts w:hint="eastAsia"/>
-        </w:rPr>
-        <w:t>-platform</w:t>
-      </w:r>
-      <w:r>
-        <w:rPr>
-          <w:rFonts w:hint="eastAsia"/>
-        </w:rPr>
-        <w:t>是平台主体部分，主要基于</w:t>
-      </w:r>
-      <w:r>
-        <w:t>Apache 2.0</w:t>
-      </w:r>
-      <w:r>
-        <w:rPr>
-          <w:rFonts w:hint="eastAsia"/>
-        </w:rPr>
-        <w:t>开源，其文本编辑</w:t>
-      </w:r>
-      <w:proofErr w:type="spellStart"/>
-      <w:r>
-        <w:t>rsyntaxtextarea</w:t>
-      </w:r>
-      <w:proofErr w:type="spellEnd"/>
-      <w:r>
-        <w:rPr>
-          <w:rFonts w:hint="eastAsia"/>
-        </w:rPr>
-        <w:t>插件，使用的是</w:t>
-      </w:r>
-      <w:r>
-        <w:rPr>
-          <w:rFonts w:hint="eastAsia"/>
-        </w:rPr>
-        <w:t>BSD-3-Clause</w:t>
-      </w:r>
-      <w:r>
-        <w:rPr>
-          <w:rFonts w:hint="eastAsia"/>
-        </w:rPr>
-        <w:t>协议。需要注意的是</w:t>
-      </w:r>
-      <w:r>
-        <w:rPr>
-          <w:rFonts w:hint="eastAsia"/>
-        </w:rPr>
-        <w:t>使</w:t>
-      </w:r>
-      <w:r>
-        <w:rPr>
-          <w:rFonts w:hint="eastAsia"/>
-        </w:rPr>
-        <w:t>用的停靠窗口</w:t>
-      </w:r>
-      <w:r>
-        <w:rPr>
-          <w:rFonts w:hint="eastAsia"/>
-        </w:rPr>
-        <w:t>docking-frames-common</w:t>
-      </w:r>
-      <w:r>
-        <w:rPr>
-          <w:rFonts w:hint="eastAsia"/>
-        </w:rPr>
-        <w:t>和</w:t>
-      </w:r>
-      <w:r>
-        <w:t>docking-frames-core</w:t>
-      </w:r>
-      <w:r>
-        <w:rPr>
-          <w:rFonts w:hint="eastAsia"/>
-        </w:rPr>
-        <w:t>基于</w:t>
-      </w:r>
-      <w:r>
-        <w:rPr>
-          <w:rFonts w:hint="eastAsia"/>
-        </w:rPr>
-        <w:t>LGPL-2.1</w:t>
-      </w:r>
-      <w:r>
-        <w:rPr>
-          <w:rFonts w:hint="eastAsia"/>
-        </w:rPr>
-        <w:t>协议。</w:t>
       </w:r>
     </w:p>
     <w:p>
       <w:pPr>
-        <w:pStyle w:val="23"/>
-        <w:ind w:firstLine="480"/>
-      </w:pPr>
-      <w:r>
-        <w:t>Yuan</w:t>
-      </w:r>
-      <w:r>
-        <w:rPr>
-          <w:rFonts w:hint="eastAsia"/>
-        </w:rPr>
-        <w:t>支持</w:t>
-      </w:r>
-      <w:r>
-        <w:rPr>
-          <w:rFonts w:hint="eastAsia"/>
-        </w:rPr>
-        <w:t>Java</w:t>
-      </w:r>
-      <w:r>
-        <w:rPr>
-          <w:rFonts w:hint="eastAsia"/>
-        </w:rPr>
-        <w:t>和</w:t>
-      </w:r>
-      <w:r>
-        <w:rPr>
-          <w:rFonts w:hint="eastAsia"/>
-        </w:rPr>
-        <w:t>Python</w:t>
-      </w:r>
-      <w:r>
-        <w:rPr>
-          <w:rFonts w:hint="eastAsia"/>
-        </w:rPr>
-        <w:t>编辑和运行</w:t>
-      </w:r>
-      <w:r>
-        <w:rPr>
-          <w:rFonts w:hint="eastAsia"/>
-        </w:rPr>
-        <w:t>，当前只在</w:t>
-      </w:r>
-      <w:r>
-        <w:rPr>
-          <w:rFonts w:hint="eastAsia"/>
-        </w:rPr>
-        <w:t>W</w:t>
-      </w:r>
-      <w:r>
-        <w:rPr>
-          <w:rFonts w:hint="eastAsia"/>
-        </w:rPr>
-        <w:t>indows</w:t>
-      </w:r>
-      <w:r>
-        <w:rPr>
-          <w:rFonts w:hint="eastAsia"/>
-        </w:rPr>
-        <w:t>操作系统测试过。支持</w:t>
-      </w:r>
-      <w:r>
-        <w:rPr>
-          <w:rFonts w:hint="eastAsia"/>
-        </w:rPr>
-        <w:t>Java</w:t>
-      </w:r>
-      <w:r>
-        <w:rPr>
-          <w:rFonts w:hint="eastAsia"/>
-        </w:rPr>
-        <w:t>标准的</w:t>
-      </w:r>
-      <w:r>
-        <w:rPr>
-          <w:rFonts w:hint="eastAsia"/>
-        </w:rPr>
-        <w:t>Maven</w:t>
-      </w:r>
-      <w:r>
-        <w:rPr>
-          <w:rFonts w:hint="eastAsia"/>
-        </w:rPr>
-        <w:t>项目的编辑、编译、运行、打包、安装到仓库，添加自定义插件等基本的功能。支持</w:t>
-      </w:r>
-      <w:r>
-        <w:rPr>
-          <w:rFonts w:hint="eastAsia"/>
-        </w:rPr>
-        <w:t>Python</w:t>
-      </w:r>
-      <w:r>
-        <w:rPr>
-          <w:rFonts w:hint="eastAsia"/>
-        </w:rPr>
-        <w:t>的编辑、运行等功能。</w:t>
-      </w:r>
-      <w:r>
-        <w:rPr>
-          <w:rFonts w:hint="eastAsia"/>
-        </w:rPr>
-        <w:t>当前</w:t>
-      </w:r>
-      <w:r>
-        <w:rPr>
-          <w:rFonts w:hint="eastAsia"/>
-        </w:rPr>
-        <w:t>Y</w:t>
-      </w:r>
-      <w:r>
-        <w:t>uan</w:t>
-      </w:r>
-      <w:r>
-        <w:rPr>
-          <w:rFonts w:hint="eastAsia"/>
-        </w:rPr>
-        <w:t>还</w:t>
-      </w:r>
-      <w:r>
-        <w:rPr>
-          <w:rFonts w:hint="eastAsia"/>
-        </w:rPr>
-        <w:t>比较简单，不</w:t>
-      </w:r>
-      <w:r>
-        <w:rPr>
-          <w:rFonts w:hint="eastAsia"/>
-        </w:rPr>
-        <w:t>太</w:t>
-      </w:r>
-      <w:r>
-        <w:rPr>
-          <w:rFonts w:hint="eastAsia"/>
-        </w:rPr>
-        <w:t>适合于做复杂的开发</w:t>
-      </w:r>
-      <w:r>
-        <w:rPr>
-          <w:rFonts w:hint="eastAsia"/>
-        </w:rPr>
-        <w:t>，</w:t>
-      </w:r>
-      <w:r>
-        <w:rPr>
-          <w:rFonts w:hint="eastAsia"/>
-        </w:rPr>
-        <w:t>主要与</w:t>
-      </w:r>
-      <w:r>
-        <w:rPr>
-          <w:rFonts w:hint="eastAsia"/>
-        </w:rPr>
-        <w:t>AI</w:t>
-      </w:r>
-      <w:r>
-        <w:rPr>
-          <w:rFonts w:hint="eastAsia"/>
-        </w:rPr>
-        <w:t>算法</w:t>
-      </w:r>
-      <w:proofErr w:type="gramStart"/>
-      <w:r>
-        <w:rPr>
-          <w:rFonts w:hint="eastAsia"/>
-        </w:rPr>
-        <w:t>库结合</w:t>
-      </w:r>
-      <w:proofErr w:type="gramEnd"/>
-      <w:r>
-        <w:rPr>
-          <w:rFonts w:hint="eastAsia"/>
-        </w:rPr>
-        <w:t>使用，形成零代码可扩展的</w:t>
-      </w:r>
-      <w:r>
-        <w:rPr>
-          <w:rFonts w:hint="eastAsia"/>
-        </w:rPr>
-        <w:t>AI</w:t>
-      </w:r>
-      <w:r>
-        <w:rPr>
-          <w:rFonts w:hint="eastAsia"/>
-        </w:rPr>
-        <w:t>智能平台</w:t>
-      </w:r>
-      <w:r>
-        <w:rPr>
-          <w:rFonts w:hint="eastAsia"/>
-        </w:rPr>
-        <w:t>。</w:t>
-      </w:r>
-    </w:p>
-    <w:p>
-      <w:pPr>
         <w:pStyle w:val="2"/>
         <w:spacing w:before="120" w:after="120"/>
         <w:rPr>
           <w:rFonts w:hint="eastAsia"/>
         </w:rPr>
       </w:pPr>
-      <w:bookmarkStart w:id="6" w:name="_Toc221692195"/>
+      <w:bookmarkStart w:id="6" w:name="_Toc225093579"/>
       <w:r>
         <w:rPr>
           <w:rFonts w:hint="eastAsia"/>
@@ -3460,7 +3850,7 @@
           <w:rFonts w:hint="eastAsia"/>
         </w:rPr>
       </w:pPr>
-      <w:bookmarkStart w:id="7" w:name="_Toc221692196"/>
+      <w:bookmarkStart w:id="7" w:name="_Toc225093580"/>
       <w:r>
         <w:rPr>
           <w:rFonts w:hint="eastAsia"/>
@@ -3592,6 +3982,24 @@
           <w:t>youcongguo@126.com</w:t>
         </w:r>
       </w:hyperlink>
+      <w:r>
+        <w:rPr>
+          <w:rFonts w:hint="eastAsia"/>
+        </w:rPr>
+        <w:t>。</w:t>
+      </w:r>
+      <w:r>
+        <w:rPr>
+          <w:rFonts w:hint="eastAsia"/>
+        </w:rPr>
+        <w:t>v1.0.6</w:t>
+      </w:r>
+      <w:r>
+        <w:rPr>
+          <w:rFonts w:hint="eastAsia"/>
+        </w:rPr>
+        <w:t>后，由杨国梁以独立身份维护。</w:t>
+      </w:r>
     </w:p>
     <w:p>
       <w:pPr>
@@ -3604,30 +4012,20 @@
         </w:rPr>
         <w:t>平台的开源主页：</w:t>
       </w:r>
-      <w:r>
-        <w:fldChar w:fldCharType="begin"/>
-      </w:r>
-      <w:r>
-        <w:instrText>HYPERLINK "https://github.com/YuanIdea/yuan"</w:instrText>
-      </w:r>
-      <w:r>
-        <w:fldChar w:fldCharType="separate"/>
-      </w:r>
-      <w:r>
-        <w:rPr>
-          <w:rStyle w:val="aff4"/>
-        </w:rPr>
-        <w:t>https://github.com/YuanIdea/</w:t>
-      </w:r>
-      <w:r>
-        <w:rPr>
-          <w:rStyle w:val="aff4"/>
-        </w:rPr>
-        <w:t>yuan</w:t>
-      </w:r>
-      <w:r>
-        <w:fldChar w:fldCharType="end"/>
-      </w:r>
+      <w:hyperlink r:id="rId11" w:history="1">
+        <w:r>
+          <w:rPr>
+            <w:rStyle w:val="aff4"/>
+          </w:rPr>
+          <w:t>https://github.com/YuanIdea/</w:t>
+        </w:r>
+        <w:r>
+          <w:rPr>
+            <w:rStyle w:val="aff4"/>
+          </w:rPr>
+          <w:t>yuan</w:t>
+        </w:r>
+      </w:hyperlink>
     </w:p>
     <w:p>
       <w:pPr>
@@ -3674,7 +4072,7 @@
         <w:rPr>
           <w:rFonts w:hint="eastAsia"/>
         </w:rPr>
-        <w:t>2</w:t>
+        <w:t>3</w:t>
       </w:r>
       <w:r>
         <w:rPr>
@@ -3686,7 +4084,7 @@
         <w:rPr>
           <w:rFonts w:hint="eastAsia"/>
         </w:rPr>
-        <w:t>11</w:t>
+        <w:t>22</w:t>
       </w:r>
       <w:r>
         <w:rPr>
@@ -3715,7 +4113,7 @@
         <w:ind w:right="240"/>
       </w:pPr>
       <w:bookmarkStart w:id="8" w:name="_Ref218414874"/>
-      <w:bookmarkStart w:id="9" w:name="_Toc221692197"/>
+      <w:bookmarkStart w:id="9" w:name="_Toc225093581"/>
       <w:r>
         <w:rPr>
           <w:rFonts w:hint="eastAsia"/>
@@ -3861,7 +4259,13 @@
         <w:rPr>
           <w:rFonts w:hint="eastAsia"/>
         </w:rPr>
-        <w:t>如果发布文件中没有提供内置的</w:t>
+        <w:t>通常，发布</w:t>
+      </w:r>
+      <w:r>
+        <w:rPr>
+          <w:rFonts w:hint="eastAsia"/>
+        </w:rPr>
+        <w:t>文件中没有提供内置的</w:t>
       </w:r>
       <w:bookmarkStart w:id="10" w:name="_Hlk218414394"/>
       <w:r>
@@ -3930,7 +4334,7 @@
       </w:pPr>
       <w:bookmarkStart w:id="11" w:name="_Ref218414159"/>
       <w:bookmarkStart w:id="12" w:name="_Ref218414476"/>
-      <w:bookmarkStart w:id="13" w:name="_Toc221692198"/>
+      <w:bookmarkStart w:id="13" w:name="_Toc225093582"/>
       <w:r>
         <w:rPr>
           <w:rFonts w:hint="eastAsia"/>
@@ -4089,7 +4493,7 @@
                     </pic:cNvPicPr>
                   </pic:nvPicPr>
                   <pic:blipFill>
-                    <a:blip r:embed="rId11">
+                    <a:blip r:embed="rId12">
                       <a:extLst>
                         <a:ext uri="{28A0092B-C50C-407E-A947-70E740481C1C}">
                           <a14:useLocalDpi xmlns:a14="http://schemas.microsoft.com/office/drawing/2010/main" val="0"/>
@@ -4339,7 +4743,7 @@
         </w:rPr>
       </w:pPr>
       <w:bookmarkStart w:id="15" w:name="_Ref218411409"/>
-      <w:bookmarkStart w:id="16" w:name="_Toc221692199"/>
+      <w:bookmarkStart w:id="16" w:name="_Toc225093583"/>
       <w:r>
         <w:rPr>
           <w:rFonts w:hint="eastAsia"/>
@@ -4381,7 +4785,7 @@
           <w:rFonts w:hint="eastAsia"/>
         </w:rPr>
       </w:pPr>
-      <w:bookmarkStart w:id="17" w:name="_Toc221692200"/>
+      <w:bookmarkStart w:id="17" w:name="_Toc225093584"/>
       <w:r>
         <w:rPr>
           <w:rFonts w:hint="eastAsia"/>
@@ -4406,7 +4810,7 @@
         </w:rPr>
         <w:t>[</w:t>
       </w:r>
-      <w:hyperlink r:id="rId12" w:history="1">
+      <w:hyperlink r:id="rId13" w:history="1">
         <w:r>
           <w:rPr>
             <w:rStyle w:val="aff4"/>
@@ -4605,7 +5009,7 @@
                     </pic:cNvPicPr>
                   </pic:nvPicPr>
                   <pic:blipFill>
-                    <a:blip r:embed="rId13" cstate="print">
+                    <a:blip r:embed="rId14" cstate="print">
                       <a:extLst>
                         <a:ext uri="{28A0092B-C50C-407E-A947-70E740481C1C}">
                           <a14:useLocalDpi xmlns:a14="http://schemas.microsoft.com/office/drawing/2010/main" val="0"/>
@@ -4751,7 +5155,7 @@
           <w:rFonts w:hint="eastAsia"/>
         </w:rPr>
       </w:pPr>
-      <w:bookmarkStart w:id="19" w:name="_Toc221692201"/>
+      <w:bookmarkStart w:id="19" w:name="_Toc225093585"/>
       <w:r>
         <w:rPr>
           <w:rFonts w:hint="eastAsia"/>
@@ -4852,7 +5256,7 @@
                     </pic:cNvPicPr>
                   </pic:nvPicPr>
                   <pic:blipFill>
-                    <a:blip r:embed="rId14">
+                    <a:blip r:embed="rId15">
                       <a:extLst>
                         <a:ext uri="{28A0092B-C50C-407E-A947-70E740481C1C}">
                           <a14:useLocalDpi xmlns:a14="http://schemas.microsoft.com/office/drawing/2010/main" val="0"/>
@@ -5075,7 +5479,7 @@
                     </pic:cNvPicPr>
                   </pic:nvPicPr>
                   <pic:blipFill>
-                    <a:blip r:embed="rId15">
+                    <a:blip r:embed="rId16">
                       <a:extLst>
                         <a:ext uri="{28A0092B-C50C-407E-A947-70E740481C1C}">
                           <a14:useLocalDpi xmlns:a14="http://schemas.microsoft.com/office/drawing/2010/main" val="0"/>
@@ -5215,7 +5619,7 @@
           <w:rFonts w:hint="eastAsia"/>
         </w:rPr>
       </w:pPr>
-      <w:bookmarkStart w:id="22" w:name="_Toc221692202"/>
+      <w:bookmarkStart w:id="22" w:name="_Toc225093586"/>
       <w:r>
         <w:rPr>
           <w:rFonts w:hint="eastAsia"/>
@@ -5294,7 +5698,7 @@
                     </pic:cNvPicPr>
                   </pic:nvPicPr>
                   <pic:blipFill>
-                    <a:blip r:embed="rId16" cstate="print">
+                    <a:blip r:embed="rId17" cstate="print">
                       <a:extLst>
                         <a:ext uri="{28A0092B-C50C-407E-A947-70E740481C1C}">
                           <a14:useLocalDpi xmlns:a14="http://schemas.microsoft.com/office/drawing/2010/main" val="0"/>
@@ -5556,7 +5960,7 @@
         </w:rPr>
         <w:lastRenderedPageBreak/>
         <w:drawing>
-          <wp:inline distT="0" distB="0" distL="0" distR="0" wp14:anchorId="0ED27ED1" wp14:editId="185E5255">
+          <wp:inline distT="0" distB="0" distL="0" distR="0" wp14:anchorId="0ED27ED1" wp14:editId="03D22B94">
             <wp:extent cx="2070100" cy="1651479"/>
             <wp:effectExtent l="0" t="0" r="6350" b="6350"/>
             <wp:docPr id="123422222" name="图片 2"/>
@@ -5573,7 +5977,7 @@
                     </pic:cNvPicPr>
                   </pic:nvPicPr>
                   <pic:blipFill>
-                    <a:blip r:embed="rId17" cstate="print">
+                    <a:blip r:embed="rId18" cstate="print">
                       <a:extLst>
                         <a:ext uri="{28A0092B-C50C-407E-A947-70E740481C1C}">
                           <a14:useLocalDpi xmlns:a14="http://schemas.microsoft.com/office/drawing/2010/main" val="0"/>
@@ -5797,7 +6201,7 @@
                     </pic:cNvPicPr>
                   </pic:nvPicPr>
                   <pic:blipFill>
-                    <a:blip r:embed="rId18" cstate="print">
+                    <a:blip r:embed="rId19" cstate="print">
                       <a:extLst>
                         <a:ext uri="{28A0092B-C50C-407E-A947-70E740481C1C}">
                           <a14:useLocalDpi xmlns:a14="http://schemas.microsoft.com/office/drawing/2010/main" val="0"/>
@@ -5981,7 +6385,7 @@
         <w:rPr>
           <w:rFonts w:hint="eastAsia"/>
         </w:rPr>
-        <w:t>，如</w:t>
+        <w:t>，</w:t>
       </w:r>
       <w:r>
         <w:fldChar w:fldCharType="begin"/>
@@ -6035,7 +6439,24 @@
         <w:rPr>
           <w:rFonts w:hint="eastAsia"/>
         </w:rPr>
-        <w:t>。</w:t>
+        <w:t xml:space="preserve"> </w:t>
+      </w:r>
+      <w:r>
+        <w:rPr>
+          <w:rFonts w:hint="eastAsia"/>
+        </w:rPr>
+        <w:t>中的“变量值”用自己电脑</w:t>
+      </w:r>
+      <w:proofErr w:type="spellStart"/>
+      <w:r>
+        <w:t>jdk</w:t>
+      </w:r>
+      <w:proofErr w:type="spellEnd"/>
+      <w:r>
+        <w:rPr>
+          <w:rFonts w:hint="eastAsia"/>
+        </w:rPr>
+        <w:t>的实际路径替代。</w:t>
       </w:r>
     </w:p>
     <w:p>
@@ -6047,7 +6468,7 @@
           <w:noProof/>
         </w:rPr>
         <w:drawing>
-          <wp:inline distT="0" distB="0" distL="0" distR="0" wp14:anchorId="0840E60A" wp14:editId="5F3892A3">
+          <wp:inline distT="0" distB="0" distL="0" distR="0" wp14:anchorId="0840E60A" wp14:editId="7D24B21E">
             <wp:extent cx="4668702" cy="1128542"/>
             <wp:effectExtent l="0" t="0" r="0" b="0"/>
             <wp:docPr id="5299923" name="图片 10"/>
@@ -6064,7 +6485,7 @@
                     </pic:cNvPicPr>
                   </pic:nvPicPr>
                   <pic:blipFill>
-                    <a:blip r:embed="rId19" cstate="print">
+                    <a:blip r:embed="rId20" cstate="print">
                       <a:extLst>
                         <a:ext uri="{28A0092B-C50C-407E-A947-70E740481C1C}">
                           <a14:useLocalDpi xmlns:a14="http://schemas.microsoft.com/office/drawing/2010/main" val="0"/>
@@ -6299,7 +6720,7 @@
           <w:noProof/>
         </w:rPr>
         <w:drawing>
-          <wp:inline distT="0" distB="0" distL="0" distR="0" wp14:anchorId="24EA3BD7" wp14:editId="5A508CDB">
+          <wp:inline distT="0" distB="0" distL="0" distR="0" wp14:anchorId="24EA3BD7" wp14:editId="6713C976">
             <wp:extent cx="3773515" cy="3559266"/>
             <wp:effectExtent l="0" t="0" r="0" b="3175"/>
             <wp:docPr id="1931158430" name="图片 1"/>
@@ -6316,7 +6737,7 @@
                     </pic:cNvPicPr>
                   </pic:nvPicPr>
                   <pic:blipFill>
-                    <a:blip r:embed="rId20" cstate="print">
+                    <a:blip r:embed="rId21" cstate="print">
                       <a:extLst>
                         <a:ext uri="{28A0092B-C50C-407E-A947-70E740481C1C}">
                           <a14:useLocalDpi xmlns:a14="http://schemas.microsoft.com/office/drawing/2010/main" val="0"/>
@@ -6635,7 +7056,7 @@
                     </pic:cNvPicPr>
                   </pic:nvPicPr>
                   <pic:blipFill>
-                    <a:blip r:embed="rId21">
+                    <a:blip r:embed="rId22">
                       <a:extLst>
                         <a:ext uri="{28A0092B-C50C-407E-A947-70E740481C1C}">
                           <a14:useLocalDpi xmlns:a14="http://schemas.microsoft.com/office/drawing/2010/main" val="0"/>
@@ -6920,7 +7341,7 @@
         <w:rPr>
           <w:rFonts w:hint="eastAsia"/>
         </w:rPr>
-        <w:t>y</w:t>
+        <w:t>Y</w:t>
       </w:r>
       <w:r>
         <w:rPr>
@@ -6957,7 +7378,7 @@
         <w:ind w:right="240"/>
       </w:pPr>
       <w:bookmarkStart w:id="32" w:name="_Ref218414883"/>
-      <w:bookmarkStart w:id="33" w:name="_Toc221692203"/>
+      <w:bookmarkStart w:id="33" w:name="_Toc225093587"/>
       <w:bookmarkEnd w:id="3"/>
       <w:bookmarkEnd w:id="2"/>
       <w:bookmarkEnd w:id="1"/>
@@ -6976,6 +7397,9 @@
       <w:pPr>
         <w:pStyle w:val="23"/>
         <w:ind w:firstLine="480"/>
+        <w:rPr>
+          <w:rFonts w:hint="eastAsia"/>
+        </w:rPr>
       </w:pPr>
       <w:r>
         <w:rPr>
@@ -7082,7 +7506,178 @@
         <w:rPr>
           <w:rFonts w:hint="eastAsia"/>
         </w:rPr>
-        <w:t>源码，找到</w:t>
+        <w:t>源码，</w:t>
+      </w:r>
+      <w:r>
+        <w:rPr>
+          <w:rFonts w:hint="eastAsia"/>
+        </w:rPr>
+        <w:t>在最新</w:t>
+      </w:r>
+      <w:r>
+        <w:rPr>
+          <w:rFonts w:hint="eastAsia"/>
+        </w:rPr>
+        <w:t>的</w:t>
+      </w:r>
+      <w:r>
+        <w:rPr>
+          <w:rFonts w:hint="eastAsia"/>
+        </w:rPr>
+        <w:t>Release</w:t>
+      </w:r>
+      <w:r>
+        <w:rPr>
+          <w:rFonts w:hint="eastAsia"/>
+        </w:rPr>
+        <w:t>版本中</w:t>
+      </w:r>
+      <w:r>
+        <w:rPr>
+          <w:rFonts w:hint="eastAsia"/>
+        </w:rPr>
+        <w:t>[</w:t>
+      </w:r>
+      <w:r>
+        <w:rPr>
+          <w:rStyle w:val="aff4"/>
+          <w:kern w:val="0"/>
+        </w:rPr>
+        <w:t>https://github.com/YuanIdea/yuan/releases</w:t>
+      </w:r>
+      <w:r>
+        <w:rPr>
+          <w:rStyle w:val="aff4"/>
+          <w:rFonts w:hint="eastAsia"/>
+          <w:kern w:val="0"/>
+        </w:rPr>
+        <w:t>]</w:t>
+      </w:r>
+      <w:r>
+        <w:rPr>
+          <w:rFonts w:hint="eastAsia"/>
+        </w:rPr>
+        <w:t>找到</w:t>
+      </w:r>
+      <w:r>
+        <w:t>yuan</w:t>
+      </w:r>
+      <w:r>
+        <w:rPr>
+          <w:rFonts w:hint="eastAsia"/>
+        </w:rPr>
+        <w:t>\</w:t>
+      </w:r>
+      <w:r>
+        <w:t xml:space="preserve"> </w:t>
+      </w:r>
+      <w:r>
+        <w:t>yuan</w:t>
+      </w:r>
+      <w:r>
+        <w:t>.exe</w:t>
+      </w:r>
+      <w:r>
+        <w:rPr>
+          <w:rFonts w:hint="eastAsia"/>
+        </w:rPr>
+        <w:t>，</w:t>
+      </w:r>
+      <w:r>
+        <w:rPr>
+          <w:rFonts w:hint="eastAsia"/>
+        </w:rPr>
+        <w:t>双击</w:t>
+      </w:r>
+      <w:r>
+        <w:rPr>
+          <w:rFonts w:hint="eastAsia"/>
+        </w:rPr>
+        <w:t>后</w:t>
+      </w:r>
+      <w:r>
+        <w:rPr>
+          <w:rFonts w:hint="eastAsia"/>
+        </w:rPr>
+        <w:t>出现</w:t>
+      </w:r>
+      <w:r>
+        <w:fldChar w:fldCharType="begin"/>
+      </w:r>
+      <w:r>
+        <w:instrText xml:space="preserve"> </w:instrText>
+      </w:r>
+      <w:r>
+        <w:rPr>
+          <w:rFonts w:hint="eastAsia"/>
+        </w:rPr>
+        <w:instrText>REF _Ref218415989 \h</w:instrText>
+      </w:r>
+      <w:r>
+        <w:instrText xml:space="preserve"> </w:instrText>
+      </w:r>
+      <w:r>
+        <w:fldChar w:fldCharType="separate"/>
+      </w:r>
+      <w:r>
+        <w:rPr>
+          <w:rFonts w:hint="eastAsia"/>
+        </w:rPr>
+        <w:t>图</w:t>
+      </w:r>
+      <w:r>
+        <w:rPr>
+          <w:rFonts w:hint="eastAsia"/>
+        </w:rPr>
+        <w:t xml:space="preserve"> </w:t>
+      </w:r>
+      <w:r>
+        <w:rPr>
+          <w:noProof/>
+        </w:rPr>
+        <w:t>3</w:t>
+      </w:r>
+      <w:r>
+        <w:noBreakHyphen/>
+      </w:r>
+      <w:r>
+        <w:rPr>
+          <w:noProof/>
+        </w:rPr>
+        <w:t>1</w:t>
+      </w:r>
+      <w:r>
+        <w:fldChar w:fldCharType="end"/>
+      </w:r>
+      <w:r>
+        <w:rPr>
+          <w:rFonts w:hint="eastAsia"/>
+        </w:rPr>
+        <w:t>平台</w:t>
+      </w:r>
+      <w:r>
+        <w:rPr>
+          <w:rFonts w:hint="eastAsia"/>
+        </w:rPr>
+        <w:t>界面</w:t>
+      </w:r>
+      <w:r>
+        <w:rPr>
+          <w:rFonts w:hint="eastAsia"/>
+        </w:rPr>
+        <w:t>，不同的版本会略有差异</w:t>
+      </w:r>
+      <w:r>
+        <w:rPr>
+          <w:rFonts w:hint="eastAsia"/>
+        </w:rPr>
+        <w:t>。</w:t>
+      </w:r>
+      <w:r>
+        <w:rPr>
+          <w:rFonts w:hint="eastAsia"/>
+        </w:rPr>
+        <w:t>注意，不要使用</w:t>
       </w:r>
       <w:r>
         <w:t>yuan\yuan-platform\target\artifacts\yuan</w:t>
@@ -7106,97 +7701,40 @@
         <w:rPr>
           <w:rFonts w:hint="eastAsia"/>
         </w:rPr>
-        <w:t>，</w:t>
-      </w:r>
-      <w:r>
-        <w:rPr>
-          <w:rFonts w:hint="eastAsia"/>
-        </w:rPr>
-        <w:t>双击</w:t>
-      </w:r>
-      <w:r>
-        <w:rPr>
-          <w:rFonts w:hint="eastAsia"/>
-        </w:rPr>
-        <w:t>后</w:t>
-      </w:r>
-      <w:r>
-        <w:rPr>
-          <w:rFonts w:hint="eastAsia"/>
-        </w:rPr>
-        <w:t>出现</w:t>
-      </w:r>
-      <w:r>
-        <w:fldChar w:fldCharType="begin"/>
-      </w:r>
-      <w:r>
-        <w:instrText xml:space="preserve"> </w:instrText>
-      </w:r>
-      <w:r>
-        <w:rPr>
-          <w:rFonts w:hint="eastAsia"/>
-        </w:rPr>
-        <w:instrText>REF _Ref218415989 \h</w:instrText>
-      </w:r>
-      <w:r>
-        <w:instrText xml:space="preserve"> </w:instrText>
-      </w:r>
-      <w:r>
-        <w:fldChar w:fldCharType="separate"/>
-      </w:r>
-      <w:r>
-        <w:rPr>
-          <w:rFonts w:hint="eastAsia"/>
-        </w:rPr>
-        <w:t>图</w:t>
-      </w:r>
-      <w:r>
-        <w:rPr>
-          <w:rFonts w:hint="eastAsia"/>
-        </w:rPr>
+        <w:t>，因为使用这个目录下的可执行文件，打包</w:t>
+      </w:r>
+      <w:r>
+        <w:t>yuan-platform</w:t>
+      </w:r>
+      <w:r>
+        <w:rPr>
+          <w:rFonts w:hint="eastAsia"/>
+        </w:rPr>
+        <w:t>时，可能</w:t>
+      </w:r>
+      <w:r>
+        <w:t>yuan-platform.jar</w:t>
+      </w:r>
+      <w:r>
+        <w:rPr>
+          <w:rFonts w:hint="eastAsia"/>
+        </w:rPr>
+        <w:t>正在被</w:t>
+      </w:r>
+      <w:r>
         <w:t xml:space="preserve"> </w:t>
       </w:r>
       <w:r>
-        <w:rPr>
-          <w:noProof/>
-        </w:rPr>
-        <w:t>3</w:t>
-      </w:r>
-      <w:r>
-        <w:noBreakHyphen/>
-      </w:r>
-      <w:r>
-        <w:rPr>
-          <w:noProof/>
-        </w:rPr>
-        <w:t>1</w:t>
-      </w:r>
-      <w:r>
-        <w:fldChar w:fldCharType="end"/>
-      </w:r>
-      <w:r>
-        <w:rPr>
-          <w:rFonts w:hint="eastAsia"/>
-        </w:rPr>
-        <w:t>平台</w:t>
-      </w:r>
-      <w:r>
-        <w:rPr>
-          <w:rFonts w:hint="eastAsia"/>
-        </w:rPr>
-        <w:t>界面</w:t>
-      </w:r>
-      <w:r>
-        <w:rPr>
-          <w:rFonts w:hint="eastAsia"/>
-        </w:rPr>
-        <w:t>，不同的版本会略有差异</w:t>
-      </w:r>
-      <w:r>
-        <w:rPr>
-          <w:rFonts w:hint="eastAsia"/>
-        </w:rPr>
-        <w:t>。</w:t>
+        <w:t>yuan</w:t>
+      </w:r>
+      <w:r>
+        <w:t>.exe</w:t>
+      </w:r>
+      <w:r>
+        <w:rPr>
+          <w:rFonts w:hint="eastAsia"/>
+        </w:rPr>
+        <w:t>占用出现错误。</w:t>
       </w:r>
     </w:p>
     <w:p>
@@ -7225,7 +7763,7 @@
                     </pic:cNvPicPr>
                   </pic:nvPicPr>
                   <pic:blipFill>
-                    <a:blip r:embed="rId22" cstate="print">
+                    <a:blip r:embed="rId23" cstate="print">
                       <a:extLst>
                         <a:ext uri="{28A0092B-C50C-407E-A947-70E740481C1C}">
                           <a14:useLocalDpi xmlns:a14="http://schemas.microsoft.com/office/drawing/2010/main" val="0"/>
@@ -7365,7 +7903,7 @@
           <w:rFonts w:hint="eastAsia"/>
         </w:rPr>
       </w:pPr>
-      <w:bookmarkStart w:id="35" w:name="_Toc221692204"/>
+      <w:bookmarkStart w:id="35" w:name="_Toc225093588"/>
       <w:r>
         <w:rPr>
           <w:rFonts w:hint="eastAsia"/>
@@ -7448,7 +7986,7 @@
           <w:rFonts w:hint="eastAsia"/>
         </w:rPr>
       </w:pPr>
-      <w:bookmarkStart w:id="36" w:name="_Toc221692205"/>
+      <w:bookmarkStart w:id="36" w:name="_Toc225093589"/>
       <w:r>
         <w:rPr>
           <w:rFonts w:hint="eastAsia"/>
@@ -7646,7 +8184,7 @@
                     </pic:cNvPicPr>
                   </pic:nvPicPr>
                   <pic:blipFill>
-                    <a:blip r:embed="rId23" cstate="print">
+                    <a:blip r:embed="rId24" cstate="print">
                       <a:extLst>
                         <a:ext uri="{28A0092B-C50C-407E-A947-70E740481C1C}">
                           <a14:useLocalDpi xmlns:a14="http://schemas.microsoft.com/office/drawing/2010/main" val="0"/>
@@ -7912,7 +8450,7 @@
                     </pic:cNvPicPr>
                   </pic:nvPicPr>
                   <pic:blipFill>
-                    <a:blip r:embed="rId24">
+                    <a:blip r:embed="rId25">
                       <a:extLst>
                         <a:ext uri="{28A0092B-C50C-407E-A947-70E740481C1C}">
                           <a14:useLocalDpi xmlns:a14="http://schemas.microsoft.com/office/drawing/2010/main" val="0"/>
@@ -8052,7 +8590,7 @@
           <w:rFonts w:hint="eastAsia"/>
         </w:rPr>
       </w:pPr>
-      <w:bookmarkStart w:id="39" w:name="_Toc221692206"/>
+      <w:bookmarkStart w:id="39" w:name="_Toc225093590"/>
       <w:r>
         <w:rPr>
           <w:rFonts w:hint="eastAsia"/>
@@ -8219,7 +8757,7 @@
                     </pic:cNvPicPr>
                   </pic:nvPicPr>
                   <pic:blipFill>
-                    <a:blip r:embed="rId25" cstate="print">
+                    <a:blip r:embed="rId26" cstate="print">
                       <a:extLst>
                         <a:ext uri="{28A0092B-C50C-407E-A947-70E740481C1C}">
                           <a14:useLocalDpi xmlns:a14="http://schemas.microsoft.com/office/drawing/2010/main" val="0"/>
@@ -8365,7 +8903,8 @@
           <w:rFonts w:hint="eastAsia"/>
         </w:rPr>
       </w:pPr>
-      <w:bookmarkStart w:id="42" w:name="_Toc221692207"/>
+      <w:bookmarkStart w:id="42" w:name="_Ref225089916"/>
+      <w:bookmarkStart w:id="43" w:name="_Toc225093591"/>
       <w:r>
         <w:rPr>
           <w:rFonts w:hint="eastAsia"/>
@@ -8373,6 +8912,7 @@
         <w:t>打包yuan-platform</w:t>
       </w:r>
       <w:bookmarkEnd w:id="42"/>
+      <w:bookmarkEnd w:id="43"/>
     </w:p>
     <w:p>
       <w:pPr>
@@ -8488,7 +9028,7 @@
         <w:rPr>
           <w:rFonts w:hint="eastAsia"/>
         </w:rPr>
-        <w:t>7</w:t>
+        <w:t>8</w:t>
       </w:r>
       <w:r>
         <w:t>.jar</w:t>
@@ -8542,7 +9082,7 @@
         <w:rPr>
           <w:rFonts w:hint="eastAsia"/>
         </w:rPr>
-        <w:t>7</w:t>
+        <w:t>8</w:t>
       </w:r>
       <w:r>
         <w:t>.jar</w:t>
@@ -8616,14 +9156,14 @@
           <w:rFonts w:hint="eastAsia"/>
         </w:rPr>
       </w:pPr>
-      <w:bookmarkStart w:id="43" w:name="_Toc221692208"/>
+      <w:bookmarkStart w:id="44" w:name="_Toc225093592"/>
       <w:r>
         <w:rPr>
           <w:rFonts w:hint="eastAsia"/>
         </w:rPr>
         <w:t>运行Maven项目</w:t>
       </w:r>
-      <w:bookmarkEnd w:id="43"/>
+      <w:bookmarkEnd w:id="44"/>
     </w:p>
     <w:p>
       <w:pPr>
@@ -8777,7 +9317,7 @@
               <w:keepNext/>
               <w:ind w:leftChars="0" w:left="0"/>
             </w:pPr>
-            <w:bookmarkStart w:id="44" w:name="_Ref208924315"/>
+            <w:bookmarkStart w:id="45" w:name="_Ref208924315"/>
             <w:r>
               <w:rPr>
                 <w:rFonts w:hint="eastAsia"/>
@@ -8859,7 +9399,7 @@
             <w:r>
               <w:fldChar w:fldCharType="end"/>
             </w:r>
-            <w:bookmarkEnd w:id="44"/>
+            <w:bookmarkEnd w:id="45"/>
             <w:r>
               <w:rPr>
                 <w:rFonts w:hint="eastAsia"/>
@@ -9360,7 +9900,7 @@
                     </pic:cNvPicPr>
                   </pic:nvPicPr>
                   <pic:blipFill>
-                    <a:blip r:embed="rId26" cstate="print">
+                    <a:blip r:embed="rId27" cstate="print">
                       <a:extLst>
                         <a:ext uri="{28A0092B-C50C-407E-A947-70E740481C1C}">
                           <a14:useLocalDpi xmlns:a14="http://schemas.microsoft.com/office/drawing/2010/main" val="0"/>
@@ -9396,7 +9936,7 @@
       <w:pPr>
         <w:pStyle w:val="affc"/>
       </w:pPr>
-      <w:bookmarkStart w:id="45" w:name="_Ref221197588"/>
+      <w:bookmarkStart w:id="46" w:name="_Ref221197588"/>
       <w:r>
         <w:rPr>
           <w:rFonts w:hint="eastAsia"/>
@@ -9478,7 +10018,7 @@
       <w:r>
         <w:fldChar w:fldCharType="end"/>
       </w:r>
-      <w:bookmarkEnd w:id="45"/>
+      <w:bookmarkEnd w:id="46"/>
       <w:r>
         <w:rPr>
           <w:rFonts w:hint="eastAsia"/>
@@ -9602,7 +10142,7 @@
           <w:rFonts w:hint="eastAsia"/>
         </w:rPr>
       </w:pPr>
-      <w:bookmarkStart w:id="46" w:name="_Toc221692209"/>
+      <w:bookmarkStart w:id="47" w:name="_Toc225093593"/>
       <w:r>
         <w:rPr>
           <w:rFonts w:hint="eastAsia"/>
@@ -9621,7 +10161,7 @@
         </w:rPr>
         <w:t>ython</w:t>
       </w:r>
-      <w:bookmarkEnd w:id="46"/>
+      <w:bookmarkEnd w:id="47"/>
     </w:p>
     <w:p>
       <w:pPr>
@@ -9847,7 +10387,7 @@
                     </pic:cNvPicPr>
                   </pic:nvPicPr>
                   <pic:blipFill>
-                    <a:blip r:embed="rId27">
+                    <a:blip r:embed="rId28">
                       <a:extLst>
                         <a:ext uri="{28A0092B-C50C-407E-A947-70E740481C1C}">
                           <a14:useLocalDpi xmlns:a14="http://schemas.microsoft.com/office/drawing/2010/main" val="0"/>
@@ -9883,7 +10423,7 @@
       <w:pPr>
         <w:pStyle w:val="affc"/>
       </w:pPr>
-      <w:bookmarkStart w:id="47" w:name="_Ref221202022"/>
+      <w:bookmarkStart w:id="48" w:name="_Ref221202022"/>
       <w:r>
         <w:rPr>
           <w:rFonts w:hint="eastAsia"/>
@@ -9965,7 +10505,7 @@
       <w:r>
         <w:fldChar w:fldCharType="end"/>
       </w:r>
-      <w:bookmarkEnd w:id="47"/>
+      <w:bookmarkEnd w:id="48"/>
       <w:r>
         <w:rPr>
           <w:rFonts w:hint="eastAsia"/>
@@ -10101,7 +10641,7 @@
               <w:keepNext/>
               <w:ind w:leftChars="0" w:left="0"/>
             </w:pPr>
-            <w:bookmarkStart w:id="48" w:name="_Ref221202525"/>
+            <w:bookmarkStart w:id="49" w:name="_Ref221202525"/>
             <w:r>
               <w:rPr>
                 <w:rFonts w:hint="eastAsia"/>
@@ -10183,7 +10723,7 @@
             <w:r>
               <w:fldChar w:fldCharType="end"/>
             </w:r>
-            <w:bookmarkEnd w:id="48"/>
+            <w:bookmarkEnd w:id="49"/>
             <w:r>
               <w:rPr>
                 <w:rFonts w:hint="eastAsia"/>
@@ -10516,7 +11056,7 @@
                     </pic:cNvPicPr>
                   </pic:nvPicPr>
                   <pic:blipFill>
-                    <a:blip r:embed="rId28"/>
+                    <a:blip r:embed="rId29"/>
                     <a:stretch>
                       <a:fillRect/>
                     </a:stretch>
@@ -10541,7 +11081,7 @@
       <w:pPr>
         <w:pStyle w:val="affc"/>
       </w:pPr>
-      <w:bookmarkStart w:id="49" w:name="_Ref221202964"/>
+      <w:bookmarkStart w:id="50" w:name="_Ref221202964"/>
       <w:r>
         <w:rPr>
           <w:rFonts w:hint="eastAsia"/>
@@ -10623,7 +11163,7 @@
       <w:r>
         <w:fldChar w:fldCharType="end"/>
       </w:r>
-      <w:bookmarkEnd w:id="49"/>
+      <w:bookmarkEnd w:id="50"/>
       <w:r>
         <w:rPr>
           <w:rFonts w:hint="eastAsia"/>
@@ -10658,6 +11198,9 @@
         <w:instrText xml:space="preserve"> </w:instrText>
       </w:r>
       <w:r>
+        <w:instrText xml:space="preserve"> \* MERGEFORMAT </w:instrText>
+      </w:r>
+      <w:r>
         <w:fldChar w:fldCharType="separate"/>
       </w:r>
       <w:r>
@@ -10673,18 +11216,10 @@
         <w:t xml:space="preserve"> </w:t>
       </w:r>
       <w:r>
-        <w:rPr>
-          <w:noProof/>
-        </w:rPr>
         <w:t>3</w:t>
       </w:r>
       <w:r>
         <w:noBreakHyphen/>
-      </w:r>
-      <w:r>
-        <w:rPr>
-          <w:noProof/>
-        </w:rPr>
         <w:t>7</w:t>
       </w:r>
       <w:r>
@@ -10748,18 +11283,27 @@
       <w:pPr>
         <w:pStyle w:val="2"/>
         <w:spacing w:before="120" w:after="120"/>
-        <w:rPr>
-          <w:rFonts w:hint="eastAsia"/>
-        </w:rPr>
-      </w:pPr>
-      <w:bookmarkStart w:id="50" w:name="_Toc221692210"/>
-      <w:r>
-        <w:rPr>
-          <w:rFonts w:hint="eastAsia"/>
-        </w:rPr>
-        <w:t>小结</w:t>
-      </w:r>
-      <w:bookmarkEnd w:id="50"/>
+      </w:pPr>
+      <w:bookmarkStart w:id="51" w:name="_Toc225093594"/>
+      <w:r>
+        <w:rPr>
+          <w:rFonts w:hint="eastAsia"/>
+        </w:rPr>
+        <w:t>Launch4</w:t>
+      </w:r>
+      <w:r>
+        <w:rPr>
+          <w:rFonts w:hint="eastAsia"/>
+        </w:rPr>
+        <w:t>生成</w:t>
+      </w:r>
+      <w:r>
+        <w:rPr>
+          <w:rFonts w:hint="eastAsia"/>
+        </w:rPr>
+        <w:t>EXE</w:t>
+      </w:r>
+      <w:bookmarkEnd w:id="51"/>
     </w:p>
     <w:p>
       <w:pPr>
@@ -10767,9 +11311,1192 @@
         <w:ind w:firstLine="480"/>
       </w:pPr>
       <w:r>
-        <w:rPr>
-          <w:rFonts w:hint="eastAsia"/>
-        </w:rPr>
+        <w:t>本文使用了一款</w:t>
+      </w:r>
+      <w:r>
+        <w:rPr>
+          <w:rFonts w:hint="eastAsia"/>
+        </w:rPr>
+        <w:t>Launch4j</w:t>
+      </w:r>
+      <w:r>
+        <w:rPr>
+          <w:rFonts w:hint="eastAsia"/>
+        </w:rPr>
+        <w:t>工具将</w:t>
+      </w:r>
+      <w:r>
+        <w:rPr>
+          <w:rFonts w:hint="eastAsia"/>
+        </w:rPr>
+        <w:t xml:space="preserve">Yun </w:t>
+      </w:r>
+      <w:r>
+        <w:rPr>
+          <w:rFonts w:hint="eastAsia"/>
+        </w:rPr>
+        <w:t>的</w:t>
+      </w:r>
+      <w:r>
+        <w:rPr>
+          <w:rFonts w:hint="eastAsia"/>
+        </w:rPr>
+        <w:t>JAR</w:t>
+      </w:r>
+      <w:r>
+        <w:rPr>
+          <w:rFonts w:hint="eastAsia"/>
+        </w:rPr>
+        <w:t>包封装为</w:t>
+      </w:r>
+      <w:r>
+        <w:rPr>
+          <w:rFonts w:hint="eastAsia"/>
+        </w:rPr>
+        <w:t>Windows</w:t>
+      </w:r>
+      <w:r>
+        <w:rPr>
+          <w:rFonts w:hint="eastAsia"/>
+        </w:rPr>
+        <w:t>原生可执行文件</w:t>
+      </w:r>
+      <w:r>
+        <w:rPr>
+          <w:rFonts w:hint="eastAsia"/>
+        </w:rPr>
+        <w:t>.exe</w:t>
+      </w:r>
+      <w:r>
+        <w:rPr>
+          <w:rFonts w:hint="eastAsia"/>
+        </w:rPr>
+        <w:t>。如果不需要生成</w:t>
+      </w:r>
+      <w:r>
+        <w:rPr>
+          <w:rFonts w:hint="eastAsia"/>
+        </w:rPr>
+        <w:t>.exe</w:t>
+      </w:r>
+      <w:r>
+        <w:rPr>
+          <w:rFonts w:hint="eastAsia"/>
+        </w:rPr>
+        <w:t>，可以跳过本节。</w:t>
+      </w:r>
+    </w:p>
+    <w:p>
+      <w:pPr>
+        <w:pStyle w:val="3"/>
+        <w:spacing w:before="120" w:after="120"/>
+        <w:rPr>
+          <w:rFonts w:hint="eastAsia"/>
+        </w:rPr>
+      </w:pPr>
+      <w:bookmarkStart w:id="52" w:name="_Toc225093595"/>
+      <w:r>
+        <w:rPr>
+          <w:rFonts w:hint="eastAsia"/>
+        </w:rPr>
+        <w:t>Launch4j简介</w:t>
+      </w:r>
+      <w:bookmarkEnd w:id="52"/>
+    </w:p>
+    <w:p>
+      <w:pPr>
+        <w:ind w:firstLine="420"/>
+      </w:pPr>
+      <w:r>
+        <w:rPr>
+          <w:rStyle w:val="2Char"/>
+          <w:rFonts w:hint="eastAsia"/>
+        </w:rPr>
+        <w:t>Launch4j是一款开源工具，可将Java应用程序的JAR包封装为Windows原生可执行文件</w:t>
+      </w:r>
+      <w:r>
+        <w:rPr>
+          <w:rStyle w:val="2Char"/>
+          <w:rFonts w:hint="eastAsia"/>
+        </w:rPr>
+        <w:t>(</w:t>
+      </w:r>
+      <w:r>
+        <w:rPr>
+          <w:rStyle w:val="2Char"/>
+          <w:rFonts w:hint="eastAsia"/>
+        </w:rPr>
+        <w:t>exe</w:t>
+      </w:r>
+      <w:r>
+        <w:rPr>
+          <w:rStyle w:val="2Char"/>
+          <w:rFonts w:hint="eastAsia"/>
+        </w:rPr>
+        <w:t>)</w:t>
+      </w:r>
+      <w:r>
+        <w:rPr>
+          <w:rStyle w:val="2Char"/>
+          <w:rFonts w:hint="eastAsia"/>
+        </w:rPr>
+        <w:t>，解决用户端无JRE环境时的运行问题。其优势在于支持自定义图标、JRE版本绑定、启动参数配置等，且生成的EXE文件兼容性强</w:t>
+      </w:r>
+      <w:r>
+        <w:rPr>
+          <w:rFonts w:hint="eastAsia"/>
+        </w:rPr>
+        <w:t>。</w:t>
+      </w:r>
+    </w:p>
+    <w:p>
+      <w:pPr>
+        <w:ind w:firstLine="420"/>
+        <w:rPr>
+          <w:rFonts w:ascii="宋体" w:hAnsi="宋体" w:hint="eastAsia"/>
+          <w:color w:val="000000" w:themeColor="text1"/>
+          <w:kern w:val="2"/>
+        </w:rPr>
+      </w:pPr>
+      <w:r>
+        <w:rPr>
+          <w:rFonts w:hint="eastAsia"/>
+        </w:rPr>
+        <w:lastRenderedPageBreak/>
+        <w:t>下载路径为</w:t>
+      </w:r>
+      <w:r>
+        <w:rPr>
+          <w:rFonts w:hint="eastAsia"/>
+        </w:rPr>
+        <w:t>[</w:t>
+      </w:r>
+      <w:r>
+        <w:rPr>
+          <w:rStyle w:val="aff4"/>
+          <w:rFonts w:cs="Times New Roman"/>
+          <w:kern w:val="0"/>
+        </w:rPr>
+        <w:t>https://sourceforge.net/projects/launch4j/files/launch4j-3/3.50/</w:t>
+      </w:r>
+      <w:r>
+        <w:rPr>
+          <w:rStyle w:val="2Char"/>
+          <w:rFonts w:hint="eastAsia"/>
+        </w:rPr>
+        <w:t>]，选择</w:t>
+      </w:r>
+      <w:r>
+        <w:rPr>
+          <w:rStyle w:val="2Char"/>
+        </w:rPr>
+        <w:t>launch4j-3.50-win32.exe</w:t>
+      </w:r>
+      <w:r>
+        <w:rPr>
+          <w:rStyle w:val="2Char"/>
+          <w:rFonts w:hint="eastAsia"/>
+        </w:rPr>
+        <w:t>进行下载。</w:t>
+      </w:r>
+      <w:r>
+        <w:rPr>
+          <w:rStyle w:val="2Char"/>
+          <w:rFonts w:hint="eastAsia"/>
+        </w:rPr>
+        <w:t xml:space="preserve">双击下载的 </w:t>
+      </w:r>
+      <w:r>
+        <w:rPr>
+          <w:rStyle w:val="2Char"/>
+        </w:rPr>
+        <w:t>launch4j-3.50-win32.exe</w:t>
+      </w:r>
+      <w:r>
+        <w:rPr>
+          <w:rStyle w:val="2Char"/>
+          <w:rFonts w:hint="eastAsia"/>
+        </w:rPr>
+        <w:t>自行安装</w:t>
+      </w:r>
+      <w:r>
+        <w:rPr>
+          <w:rStyle w:val="2Char"/>
+          <w:rFonts w:hint="eastAsia"/>
+        </w:rPr>
+        <w:t>。</w:t>
+      </w:r>
+    </w:p>
+    <w:p>
+      <w:pPr>
+        <w:pStyle w:val="3"/>
+        <w:spacing w:before="120" w:after="120"/>
+      </w:pPr>
+      <w:bookmarkStart w:id="53" w:name="_Toc225093596"/>
+      <w:r>
+        <w:rPr>
+          <w:rFonts w:hint="eastAsia"/>
+        </w:rPr>
+        <w:t>环境准备</w:t>
+      </w:r>
+      <w:bookmarkEnd w:id="53"/>
+    </w:p>
+    <w:p>
+      <w:pPr>
+        <w:pStyle w:val="23"/>
+        <w:ind w:firstLine="480"/>
+      </w:pPr>
+      <w:r>
+        <w:rPr>
+          <w:rFonts w:hint="eastAsia"/>
+        </w:rPr>
+        <w:t>Java</w:t>
+      </w:r>
+      <w:r>
+        <w:rPr>
+          <w:rFonts w:hint="eastAsia"/>
+        </w:rPr>
+        <w:t>环境：确保本地已安装</w:t>
+      </w:r>
+      <w:r>
+        <w:rPr>
+          <w:rFonts w:hint="eastAsia"/>
+        </w:rPr>
+        <w:t>JDK/JRE</w:t>
+      </w:r>
+      <w:r>
+        <w:rPr>
+          <w:rFonts w:hint="eastAsia"/>
+        </w:rPr>
+        <w:t>，并配置好环境变量</w:t>
+      </w:r>
+      <w:r>
+        <w:rPr>
+          <w:rFonts w:hint="eastAsia"/>
+        </w:rPr>
+        <w:t>，</w:t>
+      </w:r>
+      <w:r>
+        <w:rPr>
+          <w:rFonts w:hint="eastAsia"/>
+        </w:rPr>
+        <w:t>见</w:t>
+      </w:r>
+      <w:r>
+        <w:fldChar w:fldCharType="begin"/>
+      </w:r>
+      <w:r>
+        <w:instrText xml:space="preserve"> </w:instrText>
+      </w:r>
+      <w:r>
+        <w:rPr>
+          <w:rFonts w:hint="eastAsia"/>
+        </w:rPr>
+        <w:instrText>REF _Ref218411409 \r \h</w:instrText>
+      </w:r>
+      <w:r>
+        <w:instrText xml:space="preserve"> </w:instrText>
+      </w:r>
+      <w:r>
+        <w:fldChar w:fldCharType="separate"/>
+      </w:r>
+      <w:r>
+        <w:t xml:space="preserve">2.2 </w:t>
+      </w:r>
+      <w:r>
+        <w:fldChar w:fldCharType="end"/>
+      </w:r>
+      <w:r>
+        <w:rPr>
+          <w:rFonts w:hint="eastAsia"/>
+        </w:rPr>
+        <w:t>节。</w:t>
+      </w:r>
+    </w:p>
+    <w:p>
+      <w:pPr>
+        <w:pStyle w:val="23"/>
+        <w:ind w:firstLine="480"/>
+      </w:pPr>
+      <w:r>
+        <w:t>JAR</w:t>
+      </w:r>
+      <w:r>
+        <w:t>文件：需打包的</w:t>
+      </w:r>
+      <w:r>
+        <w:t>Java</w:t>
+      </w:r>
+      <w:proofErr w:type="gramStart"/>
+      <w:r>
+        <w:t>程序需已编译</w:t>
+      </w:r>
+      <w:proofErr w:type="gramEnd"/>
+      <w:r>
+        <w:t>为可执行</w:t>
+      </w:r>
+      <w:r>
+        <w:t>JAR</w:t>
+      </w:r>
+      <w:r>
+        <w:rPr>
+          <w:rFonts w:hint="eastAsia"/>
+        </w:rPr>
+        <w:t>，见</w:t>
+      </w:r>
+      <w:r>
+        <w:fldChar w:fldCharType="begin"/>
+      </w:r>
+      <w:r>
+        <w:instrText xml:space="preserve"> </w:instrText>
+      </w:r>
+      <w:r>
+        <w:rPr>
+          <w:rFonts w:hint="eastAsia"/>
+        </w:rPr>
+        <w:instrText>REF _Ref225089916 \r \h</w:instrText>
+      </w:r>
+      <w:r>
+        <w:instrText xml:space="preserve"> </w:instrText>
+      </w:r>
+      <w:r>
+        <w:fldChar w:fldCharType="separate"/>
+      </w:r>
+      <w:r>
+        <w:t xml:space="preserve">3.1.3 </w:t>
+      </w:r>
+      <w:r>
+        <w:fldChar w:fldCharType="end"/>
+      </w:r>
+      <w:r>
+        <w:rPr>
+          <w:rFonts w:hint="eastAsia"/>
+        </w:rPr>
+        <w:t>节。</w:t>
+      </w:r>
+    </w:p>
+    <w:p>
+      <w:pPr>
+        <w:pStyle w:val="3"/>
+        <w:spacing w:before="120" w:after="120"/>
+      </w:pPr>
+      <w:bookmarkStart w:id="54" w:name="_Toc225093597"/>
+      <w:r>
+        <w:rPr>
+          <w:rFonts w:hint="eastAsia"/>
+        </w:rPr>
+        <w:t>详细打包步骤</w:t>
+      </w:r>
+      <w:bookmarkEnd w:id="54"/>
+    </w:p>
+    <w:p>
+      <w:pPr>
+        <w:pStyle w:val="23"/>
+        <w:ind w:firstLine="480"/>
+        <w:rPr>
+          <w:rFonts w:hint="eastAsia"/>
+        </w:rPr>
+      </w:pPr>
+      <w:r>
+        <w:rPr>
+          <w:rFonts w:hint="eastAsia"/>
+        </w:rPr>
+        <w:t>启动安装好的</w:t>
+      </w:r>
+      <w:r>
+        <w:rPr>
+          <w:rFonts w:hint="eastAsia"/>
+        </w:rPr>
+        <w:t xml:space="preserve"> Launch4j</w:t>
+      </w:r>
+      <w:r>
+        <w:rPr>
+          <w:rFonts w:hint="eastAsia"/>
+        </w:rPr>
+        <w:t>，</w:t>
+      </w:r>
+      <w:r>
+        <w:rPr>
+          <w:rFonts w:hint="eastAsia"/>
+        </w:rPr>
+        <w:t>打开配置文件</w:t>
+      </w:r>
+      <w:r>
+        <w:t>yuan\yuan-platform\target\artifacts</w:t>
+      </w:r>
+      <w:r>
+        <w:rPr>
+          <w:rFonts w:hint="eastAsia"/>
+        </w:rPr>
+        <w:t>\</w:t>
+      </w:r>
+      <w:r>
+        <w:t xml:space="preserve"> </w:t>
+      </w:r>
+      <w:r>
+        <w:t>yuan_jdk.xml</w:t>
+      </w:r>
+      <w:r>
+        <w:rPr>
+          <w:rFonts w:hint="eastAsia"/>
+        </w:rPr>
+        <w:t>，</w:t>
+      </w:r>
+      <w:r>
+        <w:rPr>
+          <w:rFonts w:hint="eastAsia"/>
+        </w:rPr>
+        <w:t>其中</w:t>
+      </w:r>
+      <w:r>
+        <w:rPr>
+          <w:rFonts w:hint="eastAsia"/>
+        </w:rPr>
+        <w:t>Basic</w:t>
+      </w:r>
+      <w:r>
+        <w:rPr>
+          <w:rFonts w:hint="eastAsia"/>
+        </w:rPr>
+        <w:t>选项卡</w:t>
+      </w:r>
+      <w:r>
+        <w:rPr>
+          <w:rFonts w:hint="eastAsia"/>
+        </w:rPr>
+        <w:t>如</w:t>
+      </w:r>
+      <w:r>
+        <w:fldChar w:fldCharType="begin"/>
+      </w:r>
+      <w:r>
+        <w:instrText xml:space="preserve"> </w:instrText>
+      </w:r>
+      <w:r>
+        <w:rPr>
+          <w:rFonts w:hint="eastAsia"/>
+        </w:rPr>
+        <w:instrText>REF _Ref225091624 \h</w:instrText>
+      </w:r>
+      <w:r>
+        <w:instrText xml:space="preserve"> </w:instrText>
+      </w:r>
+      <w:r>
+        <w:fldChar w:fldCharType="separate"/>
+      </w:r>
+      <w:r>
+        <w:rPr>
+          <w:rFonts w:hint="eastAsia"/>
+        </w:rPr>
+        <w:t>图</w:t>
+      </w:r>
+      <w:r>
+        <w:rPr>
+          <w:rFonts w:hint="eastAsia"/>
+        </w:rPr>
+        <w:t xml:space="preserve"> </w:t>
+      </w:r>
+      <w:r>
+        <w:rPr>
+          <w:noProof/>
+        </w:rPr>
+        <w:t>3</w:t>
+      </w:r>
+      <w:r>
+        <w:noBreakHyphen/>
+      </w:r>
+      <w:r>
+        <w:rPr>
+          <w:noProof/>
+        </w:rPr>
+        <w:t>8</w:t>
+      </w:r>
+      <w:r>
+        <w:fldChar w:fldCharType="end"/>
+      </w:r>
+      <w:r>
+        <w:rPr>
+          <w:rFonts w:hint="eastAsia"/>
+        </w:rPr>
+        <w:t>所示。</w:t>
+      </w:r>
+    </w:p>
+    <w:p>
+      <w:pPr>
+        <w:pStyle w:val="affc"/>
+      </w:pPr>
+      <w:r>
+        <w:rPr>
+          <w:noProof/>
+        </w:rPr>
+        <w:drawing>
+          <wp:inline distT="0" distB="0" distL="0" distR="0" wp14:anchorId="1AEE81EF" wp14:editId="3A6B7746">
+            <wp:extent cx="4793887" cy="4672853"/>
+            <wp:effectExtent l="0" t="0" r="6985" b="0"/>
+            <wp:docPr id="775837512" name="图片 5"/>
+            <wp:cNvGraphicFramePr>
+              <a:graphicFrameLocks xmlns:a="http://schemas.openxmlformats.org/drawingml/2006/main" noChangeAspect="1"/>
+            </wp:cNvGraphicFramePr>
+            <a:graphic xmlns:a="http://schemas.openxmlformats.org/drawingml/2006/main">
+              <a:graphicData uri="http://schemas.openxmlformats.org/drawingml/2006/picture">
+                <pic:pic xmlns:pic="http://schemas.openxmlformats.org/drawingml/2006/picture">
+                  <pic:nvPicPr>
+                    <pic:cNvPr id="0" name="Picture 6"/>
+                    <pic:cNvPicPr>
+                      <a:picLocks noChangeAspect="1" noChangeArrowheads="1"/>
+                    </pic:cNvPicPr>
+                  </pic:nvPicPr>
+                  <pic:blipFill>
+                    <a:blip r:embed="rId30" cstate="print">
+                      <a:extLst>
+                        <a:ext uri="{28A0092B-C50C-407E-A947-70E740481C1C}">
+                          <a14:useLocalDpi xmlns:a14="http://schemas.microsoft.com/office/drawing/2010/main" val="0"/>
+                        </a:ext>
+                      </a:extLst>
+                    </a:blip>
+                    <a:srcRect/>
+                    <a:stretch>
+                      <a:fillRect/>
+                    </a:stretch>
+                  </pic:blipFill>
+                  <pic:spPr bwMode="auto">
+                    <a:xfrm>
+                      <a:off x="0" y="0"/>
+                      <a:ext cx="4797534" cy="4676408"/>
+                    </a:xfrm>
+                    <a:prstGeom prst="rect">
+                      <a:avLst/>
+                    </a:prstGeom>
+                    <a:noFill/>
+                    <a:ln>
+                      <a:noFill/>
+                    </a:ln>
+                  </pic:spPr>
+                </pic:pic>
+              </a:graphicData>
+            </a:graphic>
+          </wp:inline>
+        </w:drawing>
+      </w:r>
+    </w:p>
+    <w:p>
+      <w:pPr>
+        <w:pStyle w:val="affc"/>
+      </w:pPr>
+      <w:bookmarkStart w:id="55" w:name="_Ref225091624"/>
+      <w:r>
+        <w:rPr>
+          <w:rFonts w:hint="eastAsia"/>
+        </w:rPr>
+        <w:t>图</w:t>
+      </w:r>
+      <w:r>
+        <w:rPr>
+          <w:rFonts w:hint="eastAsia"/>
+        </w:rPr>
+        <w:t xml:space="preserve"> </w:t>
+      </w:r>
+      <w:r>
+        <w:fldChar w:fldCharType="begin"/>
+      </w:r>
+      <w:r>
+        <w:instrText xml:space="preserve"> </w:instrText>
+      </w:r>
+      <w:r>
+        <w:rPr>
+          <w:rFonts w:hint="eastAsia"/>
+        </w:rPr>
+        <w:instrText>STYLEREF 1 \s</w:instrText>
+      </w:r>
+      <w:r>
+        <w:instrText xml:space="preserve"> </w:instrText>
+      </w:r>
+      <w:r>
+        <w:fldChar w:fldCharType="separate"/>
+      </w:r>
+      <w:r>
+        <w:rPr>
+          <w:noProof/>
+        </w:rPr>
+        <w:t>3</w:t>
+      </w:r>
+      <w:r>
+        <w:fldChar w:fldCharType="end"/>
+      </w:r>
+      <w:r>
+        <w:noBreakHyphen/>
+      </w:r>
+      <w:r>
+        <w:fldChar w:fldCharType="begin"/>
+      </w:r>
+      <w:r>
+        <w:instrText xml:space="preserve"> </w:instrText>
+      </w:r>
+      <w:r>
+        <w:rPr>
+          <w:rFonts w:hint="eastAsia"/>
+        </w:rPr>
+        <w:instrText xml:space="preserve">SEQ </w:instrText>
+      </w:r>
+      <w:r>
+        <w:rPr>
+          <w:rFonts w:hint="eastAsia"/>
+        </w:rPr>
+        <w:instrText>图</w:instrText>
+      </w:r>
+      <w:r>
+        <w:rPr>
+          <w:rFonts w:hint="eastAsia"/>
+        </w:rPr>
+        <w:instrText xml:space="preserve"> \* ARABIC \s 1</w:instrText>
+      </w:r>
+      <w:r>
+        <w:instrText xml:space="preserve"> </w:instrText>
+      </w:r>
+      <w:r>
+        <w:fldChar w:fldCharType="separate"/>
+      </w:r>
+      <w:r>
+        <w:rPr>
+          <w:noProof/>
+        </w:rPr>
+        <w:t>8</w:t>
+      </w:r>
+      <w:r>
+        <w:fldChar w:fldCharType="end"/>
+      </w:r>
+      <w:bookmarkEnd w:id="55"/>
+      <w:r>
+        <w:rPr>
+          <w:rFonts w:hint="eastAsia"/>
+        </w:rPr>
+        <w:t xml:space="preserve"> </w:t>
+      </w:r>
+      <w:r>
+        <w:rPr>
+          <w:rFonts w:hint="eastAsia"/>
+        </w:rPr>
+        <w:t>配置</w:t>
+      </w:r>
+      <w:r>
+        <w:t>yuan_jdk.xml</w:t>
+      </w:r>
+    </w:p>
+    <w:p>
+      <w:pPr>
+        <w:pStyle w:val="23"/>
+        <w:ind w:firstLine="480"/>
+      </w:pPr>
+      <w:r>
+        <w:rPr>
+          <w:rFonts w:hint="eastAsia"/>
+        </w:rPr>
+        <w:lastRenderedPageBreak/>
+        <w:t>其中，</w:t>
+      </w:r>
+      <w:r>
+        <w:rPr>
+          <w:rFonts w:hint="eastAsia"/>
+        </w:rPr>
+        <w:t>Output file</w:t>
+      </w:r>
+      <w:r>
+        <w:rPr>
+          <w:rFonts w:hint="eastAsia"/>
+        </w:rPr>
+        <w:t>：设置生成的</w:t>
+      </w:r>
+      <w:r>
+        <w:rPr>
+          <w:rFonts w:hint="eastAsia"/>
+        </w:rPr>
+        <w:t xml:space="preserve"> EXE </w:t>
+      </w:r>
+      <w:r>
+        <w:rPr>
+          <w:rFonts w:hint="eastAsia"/>
+        </w:rPr>
+        <w:t>路径；</w:t>
+      </w:r>
+      <w:r>
+        <w:rPr>
+          <w:rFonts w:hint="eastAsia"/>
+        </w:rPr>
+        <w:t>Jar</w:t>
+      </w:r>
+      <w:r>
+        <w:rPr>
+          <w:rFonts w:hint="eastAsia"/>
+        </w:rPr>
+        <w:t>：选择待打包的</w:t>
+      </w:r>
+      <w:r>
+        <w:rPr>
+          <w:rFonts w:hint="eastAsia"/>
+        </w:rPr>
+        <w:t xml:space="preserve"> JAR </w:t>
+      </w:r>
+      <w:r>
+        <w:rPr>
+          <w:rFonts w:hint="eastAsia"/>
+        </w:rPr>
+        <w:t>文件路径；</w:t>
+      </w:r>
+      <w:r>
+        <w:rPr>
+          <w:rFonts w:hint="eastAsia"/>
+        </w:rPr>
+        <w:t>Icon</w:t>
+      </w:r>
+      <w:r>
+        <w:rPr>
+          <w:rFonts w:hint="eastAsia"/>
+        </w:rPr>
+        <w:t>（可选）：添加</w:t>
+      </w:r>
+      <w:r>
+        <w:rPr>
+          <w:rFonts w:hint="eastAsia"/>
+        </w:rPr>
+        <w:t xml:space="preserve"> EXE </w:t>
+      </w:r>
+      <w:r>
+        <w:rPr>
+          <w:rFonts w:hint="eastAsia"/>
+        </w:rPr>
+        <w:t>图标（需</w:t>
+      </w:r>
+      <w:r>
+        <w:rPr>
+          <w:rFonts w:hint="eastAsia"/>
+        </w:rPr>
+        <w:t xml:space="preserve"> .</w:t>
+      </w:r>
+      <w:proofErr w:type="spellStart"/>
+      <w:r>
+        <w:rPr>
+          <w:rFonts w:hint="eastAsia"/>
+        </w:rPr>
+        <w:t>ico</w:t>
+      </w:r>
+      <w:proofErr w:type="spellEnd"/>
+      <w:r>
+        <w:rPr>
+          <w:rFonts w:hint="eastAsia"/>
+        </w:rPr>
+        <w:t xml:space="preserve"> </w:t>
+      </w:r>
+      <w:r>
+        <w:rPr>
+          <w:rFonts w:hint="eastAsia"/>
+        </w:rPr>
+        <w:t>格式）。</w:t>
+      </w:r>
+    </w:p>
+    <w:p>
+      <w:pPr>
+        <w:pStyle w:val="23"/>
+        <w:ind w:firstLine="480"/>
+      </w:pPr>
+      <w:r>
+        <w:t>进入</w:t>
+      </w:r>
+      <w:r>
+        <w:t>JRE</w:t>
+      </w:r>
+      <w:r>
+        <w:t>选项卡</w:t>
+      </w:r>
+      <w:r>
+        <w:rPr>
+          <w:rFonts w:hint="eastAsia"/>
+        </w:rPr>
+        <w:t>，</w:t>
+      </w:r>
+      <w:r>
+        <w:rPr>
+          <w:rFonts w:hint="eastAsia"/>
+        </w:rPr>
+        <w:t>根据</w:t>
+      </w:r>
+      <w:r>
+        <w:rPr>
+          <w:rFonts w:hint="eastAsia"/>
+        </w:rPr>
+        <w:t>设置</w:t>
+      </w:r>
+      <w:r>
+        <w:rPr>
+          <w:rFonts w:hint="eastAsia"/>
+        </w:rPr>
+        <w:t>JRE</w:t>
+      </w:r>
+      <w:r>
+        <w:t>的路径</w:t>
+      </w:r>
+      <w:r>
+        <w:rPr>
+          <w:rFonts w:hint="eastAsia"/>
+        </w:rPr>
+        <w:t>，如</w:t>
+      </w:r>
+      <w:r>
+        <w:fldChar w:fldCharType="begin"/>
+      </w:r>
+      <w:r>
+        <w:instrText xml:space="preserve"> </w:instrText>
+      </w:r>
+      <w:r>
+        <w:rPr>
+          <w:rFonts w:hint="eastAsia"/>
+        </w:rPr>
+        <w:instrText>REF _Ref225092893 \h</w:instrText>
+      </w:r>
+      <w:r>
+        <w:instrText xml:space="preserve"> </w:instrText>
+      </w:r>
+      <w:r>
+        <w:instrText xml:space="preserve"> \* MERGEFORMAT </w:instrText>
+      </w:r>
+      <w:r>
+        <w:fldChar w:fldCharType="separate"/>
+      </w:r>
+      <w:r>
+        <w:rPr>
+          <w:rFonts w:hint="eastAsia"/>
+        </w:rPr>
+        <w:t>图</w:t>
+      </w:r>
+      <w:r>
+        <w:rPr>
+          <w:rFonts w:hint="eastAsia"/>
+        </w:rPr>
+        <w:t xml:space="preserve"> </w:t>
+      </w:r>
+      <w:r>
+        <w:t>3</w:t>
+      </w:r>
+      <w:r>
+        <w:noBreakHyphen/>
+        <w:t>9</w:t>
+      </w:r>
+      <w:r>
+        <w:fldChar w:fldCharType="end"/>
+      </w:r>
+      <w:r>
+        <w:t>所示。</w:t>
+      </w:r>
+    </w:p>
+    <w:p>
+      <w:pPr>
+        <w:pStyle w:val="affc"/>
+      </w:pPr>
+      <w:r>
+        <w:rPr>
+          <w:noProof/>
+        </w:rPr>
+        <w:drawing>
+          <wp:inline distT="0" distB="0" distL="0" distR="0" wp14:anchorId="4EA5D2CE" wp14:editId="7F6648BA">
+            <wp:extent cx="5256530" cy="5170805"/>
+            <wp:effectExtent l="0" t="0" r="1270" b="0"/>
+            <wp:docPr id="432655210" name="图片 6"/>
+            <wp:cNvGraphicFramePr>
+              <a:graphicFrameLocks xmlns:a="http://schemas.openxmlformats.org/drawingml/2006/main" noChangeAspect="1"/>
+            </wp:cNvGraphicFramePr>
+            <a:graphic xmlns:a="http://schemas.openxmlformats.org/drawingml/2006/main">
+              <a:graphicData uri="http://schemas.openxmlformats.org/drawingml/2006/picture">
+                <pic:pic xmlns:pic="http://schemas.openxmlformats.org/drawingml/2006/picture">
+                  <pic:nvPicPr>
+                    <pic:cNvPr id="0" name="Picture 7"/>
+                    <pic:cNvPicPr>
+                      <a:picLocks noChangeAspect="1" noChangeArrowheads="1"/>
+                    </pic:cNvPicPr>
+                  </pic:nvPicPr>
+                  <pic:blipFill>
+                    <a:blip r:embed="rId31">
+                      <a:extLst>
+                        <a:ext uri="{28A0092B-C50C-407E-A947-70E740481C1C}">
+                          <a14:useLocalDpi xmlns:a14="http://schemas.microsoft.com/office/drawing/2010/main" val="0"/>
+                        </a:ext>
+                      </a:extLst>
+                    </a:blip>
+                    <a:srcRect/>
+                    <a:stretch>
+                      <a:fillRect/>
+                    </a:stretch>
+                  </pic:blipFill>
+                  <pic:spPr bwMode="auto">
+                    <a:xfrm>
+                      <a:off x="0" y="0"/>
+                      <a:ext cx="5256530" cy="5170805"/>
+                    </a:xfrm>
+                    <a:prstGeom prst="rect">
+                      <a:avLst/>
+                    </a:prstGeom>
+                    <a:noFill/>
+                    <a:ln>
+                      <a:noFill/>
+                    </a:ln>
+                  </pic:spPr>
+                </pic:pic>
+              </a:graphicData>
+            </a:graphic>
+          </wp:inline>
+        </w:drawing>
+      </w:r>
+    </w:p>
+    <w:p>
+      <w:pPr>
+        <w:pStyle w:val="affc"/>
+      </w:pPr>
+      <w:bookmarkStart w:id="56" w:name="_Ref225092893"/>
+      <w:r>
+        <w:rPr>
+          <w:rFonts w:hint="eastAsia"/>
+        </w:rPr>
+        <w:t>图</w:t>
+      </w:r>
+      <w:r>
+        <w:rPr>
+          <w:rFonts w:hint="eastAsia"/>
+        </w:rPr>
+        <w:t xml:space="preserve"> </w:t>
+      </w:r>
+      <w:r>
+        <w:fldChar w:fldCharType="begin"/>
+      </w:r>
+      <w:r>
+        <w:instrText xml:space="preserve"> </w:instrText>
+      </w:r>
+      <w:r>
+        <w:rPr>
+          <w:rFonts w:hint="eastAsia"/>
+        </w:rPr>
+        <w:instrText>STYLEREF 1 \s</w:instrText>
+      </w:r>
+      <w:r>
+        <w:instrText xml:space="preserve"> </w:instrText>
+      </w:r>
+      <w:r>
+        <w:fldChar w:fldCharType="separate"/>
+      </w:r>
+      <w:r>
+        <w:rPr>
+          <w:noProof/>
+        </w:rPr>
+        <w:t>3</w:t>
+      </w:r>
+      <w:r>
+        <w:fldChar w:fldCharType="end"/>
+      </w:r>
+      <w:r>
+        <w:noBreakHyphen/>
+      </w:r>
+      <w:r>
+        <w:fldChar w:fldCharType="begin"/>
+      </w:r>
+      <w:r>
+        <w:instrText xml:space="preserve"> </w:instrText>
+      </w:r>
+      <w:r>
+        <w:rPr>
+          <w:rFonts w:hint="eastAsia"/>
+        </w:rPr>
+        <w:instrText xml:space="preserve">SEQ </w:instrText>
+      </w:r>
+      <w:r>
+        <w:rPr>
+          <w:rFonts w:hint="eastAsia"/>
+        </w:rPr>
+        <w:instrText>图</w:instrText>
+      </w:r>
+      <w:r>
+        <w:rPr>
+          <w:rFonts w:hint="eastAsia"/>
+        </w:rPr>
+        <w:instrText xml:space="preserve"> \* ARABIC \s 1</w:instrText>
+      </w:r>
+      <w:r>
+        <w:instrText xml:space="preserve"> </w:instrText>
+      </w:r>
+      <w:r>
+        <w:fldChar w:fldCharType="separate"/>
+      </w:r>
+      <w:r>
+        <w:rPr>
+          <w:noProof/>
+        </w:rPr>
+        <w:t>9</w:t>
+      </w:r>
+      <w:r>
+        <w:fldChar w:fldCharType="end"/>
+      </w:r>
+      <w:bookmarkEnd w:id="56"/>
+      <w:r>
+        <w:rPr>
+          <w:rFonts w:hint="eastAsia"/>
+        </w:rPr>
+        <w:t xml:space="preserve"> JRE</w:t>
+      </w:r>
+      <w:r>
+        <w:rPr>
+          <w:rFonts w:hint="eastAsia"/>
+        </w:rPr>
+        <w:t>信息</w:t>
+      </w:r>
+    </w:p>
+    <w:p>
+      <w:pPr>
+        <w:pStyle w:val="23"/>
+        <w:ind w:firstLine="480"/>
+      </w:pPr>
+      <w:r>
+        <w:rPr>
+          <w:rFonts w:hint="eastAsia"/>
+        </w:rPr>
+        <w:t>Min JRE version</w:t>
+      </w:r>
+      <w:r>
+        <w:rPr>
+          <w:rFonts w:hint="eastAsia"/>
+        </w:rPr>
+        <w:t>：填写最低兼容的</w:t>
+      </w:r>
+      <w:r>
+        <w:rPr>
+          <w:rFonts w:hint="eastAsia"/>
+        </w:rPr>
+        <w:t>JRE</w:t>
+      </w:r>
+      <w:r>
+        <w:rPr>
+          <w:rFonts w:hint="eastAsia"/>
+        </w:rPr>
+        <w:t>版本。</w:t>
+      </w:r>
+      <w:r>
+        <w:rPr>
+          <w:rFonts w:hint="eastAsia"/>
+        </w:rPr>
+        <w:t>Bundled JRE path</w:t>
+      </w:r>
+      <w:r>
+        <w:rPr>
+          <w:rFonts w:hint="eastAsia"/>
+        </w:rPr>
+        <w:t>：指定相对路径。</w:t>
+      </w:r>
+      <w:r>
+        <w:rPr>
+          <w:rFonts w:hint="eastAsia"/>
+        </w:rPr>
+        <w:t>JVM Options</w:t>
+      </w:r>
+      <w:r>
+        <w:rPr>
+          <w:rFonts w:hint="eastAsia"/>
+        </w:rPr>
+        <w:t>：可以添加需要的参数，譬如</w:t>
+      </w:r>
+      <w:r>
+        <w:rPr>
+          <w:rFonts w:hint="eastAsia"/>
+        </w:rPr>
+        <w:t>-</w:t>
+      </w:r>
+      <w:proofErr w:type="spellStart"/>
+      <w:r>
+        <w:rPr>
+          <w:rFonts w:hint="eastAsia"/>
+        </w:rPr>
+        <w:t>Dfile.encoding</w:t>
+      </w:r>
+      <w:proofErr w:type="spellEnd"/>
+      <w:r>
+        <w:rPr>
+          <w:rFonts w:hint="eastAsia"/>
+        </w:rPr>
+        <w:t>=UTF-8</w:t>
+      </w:r>
+      <w:r>
+        <w:rPr>
+          <w:rFonts w:hint="eastAsia"/>
+        </w:rPr>
+        <w:t>。</w:t>
+      </w:r>
+    </w:p>
+    <w:p>
+      <w:pPr>
+        <w:pStyle w:val="23"/>
+        <w:ind w:firstLine="480"/>
+        <w:rPr>
+          <w:rFonts w:hint="eastAsia"/>
+        </w:rPr>
+      </w:pPr>
+      <w:r>
+        <w:rPr>
+          <w:rFonts w:hint="eastAsia"/>
+        </w:rPr>
+        <w:t>其它参数根据需要自行调整，配置完成后，点击</w:t>
+      </w:r>
+      <w:r>
+        <w:rPr>
+          <w:rFonts w:hint="eastAsia"/>
+        </w:rPr>
+        <w:t>Build wrapper</w:t>
+      </w:r>
+      <w:r>
+        <w:rPr>
+          <w:rFonts w:hint="eastAsia"/>
+        </w:rPr>
+        <w:t>按钮后，</w:t>
+      </w:r>
+      <w:r>
+        <w:t>yuan\yuan-platform\target\artifacts\yuan</w:t>
+      </w:r>
+      <w:r>
+        <w:rPr>
+          <w:rFonts w:hint="eastAsia"/>
+        </w:rPr>
+        <w:t>路径下可以看到生成的</w:t>
+      </w:r>
+      <w:r>
+        <w:t>yuan-1.0.8.exe</w:t>
+      </w:r>
+      <w:r>
+        <w:rPr>
+          <w:rFonts w:hint="eastAsia"/>
+        </w:rPr>
+        <w:t>。</w:t>
+      </w:r>
+    </w:p>
+    <w:p>
+      <w:pPr>
+        <w:pStyle w:val="2"/>
+        <w:spacing w:before="120" w:after="120"/>
+        <w:rPr>
+          <w:rFonts w:hint="eastAsia"/>
+        </w:rPr>
+      </w:pPr>
+      <w:bookmarkStart w:id="57" w:name="_Toc225093598"/>
+      <w:r>
+        <w:rPr>
+          <w:rFonts w:hint="eastAsia"/>
+        </w:rPr>
+        <w:t>小结</w:t>
+      </w:r>
+      <w:bookmarkEnd w:id="57"/>
+    </w:p>
+    <w:p>
+      <w:pPr>
+        <w:pStyle w:val="23"/>
+        <w:ind w:firstLine="480"/>
+      </w:pPr>
+      <w:r>
+        <w:rPr>
+          <w:rFonts w:hint="eastAsia"/>
+        </w:rPr>
+        <w:lastRenderedPageBreak/>
         <w:t>本</w:t>
       </w:r>
       <w:r>
@@ -10857,7 +12584,25 @@
         <w:rPr>
           <w:rFonts w:hint="eastAsia"/>
         </w:rPr>
-        <w:t>，演示了</w:t>
+        <w:t>，以及生成</w:t>
+      </w:r>
+      <w:r>
+        <w:rPr>
+          <w:rFonts w:hint="eastAsia"/>
+        </w:rPr>
+        <w:t>yuan.exe</w:t>
+      </w:r>
+      <w:r>
+        <w:rPr>
+          <w:rFonts w:hint="eastAsia"/>
+        </w:rPr>
+        <w:t>可执行文件。</w:t>
+      </w:r>
+      <w:r>
+        <w:rPr>
+          <w:rFonts w:hint="eastAsia"/>
+        </w:rPr>
+        <w:t>演示了</w:t>
       </w:r>
       <w:r>
         <w:rPr>
@@ -10940,7 +12685,7 @@
       </w:pPr>
     </w:p>
     <w:sectPr>
-      <w:headerReference w:type="default" r:id="rId29"/>
+      <w:headerReference w:type="default" r:id="rId32"/>
       <w:endnotePr>
         <w:numFmt w:val="decimal"/>
       </w:endnotePr>
@@ -13990,6 +15735,18 @@
   </w:num>
   <w:num w:numId="39" w16cid:durableId="341585567">
     <w:abstractNumId w:val="0"/>
+  </w:num>
+  <w:num w:numId="40" w16cid:durableId="1614895478">
+    <w:abstractNumId w:val="19"/>
+  </w:num>
+  <w:num w:numId="41" w16cid:durableId="444156359">
+    <w:abstractNumId w:val="19"/>
+  </w:num>
+  <w:num w:numId="42" w16cid:durableId="905650823">
+    <w:abstractNumId w:val="19"/>
+  </w:num>
+  <w:num w:numId="43" w16cid:durableId="10181531">
+    <w:abstractNumId w:val="19"/>
   </w:num>
   <w:numIdMacAtCleanup w:val="7"/>
 </w:numbering>
@@ -14547,7 +16304,6 @@
   <w:style w:type="character" w:default="1" w:styleId="a1">
     <w:name w:val="Default Paragraph Font"/>
     <w:uiPriority w:val="1"/>
-    <w:semiHidden/>
     <w:unhideWhenUsed/>
   </w:style>
   <w:style w:type="table" w:default="1" w:styleId="a2">

</xml_diff>

<commit_message>
Fixed the version error and added documentation for installing plugins.
</commit_message>
<xml_diff>
--- a/yuan.docx
+++ b/yuan.docx
@@ -772,7 +772,7 @@
             </w:rPr>
             <w:fldChar w:fldCharType="separate"/>
           </w:r>
-          <w:hyperlink w:anchor="_Toc225093578" w:history="1">
+          <w:hyperlink w:anchor="_Toc225175950" w:history="1">
             <w:r>
               <w:rPr>
                 <w:rStyle w:val="aff4"/>
@@ -847,7 +847,7 @@
                 <w:noProof/>
                 <w:webHidden/>
               </w:rPr>
-              <w:instrText>PAGEREF _Toc225093578 \h</w:instrText>
+              <w:instrText>PAGEREF _Toc225175950 \h</w:instrText>
             </w:r>
             <w:r>
               <w:rPr>
@@ -902,7 +902,7 @@
               <w14:ligatures w14:val="standardContextual"/>
             </w:rPr>
           </w:pPr>
-          <w:hyperlink w:anchor="_Toc225093579" w:history="1">
+          <w:hyperlink w:anchor="_Toc225175951" w:history="1">
             <w:r>
               <w:rPr>
                 <w:rStyle w:val="aff4"/>
@@ -956,7 +956,7 @@
                 <w:noProof/>
                 <w:webHidden/>
               </w:rPr>
-              <w:instrText>PAGEREF _Toc225093579 \h</w:instrText>
+              <w:instrText>PAGEREF _Toc225175951 \h</w:instrText>
             </w:r>
             <w:r>
               <w:rPr>
@@ -1011,7 +1011,7 @@
               <w14:ligatures w14:val="standardContextual"/>
             </w:rPr>
           </w:pPr>
-          <w:hyperlink w:anchor="_Toc225093580" w:history="1">
+          <w:hyperlink w:anchor="_Toc225175952" w:history="1">
             <w:r>
               <w:rPr>
                 <w:rStyle w:val="aff4"/>
@@ -1065,7 +1065,7 @@
                 <w:noProof/>
                 <w:webHidden/>
               </w:rPr>
-              <w:instrText>PAGEREF _Toc225093580 \h</w:instrText>
+              <w:instrText>PAGEREF _Toc225175952 \h</w:instrText>
             </w:r>
             <w:r>
               <w:rPr>
@@ -1126,7 +1126,7 @@
               <w14:ligatures w14:val="standardContextual"/>
             </w:rPr>
           </w:pPr>
-          <w:hyperlink w:anchor="_Toc225093581" w:history="1">
+          <w:hyperlink w:anchor="_Toc225175953" w:history="1">
             <w:r>
               <w:rPr>
                 <w:rStyle w:val="aff4"/>
@@ -1201,7 +1201,7 @@
                 <w:noProof/>
                 <w:webHidden/>
               </w:rPr>
-              <w:instrText>PAGEREF _Toc225093581 \h</w:instrText>
+              <w:instrText>PAGEREF _Toc225175953 \h</w:instrText>
             </w:r>
             <w:r>
               <w:rPr>
@@ -1256,7 +1256,7 @@
               <w14:ligatures w14:val="standardContextual"/>
             </w:rPr>
           </w:pPr>
-          <w:hyperlink w:anchor="_Toc225093582" w:history="1">
+          <w:hyperlink w:anchor="_Toc225175954" w:history="1">
             <w:r>
               <w:rPr>
                 <w:rStyle w:val="aff4"/>
@@ -1310,7 +1310,7 @@
                 <w:noProof/>
                 <w:webHidden/>
               </w:rPr>
-              <w:instrText>PAGEREF _Toc225093582 \h</w:instrText>
+              <w:instrText>PAGEREF _Toc225175954 \h</w:instrText>
             </w:r>
             <w:r>
               <w:rPr>
@@ -1365,7 +1365,7 @@
               <w14:ligatures w14:val="standardContextual"/>
             </w:rPr>
           </w:pPr>
-          <w:hyperlink w:anchor="_Toc225093583" w:history="1">
+          <w:hyperlink w:anchor="_Toc225175955" w:history="1">
             <w:r>
               <w:rPr>
                 <w:rStyle w:val="aff4"/>
@@ -1427,7 +1427,7 @@
                 <w:noProof/>
                 <w:webHidden/>
               </w:rPr>
-              <w:instrText>PAGEREF _Toc225093583 \h</w:instrText>
+              <w:instrText>PAGEREF _Toc225175955 \h</w:instrText>
             </w:r>
             <w:r>
               <w:rPr>
@@ -1482,7 +1482,7 @@
               <w14:ligatures w14:val="standardContextual"/>
             </w:rPr>
           </w:pPr>
-          <w:hyperlink w:anchor="_Toc225093584" w:history="1">
+          <w:hyperlink w:anchor="_Toc225175956" w:history="1">
             <w:r>
               <w:rPr>
                 <w:rStyle w:val="aff4"/>
@@ -1528,7 +1528,7 @@
                 <w:noProof/>
                 <w:webHidden/>
               </w:rPr>
-              <w:instrText>PAGEREF _Toc225093584 \h</w:instrText>
+              <w:instrText>PAGEREF _Toc225175956 \h</w:instrText>
             </w:r>
             <w:r>
               <w:rPr>
@@ -1583,7 +1583,7 @@
               <w14:ligatures w14:val="standardContextual"/>
             </w:rPr>
           </w:pPr>
-          <w:hyperlink w:anchor="_Toc225093585" w:history="1">
+          <w:hyperlink w:anchor="_Toc225175957" w:history="1">
             <w:r>
               <w:rPr>
                 <w:rStyle w:val="aff4"/>
@@ -1629,7 +1629,7 @@
                 <w:noProof/>
                 <w:webHidden/>
               </w:rPr>
-              <w:instrText>PAGEREF _Toc225093585 \h</w:instrText>
+              <w:instrText>PAGEREF _Toc225175957 \h</w:instrText>
             </w:r>
             <w:r>
               <w:rPr>
@@ -1684,7 +1684,7 @@
               <w14:ligatures w14:val="standardContextual"/>
             </w:rPr>
           </w:pPr>
-          <w:hyperlink w:anchor="_Toc225093586" w:history="1">
+          <w:hyperlink w:anchor="_Toc225175958" w:history="1">
             <w:r>
               <w:rPr>
                 <w:rStyle w:val="aff4"/>
@@ -1730,7 +1730,7 @@
                 <w:noProof/>
                 <w:webHidden/>
               </w:rPr>
-              <w:instrText>PAGEREF _Toc225093586 \h</w:instrText>
+              <w:instrText>PAGEREF _Toc225175958 \h</w:instrText>
             </w:r>
             <w:r>
               <w:rPr>
@@ -1791,7 +1791,7 @@
               <w14:ligatures w14:val="standardContextual"/>
             </w:rPr>
           </w:pPr>
-          <w:hyperlink w:anchor="_Toc225093587" w:history="1">
+          <w:hyperlink w:anchor="_Toc225175959" w:history="1">
             <w:r>
               <w:rPr>
                 <w:rStyle w:val="aff4"/>
@@ -1866,7 +1866,7 @@
                 <w:noProof/>
                 <w:webHidden/>
               </w:rPr>
-              <w:instrText>PAGEREF _Toc225093587 \h</w:instrText>
+              <w:instrText>PAGEREF _Toc225175959 \h</w:instrText>
             </w:r>
             <w:r>
               <w:rPr>
@@ -1921,7 +1921,7 @@
               <w14:ligatures w14:val="standardContextual"/>
             </w:rPr>
           </w:pPr>
-          <w:hyperlink w:anchor="_Toc225093588" w:history="1">
+          <w:hyperlink w:anchor="_Toc225175960" w:history="1">
             <w:r>
               <w:rPr>
                 <w:rStyle w:val="aff4"/>
@@ -1975,7 +1975,7 @@
                 <w:noProof/>
                 <w:webHidden/>
               </w:rPr>
-              <w:instrText>PAGEREF _Toc225093588 \h</w:instrText>
+              <w:instrText>PAGEREF _Toc225175960 \h</w:instrText>
             </w:r>
             <w:r>
               <w:rPr>
@@ -2030,7 +2030,7 @@
               <w14:ligatures w14:val="standardContextual"/>
             </w:rPr>
           </w:pPr>
-          <w:hyperlink w:anchor="_Toc225093589" w:history="1">
+          <w:hyperlink w:anchor="_Toc225175961" w:history="1">
             <w:r>
               <w:rPr>
                 <w:rStyle w:val="aff4"/>
@@ -2084,7 +2084,7 @@
                 <w:noProof/>
                 <w:webHidden/>
               </w:rPr>
-              <w:instrText>PAGEREF _Toc225093589 \h</w:instrText>
+              <w:instrText>PAGEREF _Toc225175961 \h</w:instrText>
             </w:r>
             <w:r>
               <w:rPr>
@@ -2139,7 +2139,7 @@
               <w14:ligatures w14:val="standardContextual"/>
             </w:rPr>
           </w:pPr>
-          <w:hyperlink w:anchor="_Toc225093590" w:history="1">
+          <w:hyperlink w:anchor="_Toc225175962" w:history="1">
             <w:r>
               <w:rPr>
                 <w:rStyle w:val="aff4"/>
@@ -2193,7 +2193,7 @@
                 <w:noProof/>
                 <w:webHidden/>
               </w:rPr>
-              <w:instrText>PAGEREF _Toc225093590 \h</w:instrText>
+              <w:instrText>PAGEREF _Toc225175962 \h</w:instrText>
             </w:r>
             <w:r>
               <w:rPr>
@@ -2248,7 +2248,7 @@
               <w14:ligatures w14:val="standardContextual"/>
             </w:rPr>
           </w:pPr>
-          <w:hyperlink w:anchor="_Toc225093591" w:history="1">
+          <w:hyperlink w:anchor="_Toc225175963" w:history="1">
             <w:r>
               <w:rPr>
                 <w:rStyle w:val="aff4"/>
@@ -2302,7 +2302,7 @@
                 <w:noProof/>
                 <w:webHidden/>
               </w:rPr>
-              <w:instrText>PAGEREF _Toc225093591 \h</w:instrText>
+              <w:instrText>PAGEREF _Toc225175963 \h</w:instrText>
             </w:r>
             <w:r>
               <w:rPr>
@@ -2357,7 +2357,7 @@
               <w14:ligatures w14:val="standardContextual"/>
             </w:rPr>
           </w:pPr>
-          <w:hyperlink w:anchor="_Toc225093592" w:history="1">
+          <w:hyperlink w:anchor="_Toc225175964" w:history="1">
             <w:r>
               <w:rPr>
                 <w:rStyle w:val="aff4"/>
@@ -2427,7 +2427,7 @@
                 <w:noProof/>
                 <w:webHidden/>
               </w:rPr>
-              <w:instrText>PAGEREF _Toc225093592 \h</w:instrText>
+              <w:instrText>PAGEREF _Toc225175964 \h</w:instrText>
             </w:r>
             <w:r>
               <w:rPr>
@@ -2482,7 +2482,7 @@
               <w14:ligatures w14:val="standardContextual"/>
             </w:rPr>
           </w:pPr>
-          <w:hyperlink w:anchor="_Toc225093593" w:history="1">
+          <w:hyperlink w:anchor="_Toc225175965" w:history="1">
             <w:r>
               <w:rPr>
                 <w:rStyle w:val="aff4"/>
@@ -2544,7 +2544,7 @@
                 <w:noProof/>
                 <w:webHidden/>
               </w:rPr>
-              <w:instrText>PAGEREF _Toc225093593 \h</w:instrText>
+              <w:instrText>PAGEREF _Toc225175965 \h</w:instrText>
             </w:r>
             <w:r>
               <w:rPr>
@@ -2599,7 +2599,7 @@
               <w14:ligatures w14:val="standardContextual"/>
             </w:rPr>
           </w:pPr>
-          <w:hyperlink w:anchor="_Toc225093594" w:history="1">
+          <w:hyperlink w:anchor="_Toc225175966" w:history="1">
             <w:r>
               <w:rPr>
                 <w:rStyle w:val="aff4"/>
@@ -2661,7 +2661,7 @@
                 <w:noProof/>
                 <w:webHidden/>
               </w:rPr>
-              <w:instrText>PAGEREF _Toc225093594 \h</w:instrText>
+              <w:instrText>PAGEREF _Toc225175966 \h</w:instrText>
             </w:r>
             <w:r>
               <w:rPr>
@@ -2716,7 +2716,7 @@
               <w14:ligatures w14:val="standardContextual"/>
             </w:rPr>
           </w:pPr>
-          <w:hyperlink w:anchor="_Toc225093595" w:history="1">
+          <w:hyperlink w:anchor="_Toc225175967" w:history="1">
             <w:r>
               <w:rPr>
                 <w:rStyle w:val="aff4"/>
@@ -2762,7 +2762,7 @@
                 <w:noProof/>
                 <w:webHidden/>
               </w:rPr>
-              <w:instrText>PAGEREF _Toc225093595 \h</w:instrText>
+              <w:instrText>PAGEREF _Toc225175967 \h</w:instrText>
             </w:r>
             <w:r>
               <w:rPr>
@@ -2817,7 +2817,7 @@
               <w14:ligatures w14:val="standardContextual"/>
             </w:rPr>
           </w:pPr>
-          <w:hyperlink w:anchor="_Toc225093596" w:history="1">
+          <w:hyperlink w:anchor="_Toc225175968" w:history="1">
             <w:r>
               <w:rPr>
                 <w:rStyle w:val="aff4"/>
@@ -2863,7 +2863,7 @@
                 <w:noProof/>
                 <w:webHidden/>
               </w:rPr>
-              <w:instrText>PAGEREF _Toc225093596 \h</w:instrText>
+              <w:instrText>PAGEREF _Toc225175968 \h</w:instrText>
             </w:r>
             <w:r>
               <w:rPr>
@@ -2918,7 +2918,7 @@
               <w14:ligatures w14:val="standardContextual"/>
             </w:rPr>
           </w:pPr>
-          <w:hyperlink w:anchor="_Toc225093597" w:history="1">
+          <w:hyperlink w:anchor="_Toc225175969" w:history="1">
             <w:r>
               <w:rPr>
                 <w:rStyle w:val="aff4"/>
@@ -2964,7 +2964,7 @@
                 <w:noProof/>
                 <w:webHidden/>
               </w:rPr>
-              <w:instrText>PAGEREF _Toc225093597 \h</w:instrText>
+              <w:instrText>PAGEREF _Toc225175969 \h</w:instrText>
             </w:r>
             <w:r>
               <w:rPr>
@@ -3019,7 +3019,7 @@
               <w14:ligatures w14:val="standardContextual"/>
             </w:rPr>
           </w:pPr>
-          <w:hyperlink w:anchor="_Toc225093598" w:history="1">
+          <w:hyperlink w:anchor="_Toc225175970" w:history="1">
             <w:r>
               <w:rPr>
                 <w:rStyle w:val="aff4"/>
@@ -3073,7 +3073,7 @@
                 <w:noProof/>
                 <w:webHidden/>
               </w:rPr>
-              <w:instrText>PAGEREF _Toc225093598 \h</w:instrText>
+              <w:instrText>PAGEREF _Toc225175970 \h</w:instrText>
             </w:r>
             <w:r>
               <w:rPr>
@@ -3104,6 +3104,469 @@
                 <w:webHidden/>
               </w:rPr>
               <w:t>15</w:t>
+            </w:r>
+            <w:r>
+              <w:rPr>
+                <w:rFonts w:hint="eastAsia"/>
+                <w:noProof/>
+                <w:webHidden/>
+              </w:rPr>
+              <w:fldChar w:fldCharType="end"/>
+            </w:r>
+          </w:hyperlink>
+        </w:p>
+        <w:p>
+          <w:pPr>
+            <w:pStyle w:val="TOC1"/>
+            <w:tabs>
+              <w:tab w:val="left" w:pos="840"/>
+            </w:tabs>
+            <w:spacing w:before="48"/>
+            <w:ind w:left="-120"/>
+            <w:rPr>
+              <w:rFonts w:asciiTheme="minorHAnsi" w:eastAsiaTheme="minorEastAsia" w:hAnsiTheme="minorHAnsi" w:cstheme="minorBidi" w:hint="eastAsia"/>
+              <w:b w:val="0"/>
+              <w:bCs w:val="0"/>
+              <w:iCs w:val="0"/>
+              <w:noProof/>
+              <w:color w:val="auto"/>
+              <w:sz w:val="22"/>
+              <w14:ligatures w14:val="standardContextual"/>
+            </w:rPr>
+          </w:pPr>
+          <w:hyperlink w:anchor="_Toc225175971" w:history="1">
+            <w:r>
+              <w:rPr>
+                <w:rStyle w:val="aff4"/>
+                <w:rFonts w:hint="eastAsia"/>
+                <w:noProof/>
+              </w:rPr>
+              <w:t>第</w:t>
+            </w:r>
+            <w:r>
+              <w:rPr>
+                <w:rStyle w:val="aff4"/>
+                <w:rFonts w:hint="eastAsia"/>
+                <w:noProof/>
+              </w:rPr>
+              <w:t>4</w:t>
+            </w:r>
+            <w:r>
+              <w:rPr>
+                <w:rStyle w:val="aff4"/>
+                <w:rFonts w:hint="eastAsia"/>
+                <w:noProof/>
+              </w:rPr>
+              <w:t>章</w:t>
+            </w:r>
+            <w:r>
+              <w:rPr>
+                <w:rFonts w:asciiTheme="minorHAnsi" w:eastAsiaTheme="minorEastAsia" w:hAnsiTheme="minorHAnsi" w:cstheme="minorBidi" w:hint="eastAsia"/>
+                <w:b w:val="0"/>
+                <w:bCs w:val="0"/>
+                <w:iCs w:val="0"/>
+                <w:noProof/>
+                <w:color w:val="auto"/>
+                <w:sz w:val="22"/>
+                <w14:ligatures w14:val="standardContextual"/>
+              </w:rPr>
+              <w:tab/>
+            </w:r>
+            <w:r>
+              <w:rPr>
+                <w:rStyle w:val="aff4"/>
+                <w:rFonts w:hint="eastAsia"/>
+                <w:noProof/>
+              </w:rPr>
+              <w:t>添加插件</w:t>
+            </w:r>
+            <w:r>
+              <w:rPr>
+                <w:rFonts w:hint="eastAsia"/>
+                <w:noProof/>
+                <w:webHidden/>
+              </w:rPr>
+              <w:tab/>
+            </w:r>
+            <w:r>
+              <w:rPr>
+                <w:rFonts w:hint="eastAsia"/>
+                <w:noProof/>
+                <w:webHidden/>
+              </w:rPr>
+              <w:fldChar w:fldCharType="begin"/>
+            </w:r>
+            <w:r>
+              <w:rPr>
+                <w:rFonts w:hint="eastAsia"/>
+                <w:noProof/>
+                <w:webHidden/>
+              </w:rPr>
+              <w:instrText xml:space="preserve"> </w:instrText>
+            </w:r>
+            <w:r>
+              <w:rPr>
+                <w:noProof/>
+                <w:webHidden/>
+              </w:rPr>
+              <w:instrText>PAGEREF _Toc225175971 \h</w:instrText>
+            </w:r>
+            <w:r>
+              <w:rPr>
+                <w:rFonts w:hint="eastAsia"/>
+                <w:noProof/>
+                <w:webHidden/>
+              </w:rPr>
+              <w:instrText xml:space="preserve"> </w:instrText>
+            </w:r>
+            <w:r>
+              <w:rPr>
+                <w:rFonts w:hint="eastAsia"/>
+                <w:noProof/>
+                <w:webHidden/>
+              </w:rPr>
+            </w:r>
+            <w:r>
+              <w:rPr>
+                <w:rFonts w:hint="eastAsia"/>
+                <w:noProof/>
+                <w:webHidden/>
+              </w:rPr>
+              <w:fldChar w:fldCharType="separate"/>
+            </w:r>
+            <w:r>
+              <w:rPr>
+                <w:noProof/>
+                <w:webHidden/>
+              </w:rPr>
+              <w:t>16</w:t>
+            </w:r>
+            <w:r>
+              <w:rPr>
+                <w:rFonts w:hint="eastAsia"/>
+                <w:noProof/>
+                <w:webHidden/>
+              </w:rPr>
+              <w:fldChar w:fldCharType="end"/>
+            </w:r>
+          </w:hyperlink>
+        </w:p>
+        <w:p>
+          <w:pPr>
+            <w:pStyle w:val="TOC2"/>
+            <w:rPr>
+              <w:rFonts w:asciiTheme="minorHAnsi" w:eastAsiaTheme="minorEastAsia" w:hAnsiTheme="minorHAnsi" w:cstheme="minorBidi" w:hint="eastAsia"/>
+              <w:bCs w:val="0"/>
+              <w:noProof/>
+              <w:color w:val="auto"/>
+              <w:sz w:val="22"/>
+              <w:szCs w:val="24"/>
+              <w14:ligatures w14:val="standardContextual"/>
+            </w:rPr>
+          </w:pPr>
+          <w:hyperlink w:anchor="_Toc225175972" w:history="1">
+            <w:r>
+              <w:rPr>
+                <w:rStyle w:val="aff4"/>
+                <w:rFonts w:hAnsi="黑体" w:hint="eastAsia"/>
+                <w:noProof/>
+              </w:rPr>
+              <w:t>4.1</w:t>
+            </w:r>
+            <w:r>
+              <w:rPr>
+                <w:rStyle w:val="aff4"/>
+                <w:rFonts w:hint="eastAsia"/>
+                <w:noProof/>
+              </w:rPr>
+              <w:t xml:space="preserve"> </w:t>
+            </w:r>
+            <w:r>
+              <w:rPr>
+                <w:rStyle w:val="aff4"/>
+                <w:rFonts w:hint="eastAsia"/>
+                <w:noProof/>
+              </w:rPr>
+              <w:t>使用插件</w:t>
+            </w:r>
+            <w:r>
+              <w:rPr>
+                <w:rFonts w:hint="eastAsia"/>
+                <w:noProof/>
+                <w:webHidden/>
+              </w:rPr>
+              <w:tab/>
+            </w:r>
+            <w:r>
+              <w:rPr>
+                <w:rFonts w:hint="eastAsia"/>
+                <w:noProof/>
+                <w:webHidden/>
+              </w:rPr>
+              <w:fldChar w:fldCharType="begin"/>
+            </w:r>
+            <w:r>
+              <w:rPr>
+                <w:rFonts w:hint="eastAsia"/>
+                <w:noProof/>
+                <w:webHidden/>
+              </w:rPr>
+              <w:instrText xml:space="preserve"> </w:instrText>
+            </w:r>
+            <w:r>
+              <w:rPr>
+                <w:noProof/>
+                <w:webHidden/>
+              </w:rPr>
+              <w:instrText>PAGEREF _Toc225175972 \h</w:instrText>
+            </w:r>
+            <w:r>
+              <w:rPr>
+                <w:rFonts w:hint="eastAsia"/>
+                <w:noProof/>
+                <w:webHidden/>
+              </w:rPr>
+              <w:instrText xml:space="preserve"> </w:instrText>
+            </w:r>
+            <w:r>
+              <w:rPr>
+                <w:rFonts w:hint="eastAsia"/>
+                <w:noProof/>
+                <w:webHidden/>
+              </w:rPr>
+            </w:r>
+            <w:r>
+              <w:rPr>
+                <w:rFonts w:hint="eastAsia"/>
+                <w:noProof/>
+                <w:webHidden/>
+              </w:rPr>
+              <w:fldChar w:fldCharType="separate"/>
+            </w:r>
+            <w:r>
+              <w:rPr>
+                <w:noProof/>
+                <w:webHidden/>
+              </w:rPr>
+              <w:t>16</w:t>
+            </w:r>
+            <w:r>
+              <w:rPr>
+                <w:rFonts w:hint="eastAsia"/>
+                <w:noProof/>
+                <w:webHidden/>
+              </w:rPr>
+              <w:fldChar w:fldCharType="end"/>
+            </w:r>
+          </w:hyperlink>
+        </w:p>
+        <w:p>
+          <w:pPr>
+            <w:pStyle w:val="TOC2"/>
+            <w:rPr>
+              <w:rFonts w:asciiTheme="minorHAnsi" w:eastAsiaTheme="minorEastAsia" w:hAnsiTheme="minorHAnsi" w:cstheme="minorBidi" w:hint="eastAsia"/>
+              <w:bCs w:val="0"/>
+              <w:noProof/>
+              <w:color w:val="auto"/>
+              <w:sz w:val="22"/>
+              <w:szCs w:val="24"/>
+              <w14:ligatures w14:val="standardContextual"/>
+            </w:rPr>
+          </w:pPr>
+          <w:hyperlink w:anchor="_Toc225175973" w:history="1">
+            <w:r>
+              <w:rPr>
+                <w:rStyle w:val="aff4"/>
+                <w:rFonts w:hAnsi="黑体" w:hint="eastAsia"/>
+                <w:noProof/>
+              </w:rPr>
+              <w:t>4.2</w:t>
+            </w:r>
+            <w:r>
+              <w:rPr>
+                <w:rStyle w:val="aff4"/>
+                <w:rFonts w:hint="eastAsia"/>
+                <w:noProof/>
+              </w:rPr>
+              <w:t xml:space="preserve"> </w:t>
+            </w:r>
+            <w:r>
+              <w:rPr>
+                <w:rStyle w:val="aff4"/>
+                <w:rFonts w:hint="eastAsia"/>
+                <w:noProof/>
+              </w:rPr>
+              <w:t>编译和添加插件</w:t>
+            </w:r>
+            <w:r>
+              <w:rPr>
+                <w:rFonts w:hint="eastAsia"/>
+                <w:noProof/>
+                <w:webHidden/>
+              </w:rPr>
+              <w:tab/>
+            </w:r>
+            <w:r>
+              <w:rPr>
+                <w:rFonts w:hint="eastAsia"/>
+                <w:noProof/>
+                <w:webHidden/>
+              </w:rPr>
+              <w:fldChar w:fldCharType="begin"/>
+            </w:r>
+            <w:r>
+              <w:rPr>
+                <w:rFonts w:hint="eastAsia"/>
+                <w:noProof/>
+                <w:webHidden/>
+              </w:rPr>
+              <w:instrText xml:space="preserve"> </w:instrText>
+            </w:r>
+            <w:r>
+              <w:rPr>
+                <w:noProof/>
+                <w:webHidden/>
+              </w:rPr>
+              <w:instrText>PAGEREF _Toc225175973 \h</w:instrText>
+            </w:r>
+            <w:r>
+              <w:rPr>
+                <w:rFonts w:hint="eastAsia"/>
+                <w:noProof/>
+                <w:webHidden/>
+              </w:rPr>
+              <w:instrText xml:space="preserve"> </w:instrText>
+            </w:r>
+            <w:r>
+              <w:rPr>
+                <w:rFonts w:hint="eastAsia"/>
+                <w:noProof/>
+                <w:webHidden/>
+              </w:rPr>
+            </w:r>
+            <w:r>
+              <w:rPr>
+                <w:rFonts w:hint="eastAsia"/>
+                <w:noProof/>
+                <w:webHidden/>
+              </w:rPr>
+              <w:fldChar w:fldCharType="separate"/>
+            </w:r>
+            <w:r>
+              <w:rPr>
+                <w:noProof/>
+                <w:webHidden/>
+              </w:rPr>
+              <w:t>16</w:t>
+            </w:r>
+            <w:r>
+              <w:rPr>
+                <w:rFonts w:hint="eastAsia"/>
+                <w:noProof/>
+                <w:webHidden/>
+              </w:rPr>
+              <w:fldChar w:fldCharType="end"/>
+            </w:r>
+          </w:hyperlink>
+        </w:p>
+        <w:p>
+          <w:pPr>
+            <w:pStyle w:val="TOC2"/>
+            <w:rPr>
+              <w:rFonts w:asciiTheme="minorHAnsi" w:eastAsiaTheme="minorEastAsia" w:hAnsiTheme="minorHAnsi" w:cstheme="minorBidi" w:hint="eastAsia"/>
+              <w:bCs w:val="0"/>
+              <w:noProof/>
+              <w:color w:val="auto"/>
+              <w:sz w:val="22"/>
+              <w:szCs w:val="24"/>
+              <w14:ligatures w14:val="standardContextual"/>
+            </w:rPr>
+          </w:pPr>
+          <w:hyperlink w:anchor="_Toc225175974" w:history="1">
+            <w:r>
+              <w:rPr>
+                <w:rStyle w:val="aff4"/>
+                <w:rFonts w:hAnsi="黑体" w:hint="eastAsia"/>
+                <w:noProof/>
+              </w:rPr>
+              <w:t>4.3</w:t>
+            </w:r>
+            <w:r>
+              <w:rPr>
+                <w:rStyle w:val="aff4"/>
+                <w:rFonts w:hint="eastAsia"/>
+                <w:noProof/>
+              </w:rPr>
+              <w:t xml:space="preserve"> </w:t>
+            </w:r>
+            <w:r>
+              <w:rPr>
+                <w:rStyle w:val="aff4"/>
+                <w:rFonts w:hint="eastAsia"/>
+                <w:noProof/>
+              </w:rPr>
+              <w:t>创建插件</w:t>
+            </w:r>
+            <w:r>
+              <w:rPr>
+                <w:rFonts w:hint="eastAsia"/>
+                <w:noProof/>
+                <w:webHidden/>
+              </w:rPr>
+              <w:tab/>
+            </w:r>
+            <w:r>
+              <w:rPr>
+                <w:rFonts w:hint="eastAsia"/>
+                <w:noProof/>
+                <w:webHidden/>
+              </w:rPr>
+              <w:fldChar w:fldCharType="begin"/>
+            </w:r>
+            <w:r>
+              <w:rPr>
+                <w:rFonts w:hint="eastAsia"/>
+                <w:noProof/>
+                <w:webHidden/>
+              </w:rPr>
+              <w:instrText xml:space="preserve"> </w:instrText>
+            </w:r>
+            <w:r>
+              <w:rPr>
+                <w:noProof/>
+                <w:webHidden/>
+              </w:rPr>
+              <w:instrText>PAGEREF _Toc225175974 \h</w:instrText>
+            </w:r>
+            <w:r>
+              <w:rPr>
+                <w:rFonts w:hint="eastAsia"/>
+                <w:noProof/>
+                <w:webHidden/>
+              </w:rPr>
+              <w:instrText xml:space="preserve"> </w:instrText>
+            </w:r>
+            <w:r>
+              <w:rPr>
+                <w:rFonts w:hint="eastAsia"/>
+                <w:noProof/>
+                <w:webHidden/>
+              </w:rPr>
+            </w:r>
+            <w:r>
+              <w:rPr>
+                <w:rFonts w:hint="eastAsia"/>
+                <w:noProof/>
+                <w:webHidden/>
+              </w:rPr>
+              <w:fldChar w:fldCharType="separate"/>
+            </w:r>
+            <w:r>
+              <w:rPr>
+                <w:noProof/>
+                <w:webHidden/>
+              </w:rPr>
+              <w:t>17</w:t>
             </w:r>
             <w:r>
               <w:rPr>
@@ -3149,7 +3612,7 @@
         <w:spacing w:before="288" w:after="240"/>
         <w:ind w:left="660" w:right="240"/>
       </w:pPr>
-      <w:bookmarkStart w:id="4" w:name="_Toc225093578"/>
+      <w:bookmarkStart w:id="4" w:name="_Toc225175950"/>
       <w:r>
         <w:rPr>
           <w:rFonts w:hint="eastAsia"/>
@@ -3641,7 +4104,7 @@
           <w:rFonts w:hint="eastAsia"/>
         </w:rPr>
       </w:pPr>
-      <w:bookmarkStart w:id="6" w:name="_Toc225093579"/>
+      <w:bookmarkStart w:id="6" w:name="_Toc225175951"/>
       <w:r>
         <w:rPr>
           <w:rFonts w:hint="eastAsia"/>
@@ -3850,7 +4313,7 @@
           <w:rFonts w:hint="eastAsia"/>
         </w:rPr>
       </w:pPr>
-      <w:bookmarkStart w:id="7" w:name="_Toc225093580"/>
+      <w:bookmarkStart w:id="7" w:name="_Toc225175952"/>
       <w:r>
         <w:rPr>
           <w:rFonts w:hint="eastAsia"/>
@@ -4113,7 +4576,7 @@
         <w:ind w:right="240"/>
       </w:pPr>
       <w:bookmarkStart w:id="8" w:name="_Ref218414874"/>
-      <w:bookmarkStart w:id="9" w:name="_Toc225093581"/>
+      <w:bookmarkStart w:id="9" w:name="_Toc225175953"/>
       <w:r>
         <w:rPr>
           <w:rFonts w:hint="eastAsia"/>
@@ -4334,7 +4797,7 @@
       </w:pPr>
       <w:bookmarkStart w:id="11" w:name="_Ref218414159"/>
       <w:bookmarkStart w:id="12" w:name="_Ref218414476"/>
-      <w:bookmarkStart w:id="13" w:name="_Toc225093582"/>
+      <w:bookmarkStart w:id="13" w:name="_Toc225175954"/>
       <w:r>
         <w:rPr>
           <w:rFonts w:hint="eastAsia"/>
@@ -4743,7 +5206,7 @@
         </w:rPr>
       </w:pPr>
       <w:bookmarkStart w:id="15" w:name="_Ref218411409"/>
-      <w:bookmarkStart w:id="16" w:name="_Toc225093583"/>
+      <w:bookmarkStart w:id="16" w:name="_Toc225175955"/>
       <w:r>
         <w:rPr>
           <w:rFonts w:hint="eastAsia"/>
@@ -4785,7 +5248,7 @@
           <w:rFonts w:hint="eastAsia"/>
         </w:rPr>
       </w:pPr>
-      <w:bookmarkStart w:id="17" w:name="_Toc225093584"/>
+      <w:bookmarkStart w:id="17" w:name="_Toc225175956"/>
       <w:r>
         <w:rPr>
           <w:rFonts w:hint="eastAsia"/>
@@ -5155,7 +5618,7 @@
           <w:rFonts w:hint="eastAsia"/>
         </w:rPr>
       </w:pPr>
-      <w:bookmarkStart w:id="19" w:name="_Toc225093585"/>
+      <w:bookmarkStart w:id="19" w:name="_Toc225175957"/>
       <w:r>
         <w:rPr>
           <w:rFonts w:hint="eastAsia"/>
@@ -5619,7 +6082,7 @@
           <w:rFonts w:hint="eastAsia"/>
         </w:rPr>
       </w:pPr>
-      <w:bookmarkStart w:id="22" w:name="_Toc225093586"/>
+      <w:bookmarkStart w:id="22" w:name="_Toc225175958"/>
       <w:r>
         <w:rPr>
           <w:rFonts w:hint="eastAsia"/>
@@ -5960,7 +6423,7 @@
         </w:rPr>
         <w:lastRenderedPageBreak/>
         <w:drawing>
-          <wp:inline distT="0" distB="0" distL="0" distR="0" wp14:anchorId="0ED27ED1" wp14:editId="03D22B94">
+          <wp:inline distT="0" distB="0" distL="0" distR="0" wp14:anchorId="0ED27ED1" wp14:editId="2F0F6B7E">
             <wp:extent cx="2070100" cy="1651479"/>
             <wp:effectExtent l="0" t="0" r="6350" b="6350"/>
             <wp:docPr id="123422222" name="图片 2"/>
@@ -6468,7 +6931,7 @@
           <w:noProof/>
         </w:rPr>
         <w:drawing>
-          <wp:inline distT="0" distB="0" distL="0" distR="0" wp14:anchorId="0840E60A" wp14:editId="7D24B21E">
+          <wp:inline distT="0" distB="0" distL="0" distR="0" wp14:anchorId="0840E60A" wp14:editId="40A5ADF5">
             <wp:extent cx="4668702" cy="1128542"/>
             <wp:effectExtent l="0" t="0" r="0" b="0"/>
             <wp:docPr id="5299923" name="图片 10"/>
@@ -6720,7 +7183,7 @@
           <w:noProof/>
         </w:rPr>
         <w:drawing>
-          <wp:inline distT="0" distB="0" distL="0" distR="0" wp14:anchorId="24EA3BD7" wp14:editId="6713C976">
+          <wp:inline distT="0" distB="0" distL="0" distR="0" wp14:anchorId="24EA3BD7" wp14:editId="6E0B4011">
             <wp:extent cx="3773515" cy="3559266"/>
             <wp:effectExtent l="0" t="0" r="0" b="3175"/>
             <wp:docPr id="1931158430" name="图片 1"/>
@@ -7378,7 +7841,7 @@
         <w:ind w:right="240"/>
       </w:pPr>
       <w:bookmarkStart w:id="32" w:name="_Ref218414883"/>
-      <w:bookmarkStart w:id="33" w:name="_Toc225093587"/>
+      <w:bookmarkStart w:id="33" w:name="_Toc225175959"/>
       <w:bookmarkEnd w:id="3"/>
       <w:bookmarkEnd w:id="2"/>
       <w:bookmarkEnd w:id="1"/>
@@ -7397,9 +7860,6 @@
       <w:pPr>
         <w:pStyle w:val="23"/>
         <w:ind w:firstLine="480"/>
-        <w:rPr>
-          <w:rFonts w:hint="eastAsia"/>
-        </w:rPr>
       </w:pPr>
       <w:r>
         <w:rPr>
@@ -7506,67 +7966,151 @@
         <w:rPr>
           <w:rFonts w:hint="eastAsia"/>
         </w:rPr>
-        <w:t>源码，</w:t>
-      </w:r>
-      <w:r>
-        <w:rPr>
-          <w:rFonts w:hint="eastAsia"/>
-        </w:rPr>
-        <w:t>在最新</w:t>
-      </w:r>
-      <w:r>
-        <w:rPr>
-          <w:rFonts w:hint="eastAsia"/>
-        </w:rPr>
-        <w:t>的</w:t>
-      </w:r>
-      <w:r>
-        <w:rPr>
-          <w:rFonts w:hint="eastAsia"/>
-        </w:rPr>
-        <w:t>Release</w:t>
-      </w:r>
-      <w:r>
-        <w:rPr>
-          <w:rFonts w:hint="eastAsia"/>
-        </w:rPr>
-        <w:t>版本中</w:t>
-      </w:r>
-      <w:r>
-        <w:rPr>
-          <w:rFonts w:hint="eastAsia"/>
-        </w:rPr>
-        <w:t>[</w:t>
-      </w:r>
-      <w:r>
-        <w:rPr>
-          <w:rStyle w:val="aff4"/>
-          <w:kern w:val="0"/>
-        </w:rPr>
-        <w:t>https://github.com/YuanIdea/yuan/releases</w:t>
-      </w:r>
-      <w:r>
-        <w:rPr>
-          <w:rStyle w:val="aff4"/>
-          <w:rFonts w:hint="eastAsia"/>
-          <w:kern w:val="0"/>
-        </w:rPr>
-        <w:t>]</w:t>
-      </w:r>
-      <w:r>
-        <w:rPr>
-          <w:rFonts w:hint="eastAsia"/>
-        </w:rPr>
-        <w:t>找到</w:t>
+        <w:t>源码，双击</w:t>
+      </w:r>
+      <w:r>
+        <w:rPr>
+          <w:rFonts w:hint="eastAsia"/>
+        </w:rPr>
+        <w:t>后</w:t>
+      </w:r>
+      <w:r>
+        <w:rPr>
+          <w:rFonts w:hint="eastAsia"/>
+        </w:rPr>
+        <w:t>出现</w:t>
+      </w:r>
+      <w:r>
+        <w:fldChar w:fldCharType="begin"/>
+      </w:r>
+      <w:r>
+        <w:instrText xml:space="preserve"> </w:instrText>
+      </w:r>
+      <w:r>
+        <w:rPr>
+          <w:rFonts w:hint="eastAsia"/>
+        </w:rPr>
+        <w:instrText>REF _Ref218415989 \h</w:instrText>
+      </w:r>
+      <w:r>
+        <w:instrText xml:space="preserve"> </w:instrText>
+      </w:r>
+      <w:r>
+        <w:fldChar w:fldCharType="separate"/>
+      </w:r>
+      <w:r>
+        <w:rPr>
+          <w:rFonts w:hint="eastAsia"/>
+        </w:rPr>
+        <w:t>图</w:t>
+      </w:r>
+      <w:r>
+        <w:rPr>
+          <w:rFonts w:hint="eastAsia"/>
+        </w:rPr>
+        <w:t xml:space="preserve"> </w:t>
+      </w:r>
+      <w:r>
+        <w:rPr>
+          <w:noProof/>
+        </w:rPr>
+        <w:t>3</w:t>
+      </w:r>
+      <w:r>
+        <w:noBreakHyphen/>
+      </w:r>
+      <w:r>
+        <w:rPr>
+          <w:noProof/>
+        </w:rPr>
+        <w:t>1</w:t>
+      </w:r>
+      <w:r>
+        <w:fldChar w:fldCharType="end"/>
+      </w:r>
+      <w:r>
+        <w:rPr>
+          <w:rFonts w:hint="eastAsia"/>
+        </w:rPr>
+        <w:t>平台</w:t>
+      </w:r>
+      <w:r>
+        <w:rPr>
+          <w:rFonts w:hint="eastAsia"/>
+        </w:rPr>
+        <w:t>界面</w:t>
+      </w:r>
+      <w:r>
+        <w:rPr>
+          <w:rFonts w:hint="eastAsia"/>
+        </w:rPr>
+        <w:t>，不同的版本会略有差异</w:t>
+      </w:r>
+      <w:r>
+        <w:rPr>
+          <w:rFonts w:hint="eastAsia"/>
+        </w:rPr>
+        <w:t>。</w:t>
+      </w:r>
+      <w:r>
+        <w:rPr>
+          <w:rFonts w:hint="eastAsia"/>
+        </w:rPr>
+        <w:t>注意，不要</w:t>
+      </w:r>
+      <w:r>
+        <w:rPr>
+          <w:rFonts w:hint="eastAsia"/>
+        </w:rPr>
+        <w:t>直接</w:t>
+      </w:r>
+      <w:r>
+        <w:rPr>
+          <w:rFonts w:hint="eastAsia"/>
+        </w:rPr>
+        <w:t>使用</w:t>
+      </w:r>
+      <w:r>
+        <w:t>yuan\yuan-platform\target\artifacts\yuan</w:t>
+      </w:r>
+      <w:r>
+        <w:rPr>
+          <w:rFonts w:hint="eastAsia"/>
+        </w:rPr>
+        <w:t>\</w:t>
+      </w:r>
+      <w:r>
+        <w:t xml:space="preserve"> </w:t>
       </w:r>
       <w:r>
         <w:t>yuan</w:t>
       </w:r>
       <w:r>
-        <w:rPr>
-          <w:rFonts w:hint="eastAsia"/>
-        </w:rPr>
-        <w:t>\</w:t>
+        <w:t>.exe</w:t>
+      </w:r>
+      <w:r>
+        <w:rPr>
+          <w:rFonts w:hint="eastAsia"/>
+        </w:rPr>
+        <w:t>，因为使用这个目录下的可执行文件，打包</w:t>
+      </w:r>
+      <w:r>
+        <w:t>yuan-platform</w:t>
+      </w:r>
+      <w:r>
+        <w:rPr>
+          <w:rFonts w:hint="eastAsia"/>
+        </w:rPr>
+        <w:t>时，可能</w:t>
+      </w:r>
+      <w:r>
+        <w:t>yuan-platform.jar</w:t>
+      </w:r>
+      <w:r>
+        <w:rPr>
+          <w:rFonts w:hint="eastAsia"/>
+        </w:rPr>
+        <w:t>正在被</w:t>
       </w:r>
       <w:r>
         <w:t xml:space="preserve"> </w:t>
@@ -7581,103 +8125,13 @@
         <w:rPr>
           <w:rFonts w:hint="eastAsia"/>
         </w:rPr>
-        <w:t>，</w:t>
-      </w:r>
-      <w:r>
-        <w:rPr>
-          <w:rFonts w:hint="eastAsia"/>
-        </w:rPr>
-        <w:t>双击</w:t>
-      </w:r>
-      <w:r>
-        <w:rPr>
-          <w:rFonts w:hint="eastAsia"/>
-        </w:rPr>
-        <w:t>后</w:t>
-      </w:r>
-      <w:r>
-        <w:rPr>
-          <w:rFonts w:hint="eastAsia"/>
-        </w:rPr>
-        <w:t>出现</w:t>
-      </w:r>
-      <w:r>
-        <w:fldChar w:fldCharType="begin"/>
-      </w:r>
-      <w:r>
-        <w:instrText xml:space="preserve"> </w:instrText>
-      </w:r>
-      <w:r>
-        <w:rPr>
-          <w:rFonts w:hint="eastAsia"/>
-        </w:rPr>
-        <w:instrText>REF _Ref218415989 \h</w:instrText>
-      </w:r>
-      <w:r>
-        <w:instrText xml:space="preserve"> </w:instrText>
-      </w:r>
-      <w:r>
-        <w:fldChar w:fldCharType="separate"/>
-      </w:r>
-      <w:r>
-        <w:rPr>
-          <w:rFonts w:hint="eastAsia"/>
-        </w:rPr>
-        <w:t>图</w:t>
-      </w:r>
-      <w:r>
-        <w:rPr>
-          <w:rFonts w:hint="eastAsia"/>
-        </w:rPr>
-        <w:t xml:space="preserve"> </w:t>
-      </w:r>
-      <w:r>
-        <w:rPr>
-          <w:noProof/>
-        </w:rPr>
-        <w:t>3</w:t>
-      </w:r>
-      <w:r>
-        <w:noBreakHyphen/>
-      </w:r>
-      <w:r>
-        <w:rPr>
-          <w:noProof/>
-        </w:rPr>
-        <w:t>1</w:t>
-      </w:r>
-      <w:r>
-        <w:fldChar w:fldCharType="end"/>
-      </w:r>
-      <w:r>
-        <w:rPr>
-          <w:rFonts w:hint="eastAsia"/>
-        </w:rPr>
-        <w:t>平台</w:t>
-      </w:r>
-      <w:r>
-        <w:rPr>
-          <w:rFonts w:hint="eastAsia"/>
-        </w:rPr>
-        <w:t>界面</w:t>
-      </w:r>
-      <w:r>
-        <w:rPr>
-          <w:rFonts w:hint="eastAsia"/>
-        </w:rPr>
-        <w:t>，不同的版本会略有差异</w:t>
-      </w:r>
-      <w:r>
-        <w:rPr>
-          <w:rFonts w:hint="eastAsia"/>
-        </w:rPr>
-        <w:t>。</w:t>
-      </w:r>
-      <w:r>
-        <w:rPr>
-          <w:rFonts w:hint="eastAsia"/>
-        </w:rPr>
-        <w:t>注意，不要使用</w:t>
+        <w:t>占用出现错误</w:t>
+      </w:r>
+      <w:r>
+        <w:rPr>
+          <w:rFonts w:hint="eastAsia"/>
+        </w:rPr>
+        <w:t>，需要将</w:t>
       </w:r>
       <w:r>
         <w:t>yuan\yuan-platform\target\artifacts\yuan</w:t>
@@ -7686,55 +8140,7 @@
         <w:rPr>
           <w:rFonts w:hint="eastAsia"/>
         </w:rPr>
-        <w:t>\</w:t>
-      </w:r>
-      <w:r>
-        <w:t xml:space="preserve"> </w:t>
-      </w:r>
-      <w:r>
-        <w:t>yuan</w:t>
-      </w:r>
-      <w:r>
-        <w:t>.exe</w:t>
-      </w:r>
-      <w:r>
-        <w:rPr>
-          <w:rFonts w:hint="eastAsia"/>
-        </w:rPr>
-        <w:t>，因为使用这个目录下的可执行文件，打包</w:t>
-      </w:r>
-      <w:r>
-        <w:t>yuan-platform</w:t>
-      </w:r>
-      <w:r>
-        <w:rPr>
-          <w:rFonts w:hint="eastAsia"/>
-        </w:rPr>
-        <w:t>时，可能</w:t>
-      </w:r>
-      <w:r>
-        <w:t>yuan-platform.jar</w:t>
-      </w:r>
-      <w:r>
-        <w:rPr>
-          <w:rFonts w:hint="eastAsia"/>
-        </w:rPr>
-        <w:t>正在被</w:t>
-      </w:r>
-      <w:r>
-        <w:t xml:space="preserve"> </w:t>
-      </w:r>
-      <w:r>
-        <w:t>yuan</w:t>
-      </w:r>
-      <w:r>
-        <w:t>.exe</w:t>
-      </w:r>
-      <w:r>
-        <w:rPr>
-          <w:rFonts w:hint="eastAsia"/>
-        </w:rPr>
-        <w:t>占用出现错误。</w:t>
+        <w:t>拷贝到其它目录后再打开。</w:t>
       </w:r>
     </w:p>
     <w:p>
@@ -7903,7 +8309,7 @@
           <w:rFonts w:hint="eastAsia"/>
         </w:rPr>
       </w:pPr>
-      <w:bookmarkStart w:id="35" w:name="_Toc225093588"/>
+      <w:bookmarkStart w:id="35" w:name="_Toc225175960"/>
       <w:r>
         <w:rPr>
           <w:rFonts w:hint="eastAsia"/>
@@ -7986,7 +8392,7 @@
           <w:rFonts w:hint="eastAsia"/>
         </w:rPr>
       </w:pPr>
-      <w:bookmarkStart w:id="36" w:name="_Toc225093589"/>
+      <w:bookmarkStart w:id="36" w:name="_Toc225175961"/>
       <w:r>
         <w:rPr>
           <w:rFonts w:hint="eastAsia"/>
@@ -8590,7 +8996,7 @@
           <w:rFonts w:hint="eastAsia"/>
         </w:rPr>
       </w:pPr>
-      <w:bookmarkStart w:id="39" w:name="_Toc225093590"/>
+      <w:bookmarkStart w:id="39" w:name="_Toc225175962"/>
       <w:r>
         <w:rPr>
           <w:rFonts w:hint="eastAsia"/>
@@ -8904,7 +9310,7 @@
         </w:rPr>
       </w:pPr>
       <w:bookmarkStart w:id="42" w:name="_Ref225089916"/>
-      <w:bookmarkStart w:id="43" w:name="_Toc225093591"/>
+      <w:bookmarkStart w:id="43" w:name="_Toc225175963"/>
       <w:r>
         <w:rPr>
           <w:rFonts w:hint="eastAsia"/>
@@ -9156,7 +9562,7 @@
           <w:rFonts w:hint="eastAsia"/>
         </w:rPr>
       </w:pPr>
-      <w:bookmarkStart w:id="44" w:name="_Toc225093592"/>
+      <w:bookmarkStart w:id="44" w:name="_Toc225175964"/>
       <w:r>
         <w:rPr>
           <w:rFonts w:hint="eastAsia"/>
@@ -10142,7 +10548,7 @@
           <w:rFonts w:hint="eastAsia"/>
         </w:rPr>
       </w:pPr>
-      <w:bookmarkStart w:id="47" w:name="_Toc225093593"/>
+      <w:bookmarkStart w:id="47" w:name="_Toc225175965"/>
       <w:r>
         <w:rPr>
           <w:rFonts w:hint="eastAsia"/>
@@ -11283,8 +11689,11 @@
       <w:pPr>
         <w:pStyle w:val="2"/>
         <w:spacing w:before="120" w:after="120"/>
-      </w:pPr>
-      <w:bookmarkStart w:id="51" w:name="_Toc225093594"/>
+        <w:rPr>
+          <w:rFonts w:hint="eastAsia"/>
+        </w:rPr>
+      </w:pPr>
+      <w:bookmarkStart w:id="51" w:name="_Toc225175966"/>
       <w:r>
         <w:rPr>
           <w:rFonts w:hint="eastAsia"/>
@@ -11394,7 +11803,7 @@
           <w:rFonts w:hint="eastAsia"/>
         </w:rPr>
       </w:pPr>
-      <w:bookmarkStart w:id="52" w:name="_Toc225093595"/>
+      <w:bookmarkStart w:id="52" w:name="_Toc225175967"/>
       <w:r>
         <w:rPr>
           <w:rFonts w:hint="eastAsia"/>
@@ -11531,8 +11940,11 @@
       <w:pPr>
         <w:pStyle w:val="3"/>
         <w:spacing w:before="120" w:after="120"/>
-      </w:pPr>
-      <w:bookmarkStart w:id="53" w:name="_Toc225093596"/>
+        <w:rPr>
+          <w:rFonts w:hint="eastAsia"/>
+        </w:rPr>
+      </w:pPr>
+      <w:bookmarkStart w:id="53" w:name="_Toc225175968"/>
       <w:r>
         <w:rPr>
           <w:rFonts w:hint="eastAsia"/>
@@ -11679,8 +12091,11 @@
       <w:pPr>
         <w:pStyle w:val="3"/>
         <w:spacing w:before="120" w:after="120"/>
-      </w:pPr>
-      <w:bookmarkStart w:id="54" w:name="_Toc225093597"/>
+        <w:rPr>
+          <w:rFonts w:hint="eastAsia"/>
+        </w:rPr>
+      </w:pPr>
+      <w:bookmarkStart w:id="54" w:name="_Toc225175969"/>
       <w:r>
         <w:rPr>
           <w:rFonts w:hint="eastAsia"/>
@@ -11693,9 +12108,6 @@
       <w:pPr>
         <w:pStyle w:val="23"/>
         <w:ind w:firstLine="480"/>
-        <w:rPr>
-          <w:rFonts w:hint="eastAsia"/>
-        </w:rPr>
       </w:pPr>
       <w:r>
         <w:rPr>
@@ -11731,10 +12143,7 @@
         <w:t>\</w:t>
       </w:r>
       <w:r>
-        <w:t xml:space="preserve"> </w:t>
-      </w:r>
-      <w:r>
-        <w:t>yuan_jdk.xml</w:t>
+        <w:t xml:space="preserve"> yuan_jdk.xml</w:t>
       </w:r>
       <w:r>
         <w:rPr>
@@ -11830,9 +12239,9 @@
           <w:noProof/>
         </w:rPr>
         <w:drawing>
-          <wp:inline distT="0" distB="0" distL="0" distR="0" wp14:anchorId="1AEE81EF" wp14:editId="3A6B7746">
-            <wp:extent cx="4793887" cy="4672853"/>
-            <wp:effectExtent l="0" t="0" r="6985" b="0"/>
+          <wp:inline distT="0" distB="0" distL="0" distR="0" wp14:anchorId="1AEE81EF" wp14:editId="10EFDEB7">
+            <wp:extent cx="4106538" cy="4002858"/>
+            <wp:effectExtent l="0" t="0" r="8890" b="0"/>
             <wp:docPr id="775837512" name="图片 5"/>
             <wp:cNvGraphicFramePr>
               <a:graphicFrameLocks xmlns:a="http://schemas.openxmlformats.org/drawingml/2006/main" noChangeAspect="1"/>
@@ -11862,7 +12271,7 @@
                   <pic:spPr bwMode="auto">
                     <a:xfrm>
                       <a:off x="0" y="0"/>
-                      <a:ext cx="4797534" cy="4676408"/>
+                      <a:ext cx="4113212" cy="4009364"/>
                     </a:xfrm>
                     <a:prstGeom prst="rect">
                       <a:avLst/>
@@ -11991,7 +12400,6 @@
         <w:rPr>
           <w:rFonts w:hint="eastAsia"/>
         </w:rPr>
-        <w:lastRenderedPageBreak/>
         <w:t>其中，</w:t>
       </w:r>
       <w:r>
@@ -12195,10 +12603,11 @@
         <w:rPr>
           <w:noProof/>
         </w:rPr>
+        <w:lastRenderedPageBreak/>
         <w:drawing>
-          <wp:inline distT="0" distB="0" distL="0" distR="0" wp14:anchorId="4EA5D2CE" wp14:editId="7F6648BA">
-            <wp:extent cx="5256530" cy="5170805"/>
-            <wp:effectExtent l="0" t="0" r="1270" b="0"/>
+          <wp:inline distT="0" distB="0" distL="0" distR="0" wp14:anchorId="4EA5D2CE" wp14:editId="2712A27A">
+            <wp:extent cx="4492964" cy="4419691"/>
+            <wp:effectExtent l="0" t="0" r="3175" b="0"/>
             <wp:docPr id="432655210" name="图片 6"/>
             <wp:cNvGraphicFramePr>
               <a:graphicFrameLocks xmlns:a="http://schemas.openxmlformats.org/drawingml/2006/main" noChangeAspect="1"/>
@@ -12213,7 +12622,7 @@
                     </pic:cNvPicPr>
                   </pic:nvPicPr>
                   <pic:blipFill>
-                    <a:blip r:embed="rId31">
+                    <a:blip r:embed="rId31" cstate="print">
                       <a:extLst>
                         <a:ext uri="{28A0092B-C50C-407E-A947-70E740481C1C}">
                           <a14:useLocalDpi xmlns:a14="http://schemas.microsoft.com/office/drawing/2010/main" val="0"/>
@@ -12228,7 +12637,7 @@
                   <pic:spPr bwMode="auto">
                     <a:xfrm>
                       <a:off x="0" y="0"/>
-                      <a:ext cx="5256530" cy="5170805"/>
+                      <a:ext cx="4495376" cy="4422064"/>
                     </a:xfrm>
                     <a:prstGeom prst="rect">
                       <a:avLst/>
@@ -12429,9 +12838,6 @@
       <w:pPr>
         <w:pStyle w:val="23"/>
         <w:ind w:firstLine="480"/>
-        <w:rPr>
-          <w:rFonts w:hint="eastAsia"/>
-        </w:rPr>
       </w:pPr>
       <w:r>
         <w:rPr>
@@ -12478,7 +12884,7 @@
           <w:rFonts w:hint="eastAsia"/>
         </w:rPr>
       </w:pPr>
-      <w:bookmarkStart w:id="57" w:name="_Toc225093598"/>
+      <w:bookmarkStart w:id="57" w:name="_Toc225175970"/>
       <w:r>
         <w:rPr>
           <w:rFonts w:hint="eastAsia"/>
@@ -12496,7 +12902,6 @@
         <w:rPr>
           <w:rFonts w:hint="eastAsia"/>
         </w:rPr>
-        <w:lastRenderedPageBreak/>
         <w:t>本</w:t>
       </w:r>
       <w:r>
@@ -12683,9 +13088,1943 @@
           <w:kern w:val="2"/>
         </w:rPr>
       </w:pPr>
+      <w:r>
+        <w:rPr>
+          <w:rFonts w:cs="Times New Roman"/>
+          <w:color w:val="000000" w:themeColor="text1"/>
+          <w:kern w:val="2"/>
+        </w:rPr>
+        <w:br w:type="page"/>
+      </w:r>
+    </w:p>
+    <w:p>
+      <w:pPr>
+        <w:pStyle w:val="1"/>
+        <w:spacing w:before="288" w:after="240"/>
+        <w:ind w:right="240"/>
+      </w:pPr>
+      <w:bookmarkStart w:id="58" w:name="_Toc225175971"/>
+      <w:r>
+        <w:rPr>
+          <w:rFonts w:hint="eastAsia"/>
+        </w:rPr>
+        <w:lastRenderedPageBreak/>
+        <w:t>添加插件</w:t>
+      </w:r>
+      <w:bookmarkEnd w:id="58"/>
+    </w:p>
+    <w:p>
+      <w:pPr>
+        <w:pStyle w:val="23"/>
+        <w:ind w:firstLine="480"/>
+      </w:pPr>
+      <w:r>
+        <w:t>Y</w:t>
+      </w:r>
+      <w:r>
+        <w:rPr>
+          <w:rFonts w:hint="eastAsia"/>
+        </w:rPr>
+        <w:t>uan</w:t>
+      </w:r>
+      <w:r>
+        <w:rPr>
+          <w:rFonts w:hint="eastAsia"/>
+        </w:rPr>
+        <w:t>平台中已经自带了一个绘图插件可以直接使用，其存放目录为“</w:t>
+      </w:r>
+      <w:r>
+        <w:t>D:\WorkSpace\github\yuan\yuan-platform\target\artifacts\yuan\plugins</w:t>
+      </w:r>
+      <w:r>
+        <w:rPr>
+          <w:rFonts w:hint="eastAsia"/>
+        </w:rPr>
+        <w:t>\</w:t>
+      </w:r>
+      <w:r>
+        <w:rPr>
+          <w:rFonts w:hint="eastAsia"/>
+        </w:rPr>
+        <w:t>”。</w:t>
+      </w:r>
+      <w:r>
+        <w:rPr>
+          <w:rFonts w:hint="eastAsia"/>
+        </w:rPr>
+        <w:t>平台启动时，在“输出</w:t>
+      </w:r>
+      <w:r>
+        <w:rPr>
+          <w:rFonts w:hint="eastAsia"/>
+        </w:rPr>
+        <w:t>”</w:t>
+      </w:r>
+      <w:r>
+        <w:rPr>
+          <w:rFonts w:hint="eastAsia"/>
+        </w:rPr>
+        <w:t>面板中如果出现了“</w:t>
+      </w:r>
+      <w:r>
+        <w:rPr>
+          <w:rFonts w:ascii="Segoe UI Emoji" w:hAnsi="Segoe UI Emoji" w:cs="Segoe UI Emoji"/>
+        </w:rPr>
+        <w:t>✅</w:t>
+      </w:r>
+      <w:r>
+        <w:t xml:space="preserve"> Plugin loaded </w:t>
+      </w:r>
+      <w:proofErr w:type="spellStart"/>
+      <w:r>
+        <w:t>successfully:com.gly.Chart</w:t>
+      </w:r>
+      <w:proofErr w:type="spellEnd"/>
+      <w:r>
+        <w:cr/>
+      </w:r>
+      <w:r>
+        <w:rPr>
+          <w:rFonts w:hint="eastAsia"/>
+        </w:rPr>
+        <w:t>”，则说明插件可以直接使用。</w:t>
+      </w:r>
+    </w:p>
+    <w:p>
+      <w:pPr>
+        <w:pStyle w:val="2"/>
+        <w:spacing w:before="120" w:after="120"/>
+      </w:pPr>
+      <w:bookmarkStart w:id="59" w:name="_Toc225175972"/>
+      <w:r>
+        <w:rPr>
+          <w:rFonts w:hint="eastAsia"/>
+        </w:rPr>
+        <w:t>使用插件</w:t>
+      </w:r>
+      <w:bookmarkEnd w:id="59"/>
+    </w:p>
+    <w:p>
+      <w:pPr>
+        <w:pStyle w:val="23"/>
+        <w:ind w:firstLine="480"/>
+        <w:rPr>
+          <w:rFonts w:hint="eastAsia"/>
+        </w:rPr>
+      </w:pPr>
+      <w:r>
+        <w:rPr>
+          <w:rFonts w:hint="eastAsia"/>
+        </w:rPr>
+        <w:t>Yuan</w:t>
+      </w:r>
+      <w:r>
+        <w:rPr>
+          <w:rFonts w:hint="eastAsia"/>
+        </w:rPr>
+        <w:t>平台中也提供了一个默认的</w:t>
+      </w:r>
+      <w:r>
+        <w:t>yuan-chart</w:t>
+      </w:r>
+      <w:r>
+        <w:rPr>
+          <w:rFonts w:hint="eastAsia"/>
+        </w:rPr>
+        <w:t>插件测试项目。</w:t>
+      </w:r>
+      <w:r>
+        <w:rPr>
+          <w:rFonts w:hint="eastAsia"/>
+        </w:rPr>
+        <w:t>使用元智能平台打开</w:t>
+      </w:r>
+      <w:r>
+        <w:t>\yuan\yuan-demo\quick</w:t>
+      </w:r>
+      <w:r>
+        <w:rPr>
+          <w:rFonts w:hint="eastAsia"/>
+        </w:rPr>
+        <w:t>项目，打开“</w:t>
+      </w:r>
+      <w:proofErr w:type="spellStart"/>
+      <w:r>
+        <w:rPr>
+          <w:rFonts w:hint="eastAsia"/>
+        </w:rPr>
+        <w:t>chart.json</w:t>
+      </w:r>
+      <w:proofErr w:type="spellEnd"/>
+      <w:r>
+        <w:rPr>
+          <w:rFonts w:hint="eastAsia"/>
+        </w:rPr>
+        <w:t>”文件。点击工具栏中的三角形的运行按钮，</w:t>
+      </w:r>
+      <w:r>
+        <w:rPr>
+          <w:rFonts w:hint="eastAsia"/>
+        </w:rPr>
+        <w:t>运行效果</w:t>
+      </w:r>
+      <w:r>
+        <w:rPr>
+          <w:rFonts w:hint="eastAsia"/>
+        </w:rPr>
+        <w:t>如</w:t>
+      </w:r>
+      <w:r>
+        <w:fldChar w:fldCharType="begin"/>
+      </w:r>
+      <w:r>
+        <w:instrText xml:space="preserve"> </w:instrText>
+      </w:r>
+      <w:r>
+        <w:rPr>
+          <w:rFonts w:hint="eastAsia"/>
+        </w:rPr>
+        <w:instrText>REF _Ref225164289 \h</w:instrText>
+      </w:r>
+      <w:r>
+        <w:instrText xml:space="preserve"> </w:instrText>
+      </w:r>
+      <w:r>
+        <w:fldChar w:fldCharType="separate"/>
+      </w:r>
+      <w:r>
+        <w:rPr>
+          <w:rFonts w:hint="eastAsia"/>
+        </w:rPr>
+        <w:t>图</w:t>
+      </w:r>
+      <w:r>
+        <w:rPr>
+          <w:rFonts w:hint="eastAsia"/>
+        </w:rPr>
+        <w:t xml:space="preserve"> </w:t>
+      </w:r>
+      <w:r>
+        <w:rPr>
+          <w:noProof/>
+        </w:rPr>
+        <w:t>4</w:t>
+      </w:r>
+      <w:r>
+        <w:noBreakHyphen/>
+      </w:r>
+      <w:r>
+        <w:rPr>
+          <w:noProof/>
+        </w:rPr>
+        <w:t>1</w:t>
+      </w:r>
+      <w:r>
+        <w:fldChar w:fldCharType="end"/>
+      </w:r>
+      <w:r>
+        <w:rPr>
+          <w:rFonts w:hint="eastAsia"/>
+        </w:rPr>
+        <w:t>所示。</w:t>
+      </w:r>
+    </w:p>
+    <w:p>
+      <w:pPr>
+        <w:pStyle w:val="affc"/>
+      </w:pPr>
+      <w:r>
+        <w:rPr>
+          <w:noProof/>
+        </w:rPr>
+        <w:drawing>
+          <wp:inline distT="0" distB="0" distL="0" distR="0" wp14:anchorId="2D3EEAF0" wp14:editId="220C5AA4">
+            <wp:extent cx="3444033" cy="3216456"/>
+            <wp:effectExtent l="0" t="0" r="4445" b="3175"/>
+            <wp:docPr id="1998672954" name="图片 2"/>
+            <wp:cNvGraphicFramePr>
+              <a:graphicFrameLocks xmlns:a="http://schemas.openxmlformats.org/drawingml/2006/main" noChangeAspect="1"/>
+            </wp:cNvGraphicFramePr>
+            <a:graphic xmlns:a="http://schemas.openxmlformats.org/drawingml/2006/main">
+              <a:graphicData uri="http://schemas.openxmlformats.org/drawingml/2006/picture">
+                <pic:pic xmlns:pic="http://schemas.openxmlformats.org/drawingml/2006/picture">
+                  <pic:nvPicPr>
+                    <pic:cNvPr id="0" name="Picture 3"/>
+                    <pic:cNvPicPr>
+                      <a:picLocks noChangeAspect="1" noChangeArrowheads="1"/>
+                    </pic:cNvPicPr>
+                  </pic:nvPicPr>
+                  <pic:blipFill>
+                    <a:blip r:embed="rId32" cstate="print">
+                      <a:extLst>
+                        <a:ext uri="{28A0092B-C50C-407E-A947-70E740481C1C}">
+                          <a14:useLocalDpi xmlns:a14="http://schemas.microsoft.com/office/drawing/2010/main" val="0"/>
+                        </a:ext>
+                      </a:extLst>
+                    </a:blip>
+                    <a:srcRect/>
+                    <a:stretch>
+                      <a:fillRect/>
+                    </a:stretch>
+                  </pic:blipFill>
+                  <pic:spPr bwMode="auto">
+                    <a:xfrm>
+                      <a:off x="0" y="0"/>
+                      <a:ext cx="3449687" cy="3221736"/>
+                    </a:xfrm>
+                    <a:prstGeom prst="rect">
+                      <a:avLst/>
+                    </a:prstGeom>
+                    <a:noFill/>
+                    <a:ln>
+                      <a:noFill/>
+                    </a:ln>
+                  </pic:spPr>
+                </pic:pic>
+              </a:graphicData>
+            </a:graphic>
+          </wp:inline>
+        </w:drawing>
+      </w:r>
+    </w:p>
+    <w:p>
+      <w:pPr>
+        <w:pStyle w:val="affc"/>
+      </w:pPr>
+      <w:bookmarkStart w:id="60" w:name="_Ref225164289"/>
+      <w:r>
+        <w:rPr>
+          <w:rFonts w:hint="eastAsia"/>
+        </w:rPr>
+        <w:t>图</w:t>
+      </w:r>
+      <w:r>
+        <w:rPr>
+          <w:rFonts w:hint="eastAsia"/>
+        </w:rPr>
+        <w:t xml:space="preserve"> </w:t>
+      </w:r>
+      <w:r>
+        <w:fldChar w:fldCharType="begin"/>
+      </w:r>
+      <w:r>
+        <w:instrText xml:space="preserve"> </w:instrText>
+      </w:r>
+      <w:r>
+        <w:rPr>
+          <w:rFonts w:hint="eastAsia"/>
+        </w:rPr>
+        <w:instrText>STYLEREF 1 \s</w:instrText>
+      </w:r>
+      <w:r>
+        <w:instrText xml:space="preserve"> </w:instrText>
+      </w:r>
+      <w:r>
+        <w:fldChar w:fldCharType="separate"/>
+      </w:r>
+      <w:r>
+        <w:rPr>
+          <w:noProof/>
+        </w:rPr>
+        <w:t>4</w:t>
+      </w:r>
+      <w:r>
+        <w:fldChar w:fldCharType="end"/>
+      </w:r>
+      <w:r>
+        <w:noBreakHyphen/>
+      </w:r>
+      <w:r>
+        <w:fldChar w:fldCharType="begin"/>
+      </w:r>
+      <w:r>
+        <w:instrText xml:space="preserve"> </w:instrText>
+      </w:r>
+      <w:r>
+        <w:rPr>
+          <w:rFonts w:hint="eastAsia"/>
+        </w:rPr>
+        <w:instrText xml:space="preserve">SEQ </w:instrText>
+      </w:r>
+      <w:r>
+        <w:rPr>
+          <w:rFonts w:hint="eastAsia"/>
+        </w:rPr>
+        <w:instrText>图</w:instrText>
+      </w:r>
+      <w:r>
+        <w:rPr>
+          <w:rFonts w:hint="eastAsia"/>
+        </w:rPr>
+        <w:instrText xml:space="preserve"> \* ARABIC \s 1</w:instrText>
+      </w:r>
+      <w:r>
+        <w:instrText xml:space="preserve"> </w:instrText>
+      </w:r>
+      <w:r>
+        <w:fldChar w:fldCharType="separate"/>
+      </w:r>
+      <w:r>
+        <w:rPr>
+          <w:noProof/>
+        </w:rPr>
+        <w:t>1</w:t>
+      </w:r>
+      <w:r>
+        <w:fldChar w:fldCharType="end"/>
+      </w:r>
+      <w:bookmarkEnd w:id="60"/>
+      <w:r>
+        <w:rPr>
+          <w:rFonts w:hint="eastAsia"/>
+        </w:rPr>
+        <w:t xml:space="preserve"> </w:t>
+      </w:r>
+      <w:r>
+        <w:rPr>
+          <w:rFonts w:hint="eastAsia"/>
+        </w:rPr>
+        <w:t>插件测试项目</w:t>
+      </w:r>
+    </w:p>
+    <w:p>
+      <w:pPr>
+        <w:pStyle w:val="23"/>
+        <w:ind w:firstLine="480"/>
+        <w:rPr>
+          <w:rFonts w:hint="eastAsia"/>
+        </w:rPr>
+      </w:pPr>
+      <w:r>
+        <w:rPr>
+          <w:rFonts w:hint="eastAsia"/>
+        </w:rPr>
+        <w:t>在</w:t>
+      </w:r>
+      <w:r>
+        <w:t>yuan\yuan-demo\quick\.yuan</w:t>
+      </w:r>
+      <w:r>
+        <w:rPr>
+          <w:rFonts w:hint="eastAsia"/>
+        </w:rPr>
+        <w:t>\</w:t>
+      </w:r>
+      <w:r>
+        <w:t>project.xml</w:t>
+      </w:r>
+      <w:r>
+        <w:rPr>
+          <w:rFonts w:hint="eastAsia"/>
+        </w:rPr>
+        <w:t>目录下配置文件内容为</w:t>
+      </w:r>
+      <w:r>
+        <w:fldChar w:fldCharType="begin"/>
+      </w:r>
+      <w:r>
+        <w:instrText xml:space="preserve"> </w:instrText>
+      </w:r>
+      <w:r>
+        <w:rPr>
+          <w:rFonts w:hint="eastAsia"/>
+        </w:rPr>
+        <w:instrText>REF _Ref225164699 \h</w:instrText>
+      </w:r>
+      <w:r>
+        <w:instrText xml:space="preserve"> </w:instrText>
+      </w:r>
+      <w:r>
+        <w:instrText xml:space="preserve"> \* MERGEFORMAT </w:instrText>
+      </w:r>
+      <w:r>
+        <w:fldChar w:fldCharType="separate"/>
+      </w:r>
+      <w:r>
+        <w:rPr>
+          <w:rFonts w:hint="eastAsia"/>
+        </w:rPr>
+        <w:t>配置</w:t>
+      </w:r>
+      <w:r>
+        <w:rPr>
+          <w:rFonts w:hint="eastAsia"/>
+        </w:rPr>
+        <w:t xml:space="preserve"> </w:t>
+      </w:r>
+      <w:r>
+        <w:rPr>
+          <w:noProof/>
+        </w:rPr>
+        <w:t>4</w:t>
+      </w:r>
+      <w:r>
+        <w:rPr>
+          <w:noProof/>
+        </w:rPr>
+        <w:noBreakHyphen/>
+        <w:t>1</w:t>
+      </w:r>
+      <w:r>
+        <w:fldChar w:fldCharType="end"/>
+      </w:r>
+      <w:r>
+        <w:rPr>
+          <w:rFonts w:hint="eastAsia"/>
+        </w:rPr>
+        <w:t>，如果没有此配置文件，工具栏的“运行”按钮无法使用。</w:t>
+      </w:r>
+    </w:p>
+    <w:tbl>
+      <w:tblPr>
+        <w:tblW w:w="8278" w:type="dxa"/>
+        <w:jc w:val="center"/>
+        <w:tblBorders>
+          <w:top w:val="single" w:sz="12" w:space="0" w:color="auto"/>
+          <w:bottom w:val="single" w:sz="12" w:space="0" w:color="auto"/>
+          <w:insideH w:val="single" w:sz="4" w:space="0" w:color="auto"/>
+          <w:insideV w:val="single" w:sz="4" w:space="0" w:color="auto"/>
+        </w:tblBorders>
+        <w:tblLook w:val="04A0" w:firstRow="1" w:lastRow="0" w:firstColumn="1" w:lastColumn="0" w:noHBand="0" w:noVBand="1"/>
+      </w:tblPr>
+      <w:tblGrid>
+        <w:gridCol w:w="8278"/>
+      </w:tblGrid>
+      <w:tr>
+        <w:trPr>
+          <w:jc w:val="center"/>
+        </w:trPr>
+        <w:tc>
+          <w:tcPr>
+            <w:tcW w:w="8278" w:type="dxa"/>
+          </w:tcPr>
+          <w:p>
+            <w:pPr>
+              <w:pStyle w:val="afff4"/>
+              <w:keepNext/>
+              <w:ind w:leftChars="0" w:left="0"/>
+            </w:pPr>
+            <w:bookmarkStart w:id="61" w:name="_Ref225164699"/>
+            <w:r>
+              <w:rPr>
+                <w:rFonts w:hint="eastAsia"/>
+              </w:rPr>
+              <w:t>配置</w:t>
+            </w:r>
+            <w:r>
+              <w:rPr>
+                <w:rFonts w:hint="eastAsia"/>
+              </w:rPr>
+              <w:t xml:space="preserve"> </w:t>
+            </w:r>
+            <w:r>
+              <w:fldChar w:fldCharType="begin"/>
+            </w:r>
+            <w:r>
+              <w:instrText xml:space="preserve"> </w:instrText>
+            </w:r>
+            <w:r>
+              <w:rPr>
+                <w:rFonts w:hint="eastAsia"/>
+              </w:rPr>
+              <w:instrText>STYLEREF 1 \s</w:instrText>
+            </w:r>
+            <w:r>
+              <w:instrText xml:space="preserve"> </w:instrText>
+            </w:r>
+            <w:r>
+              <w:fldChar w:fldCharType="separate"/>
+            </w:r>
+            <w:r>
+              <w:rPr>
+                <w:noProof/>
+              </w:rPr>
+              <w:t>4</w:t>
+            </w:r>
+            <w:r>
+              <w:fldChar w:fldCharType="end"/>
+            </w:r>
+            <w:r>
+              <w:noBreakHyphen/>
+            </w:r>
+            <w:r>
+              <w:fldChar w:fldCharType="begin"/>
+            </w:r>
+            <w:r>
+              <w:instrText xml:space="preserve"> </w:instrText>
+            </w:r>
+            <w:r>
+              <w:rPr>
+                <w:rFonts w:hint="eastAsia"/>
+              </w:rPr>
+              <w:instrText xml:space="preserve">SEQ </w:instrText>
+            </w:r>
+            <w:r>
+              <w:rPr>
+                <w:rFonts w:hint="eastAsia"/>
+              </w:rPr>
+              <w:instrText>配置</w:instrText>
+            </w:r>
+            <w:r>
+              <w:rPr>
+                <w:rFonts w:hint="eastAsia"/>
+              </w:rPr>
+              <w:instrText xml:space="preserve"> \* ARABIC \s 1</w:instrText>
+            </w:r>
+            <w:r>
+              <w:instrText xml:space="preserve"> </w:instrText>
+            </w:r>
+            <w:r>
+              <w:fldChar w:fldCharType="separate"/>
+            </w:r>
+            <w:r>
+              <w:rPr>
+                <w:noProof/>
+              </w:rPr>
+              <w:t>1</w:t>
+            </w:r>
+            <w:r>
+              <w:fldChar w:fldCharType="end"/>
+            </w:r>
+            <w:bookmarkEnd w:id="61"/>
+            <w:r>
+              <w:rPr>
+                <w:rFonts w:hint="eastAsia"/>
+              </w:rPr>
+              <w:t xml:space="preserve"> </w:t>
+            </w:r>
+            <w:r>
+              <w:t>project</w:t>
+            </w:r>
+            <w:r>
+              <w:rPr>
+                <w:rFonts w:hint="eastAsia"/>
+              </w:rPr>
+              <w:t>.</w:t>
+            </w:r>
+            <w:r>
+              <w:rPr>
+                <w:rFonts w:hint="eastAsia"/>
+              </w:rPr>
+              <w:t>xml</w:t>
+            </w:r>
+          </w:p>
+        </w:tc>
+      </w:tr>
+      <w:tr>
+        <w:trPr>
+          <w:jc w:val="center"/>
+        </w:trPr>
+        <w:tc>
+          <w:tcPr>
+            <w:tcW w:w="8278" w:type="dxa"/>
+          </w:tcPr>
+          <w:p>
+            <w:pPr>
+              <w:widowControl w:val="0"/>
+              <w:numPr>
+                <w:ilvl w:val="0"/>
+                <w:numId w:val="44"/>
+              </w:numPr>
+              <w:autoSpaceDE w:val="0"/>
+              <w:autoSpaceDN w:val="0"/>
+              <w:adjustRightInd w:val="0"/>
+              <w:spacing w:line="300" w:lineRule="auto"/>
+              <w:rPr>
+                <w:rFonts w:ascii="Courier New" w:hAnsi="Courier New" w:cs="Courier New"/>
+                <w:color w:val="000000"/>
+              </w:rPr>
+            </w:pPr>
+            <w:r>
+              <w:rPr>
+                <w:rFonts w:ascii="Courier New" w:hAnsi="Courier New" w:cs="Courier New"/>
+                <w:color w:val="000000"/>
+              </w:rPr>
+              <w:t>&lt;project&gt;</w:t>
+            </w:r>
+          </w:p>
+          <w:p>
+            <w:pPr>
+              <w:widowControl w:val="0"/>
+              <w:numPr>
+                <w:ilvl w:val="0"/>
+                <w:numId w:val="44"/>
+              </w:numPr>
+              <w:autoSpaceDE w:val="0"/>
+              <w:autoSpaceDN w:val="0"/>
+              <w:adjustRightInd w:val="0"/>
+              <w:spacing w:line="300" w:lineRule="auto"/>
+              <w:rPr>
+                <w:rFonts w:ascii="Courier New" w:hAnsi="Courier New" w:cs="Courier New"/>
+                <w:color w:val="000000"/>
+              </w:rPr>
+            </w:pPr>
+            <w:r>
+              <w:rPr>
+                <w:rFonts w:ascii="Courier New" w:hAnsi="Courier New" w:cs="Courier New"/>
+                <w:color w:val="000000"/>
+              </w:rPr>
+              <w:t xml:space="preserve">    &lt;type&gt;model&lt;/type&gt;</w:t>
+            </w:r>
+          </w:p>
+          <w:p>
+            <w:pPr>
+              <w:widowControl w:val="0"/>
+              <w:numPr>
+                <w:ilvl w:val="0"/>
+                <w:numId w:val="44"/>
+              </w:numPr>
+              <w:autoSpaceDE w:val="0"/>
+              <w:autoSpaceDN w:val="0"/>
+              <w:adjustRightInd w:val="0"/>
+              <w:spacing w:line="300" w:lineRule="auto"/>
+              <w:rPr>
+                <w:rFonts w:ascii="Courier New" w:hAnsi="Courier New" w:cs="Courier New"/>
+                <w:color w:val="000000"/>
+              </w:rPr>
+            </w:pPr>
+            <w:r>
+              <w:rPr>
+                <w:rFonts w:ascii="Courier New" w:hAnsi="Courier New" w:cs="Courier New"/>
+                <w:color w:val="000000"/>
+              </w:rPr>
+              <w:t>&lt;/project&gt;</w:t>
+            </w:r>
+          </w:p>
+        </w:tc>
+      </w:tr>
+    </w:tbl>
+    <w:p>
+      <w:pPr>
+        <w:pStyle w:val="2"/>
+        <w:spacing w:before="120" w:after="120"/>
+      </w:pPr>
+      <w:bookmarkStart w:id="62" w:name="_Ref225175924"/>
+      <w:bookmarkStart w:id="63" w:name="_Toc225175973"/>
+      <w:r>
+        <w:rPr>
+          <w:rFonts w:hint="eastAsia"/>
+        </w:rPr>
+        <w:t>编译</w:t>
+      </w:r>
+      <w:r>
+        <w:rPr>
+          <w:rFonts w:hint="eastAsia"/>
+        </w:rPr>
+        <w:t>和</w:t>
+      </w:r>
+      <w:r>
+        <w:rPr>
+          <w:rFonts w:hint="eastAsia"/>
+        </w:rPr>
+        <w:t>添加</w:t>
+      </w:r>
+      <w:r>
+        <w:rPr>
+          <w:rFonts w:hint="eastAsia"/>
+        </w:rPr>
+        <w:t>插件</w:t>
+      </w:r>
+      <w:bookmarkEnd w:id="62"/>
+      <w:bookmarkEnd w:id="63"/>
+    </w:p>
+    <w:p>
+      <w:pPr>
+        <w:pStyle w:val="23"/>
+        <w:ind w:firstLine="480"/>
+        <w:rPr>
+          <w:rFonts w:hint="eastAsia"/>
+        </w:rPr>
+      </w:pPr>
+      <w:r>
+        <w:rPr>
+          <w:rFonts w:hint="eastAsia"/>
+        </w:rPr>
+        <w:lastRenderedPageBreak/>
+        <w:t>使用</w:t>
+      </w:r>
+      <w:r>
+        <w:rPr>
+          <w:rFonts w:hint="eastAsia"/>
+        </w:rPr>
+        <w:t>Yuan</w:t>
+      </w:r>
+      <w:r>
+        <w:rPr>
+          <w:rFonts w:hint="eastAsia"/>
+        </w:rPr>
+        <w:t>打开</w:t>
+      </w:r>
+      <w:r>
+        <w:t>yuan\plugins\yuan-chart</w:t>
+      </w:r>
+      <w:r>
+        <w:rPr>
+          <w:rFonts w:hint="eastAsia"/>
+        </w:rPr>
+        <w:t>项目，</w:t>
+      </w:r>
+      <w:r>
+        <w:rPr>
+          <w:rFonts w:hint="eastAsia"/>
+        </w:rPr>
+        <w:t>选择</w:t>
+      </w:r>
+      <w:r>
+        <w:rPr>
+          <w:rFonts w:hint="eastAsia"/>
+        </w:rPr>
+        <w:t>Maven</w:t>
+      </w:r>
+      <w:r>
+        <w:rPr>
+          <w:rFonts w:hint="eastAsia"/>
+        </w:rPr>
+        <w:t>面板中的</w:t>
+      </w:r>
+      <w:r>
+        <w:rPr>
+          <w:rFonts w:hint="eastAsia"/>
+        </w:rPr>
+        <w:t>Package</w:t>
+      </w:r>
+      <w:r>
+        <w:rPr>
+          <w:rFonts w:hint="eastAsia"/>
+        </w:rPr>
+        <w:t>命令，如</w:t>
+      </w:r>
+      <w:r>
+        <w:fldChar w:fldCharType="begin"/>
+      </w:r>
+      <w:r>
+        <w:instrText xml:space="preserve"> </w:instrText>
+      </w:r>
+      <w:r>
+        <w:rPr>
+          <w:rFonts w:hint="eastAsia"/>
+        </w:rPr>
+        <w:instrText>REF _Ref225169142 \h</w:instrText>
+      </w:r>
+      <w:r>
+        <w:instrText xml:space="preserve"> </w:instrText>
+      </w:r>
+      <w:r>
+        <w:fldChar w:fldCharType="separate"/>
+      </w:r>
+      <w:r>
+        <w:rPr>
+          <w:rFonts w:hint="eastAsia"/>
+        </w:rPr>
+        <w:t>图</w:t>
+      </w:r>
+      <w:r>
+        <w:rPr>
+          <w:rFonts w:hint="eastAsia"/>
+        </w:rPr>
+        <w:t xml:space="preserve"> </w:t>
+      </w:r>
+      <w:r>
+        <w:rPr>
+          <w:noProof/>
+        </w:rPr>
+        <w:t>4</w:t>
+      </w:r>
+      <w:r>
+        <w:noBreakHyphen/>
+      </w:r>
+      <w:r>
+        <w:rPr>
+          <w:noProof/>
+        </w:rPr>
+        <w:t>2</w:t>
+      </w:r>
+      <w:r>
+        <w:fldChar w:fldCharType="end"/>
+      </w:r>
+      <w:r>
+        <w:rPr>
+          <w:rFonts w:hint="eastAsia"/>
+        </w:rPr>
+        <w:t>所示，运行成功后在</w:t>
+      </w:r>
+      <w:r>
+        <w:t>yuan\plugins\yuan-chart\target</w:t>
+      </w:r>
+      <w:r>
+        <w:rPr>
+          <w:rFonts w:hint="eastAsia"/>
+        </w:rPr>
+        <w:t>目录下就会生成一个</w:t>
+      </w:r>
+      <w:r>
+        <w:t>plot-chart-1.0.0.jar</w:t>
+      </w:r>
+      <w:r>
+        <w:rPr>
+          <w:rFonts w:hint="eastAsia"/>
+        </w:rPr>
+        <w:t>文件。</w:t>
+      </w:r>
+    </w:p>
+    <w:p>
+      <w:pPr>
+        <w:pStyle w:val="affc"/>
+      </w:pPr>
+      <w:r>
+        <w:rPr>
+          <w:noProof/>
+        </w:rPr>
+        <w:drawing>
+          <wp:inline distT="0" distB="0" distL="0" distR="0" wp14:anchorId="32BD5CAC" wp14:editId="62D9A8BF">
+            <wp:extent cx="4729151" cy="2586808"/>
+            <wp:effectExtent l="0" t="0" r="0" b="4445"/>
+            <wp:docPr id="34792203" name="图片 3"/>
+            <wp:cNvGraphicFramePr>
+              <a:graphicFrameLocks xmlns:a="http://schemas.openxmlformats.org/drawingml/2006/main" noChangeAspect="1"/>
+            </wp:cNvGraphicFramePr>
+            <a:graphic xmlns:a="http://schemas.openxmlformats.org/drawingml/2006/main">
+              <a:graphicData uri="http://schemas.openxmlformats.org/drawingml/2006/picture">
+                <pic:pic xmlns:pic="http://schemas.openxmlformats.org/drawingml/2006/picture">
+                  <pic:nvPicPr>
+                    <pic:cNvPr id="0" name="Picture 4"/>
+                    <pic:cNvPicPr>
+                      <a:picLocks noChangeAspect="1" noChangeArrowheads="1"/>
+                    </pic:cNvPicPr>
+                  </pic:nvPicPr>
+                  <pic:blipFill>
+                    <a:blip r:embed="rId33" cstate="print">
+                      <a:extLst>
+                        <a:ext uri="{28A0092B-C50C-407E-A947-70E740481C1C}">
+                          <a14:useLocalDpi xmlns:a14="http://schemas.microsoft.com/office/drawing/2010/main" val="0"/>
+                        </a:ext>
+                      </a:extLst>
+                    </a:blip>
+                    <a:srcRect/>
+                    <a:stretch>
+                      <a:fillRect/>
+                    </a:stretch>
+                  </pic:blipFill>
+                  <pic:spPr bwMode="auto">
+                    <a:xfrm>
+                      <a:off x="0" y="0"/>
+                      <a:ext cx="4735631" cy="2590353"/>
+                    </a:xfrm>
+                    <a:prstGeom prst="rect">
+                      <a:avLst/>
+                    </a:prstGeom>
+                    <a:noFill/>
+                    <a:ln>
+                      <a:noFill/>
+                    </a:ln>
+                  </pic:spPr>
+                </pic:pic>
+              </a:graphicData>
+            </a:graphic>
+          </wp:inline>
+        </w:drawing>
+      </w:r>
+    </w:p>
+    <w:p>
+      <w:pPr>
+        <w:pStyle w:val="affc"/>
+      </w:pPr>
+      <w:bookmarkStart w:id="64" w:name="_Ref225169142"/>
+      <w:r>
+        <w:rPr>
+          <w:rFonts w:hint="eastAsia"/>
+        </w:rPr>
+        <w:t>图</w:t>
+      </w:r>
+      <w:r>
+        <w:rPr>
+          <w:rFonts w:hint="eastAsia"/>
+        </w:rPr>
+        <w:t xml:space="preserve"> </w:t>
+      </w:r>
+      <w:r>
+        <w:fldChar w:fldCharType="begin"/>
+      </w:r>
+      <w:r>
+        <w:instrText xml:space="preserve"> </w:instrText>
+      </w:r>
+      <w:r>
+        <w:rPr>
+          <w:rFonts w:hint="eastAsia"/>
+        </w:rPr>
+        <w:instrText>STYLEREF 1 \s</w:instrText>
+      </w:r>
+      <w:r>
+        <w:instrText xml:space="preserve"> </w:instrText>
+      </w:r>
+      <w:r>
+        <w:fldChar w:fldCharType="separate"/>
+      </w:r>
+      <w:r>
+        <w:rPr>
+          <w:noProof/>
+        </w:rPr>
+        <w:t>4</w:t>
+      </w:r>
+      <w:r>
+        <w:fldChar w:fldCharType="end"/>
+      </w:r>
+      <w:r>
+        <w:noBreakHyphen/>
+      </w:r>
+      <w:r>
+        <w:fldChar w:fldCharType="begin"/>
+      </w:r>
+      <w:r>
+        <w:instrText xml:space="preserve"> </w:instrText>
+      </w:r>
+      <w:r>
+        <w:rPr>
+          <w:rFonts w:hint="eastAsia"/>
+        </w:rPr>
+        <w:instrText xml:space="preserve">SEQ </w:instrText>
+      </w:r>
+      <w:r>
+        <w:rPr>
+          <w:rFonts w:hint="eastAsia"/>
+        </w:rPr>
+        <w:instrText>图</w:instrText>
+      </w:r>
+      <w:r>
+        <w:rPr>
+          <w:rFonts w:hint="eastAsia"/>
+        </w:rPr>
+        <w:instrText xml:space="preserve"> \* ARABIC \s 1</w:instrText>
+      </w:r>
+      <w:r>
+        <w:instrText xml:space="preserve"> </w:instrText>
+      </w:r>
+      <w:r>
+        <w:fldChar w:fldCharType="separate"/>
+      </w:r>
+      <w:r>
+        <w:rPr>
+          <w:noProof/>
+        </w:rPr>
+        <w:t>2</w:t>
+      </w:r>
+      <w:r>
+        <w:fldChar w:fldCharType="end"/>
+      </w:r>
+      <w:bookmarkEnd w:id="64"/>
+      <w:r>
+        <w:rPr>
+          <w:rFonts w:hint="eastAsia"/>
+        </w:rPr>
+        <w:t xml:space="preserve"> </w:t>
+      </w:r>
+      <w:r>
+        <w:t>yuan-chart</w:t>
+      </w:r>
+      <w:r>
+        <w:rPr>
+          <w:rFonts w:hint="eastAsia"/>
+        </w:rPr>
+        <w:t>生成</w:t>
+      </w:r>
+      <w:r>
+        <w:rPr>
+          <w:rFonts w:hint="eastAsia"/>
+        </w:rPr>
+        <w:t>jar</w:t>
+      </w:r>
+    </w:p>
+    <w:p>
+      <w:pPr>
+        <w:pStyle w:val="23"/>
+        <w:ind w:firstLine="480"/>
+      </w:pPr>
+      <w:r>
+        <w:t>yuan\yuan-platform\target\artifacts\yuan\plugins\plot-chart\lib</w:t>
+      </w:r>
+      <w:r>
+        <w:t>将</w:t>
+      </w:r>
+      <w:r>
+        <w:rPr>
+          <w:rFonts w:hint="eastAsia"/>
+        </w:rPr>
+        <w:t>生成的</w:t>
+      </w:r>
+      <w:r>
+        <w:t>plot-chart-1.0.0.jar</w:t>
+      </w:r>
+      <w:r>
+        <w:t>拷贝到</w:t>
+      </w:r>
+      <w:r>
+        <w:rPr>
+          <w:rFonts w:hint="eastAsia"/>
+        </w:rPr>
+        <w:t>前</w:t>
+      </w:r>
+      <w:r>
+        <w:rPr>
+          <w:rFonts w:hint="eastAsia"/>
+        </w:rPr>
+        <w:t>面的目录</w:t>
+      </w:r>
+      <w:r>
+        <w:rPr>
+          <w:rFonts w:hint="eastAsia"/>
+        </w:rPr>
+        <w:t>后，</w:t>
+      </w:r>
+      <w:r>
+        <w:t>重新启动</w:t>
+      </w:r>
+      <w:r>
+        <w:rPr>
+          <w:rFonts w:hint="eastAsia"/>
+        </w:rPr>
+        <w:t>Yuan</w:t>
+      </w:r>
+      <w:r>
+        <w:rPr>
+          <w:rFonts w:hint="eastAsia"/>
+        </w:rPr>
+        <w:t>平台，插件就添加完成</w:t>
+      </w:r>
+      <w:r>
+        <w:rPr>
+          <w:rFonts w:hint="eastAsia"/>
+        </w:rPr>
+        <w:t>。如果想将插件去掉，只需要将</w:t>
+      </w:r>
+      <w:r>
+        <w:t>plot-char</w:t>
+      </w:r>
+      <w:r>
+        <w:t>文件夹整体删除就可以了</w:t>
+      </w:r>
+      <w:r>
+        <w:rPr>
+          <w:rFonts w:hint="eastAsia"/>
+        </w:rPr>
+        <w:t>。</w:t>
+      </w:r>
+    </w:p>
+    <w:p>
+      <w:pPr>
+        <w:pStyle w:val="2"/>
+        <w:spacing w:before="120" w:after="120"/>
+      </w:pPr>
+      <w:bookmarkStart w:id="65" w:name="_Ref225175925"/>
+      <w:bookmarkStart w:id="66" w:name="_Toc225175974"/>
+      <w:r>
+        <w:rPr>
+          <w:rFonts w:hint="eastAsia"/>
+        </w:rPr>
+        <w:t>创建插件</w:t>
+      </w:r>
+      <w:bookmarkEnd w:id="65"/>
+      <w:bookmarkEnd w:id="66"/>
+    </w:p>
+    <w:p>
+      <w:pPr>
+        <w:pStyle w:val="23"/>
+        <w:ind w:firstLine="480"/>
+        <w:rPr>
+          <w:rFonts w:hint="eastAsia"/>
+        </w:rPr>
+      </w:pPr>
+      <w:r>
+        <w:rPr>
+          <w:rFonts w:hint="eastAsia"/>
+        </w:rPr>
+        <w:t>以</w:t>
+      </w:r>
+      <w:r>
+        <w:t>plot-chart</w:t>
+      </w:r>
+      <w:r>
+        <w:rPr>
+          <w:rFonts w:hint="eastAsia"/>
+        </w:rPr>
+        <w:t>插件为例，</w:t>
+      </w:r>
+      <w:r>
+        <w:rPr>
+          <w:rFonts w:hint="eastAsia"/>
+        </w:rPr>
+        <w:t>yuan</w:t>
+      </w:r>
+      <w:r>
+        <w:rPr>
+          <w:rFonts w:hint="eastAsia"/>
+        </w:rPr>
+        <w:t>平台的插件的</w:t>
+      </w:r>
+      <w:r>
+        <w:rPr>
+          <w:rFonts w:hint="eastAsia"/>
+        </w:rPr>
+        <w:t>pom.xml</w:t>
+      </w:r>
+      <w:r>
+        <w:rPr>
+          <w:rFonts w:hint="eastAsia"/>
+        </w:rPr>
+        <w:t>都必须包含</w:t>
+      </w:r>
+      <w:r>
+        <w:t>yuan-common</w:t>
+      </w:r>
+      <w:r>
+        <w:rPr>
+          <w:rFonts w:hint="eastAsia"/>
+        </w:rPr>
+        <w:t>依赖，实现</w:t>
+      </w:r>
+      <w:r>
+        <w:rPr>
+          <w:rFonts w:hint="eastAsia"/>
+        </w:rPr>
+        <w:t>yuan</w:t>
+      </w:r>
+      <w:r>
+        <w:rPr>
+          <w:rFonts w:hint="eastAsia"/>
+        </w:rPr>
+        <w:t>平台</w:t>
+      </w:r>
+      <w:r>
+        <w:rPr>
+          <w:rFonts w:hint="eastAsia"/>
+        </w:rPr>
+        <w:t>规定的插件接口。</w:t>
+      </w:r>
+      <w:r>
+        <w:fldChar w:fldCharType="begin"/>
+      </w:r>
+      <w:r>
+        <w:instrText xml:space="preserve"> </w:instrText>
+      </w:r>
+      <w:r>
+        <w:rPr>
+          <w:rFonts w:hint="eastAsia"/>
+        </w:rPr>
+        <w:instrText>REF _Ref225175111 \h</w:instrText>
+      </w:r>
+      <w:r>
+        <w:instrText xml:space="preserve"> </w:instrText>
+      </w:r>
+      <w:r>
+        <w:fldChar w:fldCharType="separate"/>
+      </w:r>
+      <w:r>
+        <w:rPr>
+          <w:rFonts w:hint="eastAsia"/>
+        </w:rPr>
+        <w:t>配置</w:t>
+      </w:r>
+      <w:r>
+        <w:rPr>
+          <w:rFonts w:hint="eastAsia"/>
+        </w:rPr>
+        <w:t xml:space="preserve"> </w:t>
+      </w:r>
+      <w:r>
+        <w:rPr>
+          <w:noProof/>
+        </w:rPr>
+        <w:t>4</w:t>
+      </w:r>
+      <w:r>
+        <w:noBreakHyphen/>
+      </w:r>
+      <w:r>
+        <w:rPr>
+          <w:noProof/>
+        </w:rPr>
+        <w:t>2</w:t>
+      </w:r>
+      <w:r>
+        <w:fldChar w:fldCharType="end"/>
+      </w:r>
+      <w:r>
+        <w:rPr>
+          <w:rFonts w:hint="eastAsia"/>
+        </w:rPr>
+        <w:t>中，</w:t>
+      </w:r>
+      <w:r>
+        <w:t>plot-chart</w:t>
+      </w:r>
+      <w:r>
+        <w:rPr>
+          <w:rFonts w:hint="eastAsia"/>
+        </w:rPr>
+        <w:t>依赖的</w:t>
+      </w:r>
+      <w:r>
+        <w:t>yuan-common</w:t>
+      </w:r>
+      <w:r>
+        <w:rPr>
+          <w:rFonts w:hint="eastAsia"/>
+        </w:rPr>
+        <w:t>版本是</w:t>
+      </w:r>
+      <w:r>
+        <w:rPr>
+          <w:rFonts w:hint="eastAsia"/>
+        </w:rPr>
+        <w:t>1.0.8</w:t>
+      </w:r>
+      <w:r>
+        <w:rPr>
+          <w:rFonts w:hint="eastAsia"/>
+        </w:rPr>
+        <w:t>。</w:t>
+      </w:r>
+    </w:p>
+    <w:tbl>
+      <w:tblPr>
+        <w:tblW w:w="8278" w:type="dxa"/>
+        <w:jc w:val="center"/>
+        <w:tblBorders>
+          <w:top w:val="single" w:sz="12" w:space="0" w:color="auto"/>
+          <w:bottom w:val="single" w:sz="12" w:space="0" w:color="auto"/>
+          <w:insideH w:val="single" w:sz="4" w:space="0" w:color="auto"/>
+          <w:insideV w:val="single" w:sz="4" w:space="0" w:color="auto"/>
+        </w:tblBorders>
+        <w:tblLook w:val="04A0" w:firstRow="1" w:lastRow="0" w:firstColumn="1" w:lastColumn="0" w:noHBand="0" w:noVBand="1"/>
+      </w:tblPr>
+      <w:tblGrid>
+        <w:gridCol w:w="8278"/>
+      </w:tblGrid>
+      <w:tr>
+        <w:trPr>
+          <w:jc w:val="center"/>
+        </w:trPr>
+        <w:tc>
+          <w:tcPr>
+            <w:tcW w:w="8278" w:type="dxa"/>
+          </w:tcPr>
+          <w:p>
+            <w:pPr>
+              <w:pStyle w:val="afff4"/>
+              <w:keepNext/>
+              <w:ind w:leftChars="0" w:left="0"/>
+            </w:pPr>
+            <w:bookmarkStart w:id="67" w:name="_Ref225175111"/>
+            <w:r>
+              <w:rPr>
+                <w:rFonts w:hint="eastAsia"/>
+              </w:rPr>
+              <w:t>配置</w:t>
+            </w:r>
+            <w:r>
+              <w:rPr>
+                <w:rFonts w:hint="eastAsia"/>
+              </w:rPr>
+              <w:t xml:space="preserve"> </w:t>
+            </w:r>
+            <w:r>
+              <w:fldChar w:fldCharType="begin"/>
+            </w:r>
+            <w:r>
+              <w:instrText xml:space="preserve"> </w:instrText>
+            </w:r>
+            <w:r>
+              <w:rPr>
+                <w:rFonts w:hint="eastAsia"/>
+              </w:rPr>
+              <w:instrText>STYLEREF 1 \s</w:instrText>
+            </w:r>
+            <w:r>
+              <w:instrText xml:space="preserve"> </w:instrText>
+            </w:r>
+            <w:r>
+              <w:fldChar w:fldCharType="separate"/>
+            </w:r>
+            <w:r>
+              <w:rPr>
+                <w:noProof/>
+              </w:rPr>
+              <w:t>4</w:t>
+            </w:r>
+            <w:r>
+              <w:fldChar w:fldCharType="end"/>
+            </w:r>
+            <w:r>
+              <w:noBreakHyphen/>
+            </w:r>
+            <w:r>
+              <w:fldChar w:fldCharType="begin"/>
+            </w:r>
+            <w:r>
+              <w:instrText xml:space="preserve"> </w:instrText>
+            </w:r>
+            <w:r>
+              <w:rPr>
+                <w:rFonts w:hint="eastAsia"/>
+              </w:rPr>
+              <w:instrText xml:space="preserve">SEQ </w:instrText>
+            </w:r>
+            <w:r>
+              <w:rPr>
+                <w:rFonts w:hint="eastAsia"/>
+              </w:rPr>
+              <w:instrText>配置</w:instrText>
+            </w:r>
+            <w:r>
+              <w:rPr>
+                <w:rFonts w:hint="eastAsia"/>
+              </w:rPr>
+              <w:instrText xml:space="preserve"> \* ARABIC \s 1</w:instrText>
+            </w:r>
+            <w:r>
+              <w:instrText xml:space="preserve"> </w:instrText>
+            </w:r>
+            <w:r>
+              <w:fldChar w:fldCharType="separate"/>
+            </w:r>
+            <w:r>
+              <w:rPr>
+                <w:noProof/>
+              </w:rPr>
+              <w:t>2</w:t>
+            </w:r>
+            <w:r>
+              <w:fldChar w:fldCharType="end"/>
+            </w:r>
+            <w:bookmarkEnd w:id="67"/>
+            <w:r>
+              <w:rPr>
+                <w:rFonts w:hint="eastAsia"/>
+              </w:rPr>
+              <w:t xml:space="preserve"> </w:t>
+            </w:r>
+            <w:r>
+              <w:rPr>
+                <w:rFonts w:hint="eastAsia"/>
+              </w:rPr>
+              <w:t>pom</w:t>
+            </w:r>
+            <w:r>
+              <w:rPr>
+                <w:rFonts w:hint="eastAsia"/>
+              </w:rPr>
+              <w:t>.</w:t>
+            </w:r>
+            <w:r>
+              <w:rPr>
+                <w:rFonts w:hint="eastAsia"/>
+              </w:rPr>
+              <w:t>xml</w:t>
+            </w:r>
+          </w:p>
+        </w:tc>
+      </w:tr>
+      <w:tr>
+        <w:trPr>
+          <w:jc w:val="center"/>
+        </w:trPr>
+        <w:tc>
+          <w:tcPr>
+            <w:tcW w:w="8278" w:type="dxa"/>
+          </w:tcPr>
+          <w:p>
+            <w:pPr>
+              <w:widowControl w:val="0"/>
+              <w:numPr>
+                <w:ilvl w:val="0"/>
+                <w:numId w:val="45"/>
+              </w:numPr>
+              <w:autoSpaceDE w:val="0"/>
+              <w:autoSpaceDN w:val="0"/>
+              <w:adjustRightInd w:val="0"/>
+              <w:spacing w:line="300" w:lineRule="auto"/>
+              <w:rPr>
+                <w:rFonts w:ascii="Courier New" w:hAnsi="Courier New" w:cs="Courier New"/>
+                <w:color w:val="000000"/>
+              </w:rPr>
+            </w:pPr>
+            <w:r>
+              <w:rPr>
+                <w:rFonts w:ascii="Courier New" w:hAnsi="Courier New" w:cs="Courier New"/>
+                <w:color w:val="000000"/>
+              </w:rPr>
+              <w:t>&lt;dependency&gt;</w:t>
+            </w:r>
+          </w:p>
+          <w:p>
+            <w:pPr>
+              <w:widowControl w:val="0"/>
+              <w:numPr>
+                <w:ilvl w:val="0"/>
+                <w:numId w:val="45"/>
+              </w:numPr>
+              <w:autoSpaceDE w:val="0"/>
+              <w:autoSpaceDN w:val="0"/>
+              <w:adjustRightInd w:val="0"/>
+              <w:spacing w:line="300" w:lineRule="auto"/>
+              <w:rPr>
+                <w:rFonts w:ascii="Courier New" w:hAnsi="Courier New" w:cs="Courier New"/>
+                <w:color w:val="000000"/>
+              </w:rPr>
+            </w:pPr>
+            <w:r>
+              <w:rPr>
+                <w:rFonts w:ascii="Courier New" w:hAnsi="Courier New" w:cs="Courier New"/>
+                <w:color w:val="000000"/>
+              </w:rPr>
+              <w:tab/>
+            </w:r>
+            <w:r>
+              <w:rPr>
+                <w:rFonts w:ascii="Courier New" w:hAnsi="Courier New" w:cs="Courier New"/>
+                <w:color w:val="000000"/>
+              </w:rPr>
+              <w:t>&lt;</w:t>
+            </w:r>
+            <w:proofErr w:type="spellStart"/>
+            <w:r>
+              <w:rPr>
+                <w:rFonts w:ascii="Courier New" w:hAnsi="Courier New" w:cs="Courier New"/>
+                <w:color w:val="000000"/>
+              </w:rPr>
+              <w:t>groupId</w:t>
+            </w:r>
+            <w:proofErr w:type="spellEnd"/>
+            <w:r>
+              <w:rPr>
+                <w:rFonts w:ascii="Courier New" w:hAnsi="Courier New" w:cs="Courier New"/>
+                <w:color w:val="000000"/>
+              </w:rPr>
+              <w:t>&gt;yuan&lt;/</w:t>
+            </w:r>
+            <w:proofErr w:type="spellStart"/>
+            <w:r>
+              <w:rPr>
+                <w:rFonts w:ascii="Courier New" w:hAnsi="Courier New" w:cs="Courier New"/>
+                <w:color w:val="000000"/>
+              </w:rPr>
+              <w:t>groupId</w:t>
+            </w:r>
+            <w:proofErr w:type="spellEnd"/>
+            <w:r>
+              <w:rPr>
+                <w:rFonts w:ascii="Courier New" w:hAnsi="Courier New" w:cs="Courier New"/>
+                <w:color w:val="000000"/>
+              </w:rPr>
+              <w:t>&gt;</w:t>
+            </w:r>
+          </w:p>
+          <w:p>
+            <w:pPr>
+              <w:widowControl w:val="0"/>
+              <w:numPr>
+                <w:ilvl w:val="0"/>
+                <w:numId w:val="45"/>
+              </w:numPr>
+              <w:autoSpaceDE w:val="0"/>
+              <w:autoSpaceDN w:val="0"/>
+              <w:adjustRightInd w:val="0"/>
+              <w:spacing w:line="300" w:lineRule="auto"/>
+              <w:rPr>
+                <w:rFonts w:ascii="Courier New" w:hAnsi="Courier New" w:cs="Courier New"/>
+                <w:color w:val="000000"/>
+              </w:rPr>
+            </w:pPr>
+            <w:r>
+              <w:rPr>
+                <w:rFonts w:ascii="Courier New" w:hAnsi="Courier New" w:cs="Courier New"/>
+                <w:color w:val="000000"/>
+              </w:rPr>
+              <w:t xml:space="preserve"> </w:t>
+            </w:r>
+            <w:r>
+              <w:rPr>
+                <w:rFonts w:ascii="Courier New" w:hAnsi="Courier New" w:cs="Courier New"/>
+                <w:color w:val="000000"/>
+              </w:rPr>
+              <w:tab/>
+            </w:r>
+            <w:r>
+              <w:rPr>
+                <w:rFonts w:ascii="Courier New" w:hAnsi="Courier New" w:cs="Courier New"/>
+                <w:color w:val="000000"/>
+              </w:rPr>
+              <w:t>&lt;</w:t>
+            </w:r>
+            <w:proofErr w:type="spellStart"/>
+            <w:r>
+              <w:rPr>
+                <w:rFonts w:ascii="Courier New" w:hAnsi="Courier New" w:cs="Courier New"/>
+                <w:color w:val="000000"/>
+              </w:rPr>
+              <w:t>artifactId</w:t>
+            </w:r>
+            <w:proofErr w:type="spellEnd"/>
+            <w:r>
+              <w:rPr>
+                <w:rFonts w:ascii="Courier New" w:hAnsi="Courier New" w:cs="Courier New"/>
+                <w:color w:val="000000"/>
+              </w:rPr>
+              <w:t>&gt;yuan-common&lt;/</w:t>
+            </w:r>
+            <w:proofErr w:type="spellStart"/>
+            <w:r>
+              <w:rPr>
+                <w:rFonts w:ascii="Courier New" w:hAnsi="Courier New" w:cs="Courier New"/>
+                <w:color w:val="000000"/>
+              </w:rPr>
+              <w:t>artifactId</w:t>
+            </w:r>
+            <w:proofErr w:type="spellEnd"/>
+            <w:r>
+              <w:rPr>
+                <w:rFonts w:ascii="Courier New" w:hAnsi="Courier New" w:cs="Courier New"/>
+                <w:color w:val="000000"/>
+              </w:rPr>
+              <w:t>&gt;</w:t>
+            </w:r>
+          </w:p>
+          <w:p>
+            <w:pPr>
+              <w:widowControl w:val="0"/>
+              <w:numPr>
+                <w:ilvl w:val="0"/>
+                <w:numId w:val="45"/>
+              </w:numPr>
+              <w:autoSpaceDE w:val="0"/>
+              <w:autoSpaceDN w:val="0"/>
+              <w:adjustRightInd w:val="0"/>
+              <w:spacing w:line="300" w:lineRule="auto"/>
+              <w:rPr>
+                <w:rFonts w:ascii="Courier New" w:hAnsi="Courier New" w:cs="Courier New"/>
+                <w:color w:val="000000"/>
+              </w:rPr>
+            </w:pPr>
+            <w:r>
+              <w:rPr>
+                <w:rFonts w:ascii="Courier New" w:hAnsi="Courier New" w:cs="Courier New"/>
+                <w:color w:val="000000"/>
+              </w:rPr>
+              <w:t xml:space="preserve">  &lt;version&gt;1.0.8&lt;/version&gt;</w:t>
+            </w:r>
+          </w:p>
+          <w:p>
+            <w:pPr>
+              <w:widowControl w:val="0"/>
+              <w:numPr>
+                <w:ilvl w:val="0"/>
+                <w:numId w:val="45"/>
+              </w:numPr>
+              <w:autoSpaceDE w:val="0"/>
+              <w:autoSpaceDN w:val="0"/>
+              <w:adjustRightInd w:val="0"/>
+              <w:spacing w:line="300" w:lineRule="auto"/>
+              <w:rPr>
+                <w:rFonts w:ascii="Courier New" w:hAnsi="Courier New" w:cs="Courier New"/>
+                <w:color w:val="000000"/>
+              </w:rPr>
+            </w:pPr>
+            <w:r>
+              <w:rPr>
+                <w:rFonts w:ascii="Courier New" w:hAnsi="Courier New" w:cs="Courier New"/>
+                <w:color w:val="000000"/>
+              </w:rPr>
+              <w:t>&lt;/dependency&gt;</w:t>
+            </w:r>
+          </w:p>
+        </w:tc>
+      </w:tr>
+    </w:tbl>
+    <w:p>
+      <w:pPr>
+        <w:pStyle w:val="23"/>
+        <w:ind w:firstLine="480"/>
+      </w:pPr>
+      <w:r>
+        <w:rPr>
+          <w:rFonts w:hint="eastAsia"/>
+        </w:rPr>
+        <w:t>插件的源文件需要放在</w:t>
+      </w:r>
+      <w:proofErr w:type="spellStart"/>
+      <w:r>
+        <w:rPr>
+          <w:rFonts w:hint="eastAsia"/>
+        </w:rPr>
+        <w:t>src</w:t>
+      </w:r>
+      <w:proofErr w:type="spellEnd"/>
+      <w:r>
+        <w:rPr>
+          <w:rFonts w:hint="eastAsia"/>
+        </w:rPr>
+        <w:t>/com/</w:t>
+      </w:r>
+      <w:proofErr w:type="spellStart"/>
+      <w:r>
+        <w:rPr>
+          <w:rFonts w:hint="eastAsia"/>
+        </w:rPr>
+        <w:t>gly</w:t>
+      </w:r>
+      <w:proofErr w:type="spellEnd"/>
+      <w:r>
+        <w:rPr>
+          <w:rFonts w:hint="eastAsia"/>
+        </w:rPr>
+        <w:t>目录下，例如</w:t>
+      </w:r>
+      <w:r>
+        <w:t>plot-char</w:t>
+      </w:r>
+      <w:r>
+        <w:rPr>
+          <w:rFonts w:hint="eastAsia"/>
+        </w:rPr>
+        <w:t>的入口类</w:t>
+      </w:r>
+      <w:r>
+        <w:rPr>
+          <w:rFonts w:hint="eastAsia"/>
+        </w:rPr>
+        <w:t>Chart</w:t>
+      </w:r>
+      <w:r>
+        <w:rPr>
+          <w:rFonts w:hint="eastAsia"/>
+        </w:rPr>
+        <w:t>.java</w:t>
+      </w:r>
+      <w:r>
+        <w:rPr>
+          <w:rFonts w:hint="eastAsia"/>
+        </w:rPr>
+        <w:t>的包名为“</w:t>
+      </w:r>
+      <w:r>
+        <w:t xml:space="preserve">package </w:t>
+      </w:r>
+      <w:proofErr w:type="spellStart"/>
+      <w:r>
+        <w:t>com.gly</w:t>
+      </w:r>
+      <w:proofErr w:type="spellEnd"/>
+      <w:r>
+        <w:rPr>
+          <w:rFonts w:hint="eastAsia"/>
+        </w:rPr>
+        <w:t>”。</w:t>
+      </w:r>
+    </w:p>
+    <w:p>
+      <w:pPr>
+        <w:pStyle w:val="23"/>
+        <w:ind w:firstLine="480"/>
+      </w:pPr>
+      <w:r>
+        <w:rPr>
+          <w:rFonts w:hint="eastAsia"/>
+        </w:rPr>
+        <w:lastRenderedPageBreak/>
+        <w:t>插件的入口类必须实现</w:t>
+      </w:r>
+      <w:r>
+        <w:t>yuan-common</w:t>
+      </w:r>
+      <w:r>
+        <w:rPr>
+          <w:rFonts w:hint="eastAsia"/>
+        </w:rPr>
+        <w:t>中定义的</w:t>
+      </w:r>
+      <w:proofErr w:type="spellStart"/>
+      <w:r>
+        <w:t>ExecutableUnit</w:t>
+      </w:r>
+      <w:proofErr w:type="spellEnd"/>
+      <w:r>
+        <w:rPr>
+          <w:rFonts w:hint="eastAsia"/>
+        </w:rPr>
+        <w:t>接口。例如，</w:t>
+      </w:r>
+      <w:r>
+        <w:t>plot-chart</w:t>
+      </w:r>
+      <w:r>
+        <w:rPr>
+          <w:rFonts w:hint="eastAsia"/>
+        </w:rPr>
+        <w:t>插件</w:t>
+      </w:r>
+      <w:r>
+        <w:rPr>
+          <w:rFonts w:hint="eastAsia"/>
+        </w:rPr>
+        <w:t>的入口类</w:t>
+      </w:r>
+      <w:r>
+        <w:rPr>
+          <w:rFonts w:hint="eastAsia"/>
+        </w:rPr>
+        <w:t>Chart</w:t>
+      </w:r>
+      <w:r>
+        <w:rPr>
+          <w:rFonts w:hint="eastAsia"/>
+        </w:rPr>
+        <w:t>.java</w:t>
+      </w:r>
+      <w:r>
+        <w:rPr>
+          <w:rFonts w:hint="eastAsia"/>
+        </w:rPr>
+        <w:t>继承了</w:t>
+      </w:r>
+      <w:r>
+        <w:t>yuan-common</w:t>
+      </w:r>
+      <w:r>
+        <w:rPr>
+          <w:rFonts w:hint="eastAsia"/>
+        </w:rPr>
+        <w:t>中</w:t>
+      </w:r>
+      <w:r>
+        <w:rPr>
+          <w:rFonts w:hint="eastAsia"/>
+        </w:rPr>
+        <w:t>的抽象类</w:t>
+      </w:r>
+      <w:proofErr w:type="spellStart"/>
+      <w:r>
+        <w:t>BaseExecutable</w:t>
+      </w:r>
+      <w:proofErr w:type="spellEnd"/>
+      <w:r>
+        <w:rPr>
+          <w:rFonts w:hint="eastAsia"/>
+        </w:rPr>
+        <w:t>，而</w:t>
+      </w:r>
+      <w:proofErr w:type="spellStart"/>
+      <w:r>
+        <w:t>BaseExecutable</w:t>
+      </w:r>
+      <w:proofErr w:type="spellEnd"/>
+      <w:r>
+        <w:rPr>
+          <w:rFonts w:hint="eastAsia"/>
+        </w:rPr>
+        <w:t>实现了</w:t>
+      </w:r>
+      <w:proofErr w:type="spellStart"/>
+      <w:r>
+        <w:t>ExecutableUnit</w:t>
+      </w:r>
+      <w:proofErr w:type="spellEnd"/>
+      <w:r>
+        <w:rPr>
+          <w:rFonts w:hint="eastAsia"/>
+        </w:rPr>
+        <w:t>接口。</w:t>
+      </w:r>
+    </w:p>
+    <w:p>
+      <w:pPr>
+        <w:pStyle w:val="23"/>
+        <w:ind w:firstLine="480"/>
+        <w:rPr>
+          <w:rFonts w:hint="eastAsia"/>
+        </w:rPr>
+      </w:pPr>
+      <w:r>
+        <w:rPr>
+          <w:rFonts w:hint="eastAsia"/>
+        </w:rPr>
+        <w:t>此外，自定义的入口类中，如果使用</w:t>
+      </w:r>
+      <w:proofErr w:type="spellStart"/>
+      <w:r>
+        <w:rPr>
+          <w:rFonts w:hint="eastAsia"/>
+        </w:rPr>
+        <w:t>json</w:t>
+      </w:r>
+      <w:proofErr w:type="spellEnd"/>
+      <w:r>
+        <w:rPr>
+          <w:rFonts w:hint="eastAsia"/>
+        </w:rPr>
+        <w:t>配置文件，可以自行封装解析逻辑。实现完成后，就可以通过</w:t>
+      </w:r>
+      <w:r>
+        <w:fldChar w:fldCharType="begin"/>
+      </w:r>
+      <w:r>
+        <w:instrText xml:space="preserve"> </w:instrText>
+      </w:r>
+      <w:r>
+        <w:rPr>
+          <w:rFonts w:hint="eastAsia"/>
+        </w:rPr>
+        <w:instrText>REF _Ref225175924 \r \h</w:instrText>
+      </w:r>
+      <w:r>
+        <w:instrText xml:space="preserve"> </w:instrText>
+      </w:r>
+      <w:r>
+        <w:fldChar w:fldCharType="separate"/>
+      </w:r>
+      <w:r>
+        <w:t xml:space="preserve">4.2 </w:t>
+      </w:r>
+      <w:r>
+        <w:fldChar w:fldCharType="end"/>
+      </w:r>
+      <w:r>
+        <w:rPr>
+          <w:rFonts w:hint="eastAsia"/>
+        </w:rPr>
+        <w:t>和</w:t>
+      </w:r>
+      <w:r>
+        <w:fldChar w:fldCharType="begin"/>
+      </w:r>
+      <w:r>
+        <w:instrText xml:space="preserve"> REF _Ref225175925 \r \h </w:instrText>
+      </w:r>
+      <w:r>
+        <w:fldChar w:fldCharType="separate"/>
+      </w:r>
+      <w:r>
+        <w:t xml:space="preserve">4.3 </w:t>
+      </w:r>
+      <w:r>
+        <w:fldChar w:fldCharType="end"/>
+      </w:r>
+      <w:r>
+        <w:rPr>
+          <w:rFonts w:hint="eastAsia"/>
+        </w:rPr>
+        <w:t>添加自己实现的插件了。</w:t>
+      </w:r>
+    </w:p>
+    <w:p>
+      <w:pPr>
+        <w:pStyle w:val="23"/>
+        <w:ind w:firstLine="480"/>
+        <w:rPr>
+          <w:rFonts w:hint="eastAsia"/>
+        </w:rPr>
+      </w:pPr>
     </w:p>
     <w:sectPr>
-      <w:headerReference w:type="default" r:id="rId32"/>
+      <w:headerReference w:type="default" r:id="rId34"/>
       <w:endnotePr>
         <w:numFmt w:val="decimal"/>
       </w:endnotePr>
@@ -12800,7 +15139,7 @@
     </w:pict>
   </w:numPicBullet>
   <w:abstractNum w:abstractNumId="0" w15:restartNumberingAfterBreak="0">
-    <w:nsid w:val="06971238"/>
+    <w:nsid w:val="05A95A44"/>
     <w:multiLevelType w:val="multilevel"/>
     <w:tmpl w:val="5FE22469"/>
     <w:lvl w:ilvl="0">
@@ -12891,141 +15230,7 @@
     </w:lvl>
   </w:abstractNum>
   <w:abstractNum w:abstractNumId="1" w15:restartNumberingAfterBreak="0">
-    <w:nsid w:val="0D5D5E98"/>
-    <w:multiLevelType w:val="hybridMultilevel"/>
-    <w:tmpl w:val="CD00F622"/>
-    <w:lvl w:ilvl="0" w:tplc="0409000B">
-      <w:start w:val="1"/>
-      <w:numFmt w:val="bullet"/>
-      <w:lvlText w:val=""/>
-      <w:lvlJc w:val="left"/>
-      <w:pPr>
-        <w:ind w:left="440" w:hanging="440"/>
-      </w:pPr>
-      <w:rPr>
-        <w:rFonts w:ascii="Wingdings" w:hAnsi="Wingdings" w:hint="default"/>
-      </w:rPr>
-    </w:lvl>
-    <w:lvl w:ilvl="1" w:tplc="FFFFFFFF" w:tentative="1">
-      <w:start w:val="1"/>
-      <w:numFmt w:val="bullet"/>
-      <w:lvlText w:val=""/>
-      <w:lvlJc w:val="left"/>
-      <w:pPr>
-        <w:ind w:left="880" w:hanging="440"/>
-      </w:pPr>
-      <w:rPr>
-        <w:rFonts w:ascii="Wingdings" w:hAnsi="Wingdings" w:hint="default"/>
-      </w:rPr>
-    </w:lvl>
-    <w:lvl w:ilvl="2" w:tplc="FFFFFFFF" w:tentative="1">
-      <w:start w:val="1"/>
-      <w:numFmt w:val="bullet"/>
-      <w:lvlText w:val=""/>
-      <w:lvlJc w:val="left"/>
-      <w:pPr>
-        <w:ind w:left="1320" w:hanging="440"/>
-      </w:pPr>
-      <w:rPr>
-        <w:rFonts w:ascii="Wingdings" w:hAnsi="Wingdings" w:hint="default"/>
-      </w:rPr>
-    </w:lvl>
-    <w:lvl w:ilvl="3" w:tplc="FFFFFFFF" w:tentative="1">
-      <w:start w:val="1"/>
-      <w:numFmt w:val="bullet"/>
-      <w:lvlText w:val=""/>
-      <w:lvlJc w:val="left"/>
-      <w:pPr>
-        <w:ind w:left="1760" w:hanging="440"/>
-      </w:pPr>
-      <w:rPr>
-        <w:rFonts w:ascii="Wingdings" w:hAnsi="Wingdings" w:hint="default"/>
-      </w:rPr>
-    </w:lvl>
-    <w:lvl w:ilvl="4" w:tplc="FFFFFFFF" w:tentative="1">
-      <w:start w:val="1"/>
-      <w:numFmt w:val="bullet"/>
-      <w:lvlText w:val=""/>
-      <w:lvlJc w:val="left"/>
-      <w:pPr>
-        <w:ind w:left="2200" w:hanging="440"/>
-      </w:pPr>
-      <w:rPr>
-        <w:rFonts w:ascii="Wingdings" w:hAnsi="Wingdings" w:hint="default"/>
-      </w:rPr>
-    </w:lvl>
-    <w:lvl w:ilvl="5" w:tplc="FFFFFFFF" w:tentative="1">
-      <w:start w:val="1"/>
-      <w:numFmt w:val="bullet"/>
-      <w:lvlText w:val=""/>
-      <w:lvlJc w:val="left"/>
-      <w:pPr>
-        <w:ind w:left="2640" w:hanging="440"/>
-      </w:pPr>
-      <w:rPr>
-        <w:rFonts w:ascii="Wingdings" w:hAnsi="Wingdings" w:hint="default"/>
-      </w:rPr>
-    </w:lvl>
-    <w:lvl w:ilvl="6" w:tplc="FFFFFFFF" w:tentative="1">
-      <w:start w:val="1"/>
-      <w:numFmt w:val="bullet"/>
-      <w:lvlText w:val=""/>
-      <w:lvlJc w:val="left"/>
-      <w:pPr>
-        <w:ind w:left="3080" w:hanging="440"/>
-      </w:pPr>
-      <w:rPr>
-        <w:rFonts w:ascii="Wingdings" w:hAnsi="Wingdings" w:hint="default"/>
-      </w:rPr>
-    </w:lvl>
-    <w:lvl w:ilvl="7" w:tplc="FFFFFFFF" w:tentative="1">
-      <w:start w:val="1"/>
-      <w:numFmt w:val="bullet"/>
-      <w:lvlText w:val=""/>
-      <w:lvlJc w:val="left"/>
-      <w:pPr>
-        <w:ind w:left="3520" w:hanging="440"/>
-      </w:pPr>
-      <w:rPr>
-        <w:rFonts w:ascii="Wingdings" w:hAnsi="Wingdings" w:hint="default"/>
-      </w:rPr>
-    </w:lvl>
-    <w:lvl w:ilvl="8" w:tplc="FFFFFFFF" w:tentative="1">
-      <w:start w:val="1"/>
-      <w:numFmt w:val="bullet"/>
-      <w:lvlText w:val=""/>
-      <w:lvlJc w:val="left"/>
-      <w:pPr>
-        <w:ind w:left="3960" w:hanging="440"/>
-      </w:pPr>
-      <w:rPr>
-        <w:rFonts w:ascii="Wingdings" w:hAnsi="Wingdings" w:hint="default"/>
-      </w:rPr>
-    </w:lvl>
-  </w:abstractNum>
-  <w:abstractNum w:abstractNumId="2" w15:restartNumberingAfterBreak="0">
-    <w:nsid w:val="1536730A"/>
-    <w:multiLevelType w:val="singleLevel"/>
-    <w:tmpl w:val="1536730A"/>
-    <w:lvl w:ilvl="0">
-      <w:start w:val="1"/>
-      <w:numFmt w:val="upperLetter"/>
-      <w:pStyle w:val="a"/>
-      <w:lvlText w:val="附录%1"/>
-      <w:lvlJc w:val="left"/>
-      <w:pPr>
-        <w:tabs>
-          <w:tab w:val="left" w:pos="720"/>
-        </w:tabs>
-        <w:ind w:left="680" w:hanging="680"/>
-      </w:pPr>
-      <w:rPr>
-        <w:rFonts w:hint="eastAsia"/>
-      </w:rPr>
-    </w:lvl>
-  </w:abstractNum>
-  <w:abstractNum w:abstractNumId="3" w15:restartNumberingAfterBreak="0">
-    <w:nsid w:val="1716532E"/>
+    <w:nsid w:val="06971238"/>
     <w:multiLevelType w:val="multilevel"/>
     <w:tmpl w:val="5FE22469"/>
     <w:lvl w:ilvl="0">
@@ -13115,8 +15320,142 @@
       </w:pPr>
     </w:lvl>
   </w:abstractNum>
+  <w:abstractNum w:abstractNumId="2" w15:restartNumberingAfterBreak="0">
+    <w:nsid w:val="0D5D5E98"/>
+    <w:multiLevelType w:val="hybridMultilevel"/>
+    <w:tmpl w:val="CD00F622"/>
+    <w:lvl w:ilvl="0" w:tplc="0409000B">
+      <w:start w:val="1"/>
+      <w:numFmt w:val="bullet"/>
+      <w:lvlText w:val=""/>
+      <w:lvlJc w:val="left"/>
+      <w:pPr>
+        <w:ind w:left="440" w:hanging="440"/>
+      </w:pPr>
+      <w:rPr>
+        <w:rFonts w:ascii="Wingdings" w:hAnsi="Wingdings" w:hint="default"/>
+      </w:rPr>
+    </w:lvl>
+    <w:lvl w:ilvl="1" w:tplc="FFFFFFFF" w:tentative="1">
+      <w:start w:val="1"/>
+      <w:numFmt w:val="bullet"/>
+      <w:lvlText w:val=""/>
+      <w:lvlJc w:val="left"/>
+      <w:pPr>
+        <w:ind w:left="880" w:hanging="440"/>
+      </w:pPr>
+      <w:rPr>
+        <w:rFonts w:ascii="Wingdings" w:hAnsi="Wingdings" w:hint="default"/>
+      </w:rPr>
+    </w:lvl>
+    <w:lvl w:ilvl="2" w:tplc="FFFFFFFF" w:tentative="1">
+      <w:start w:val="1"/>
+      <w:numFmt w:val="bullet"/>
+      <w:lvlText w:val=""/>
+      <w:lvlJc w:val="left"/>
+      <w:pPr>
+        <w:ind w:left="1320" w:hanging="440"/>
+      </w:pPr>
+      <w:rPr>
+        <w:rFonts w:ascii="Wingdings" w:hAnsi="Wingdings" w:hint="default"/>
+      </w:rPr>
+    </w:lvl>
+    <w:lvl w:ilvl="3" w:tplc="FFFFFFFF" w:tentative="1">
+      <w:start w:val="1"/>
+      <w:numFmt w:val="bullet"/>
+      <w:lvlText w:val=""/>
+      <w:lvlJc w:val="left"/>
+      <w:pPr>
+        <w:ind w:left="1760" w:hanging="440"/>
+      </w:pPr>
+      <w:rPr>
+        <w:rFonts w:ascii="Wingdings" w:hAnsi="Wingdings" w:hint="default"/>
+      </w:rPr>
+    </w:lvl>
+    <w:lvl w:ilvl="4" w:tplc="FFFFFFFF" w:tentative="1">
+      <w:start w:val="1"/>
+      <w:numFmt w:val="bullet"/>
+      <w:lvlText w:val=""/>
+      <w:lvlJc w:val="left"/>
+      <w:pPr>
+        <w:ind w:left="2200" w:hanging="440"/>
+      </w:pPr>
+      <w:rPr>
+        <w:rFonts w:ascii="Wingdings" w:hAnsi="Wingdings" w:hint="default"/>
+      </w:rPr>
+    </w:lvl>
+    <w:lvl w:ilvl="5" w:tplc="FFFFFFFF" w:tentative="1">
+      <w:start w:val="1"/>
+      <w:numFmt w:val="bullet"/>
+      <w:lvlText w:val=""/>
+      <w:lvlJc w:val="left"/>
+      <w:pPr>
+        <w:ind w:left="2640" w:hanging="440"/>
+      </w:pPr>
+      <w:rPr>
+        <w:rFonts w:ascii="Wingdings" w:hAnsi="Wingdings" w:hint="default"/>
+      </w:rPr>
+    </w:lvl>
+    <w:lvl w:ilvl="6" w:tplc="FFFFFFFF" w:tentative="1">
+      <w:start w:val="1"/>
+      <w:numFmt w:val="bullet"/>
+      <w:lvlText w:val=""/>
+      <w:lvlJc w:val="left"/>
+      <w:pPr>
+        <w:ind w:left="3080" w:hanging="440"/>
+      </w:pPr>
+      <w:rPr>
+        <w:rFonts w:ascii="Wingdings" w:hAnsi="Wingdings" w:hint="default"/>
+      </w:rPr>
+    </w:lvl>
+    <w:lvl w:ilvl="7" w:tplc="FFFFFFFF" w:tentative="1">
+      <w:start w:val="1"/>
+      <w:numFmt w:val="bullet"/>
+      <w:lvlText w:val=""/>
+      <w:lvlJc w:val="left"/>
+      <w:pPr>
+        <w:ind w:left="3520" w:hanging="440"/>
+      </w:pPr>
+      <w:rPr>
+        <w:rFonts w:ascii="Wingdings" w:hAnsi="Wingdings" w:hint="default"/>
+      </w:rPr>
+    </w:lvl>
+    <w:lvl w:ilvl="8" w:tplc="FFFFFFFF" w:tentative="1">
+      <w:start w:val="1"/>
+      <w:numFmt w:val="bullet"/>
+      <w:lvlText w:val=""/>
+      <w:lvlJc w:val="left"/>
+      <w:pPr>
+        <w:ind w:left="3960" w:hanging="440"/>
+      </w:pPr>
+      <w:rPr>
+        <w:rFonts w:ascii="Wingdings" w:hAnsi="Wingdings" w:hint="default"/>
+      </w:rPr>
+    </w:lvl>
+  </w:abstractNum>
+  <w:abstractNum w:abstractNumId="3" w15:restartNumberingAfterBreak="0">
+    <w:nsid w:val="1536730A"/>
+    <w:multiLevelType w:val="singleLevel"/>
+    <w:tmpl w:val="1536730A"/>
+    <w:lvl w:ilvl="0">
+      <w:start w:val="1"/>
+      <w:numFmt w:val="upperLetter"/>
+      <w:pStyle w:val="a"/>
+      <w:lvlText w:val="附录%1"/>
+      <w:lvlJc w:val="left"/>
+      <w:pPr>
+        <w:tabs>
+          <w:tab w:val="left" w:pos="720"/>
+        </w:tabs>
+        <w:ind w:left="680" w:hanging="680"/>
+      </w:pPr>
+      <w:rPr>
+        <w:rFonts w:hint="eastAsia"/>
+      </w:rPr>
+    </w:lvl>
+  </w:abstractNum>
   <w:abstractNum w:abstractNumId="4" w15:restartNumberingAfterBreak="0">
-    <w:nsid w:val="1A225312"/>
+    <w:nsid w:val="1716532E"/>
     <w:multiLevelType w:val="multilevel"/>
     <w:tmpl w:val="5FE22469"/>
     <w:lvl w:ilvl="0">
@@ -13207,7 +15546,7 @@
     </w:lvl>
   </w:abstractNum>
   <w:abstractNum w:abstractNumId="5" w15:restartNumberingAfterBreak="0">
-    <w:nsid w:val="1C4531CB"/>
+    <w:nsid w:val="1A225312"/>
     <w:multiLevelType w:val="multilevel"/>
     <w:tmpl w:val="5FE22469"/>
     <w:lvl w:ilvl="0">
@@ -13298,7 +15637,7 @@
     </w:lvl>
   </w:abstractNum>
   <w:abstractNum w:abstractNumId="6" w15:restartNumberingAfterBreak="0">
-    <w:nsid w:val="21BB299B"/>
+    <w:nsid w:val="1C4531CB"/>
     <w:multiLevelType w:val="multilevel"/>
     <w:tmpl w:val="5FE22469"/>
     <w:lvl w:ilvl="0">
@@ -13389,7 +15728,7 @@
     </w:lvl>
   </w:abstractNum>
   <w:abstractNum w:abstractNumId="7" w15:restartNumberingAfterBreak="0">
-    <w:nsid w:val="222635B9"/>
+    <w:nsid w:val="1CDB31A6"/>
     <w:multiLevelType w:val="multilevel"/>
     <w:tmpl w:val="5FE22469"/>
     <w:lvl w:ilvl="0">
@@ -13480,233 +15819,7 @@
     </w:lvl>
   </w:abstractNum>
   <w:abstractNum w:abstractNumId="8" w15:restartNumberingAfterBreak="0">
-    <w:nsid w:val="25E46857"/>
-    <w:multiLevelType w:val="hybridMultilevel"/>
-    <w:tmpl w:val="44587382"/>
-    <w:lvl w:ilvl="0" w:tplc="0409000D">
-      <w:start w:val="1"/>
-      <w:numFmt w:val="bullet"/>
-      <w:lvlText w:val=""/>
-      <w:lvlJc w:val="left"/>
-      <w:pPr>
-        <w:ind w:left="440" w:hanging="440"/>
-      </w:pPr>
-      <w:rPr>
-        <w:rFonts w:ascii="Wingdings" w:hAnsi="Wingdings" w:hint="default"/>
-      </w:rPr>
-    </w:lvl>
-    <w:lvl w:ilvl="1" w:tplc="FFFFFFFF" w:tentative="1">
-      <w:start w:val="1"/>
-      <w:numFmt w:val="bullet"/>
-      <w:lvlText w:val=""/>
-      <w:lvlJc w:val="left"/>
-      <w:pPr>
-        <w:ind w:left="880" w:hanging="440"/>
-      </w:pPr>
-      <w:rPr>
-        <w:rFonts w:ascii="Wingdings" w:hAnsi="Wingdings" w:hint="default"/>
-      </w:rPr>
-    </w:lvl>
-    <w:lvl w:ilvl="2" w:tplc="FFFFFFFF" w:tentative="1">
-      <w:start w:val="1"/>
-      <w:numFmt w:val="bullet"/>
-      <w:lvlText w:val=""/>
-      <w:lvlJc w:val="left"/>
-      <w:pPr>
-        <w:ind w:left="1320" w:hanging="440"/>
-      </w:pPr>
-      <w:rPr>
-        <w:rFonts w:ascii="Wingdings" w:hAnsi="Wingdings" w:hint="default"/>
-      </w:rPr>
-    </w:lvl>
-    <w:lvl w:ilvl="3" w:tplc="FFFFFFFF" w:tentative="1">
-      <w:start w:val="1"/>
-      <w:numFmt w:val="bullet"/>
-      <w:lvlText w:val=""/>
-      <w:lvlJc w:val="left"/>
-      <w:pPr>
-        <w:ind w:left="1760" w:hanging="440"/>
-      </w:pPr>
-      <w:rPr>
-        <w:rFonts w:ascii="Wingdings" w:hAnsi="Wingdings" w:hint="default"/>
-      </w:rPr>
-    </w:lvl>
-    <w:lvl w:ilvl="4" w:tplc="FFFFFFFF" w:tentative="1">
-      <w:start w:val="1"/>
-      <w:numFmt w:val="bullet"/>
-      <w:lvlText w:val=""/>
-      <w:lvlJc w:val="left"/>
-      <w:pPr>
-        <w:ind w:left="2200" w:hanging="440"/>
-      </w:pPr>
-      <w:rPr>
-        <w:rFonts w:ascii="Wingdings" w:hAnsi="Wingdings" w:hint="default"/>
-      </w:rPr>
-    </w:lvl>
-    <w:lvl w:ilvl="5" w:tplc="FFFFFFFF" w:tentative="1">
-      <w:start w:val="1"/>
-      <w:numFmt w:val="bullet"/>
-      <w:lvlText w:val=""/>
-      <w:lvlJc w:val="left"/>
-      <w:pPr>
-        <w:ind w:left="2640" w:hanging="440"/>
-      </w:pPr>
-      <w:rPr>
-        <w:rFonts w:ascii="Wingdings" w:hAnsi="Wingdings" w:hint="default"/>
-      </w:rPr>
-    </w:lvl>
-    <w:lvl w:ilvl="6" w:tplc="FFFFFFFF" w:tentative="1">
-      <w:start w:val="1"/>
-      <w:numFmt w:val="bullet"/>
-      <w:lvlText w:val=""/>
-      <w:lvlJc w:val="left"/>
-      <w:pPr>
-        <w:ind w:left="3080" w:hanging="440"/>
-      </w:pPr>
-      <w:rPr>
-        <w:rFonts w:ascii="Wingdings" w:hAnsi="Wingdings" w:hint="default"/>
-      </w:rPr>
-    </w:lvl>
-    <w:lvl w:ilvl="7" w:tplc="FFFFFFFF" w:tentative="1">
-      <w:start w:val="1"/>
-      <w:numFmt w:val="bullet"/>
-      <w:lvlText w:val=""/>
-      <w:lvlJc w:val="left"/>
-      <w:pPr>
-        <w:ind w:left="3520" w:hanging="440"/>
-      </w:pPr>
-      <w:rPr>
-        <w:rFonts w:ascii="Wingdings" w:hAnsi="Wingdings" w:hint="default"/>
-      </w:rPr>
-    </w:lvl>
-    <w:lvl w:ilvl="8" w:tplc="FFFFFFFF" w:tentative="1">
-      <w:start w:val="1"/>
-      <w:numFmt w:val="bullet"/>
-      <w:lvlText w:val=""/>
-      <w:lvlJc w:val="left"/>
-      <w:pPr>
-        <w:ind w:left="3960" w:hanging="440"/>
-      </w:pPr>
-      <w:rPr>
-        <w:rFonts w:ascii="Wingdings" w:hAnsi="Wingdings" w:hint="default"/>
-      </w:rPr>
-    </w:lvl>
-  </w:abstractNum>
-  <w:abstractNum w:abstractNumId="9" w15:restartNumberingAfterBreak="0">
-    <w:nsid w:val="2B60327D"/>
-    <w:multiLevelType w:val="hybridMultilevel"/>
-    <w:tmpl w:val="17A0BC04"/>
-    <w:lvl w:ilvl="0" w:tplc="0409000B">
-      <w:start w:val="1"/>
-      <w:numFmt w:val="bullet"/>
-      <w:lvlText w:val=""/>
-      <w:lvlJc w:val="left"/>
-      <w:pPr>
-        <w:ind w:left="440" w:hanging="440"/>
-      </w:pPr>
-      <w:rPr>
-        <w:rFonts w:ascii="Wingdings" w:hAnsi="Wingdings" w:hint="default"/>
-      </w:rPr>
-    </w:lvl>
-    <w:lvl w:ilvl="1" w:tplc="FFFFFFFF" w:tentative="1">
-      <w:start w:val="1"/>
-      <w:numFmt w:val="bullet"/>
-      <w:lvlText w:val=""/>
-      <w:lvlJc w:val="left"/>
-      <w:pPr>
-        <w:ind w:left="880" w:hanging="440"/>
-      </w:pPr>
-      <w:rPr>
-        <w:rFonts w:ascii="Wingdings" w:hAnsi="Wingdings" w:hint="default"/>
-      </w:rPr>
-    </w:lvl>
-    <w:lvl w:ilvl="2" w:tplc="FFFFFFFF" w:tentative="1">
-      <w:start w:val="1"/>
-      <w:numFmt w:val="bullet"/>
-      <w:lvlText w:val=""/>
-      <w:lvlJc w:val="left"/>
-      <w:pPr>
-        <w:ind w:left="1320" w:hanging="440"/>
-      </w:pPr>
-      <w:rPr>
-        <w:rFonts w:ascii="Wingdings" w:hAnsi="Wingdings" w:hint="default"/>
-      </w:rPr>
-    </w:lvl>
-    <w:lvl w:ilvl="3" w:tplc="FFFFFFFF" w:tentative="1">
-      <w:start w:val="1"/>
-      <w:numFmt w:val="bullet"/>
-      <w:lvlText w:val=""/>
-      <w:lvlJc w:val="left"/>
-      <w:pPr>
-        <w:ind w:left="1760" w:hanging="440"/>
-      </w:pPr>
-      <w:rPr>
-        <w:rFonts w:ascii="Wingdings" w:hAnsi="Wingdings" w:hint="default"/>
-      </w:rPr>
-    </w:lvl>
-    <w:lvl w:ilvl="4" w:tplc="FFFFFFFF" w:tentative="1">
-      <w:start w:val="1"/>
-      <w:numFmt w:val="bullet"/>
-      <w:lvlText w:val=""/>
-      <w:lvlJc w:val="left"/>
-      <w:pPr>
-        <w:ind w:left="2200" w:hanging="440"/>
-      </w:pPr>
-      <w:rPr>
-        <w:rFonts w:ascii="Wingdings" w:hAnsi="Wingdings" w:hint="default"/>
-      </w:rPr>
-    </w:lvl>
-    <w:lvl w:ilvl="5" w:tplc="FFFFFFFF" w:tentative="1">
-      <w:start w:val="1"/>
-      <w:numFmt w:val="bullet"/>
-      <w:lvlText w:val=""/>
-      <w:lvlJc w:val="left"/>
-      <w:pPr>
-        <w:ind w:left="2640" w:hanging="440"/>
-      </w:pPr>
-      <w:rPr>
-        <w:rFonts w:ascii="Wingdings" w:hAnsi="Wingdings" w:hint="default"/>
-      </w:rPr>
-    </w:lvl>
-    <w:lvl w:ilvl="6" w:tplc="FFFFFFFF" w:tentative="1">
-      <w:start w:val="1"/>
-      <w:numFmt w:val="bullet"/>
-      <w:lvlText w:val=""/>
-      <w:lvlJc w:val="left"/>
-      <w:pPr>
-        <w:ind w:left="3080" w:hanging="440"/>
-      </w:pPr>
-      <w:rPr>
-        <w:rFonts w:ascii="Wingdings" w:hAnsi="Wingdings" w:hint="default"/>
-      </w:rPr>
-    </w:lvl>
-    <w:lvl w:ilvl="7" w:tplc="FFFFFFFF" w:tentative="1">
-      <w:start w:val="1"/>
-      <w:numFmt w:val="bullet"/>
-      <w:lvlText w:val=""/>
-      <w:lvlJc w:val="left"/>
-      <w:pPr>
-        <w:ind w:left="3520" w:hanging="440"/>
-      </w:pPr>
-      <w:rPr>
-        <w:rFonts w:ascii="Wingdings" w:hAnsi="Wingdings" w:hint="default"/>
-      </w:rPr>
-    </w:lvl>
-    <w:lvl w:ilvl="8" w:tplc="FFFFFFFF" w:tentative="1">
-      <w:start w:val="1"/>
-      <w:numFmt w:val="bullet"/>
-      <w:lvlText w:val=""/>
-      <w:lvlJc w:val="left"/>
-      <w:pPr>
-        <w:ind w:left="3960" w:hanging="440"/>
-      </w:pPr>
-      <w:rPr>
-        <w:rFonts w:ascii="Wingdings" w:hAnsi="Wingdings" w:hint="default"/>
-      </w:rPr>
-    </w:lvl>
-  </w:abstractNum>
-  <w:abstractNum w:abstractNumId="10" w15:restartNumberingAfterBreak="0">
-    <w:nsid w:val="2B790D59"/>
+    <w:nsid w:val="21BB299B"/>
     <w:multiLevelType w:val="multilevel"/>
     <w:tmpl w:val="5FE22469"/>
     <w:lvl w:ilvl="0">
@@ -13796,8 +15909,8 @@
       </w:pPr>
     </w:lvl>
   </w:abstractNum>
-  <w:abstractNum w:abstractNumId="11" w15:restartNumberingAfterBreak="0">
-    <w:nsid w:val="2E553710"/>
+  <w:abstractNum w:abstractNumId="9" w15:restartNumberingAfterBreak="0">
+    <w:nsid w:val="222635B9"/>
     <w:multiLevelType w:val="multilevel"/>
     <w:tmpl w:val="5FE22469"/>
     <w:lvl w:ilvl="0">
@@ -13887,8 +16000,234 @@
       </w:pPr>
     </w:lvl>
   </w:abstractNum>
+  <w:abstractNum w:abstractNumId="10" w15:restartNumberingAfterBreak="0">
+    <w:nsid w:val="25E46857"/>
+    <w:multiLevelType w:val="hybridMultilevel"/>
+    <w:tmpl w:val="44587382"/>
+    <w:lvl w:ilvl="0" w:tplc="0409000D">
+      <w:start w:val="1"/>
+      <w:numFmt w:val="bullet"/>
+      <w:lvlText w:val=""/>
+      <w:lvlJc w:val="left"/>
+      <w:pPr>
+        <w:ind w:left="440" w:hanging="440"/>
+      </w:pPr>
+      <w:rPr>
+        <w:rFonts w:ascii="Wingdings" w:hAnsi="Wingdings" w:hint="default"/>
+      </w:rPr>
+    </w:lvl>
+    <w:lvl w:ilvl="1" w:tplc="FFFFFFFF" w:tentative="1">
+      <w:start w:val="1"/>
+      <w:numFmt w:val="bullet"/>
+      <w:lvlText w:val=""/>
+      <w:lvlJc w:val="left"/>
+      <w:pPr>
+        <w:ind w:left="880" w:hanging="440"/>
+      </w:pPr>
+      <w:rPr>
+        <w:rFonts w:ascii="Wingdings" w:hAnsi="Wingdings" w:hint="default"/>
+      </w:rPr>
+    </w:lvl>
+    <w:lvl w:ilvl="2" w:tplc="FFFFFFFF" w:tentative="1">
+      <w:start w:val="1"/>
+      <w:numFmt w:val="bullet"/>
+      <w:lvlText w:val=""/>
+      <w:lvlJc w:val="left"/>
+      <w:pPr>
+        <w:ind w:left="1320" w:hanging="440"/>
+      </w:pPr>
+      <w:rPr>
+        <w:rFonts w:ascii="Wingdings" w:hAnsi="Wingdings" w:hint="default"/>
+      </w:rPr>
+    </w:lvl>
+    <w:lvl w:ilvl="3" w:tplc="FFFFFFFF" w:tentative="1">
+      <w:start w:val="1"/>
+      <w:numFmt w:val="bullet"/>
+      <w:lvlText w:val=""/>
+      <w:lvlJc w:val="left"/>
+      <w:pPr>
+        <w:ind w:left="1760" w:hanging="440"/>
+      </w:pPr>
+      <w:rPr>
+        <w:rFonts w:ascii="Wingdings" w:hAnsi="Wingdings" w:hint="default"/>
+      </w:rPr>
+    </w:lvl>
+    <w:lvl w:ilvl="4" w:tplc="FFFFFFFF" w:tentative="1">
+      <w:start w:val="1"/>
+      <w:numFmt w:val="bullet"/>
+      <w:lvlText w:val=""/>
+      <w:lvlJc w:val="left"/>
+      <w:pPr>
+        <w:ind w:left="2200" w:hanging="440"/>
+      </w:pPr>
+      <w:rPr>
+        <w:rFonts w:ascii="Wingdings" w:hAnsi="Wingdings" w:hint="default"/>
+      </w:rPr>
+    </w:lvl>
+    <w:lvl w:ilvl="5" w:tplc="FFFFFFFF" w:tentative="1">
+      <w:start w:val="1"/>
+      <w:numFmt w:val="bullet"/>
+      <w:lvlText w:val=""/>
+      <w:lvlJc w:val="left"/>
+      <w:pPr>
+        <w:ind w:left="2640" w:hanging="440"/>
+      </w:pPr>
+      <w:rPr>
+        <w:rFonts w:ascii="Wingdings" w:hAnsi="Wingdings" w:hint="default"/>
+      </w:rPr>
+    </w:lvl>
+    <w:lvl w:ilvl="6" w:tplc="FFFFFFFF" w:tentative="1">
+      <w:start w:val="1"/>
+      <w:numFmt w:val="bullet"/>
+      <w:lvlText w:val=""/>
+      <w:lvlJc w:val="left"/>
+      <w:pPr>
+        <w:ind w:left="3080" w:hanging="440"/>
+      </w:pPr>
+      <w:rPr>
+        <w:rFonts w:ascii="Wingdings" w:hAnsi="Wingdings" w:hint="default"/>
+      </w:rPr>
+    </w:lvl>
+    <w:lvl w:ilvl="7" w:tplc="FFFFFFFF" w:tentative="1">
+      <w:start w:val="1"/>
+      <w:numFmt w:val="bullet"/>
+      <w:lvlText w:val=""/>
+      <w:lvlJc w:val="left"/>
+      <w:pPr>
+        <w:ind w:left="3520" w:hanging="440"/>
+      </w:pPr>
+      <w:rPr>
+        <w:rFonts w:ascii="Wingdings" w:hAnsi="Wingdings" w:hint="default"/>
+      </w:rPr>
+    </w:lvl>
+    <w:lvl w:ilvl="8" w:tplc="FFFFFFFF" w:tentative="1">
+      <w:start w:val="1"/>
+      <w:numFmt w:val="bullet"/>
+      <w:lvlText w:val=""/>
+      <w:lvlJc w:val="left"/>
+      <w:pPr>
+        <w:ind w:left="3960" w:hanging="440"/>
+      </w:pPr>
+      <w:rPr>
+        <w:rFonts w:ascii="Wingdings" w:hAnsi="Wingdings" w:hint="default"/>
+      </w:rPr>
+    </w:lvl>
+  </w:abstractNum>
+  <w:abstractNum w:abstractNumId="11" w15:restartNumberingAfterBreak="0">
+    <w:nsid w:val="2B60327D"/>
+    <w:multiLevelType w:val="hybridMultilevel"/>
+    <w:tmpl w:val="17A0BC04"/>
+    <w:lvl w:ilvl="0" w:tplc="0409000B">
+      <w:start w:val="1"/>
+      <w:numFmt w:val="bullet"/>
+      <w:lvlText w:val=""/>
+      <w:lvlJc w:val="left"/>
+      <w:pPr>
+        <w:ind w:left="440" w:hanging="440"/>
+      </w:pPr>
+      <w:rPr>
+        <w:rFonts w:ascii="Wingdings" w:hAnsi="Wingdings" w:hint="default"/>
+      </w:rPr>
+    </w:lvl>
+    <w:lvl w:ilvl="1" w:tplc="FFFFFFFF" w:tentative="1">
+      <w:start w:val="1"/>
+      <w:numFmt w:val="bullet"/>
+      <w:lvlText w:val=""/>
+      <w:lvlJc w:val="left"/>
+      <w:pPr>
+        <w:ind w:left="880" w:hanging="440"/>
+      </w:pPr>
+      <w:rPr>
+        <w:rFonts w:ascii="Wingdings" w:hAnsi="Wingdings" w:hint="default"/>
+      </w:rPr>
+    </w:lvl>
+    <w:lvl w:ilvl="2" w:tplc="FFFFFFFF" w:tentative="1">
+      <w:start w:val="1"/>
+      <w:numFmt w:val="bullet"/>
+      <w:lvlText w:val=""/>
+      <w:lvlJc w:val="left"/>
+      <w:pPr>
+        <w:ind w:left="1320" w:hanging="440"/>
+      </w:pPr>
+      <w:rPr>
+        <w:rFonts w:ascii="Wingdings" w:hAnsi="Wingdings" w:hint="default"/>
+      </w:rPr>
+    </w:lvl>
+    <w:lvl w:ilvl="3" w:tplc="FFFFFFFF" w:tentative="1">
+      <w:start w:val="1"/>
+      <w:numFmt w:val="bullet"/>
+      <w:lvlText w:val=""/>
+      <w:lvlJc w:val="left"/>
+      <w:pPr>
+        <w:ind w:left="1760" w:hanging="440"/>
+      </w:pPr>
+      <w:rPr>
+        <w:rFonts w:ascii="Wingdings" w:hAnsi="Wingdings" w:hint="default"/>
+      </w:rPr>
+    </w:lvl>
+    <w:lvl w:ilvl="4" w:tplc="FFFFFFFF" w:tentative="1">
+      <w:start w:val="1"/>
+      <w:numFmt w:val="bullet"/>
+      <w:lvlText w:val=""/>
+      <w:lvlJc w:val="left"/>
+      <w:pPr>
+        <w:ind w:left="2200" w:hanging="440"/>
+      </w:pPr>
+      <w:rPr>
+        <w:rFonts w:ascii="Wingdings" w:hAnsi="Wingdings" w:hint="default"/>
+      </w:rPr>
+    </w:lvl>
+    <w:lvl w:ilvl="5" w:tplc="FFFFFFFF" w:tentative="1">
+      <w:start w:val="1"/>
+      <w:numFmt w:val="bullet"/>
+      <w:lvlText w:val=""/>
+      <w:lvlJc w:val="left"/>
+      <w:pPr>
+        <w:ind w:left="2640" w:hanging="440"/>
+      </w:pPr>
+      <w:rPr>
+        <w:rFonts w:ascii="Wingdings" w:hAnsi="Wingdings" w:hint="default"/>
+      </w:rPr>
+    </w:lvl>
+    <w:lvl w:ilvl="6" w:tplc="FFFFFFFF" w:tentative="1">
+      <w:start w:val="1"/>
+      <w:numFmt w:val="bullet"/>
+      <w:lvlText w:val=""/>
+      <w:lvlJc w:val="left"/>
+      <w:pPr>
+        <w:ind w:left="3080" w:hanging="440"/>
+      </w:pPr>
+      <w:rPr>
+        <w:rFonts w:ascii="Wingdings" w:hAnsi="Wingdings" w:hint="default"/>
+      </w:rPr>
+    </w:lvl>
+    <w:lvl w:ilvl="7" w:tplc="FFFFFFFF" w:tentative="1">
+      <w:start w:val="1"/>
+      <w:numFmt w:val="bullet"/>
+      <w:lvlText w:val=""/>
+      <w:lvlJc w:val="left"/>
+      <w:pPr>
+        <w:ind w:left="3520" w:hanging="440"/>
+      </w:pPr>
+      <w:rPr>
+        <w:rFonts w:ascii="Wingdings" w:hAnsi="Wingdings" w:hint="default"/>
+      </w:rPr>
+    </w:lvl>
+    <w:lvl w:ilvl="8" w:tplc="FFFFFFFF" w:tentative="1">
+      <w:start w:val="1"/>
+      <w:numFmt w:val="bullet"/>
+      <w:lvlText w:val=""/>
+      <w:lvlJc w:val="left"/>
+      <w:pPr>
+        <w:ind w:left="3960" w:hanging="440"/>
+      </w:pPr>
+      <w:rPr>
+        <w:rFonts w:ascii="Wingdings" w:hAnsi="Wingdings" w:hint="default"/>
+      </w:rPr>
+    </w:lvl>
+  </w:abstractNum>
   <w:abstractNum w:abstractNumId="12" w15:restartNumberingAfterBreak="0">
-    <w:nsid w:val="2FE64530"/>
+    <w:nsid w:val="2B790D59"/>
     <w:multiLevelType w:val="multilevel"/>
     <w:tmpl w:val="5FE22469"/>
     <w:lvl w:ilvl="0">
@@ -13979,7 +16318,7 @@
     </w:lvl>
   </w:abstractNum>
   <w:abstractNum w:abstractNumId="13" w15:restartNumberingAfterBreak="0">
-    <w:nsid w:val="39DA278F"/>
+    <w:nsid w:val="2E553710"/>
     <w:multiLevelType w:val="multilevel"/>
     <w:tmpl w:val="5FE22469"/>
     <w:lvl w:ilvl="0">
@@ -14070,7 +16409,7 @@
     </w:lvl>
   </w:abstractNum>
   <w:abstractNum w:abstractNumId="14" w15:restartNumberingAfterBreak="0">
-    <w:nsid w:val="3EF628F5"/>
+    <w:nsid w:val="2FE64530"/>
     <w:multiLevelType w:val="multilevel"/>
     <w:tmpl w:val="5FE22469"/>
     <w:lvl w:ilvl="0">
@@ -14161,7 +16500,7 @@
     </w:lvl>
   </w:abstractNum>
   <w:abstractNum w:abstractNumId="15" w15:restartNumberingAfterBreak="0">
-    <w:nsid w:val="402E626D"/>
+    <w:nsid w:val="39DA278F"/>
     <w:multiLevelType w:val="multilevel"/>
     <w:tmpl w:val="5FE22469"/>
     <w:lvl w:ilvl="0">
@@ -14252,7 +16591,7 @@
     </w:lvl>
   </w:abstractNum>
   <w:abstractNum w:abstractNumId="16" w15:restartNumberingAfterBreak="0">
-    <w:nsid w:val="43235B79"/>
+    <w:nsid w:val="3EF628F5"/>
     <w:multiLevelType w:val="multilevel"/>
     <w:tmpl w:val="5FE22469"/>
     <w:lvl w:ilvl="0">
@@ -14343,6 +16682,188 @@
     </w:lvl>
   </w:abstractNum>
   <w:abstractNum w:abstractNumId="17" w15:restartNumberingAfterBreak="0">
+    <w:nsid w:val="402E626D"/>
+    <w:multiLevelType w:val="multilevel"/>
+    <w:tmpl w:val="5FE22469"/>
+    <w:lvl w:ilvl="0">
+      <w:start w:val="1"/>
+      <w:numFmt w:val="decimal"/>
+      <w:lvlText w:val="%1."/>
+      <w:lvlJc w:val="left"/>
+      <w:pPr>
+        <w:ind w:left="660" w:hanging="660"/>
+      </w:pPr>
+      <w:rPr>
+        <w:rFonts w:hint="default"/>
+        <w:sz w:val="24"/>
+        <w:szCs w:val="24"/>
+      </w:rPr>
+    </w:lvl>
+    <w:lvl w:ilvl="1">
+      <w:start w:val="1"/>
+      <w:numFmt w:val="lowerLetter"/>
+      <w:lvlText w:val="%2)"/>
+      <w:lvlJc w:val="left"/>
+      <w:pPr>
+        <w:ind w:left="840" w:hanging="420"/>
+      </w:pPr>
+    </w:lvl>
+    <w:lvl w:ilvl="2">
+      <w:start w:val="1"/>
+      <w:numFmt w:val="lowerRoman"/>
+      <w:lvlText w:val="%3."/>
+      <w:lvlJc w:val="right"/>
+      <w:pPr>
+        <w:ind w:left="1260" w:hanging="420"/>
+      </w:pPr>
+    </w:lvl>
+    <w:lvl w:ilvl="3">
+      <w:start w:val="1"/>
+      <w:numFmt w:val="decimal"/>
+      <w:lvlText w:val="%4."/>
+      <w:lvlJc w:val="left"/>
+      <w:pPr>
+        <w:ind w:left="1680" w:hanging="420"/>
+      </w:pPr>
+    </w:lvl>
+    <w:lvl w:ilvl="4">
+      <w:start w:val="1"/>
+      <w:numFmt w:val="lowerLetter"/>
+      <w:lvlText w:val="%5)"/>
+      <w:lvlJc w:val="left"/>
+      <w:pPr>
+        <w:ind w:left="2100" w:hanging="420"/>
+      </w:pPr>
+    </w:lvl>
+    <w:lvl w:ilvl="5">
+      <w:start w:val="1"/>
+      <w:numFmt w:val="lowerRoman"/>
+      <w:lvlText w:val="%6."/>
+      <w:lvlJc w:val="right"/>
+      <w:pPr>
+        <w:ind w:left="2520" w:hanging="420"/>
+      </w:pPr>
+    </w:lvl>
+    <w:lvl w:ilvl="6">
+      <w:start w:val="1"/>
+      <w:numFmt w:val="decimal"/>
+      <w:lvlText w:val="%7."/>
+      <w:lvlJc w:val="left"/>
+      <w:pPr>
+        <w:ind w:left="2940" w:hanging="420"/>
+      </w:pPr>
+    </w:lvl>
+    <w:lvl w:ilvl="7">
+      <w:start w:val="1"/>
+      <w:numFmt w:val="lowerLetter"/>
+      <w:lvlText w:val="%8)"/>
+      <w:lvlJc w:val="left"/>
+      <w:pPr>
+        <w:ind w:left="3360" w:hanging="420"/>
+      </w:pPr>
+    </w:lvl>
+    <w:lvl w:ilvl="8">
+      <w:start w:val="1"/>
+      <w:numFmt w:val="lowerRoman"/>
+      <w:lvlText w:val="%9."/>
+      <w:lvlJc w:val="right"/>
+      <w:pPr>
+        <w:ind w:left="3780" w:hanging="420"/>
+      </w:pPr>
+    </w:lvl>
+  </w:abstractNum>
+  <w:abstractNum w:abstractNumId="18" w15:restartNumberingAfterBreak="0">
+    <w:nsid w:val="43235B79"/>
+    <w:multiLevelType w:val="multilevel"/>
+    <w:tmpl w:val="5FE22469"/>
+    <w:lvl w:ilvl="0">
+      <w:start w:val="1"/>
+      <w:numFmt w:val="decimal"/>
+      <w:lvlText w:val="%1."/>
+      <w:lvlJc w:val="left"/>
+      <w:pPr>
+        <w:ind w:left="660" w:hanging="660"/>
+      </w:pPr>
+      <w:rPr>
+        <w:rFonts w:hint="default"/>
+        <w:sz w:val="24"/>
+        <w:szCs w:val="24"/>
+      </w:rPr>
+    </w:lvl>
+    <w:lvl w:ilvl="1">
+      <w:start w:val="1"/>
+      <w:numFmt w:val="lowerLetter"/>
+      <w:lvlText w:val="%2)"/>
+      <w:lvlJc w:val="left"/>
+      <w:pPr>
+        <w:ind w:left="840" w:hanging="420"/>
+      </w:pPr>
+    </w:lvl>
+    <w:lvl w:ilvl="2">
+      <w:start w:val="1"/>
+      <w:numFmt w:val="lowerRoman"/>
+      <w:lvlText w:val="%3."/>
+      <w:lvlJc w:val="right"/>
+      <w:pPr>
+        <w:ind w:left="1260" w:hanging="420"/>
+      </w:pPr>
+    </w:lvl>
+    <w:lvl w:ilvl="3">
+      <w:start w:val="1"/>
+      <w:numFmt w:val="decimal"/>
+      <w:lvlText w:val="%4."/>
+      <w:lvlJc w:val="left"/>
+      <w:pPr>
+        <w:ind w:left="1680" w:hanging="420"/>
+      </w:pPr>
+    </w:lvl>
+    <w:lvl w:ilvl="4">
+      <w:start w:val="1"/>
+      <w:numFmt w:val="lowerLetter"/>
+      <w:lvlText w:val="%5)"/>
+      <w:lvlJc w:val="left"/>
+      <w:pPr>
+        <w:ind w:left="2100" w:hanging="420"/>
+      </w:pPr>
+    </w:lvl>
+    <w:lvl w:ilvl="5">
+      <w:start w:val="1"/>
+      <w:numFmt w:val="lowerRoman"/>
+      <w:lvlText w:val="%6."/>
+      <w:lvlJc w:val="right"/>
+      <w:pPr>
+        <w:ind w:left="2520" w:hanging="420"/>
+      </w:pPr>
+    </w:lvl>
+    <w:lvl w:ilvl="6">
+      <w:start w:val="1"/>
+      <w:numFmt w:val="decimal"/>
+      <w:lvlText w:val="%7."/>
+      <w:lvlJc w:val="left"/>
+      <w:pPr>
+        <w:ind w:left="2940" w:hanging="420"/>
+      </w:pPr>
+    </w:lvl>
+    <w:lvl w:ilvl="7">
+      <w:start w:val="1"/>
+      <w:numFmt w:val="lowerLetter"/>
+      <w:lvlText w:val="%8)"/>
+      <w:lvlJc w:val="left"/>
+      <w:pPr>
+        <w:ind w:left="3360" w:hanging="420"/>
+      </w:pPr>
+    </w:lvl>
+    <w:lvl w:ilvl="8">
+      <w:start w:val="1"/>
+      <w:numFmt w:val="lowerRoman"/>
+      <w:lvlText w:val="%9."/>
+      <w:lvlJc w:val="right"/>
+      <w:pPr>
+        <w:ind w:left="3780" w:hanging="420"/>
+      </w:pPr>
+    </w:lvl>
+  </w:abstractNum>
+  <w:abstractNum w:abstractNumId="19" w15:restartNumberingAfterBreak="0">
     <w:nsid w:val="46E46B30"/>
     <w:multiLevelType w:val="hybridMultilevel"/>
     <w:tmpl w:val="B7D4F7DE"/>
@@ -14456,7 +16977,7 @@
       </w:rPr>
     </w:lvl>
   </w:abstractNum>
-  <w:abstractNum w:abstractNumId="18" w15:restartNumberingAfterBreak="0">
+  <w:abstractNum w:abstractNumId="20" w15:restartNumberingAfterBreak="0">
     <w:nsid w:val="4A0F7635"/>
     <w:multiLevelType w:val="hybridMultilevel"/>
     <w:tmpl w:val="1BE0DA0C"/>
@@ -14569,7 +17090,7 @@
       </w:rPr>
     </w:lvl>
   </w:abstractNum>
-  <w:abstractNum w:abstractNumId="19" w15:restartNumberingAfterBreak="0">
+  <w:abstractNum w:abstractNumId="21" w15:restartNumberingAfterBreak="0">
     <w:nsid w:val="4B9D042C"/>
     <w:multiLevelType w:val="multilevel"/>
     <w:tmpl w:val="4B9D042C"/>
@@ -14734,7 +17255,7 @@
       </w:rPr>
     </w:lvl>
   </w:abstractNum>
-  <w:abstractNum w:abstractNumId="20" w15:restartNumberingAfterBreak="0">
+  <w:abstractNum w:abstractNumId="22" w15:restartNumberingAfterBreak="0">
     <w:nsid w:val="67917C7B"/>
     <w:multiLevelType w:val="multilevel"/>
     <w:tmpl w:val="5FE22469"/>
@@ -14825,7 +17346,7 @@
       </w:pPr>
     </w:lvl>
   </w:abstractNum>
-  <w:abstractNum w:abstractNumId="21" w15:restartNumberingAfterBreak="0">
+  <w:abstractNum w:abstractNumId="23" w15:restartNumberingAfterBreak="0">
     <w:nsid w:val="67C83518"/>
     <w:multiLevelType w:val="multilevel"/>
     <w:tmpl w:val="5FE22469"/>
@@ -14916,7 +17437,7 @@
       </w:pPr>
     </w:lvl>
   </w:abstractNum>
-  <w:abstractNum w:abstractNumId="22" w15:restartNumberingAfterBreak="0">
+  <w:abstractNum w:abstractNumId="24" w15:restartNumberingAfterBreak="0">
     <w:nsid w:val="687D54E2"/>
     <w:multiLevelType w:val="hybridMultilevel"/>
     <w:tmpl w:val="DBC0040C"/>
@@ -15029,7 +17550,7 @@
       </w:rPr>
     </w:lvl>
   </w:abstractNum>
-  <w:abstractNum w:abstractNumId="23" w15:restartNumberingAfterBreak="0">
+  <w:abstractNum w:abstractNumId="25" w15:restartNumberingAfterBreak="0">
     <w:nsid w:val="6BC5436A"/>
     <w:multiLevelType w:val="hybridMultilevel"/>
     <w:tmpl w:val="6130DCE2"/>
@@ -15142,7 +17663,7 @@
       </w:rPr>
     </w:lvl>
   </w:abstractNum>
-  <w:abstractNum w:abstractNumId="24" w15:restartNumberingAfterBreak="0">
+  <w:abstractNum w:abstractNumId="26" w15:restartNumberingAfterBreak="0">
     <w:nsid w:val="6CF66DD6"/>
     <w:multiLevelType w:val="multilevel"/>
     <w:tmpl w:val="5FE22469"/>
@@ -15233,7 +17754,7 @@
       </w:pPr>
     </w:lvl>
   </w:abstractNum>
-  <w:abstractNum w:abstractNumId="25" w15:restartNumberingAfterBreak="0">
+  <w:abstractNum w:abstractNumId="27" w15:restartNumberingAfterBreak="0">
     <w:nsid w:val="6CF950DF"/>
     <w:multiLevelType w:val="hybridMultilevel"/>
     <w:tmpl w:val="A8A2CDD8"/>
@@ -15346,7 +17867,7 @@
       </w:rPr>
     </w:lvl>
   </w:abstractNum>
-  <w:abstractNum w:abstractNumId="26" w15:restartNumberingAfterBreak="0">
+  <w:abstractNum w:abstractNumId="28" w15:restartNumberingAfterBreak="0">
     <w:nsid w:val="721A1944"/>
     <w:multiLevelType w:val="multilevel"/>
     <w:tmpl w:val="5FE22469"/>
@@ -15437,7 +17958,7 @@
       </w:pPr>
     </w:lvl>
   </w:abstractNum>
-  <w:abstractNum w:abstractNumId="27" w15:restartNumberingAfterBreak="0">
+  <w:abstractNum w:abstractNumId="29" w15:restartNumberingAfterBreak="0">
     <w:nsid w:val="7ADD4F31"/>
     <w:multiLevelType w:val="multilevel"/>
     <w:tmpl w:val="5FE22469"/>
@@ -15528,7 +18049,7 @@
       </w:pPr>
     </w:lvl>
   </w:abstractNum>
-  <w:abstractNum w:abstractNumId="28" w15:restartNumberingAfterBreak="0">
+  <w:abstractNum w:abstractNumId="30" w15:restartNumberingAfterBreak="0">
     <w:nsid w:val="7C6B63DD"/>
     <w:multiLevelType w:val="multilevel"/>
     <w:tmpl w:val="5FE22469"/>
@@ -15620,133 +18141,139 @@
     </w:lvl>
   </w:abstractNum>
   <w:num w:numId="1" w16cid:durableId="484665545">
+    <w:abstractNumId w:val="21"/>
+  </w:num>
+  <w:num w:numId="2" w16cid:durableId="932931373">
+    <w:abstractNumId w:val="3"/>
+  </w:num>
+  <w:num w:numId="3" w16cid:durableId="1692951244">
+    <w:abstractNumId w:val="8"/>
+  </w:num>
+  <w:num w:numId="4" w16cid:durableId="1018237340">
     <w:abstractNumId w:val="19"/>
   </w:num>
-  <w:num w:numId="2" w16cid:durableId="932931373">
+  <w:num w:numId="5" w16cid:durableId="1765152854">
+    <w:abstractNumId w:val="6"/>
+  </w:num>
+  <w:num w:numId="6" w16cid:durableId="1547988847">
+    <w:abstractNumId w:val="30"/>
+  </w:num>
+  <w:num w:numId="7" w16cid:durableId="1337613255">
+    <w:abstractNumId w:val="22"/>
+  </w:num>
+  <w:num w:numId="8" w16cid:durableId="146287599">
+    <w:abstractNumId w:val="18"/>
+  </w:num>
+  <w:num w:numId="9" w16cid:durableId="503126039">
+    <w:abstractNumId w:val="5"/>
+  </w:num>
+  <w:num w:numId="10" w16cid:durableId="1044520791">
+    <w:abstractNumId w:val="21"/>
+  </w:num>
+  <w:num w:numId="11" w16cid:durableId="1544712850">
+    <w:abstractNumId w:val="21"/>
+  </w:num>
+  <w:num w:numId="12" w16cid:durableId="288898003">
+    <w:abstractNumId w:val="21"/>
+  </w:num>
+  <w:num w:numId="13" w16cid:durableId="1275089832">
+    <w:abstractNumId w:val="21"/>
+  </w:num>
+  <w:num w:numId="14" w16cid:durableId="1793357744">
+    <w:abstractNumId w:val="21"/>
+  </w:num>
+  <w:num w:numId="15" w16cid:durableId="802622299">
+    <w:abstractNumId w:val="21"/>
+  </w:num>
+  <w:num w:numId="16" w16cid:durableId="96679514">
+    <w:abstractNumId w:val="26"/>
+  </w:num>
+  <w:num w:numId="17" w16cid:durableId="655105655">
+    <w:abstractNumId w:val="13"/>
+  </w:num>
+  <w:num w:numId="18" w16cid:durableId="1076242472">
+    <w:abstractNumId w:val="12"/>
+  </w:num>
+  <w:num w:numId="19" w16cid:durableId="766850394">
+    <w:abstractNumId w:val="9"/>
+  </w:num>
+  <w:num w:numId="20" w16cid:durableId="79645665">
+    <w:abstractNumId w:val="20"/>
+  </w:num>
+  <w:num w:numId="21" w16cid:durableId="397870083">
+    <w:abstractNumId w:val="10"/>
+  </w:num>
+  <w:num w:numId="22" w16cid:durableId="895513677">
+    <w:abstractNumId w:val="24"/>
+  </w:num>
+  <w:num w:numId="23" w16cid:durableId="782844608">
+    <w:abstractNumId w:val="11"/>
+  </w:num>
+  <w:num w:numId="24" w16cid:durableId="1797988177">
+    <w:abstractNumId w:val="25"/>
+  </w:num>
+  <w:num w:numId="25" w16cid:durableId="910886842">
+    <w:abstractNumId w:val="21"/>
+  </w:num>
+  <w:num w:numId="26" w16cid:durableId="2112428328">
+    <w:abstractNumId w:val="14"/>
+  </w:num>
+  <w:num w:numId="27" w16cid:durableId="2012874112">
+    <w:abstractNumId w:val="28"/>
+  </w:num>
+  <w:num w:numId="28" w16cid:durableId="791091440">
+    <w:abstractNumId w:val="17"/>
+  </w:num>
+  <w:num w:numId="29" w16cid:durableId="386880435">
+    <w:abstractNumId w:val="23"/>
+  </w:num>
+  <w:num w:numId="30" w16cid:durableId="1230729616">
+    <w:abstractNumId w:val="15"/>
+  </w:num>
+  <w:num w:numId="31" w16cid:durableId="1734036635">
+    <w:abstractNumId w:val="16"/>
+  </w:num>
+  <w:num w:numId="32" w16cid:durableId="1086071878">
+    <w:abstractNumId w:val="27"/>
+  </w:num>
+  <w:num w:numId="33" w16cid:durableId="750078759">
     <w:abstractNumId w:val="2"/>
   </w:num>
-  <w:num w:numId="3" w16cid:durableId="1692951244">
-    <w:abstractNumId w:val="6"/>
+  <w:num w:numId="34" w16cid:durableId="2051493994">
+    <w:abstractNumId w:val="21"/>
   </w:num>
-  <w:num w:numId="4" w16cid:durableId="1018237340">
-    <w:abstractNumId w:val="17"/>
-  </w:num>
-  <w:num w:numId="5" w16cid:durableId="1765152854">
-    <w:abstractNumId w:val="5"/>
-  </w:num>
-  <w:num w:numId="6" w16cid:durableId="1547988847">
-    <w:abstractNumId w:val="28"/>
-  </w:num>
-  <w:num w:numId="7" w16cid:durableId="1337613255">
-    <w:abstractNumId w:val="20"/>
-  </w:num>
-  <w:num w:numId="8" w16cid:durableId="146287599">
-    <w:abstractNumId w:val="16"/>
-  </w:num>
-  <w:num w:numId="9" w16cid:durableId="503126039">
+  <w:num w:numId="35" w16cid:durableId="1077481959">
     <w:abstractNumId w:val="4"/>
   </w:num>
-  <w:num w:numId="10" w16cid:durableId="1044520791">
-    <w:abstractNumId w:val="19"/>
+  <w:num w:numId="36" w16cid:durableId="1237278817">
+    <w:abstractNumId w:val="29"/>
   </w:num>
-  <w:num w:numId="11" w16cid:durableId="1544712850">
-    <w:abstractNumId w:val="19"/>
+  <w:num w:numId="37" w16cid:durableId="460811352">
+    <w:abstractNumId w:val="21"/>
   </w:num>
-  <w:num w:numId="12" w16cid:durableId="288898003">
-    <w:abstractNumId w:val="19"/>
+  <w:num w:numId="38" w16cid:durableId="156967511">
+    <w:abstractNumId w:val="21"/>
   </w:num>
-  <w:num w:numId="13" w16cid:durableId="1275089832">
-    <w:abstractNumId w:val="19"/>
+  <w:num w:numId="39" w16cid:durableId="341585567">
+    <w:abstractNumId w:val="1"/>
   </w:num>
-  <w:num w:numId="14" w16cid:durableId="1793357744">
-    <w:abstractNumId w:val="19"/>
+  <w:num w:numId="40" w16cid:durableId="1614895478">
+    <w:abstractNumId w:val="21"/>
   </w:num>
-  <w:num w:numId="15" w16cid:durableId="802622299">
-    <w:abstractNumId w:val="19"/>
+  <w:num w:numId="41" w16cid:durableId="444156359">
+    <w:abstractNumId w:val="21"/>
   </w:num>
-  <w:num w:numId="16" w16cid:durableId="96679514">
-    <w:abstractNumId w:val="24"/>
+  <w:num w:numId="42" w16cid:durableId="905650823">
+    <w:abstractNumId w:val="21"/>
   </w:num>
-  <w:num w:numId="17" w16cid:durableId="655105655">
-    <w:abstractNumId w:val="11"/>
+  <w:num w:numId="43" w16cid:durableId="10181531">
+    <w:abstractNumId w:val="21"/>
   </w:num>
-  <w:num w:numId="18" w16cid:durableId="1076242472">
-    <w:abstractNumId w:val="10"/>
-  </w:num>
-  <w:num w:numId="19" w16cid:durableId="766850394">
+  <w:num w:numId="44" w16cid:durableId="1565994361">
     <w:abstractNumId w:val="7"/>
   </w:num>
-  <w:num w:numId="20" w16cid:durableId="79645665">
-    <w:abstractNumId w:val="18"/>
-  </w:num>
-  <w:num w:numId="21" w16cid:durableId="397870083">
-    <w:abstractNumId w:val="8"/>
-  </w:num>
-  <w:num w:numId="22" w16cid:durableId="895513677">
-    <w:abstractNumId w:val="22"/>
-  </w:num>
-  <w:num w:numId="23" w16cid:durableId="782844608">
-    <w:abstractNumId w:val="9"/>
-  </w:num>
-  <w:num w:numId="24" w16cid:durableId="1797988177">
-    <w:abstractNumId w:val="23"/>
-  </w:num>
-  <w:num w:numId="25" w16cid:durableId="910886842">
-    <w:abstractNumId w:val="19"/>
-  </w:num>
-  <w:num w:numId="26" w16cid:durableId="2112428328">
-    <w:abstractNumId w:val="12"/>
-  </w:num>
-  <w:num w:numId="27" w16cid:durableId="2012874112">
-    <w:abstractNumId w:val="26"/>
-  </w:num>
-  <w:num w:numId="28" w16cid:durableId="791091440">
-    <w:abstractNumId w:val="15"/>
-  </w:num>
-  <w:num w:numId="29" w16cid:durableId="386880435">
-    <w:abstractNumId w:val="21"/>
-  </w:num>
-  <w:num w:numId="30" w16cid:durableId="1230729616">
-    <w:abstractNumId w:val="13"/>
-  </w:num>
-  <w:num w:numId="31" w16cid:durableId="1734036635">
-    <w:abstractNumId w:val="14"/>
-  </w:num>
-  <w:num w:numId="32" w16cid:durableId="1086071878">
-    <w:abstractNumId w:val="25"/>
-  </w:num>
-  <w:num w:numId="33" w16cid:durableId="750078759">
-    <w:abstractNumId w:val="1"/>
-  </w:num>
-  <w:num w:numId="34" w16cid:durableId="2051493994">
-    <w:abstractNumId w:val="19"/>
-  </w:num>
-  <w:num w:numId="35" w16cid:durableId="1077481959">
-    <w:abstractNumId w:val="3"/>
-  </w:num>
-  <w:num w:numId="36" w16cid:durableId="1237278817">
-    <w:abstractNumId w:val="27"/>
-  </w:num>
-  <w:num w:numId="37" w16cid:durableId="460811352">
-    <w:abstractNumId w:val="19"/>
-  </w:num>
-  <w:num w:numId="38" w16cid:durableId="156967511">
-    <w:abstractNumId w:val="19"/>
-  </w:num>
-  <w:num w:numId="39" w16cid:durableId="341585567">
+  <w:num w:numId="45" w16cid:durableId="606086147">
     <w:abstractNumId w:val="0"/>
-  </w:num>
-  <w:num w:numId="40" w16cid:durableId="1614895478">
-    <w:abstractNumId w:val="19"/>
-  </w:num>
-  <w:num w:numId="41" w16cid:durableId="444156359">
-    <w:abstractNumId w:val="19"/>
-  </w:num>
-  <w:num w:numId="42" w16cid:durableId="905650823">
-    <w:abstractNumId w:val="19"/>
-  </w:num>
-  <w:num w:numId="43" w16cid:durableId="10181531">
-    <w:abstractNumId w:val="19"/>
   </w:num>
   <w:numIdMacAtCleanup w:val="7"/>
 </w:numbering>

</xml_diff>

<commit_message>
Modified the plugin addition functionality.
</commit_message>
<xml_diff>
--- a/yuan.docx
+++ b/yuan.docx
@@ -696,10 +696,10 @@
         </w:sectPr>
       </w:pPr>
     </w:p>
-    <w:bookmarkStart w:id="0" w:name="_Toc133306321" w:displacedByCustomXml="next"/>
-    <w:bookmarkStart w:id="1" w:name="_Ref75944810" w:displacedByCustomXml="next"/>
-    <w:bookmarkStart w:id="2" w:name="_Hlk127886576" w:displacedByCustomXml="next"/>
-    <w:bookmarkStart w:id="3" w:name="_Ref142298286" w:displacedByCustomXml="next"/>
+    <w:bookmarkStart w:id="0" w:name="_Ref142298286" w:displacedByCustomXml="next"/>
+    <w:bookmarkStart w:id="1" w:name="_Hlk127886576" w:displacedByCustomXml="next"/>
+    <w:bookmarkStart w:id="2" w:name="_Ref75944810" w:displacedByCustomXml="next"/>
+    <w:bookmarkStart w:id="3" w:name="_Toc133306321" w:displacedByCustomXml="next"/>
     <w:sdt>
       <w:sdtPr>
         <w:rPr>
@@ -772,7 +772,7 @@
             </w:rPr>
             <w:fldChar w:fldCharType="separate"/>
           </w:r>
-          <w:hyperlink w:anchor="_Toc225175950" w:history="1">
+          <w:hyperlink w:anchor="_Toc225442829" w:history="1">
             <w:r>
               <w:rPr>
                 <w:rStyle w:val="aff4"/>
@@ -847,7 +847,7 @@
                 <w:noProof/>
                 <w:webHidden/>
               </w:rPr>
-              <w:instrText>PAGEREF _Toc225175950 \h</w:instrText>
+              <w:instrText>PAGEREF _Toc225442829 \h</w:instrText>
             </w:r>
             <w:r>
               <w:rPr>
@@ -902,7 +902,7 @@
               <w14:ligatures w14:val="standardContextual"/>
             </w:rPr>
           </w:pPr>
-          <w:hyperlink w:anchor="_Toc225175951" w:history="1">
+          <w:hyperlink w:anchor="_Toc225442830" w:history="1">
             <w:r>
               <w:rPr>
                 <w:rStyle w:val="aff4"/>
@@ -956,7 +956,7 @@
                 <w:noProof/>
                 <w:webHidden/>
               </w:rPr>
-              <w:instrText>PAGEREF _Toc225175951 \h</w:instrText>
+              <w:instrText>PAGEREF _Toc225442830 \h</w:instrText>
             </w:r>
             <w:r>
               <w:rPr>
@@ -1011,7 +1011,7 @@
               <w14:ligatures w14:val="standardContextual"/>
             </w:rPr>
           </w:pPr>
-          <w:hyperlink w:anchor="_Toc225175952" w:history="1">
+          <w:hyperlink w:anchor="_Toc225442831" w:history="1">
             <w:r>
               <w:rPr>
                 <w:rStyle w:val="aff4"/>
@@ -1065,7 +1065,7 @@
                 <w:noProof/>
                 <w:webHidden/>
               </w:rPr>
-              <w:instrText>PAGEREF _Toc225175952 \h</w:instrText>
+              <w:instrText>PAGEREF _Toc225442831 \h</w:instrText>
             </w:r>
             <w:r>
               <w:rPr>
@@ -1126,7 +1126,7 @@
               <w14:ligatures w14:val="standardContextual"/>
             </w:rPr>
           </w:pPr>
-          <w:hyperlink w:anchor="_Toc225175953" w:history="1">
+          <w:hyperlink w:anchor="_Toc225442832" w:history="1">
             <w:r>
               <w:rPr>
                 <w:rStyle w:val="aff4"/>
@@ -1201,7 +1201,7 @@
                 <w:noProof/>
                 <w:webHidden/>
               </w:rPr>
-              <w:instrText>PAGEREF _Toc225175953 \h</w:instrText>
+              <w:instrText>PAGEREF _Toc225442832 \h</w:instrText>
             </w:r>
             <w:r>
               <w:rPr>
@@ -1256,7 +1256,7 @@
               <w14:ligatures w14:val="standardContextual"/>
             </w:rPr>
           </w:pPr>
-          <w:hyperlink w:anchor="_Toc225175954" w:history="1">
+          <w:hyperlink w:anchor="_Toc225442833" w:history="1">
             <w:r>
               <w:rPr>
                 <w:rStyle w:val="aff4"/>
@@ -1310,7 +1310,7 @@
                 <w:noProof/>
                 <w:webHidden/>
               </w:rPr>
-              <w:instrText>PAGEREF _Toc225175954 \h</w:instrText>
+              <w:instrText>PAGEREF _Toc225442833 \h</w:instrText>
             </w:r>
             <w:r>
               <w:rPr>
@@ -1365,7 +1365,7 @@
               <w14:ligatures w14:val="standardContextual"/>
             </w:rPr>
           </w:pPr>
-          <w:hyperlink w:anchor="_Toc225175955" w:history="1">
+          <w:hyperlink w:anchor="_Toc225442834" w:history="1">
             <w:r>
               <w:rPr>
                 <w:rStyle w:val="aff4"/>
@@ -1427,7 +1427,7 @@
                 <w:noProof/>
                 <w:webHidden/>
               </w:rPr>
-              <w:instrText>PAGEREF _Toc225175955 \h</w:instrText>
+              <w:instrText>PAGEREF _Toc225442834 \h</w:instrText>
             </w:r>
             <w:r>
               <w:rPr>
@@ -1482,7 +1482,7 @@
               <w14:ligatures w14:val="standardContextual"/>
             </w:rPr>
           </w:pPr>
-          <w:hyperlink w:anchor="_Toc225175956" w:history="1">
+          <w:hyperlink w:anchor="_Toc225442835" w:history="1">
             <w:r>
               <w:rPr>
                 <w:rStyle w:val="aff4"/>
@@ -1528,7 +1528,7 @@
                 <w:noProof/>
                 <w:webHidden/>
               </w:rPr>
-              <w:instrText>PAGEREF _Toc225175956 \h</w:instrText>
+              <w:instrText>PAGEREF _Toc225442835 \h</w:instrText>
             </w:r>
             <w:r>
               <w:rPr>
@@ -1583,7 +1583,7 @@
               <w14:ligatures w14:val="standardContextual"/>
             </w:rPr>
           </w:pPr>
-          <w:hyperlink w:anchor="_Toc225175957" w:history="1">
+          <w:hyperlink w:anchor="_Toc225442836" w:history="1">
             <w:r>
               <w:rPr>
                 <w:rStyle w:val="aff4"/>
@@ -1629,7 +1629,7 @@
                 <w:noProof/>
                 <w:webHidden/>
               </w:rPr>
-              <w:instrText>PAGEREF _Toc225175957 \h</w:instrText>
+              <w:instrText>PAGEREF _Toc225442836 \h</w:instrText>
             </w:r>
             <w:r>
               <w:rPr>
@@ -1684,7 +1684,7 @@
               <w14:ligatures w14:val="standardContextual"/>
             </w:rPr>
           </w:pPr>
-          <w:hyperlink w:anchor="_Toc225175958" w:history="1">
+          <w:hyperlink w:anchor="_Toc225442837" w:history="1">
             <w:r>
               <w:rPr>
                 <w:rStyle w:val="aff4"/>
@@ -1730,7 +1730,7 @@
                 <w:noProof/>
                 <w:webHidden/>
               </w:rPr>
-              <w:instrText>PAGEREF _Toc225175958 \h</w:instrText>
+              <w:instrText>PAGEREF _Toc225442837 \h</w:instrText>
             </w:r>
             <w:r>
               <w:rPr>
@@ -1791,7 +1791,7 @@
               <w14:ligatures w14:val="standardContextual"/>
             </w:rPr>
           </w:pPr>
-          <w:hyperlink w:anchor="_Toc225175959" w:history="1">
+          <w:hyperlink w:anchor="_Toc225442838" w:history="1">
             <w:r>
               <w:rPr>
                 <w:rStyle w:val="aff4"/>
@@ -1866,7 +1866,7 @@
                 <w:noProof/>
                 <w:webHidden/>
               </w:rPr>
-              <w:instrText>PAGEREF _Toc225175959 \h</w:instrText>
+              <w:instrText>PAGEREF _Toc225442838 \h</w:instrText>
             </w:r>
             <w:r>
               <w:rPr>
@@ -1921,7 +1921,7 @@
               <w14:ligatures w14:val="standardContextual"/>
             </w:rPr>
           </w:pPr>
-          <w:hyperlink w:anchor="_Toc225175960" w:history="1">
+          <w:hyperlink w:anchor="_Toc225442839" w:history="1">
             <w:r>
               <w:rPr>
                 <w:rStyle w:val="aff4"/>
@@ -1975,7 +1975,7 @@
                 <w:noProof/>
                 <w:webHidden/>
               </w:rPr>
-              <w:instrText>PAGEREF _Toc225175960 \h</w:instrText>
+              <w:instrText>PAGEREF _Toc225442839 \h</w:instrText>
             </w:r>
             <w:r>
               <w:rPr>
@@ -2030,7 +2030,7 @@
               <w14:ligatures w14:val="standardContextual"/>
             </w:rPr>
           </w:pPr>
-          <w:hyperlink w:anchor="_Toc225175961" w:history="1">
+          <w:hyperlink w:anchor="_Toc225442840" w:history="1">
             <w:r>
               <w:rPr>
                 <w:rStyle w:val="aff4"/>
@@ -2084,7 +2084,7 @@
                 <w:noProof/>
                 <w:webHidden/>
               </w:rPr>
-              <w:instrText>PAGEREF _Toc225175961 \h</w:instrText>
+              <w:instrText>PAGEREF _Toc225442840 \h</w:instrText>
             </w:r>
             <w:r>
               <w:rPr>
@@ -2139,7 +2139,7 @@
               <w14:ligatures w14:val="standardContextual"/>
             </w:rPr>
           </w:pPr>
-          <w:hyperlink w:anchor="_Toc225175962" w:history="1">
+          <w:hyperlink w:anchor="_Toc225442841" w:history="1">
             <w:r>
               <w:rPr>
                 <w:rStyle w:val="aff4"/>
@@ -2193,7 +2193,7 @@
                 <w:noProof/>
                 <w:webHidden/>
               </w:rPr>
-              <w:instrText>PAGEREF _Toc225175962 \h</w:instrText>
+              <w:instrText>PAGEREF _Toc225442841 \h</w:instrText>
             </w:r>
             <w:r>
               <w:rPr>
@@ -2248,7 +2248,7 @@
               <w14:ligatures w14:val="standardContextual"/>
             </w:rPr>
           </w:pPr>
-          <w:hyperlink w:anchor="_Toc225175963" w:history="1">
+          <w:hyperlink w:anchor="_Toc225442842" w:history="1">
             <w:r>
               <w:rPr>
                 <w:rStyle w:val="aff4"/>
@@ -2302,7 +2302,7 @@
                 <w:noProof/>
                 <w:webHidden/>
               </w:rPr>
-              <w:instrText>PAGEREF _Toc225175963 \h</w:instrText>
+              <w:instrText>PAGEREF _Toc225442842 \h</w:instrText>
             </w:r>
             <w:r>
               <w:rPr>
@@ -2357,7 +2357,7 @@
               <w14:ligatures w14:val="standardContextual"/>
             </w:rPr>
           </w:pPr>
-          <w:hyperlink w:anchor="_Toc225175964" w:history="1">
+          <w:hyperlink w:anchor="_Toc225442843" w:history="1">
             <w:r>
               <w:rPr>
                 <w:rStyle w:val="aff4"/>
@@ -2427,7 +2427,7 @@
                 <w:noProof/>
                 <w:webHidden/>
               </w:rPr>
-              <w:instrText>PAGEREF _Toc225175964 \h</w:instrText>
+              <w:instrText>PAGEREF _Toc225442843 \h</w:instrText>
             </w:r>
             <w:r>
               <w:rPr>
@@ -2482,7 +2482,7 @@
               <w14:ligatures w14:val="standardContextual"/>
             </w:rPr>
           </w:pPr>
-          <w:hyperlink w:anchor="_Toc225175965" w:history="1">
+          <w:hyperlink w:anchor="_Toc225442844" w:history="1">
             <w:r>
               <w:rPr>
                 <w:rStyle w:val="aff4"/>
@@ -2544,7 +2544,7 @@
                 <w:noProof/>
                 <w:webHidden/>
               </w:rPr>
-              <w:instrText>PAGEREF _Toc225175965 \h</w:instrText>
+              <w:instrText>PAGEREF _Toc225442844 \h</w:instrText>
             </w:r>
             <w:r>
               <w:rPr>
@@ -2599,7 +2599,7 @@
               <w14:ligatures w14:val="standardContextual"/>
             </w:rPr>
           </w:pPr>
-          <w:hyperlink w:anchor="_Toc225175966" w:history="1">
+          <w:hyperlink w:anchor="_Toc225442845" w:history="1">
             <w:r>
               <w:rPr>
                 <w:rStyle w:val="aff4"/>
@@ -2661,7 +2661,7 @@
                 <w:noProof/>
                 <w:webHidden/>
               </w:rPr>
-              <w:instrText>PAGEREF _Toc225175966 \h</w:instrText>
+              <w:instrText>PAGEREF _Toc225442845 \h</w:instrText>
             </w:r>
             <w:r>
               <w:rPr>
@@ -2716,7 +2716,7 @@
               <w14:ligatures w14:val="standardContextual"/>
             </w:rPr>
           </w:pPr>
-          <w:hyperlink w:anchor="_Toc225175967" w:history="1">
+          <w:hyperlink w:anchor="_Toc225442846" w:history="1">
             <w:r>
               <w:rPr>
                 <w:rStyle w:val="aff4"/>
@@ -2762,7 +2762,7 @@
                 <w:noProof/>
                 <w:webHidden/>
               </w:rPr>
-              <w:instrText>PAGEREF _Toc225175967 \h</w:instrText>
+              <w:instrText>PAGEREF _Toc225442846 \h</w:instrText>
             </w:r>
             <w:r>
               <w:rPr>
@@ -2817,7 +2817,7 @@
               <w14:ligatures w14:val="standardContextual"/>
             </w:rPr>
           </w:pPr>
-          <w:hyperlink w:anchor="_Toc225175968" w:history="1">
+          <w:hyperlink w:anchor="_Toc225442847" w:history="1">
             <w:r>
               <w:rPr>
                 <w:rStyle w:val="aff4"/>
@@ -2863,7 +2863,7 @@
                 <w:noProof/>
                 <w:webHidden/>
               </w:rPr>
-              <w:instrText>PAGEREF _Toc225175968 \h</w:instrText>
+              <w:instrText>PAGEREF _Toc225442847 \h</w:instrText>
             </w:r>
             <w:r>
               <w:rPr>
@@ -2918,7 +2918,7 @@
               <w14:ligatures w14:val="standardContextual"/>
             </w:rPr>
           </w:pPr>
-          <w:hyperlink w:anchor="_Toc225175969" w:history="1">
+          <w:hyperlink w:anchor="_Toc225442848" w:history="1">
             <w:r>
               <w:rPr>
                 <w:rStyle w:val="aff4"/>
@@ -2964,7 +2964,7 @@
                 <w:noProof/>
                 <w:webHidden/>
               </w:rPr>
-              <w:instrText>PAGEREF _Toc225175969 \h</w:instrText>
+              <w:instrText>PAGEREF _Toc225442848 \h</w:instrText>
             </w:r>
             <w:r>
               <w:rPr>
@@ -3019,7 +3019,7 @@
               <w14:ligatures w14:val="standardContextual"/>
             </w:rPr>
           </w:pPr>
-          <w:hyperlink w:anchor="_Toc225175970" w:history="1">
+          <w:hyperlink w:anchor="_Toc225442849" w:history="1">
             <w:r>
               <w:rPr>
                 <w:rStyle w:val="aff4"/>
@@ -3073,7 +3073,7 @@
                 <w:noProof/>
                 <w:webHidden/>
               </w:rPr>
-              <w:instrText>PAGEREF _Toc225175970 \h</w:instrText>
+              <w:instrText>PAGEREF _Toc225442849 \h</w:instrText>
             </w:r>
             <w:r>
               <w:rPr>
@@ -3134,7 +3134,7 @@
               <w14:ligatures w14:val="standardContextual"/>
             </w:rPr>
           </w:pPr>
-          <w:hyperlink w:anchor="_Toc225175971" w:history="1">
+          <w:hyperlink w:anchor="_Toc225442850" w:history="1">
             <w:r>
               <w:rPr>
                 <w:rStyle w:val="aff4"/>
@@ -3209,7 +3209,7 @@
                 <w:noProof/>
                 <w:webHidden/>
               </w:rPr>
-              <w:instrText>PAGEREF _Toc225175971 \h</w:instrText>
+              <w:instrText>PAGEREF _Toc225442850 \h</w:instrText>
             </w:r>
             <w:r>
               <w:rPr>
@@ -3264,7 +3264,7 @@
               <w14:ligatures w14:val="standardContextual"/>
             </w:rPr>
           </w:pPr>
-          <w:hyperlink w:anchor="_Toc225175972" w:history="1">
+          <w:hyperlink w:anchor="_Toc225442851" w:history="1">
             <w:r>
               <w:rPr>
                 <w:rStyle w:val="aff4"/>
@@ -3287,7 +3287,7 @@
                 <w:rFonts w:hint="eastAsia"/>
                 <w:noProof/>
               </w:rPr>
-              <w:t>使用插件</w:t>
+              <w:t>快速使用插件</w:t>
             </w:r>
             <w:r>
               <w:rPr>
@@ -3318,7 +3318,7 @@
                 <w:noProof/>
                 <w:webHidden/>
               </w:rPr>
-              <w:instrText>PAGEREF _Toc225175972 \h</w:instrText>
+              <w:instrText>PAGEREF _Toc225442851 \h</w:instrText>
             </w:r>
             <w:r>
               <w:rPr>
@@ -3373,7 +3373,7 @@
               <w14:ligatures w14:val="standardContextual"/>
             </w:rPr>
           </w:pPr>
-          <w:hyperlink w:anchor="_Toc225175973" w:history="1">
+          <w:hyperlink w:anchor="_Toc225442852" w:history="1">
             <w:r>
               <w:rPr>
                 <w:rStyle w:val="aff4"/>
@@ -3396,7 +3396,7 @@
                 <w:rFonts w:hint="eastAsia"/>
                 <w:noProof/>
               </w:rPr>
-              <w:t>编译和添加插件</w:t>
+              <w:t>创建插件</w:t>
             </w:r>
             <w:r>
               <w:rPr>
@@ -3427,7 +3427,7 @@
                 <w:noProof/>
                 <w:webHidden/>
               </w:rPr>
-              <w:instrText>PAGEREF _Toc225175973 \h</w:instrText>
+              <w:instrText>PAGEREF _Toc225442852 \h</w:instrText>
             </w:r>
             <w:r>
               <w:rPr>
@@ -3457,7 +3457,7 @@
                 <w:noProof/>
                 <w:webHidden/>
               </w:rPr>
-              <w:t>16</w:t>
+              <w:t>17</w:t>
             </w:r>
             <w:r>
               <w:rPr>
@@ -3482,7 +3482,7 @@
               <w14:ligatures w14:val="standardContextual"/>
             </w:rPr>
           </w:pPr>
-          <w:hyperlink w:anchor="_Toc225175974" w:history="1">
+          <w:hyperlink w:anchor="_Toc225442853" w:history="1">
             <w:r>
               <w:rPr>
                 <w:rStyle w:val="aff4"/>
@@ -3505,7 +3505,7 @@
                 <w:rFonts w:hint="eastAsia"/>
                 <w:noProof/>
               </w:rPr>
-              <w:t>创建插件</w:t>
+              <w:t>编译和发布插件</w:t>
             </w:r>
             <w:r>
               <w:rPr>
@@ -3536,7 +3536,7 @@
                 <w:noProof/>
                 <w:webHidden/>
               </w:rPr>
-              <w:instrText>PAGEREF _Toc225175974 \h</w:instrText>
+              <w:instrText>PAGEREF _Toc225442853 \h</w:instrText>
             </w:r>
             <w:r>
               <w:rPr>
@@ -3612,7 +3612,8 @@
         <w:spacing w:before="288" w:after="240"/>
         <w:ind w:left="660" w:right="240"/>
       </w:pPr>
-      <w:bookmarkStart w:id="4" w:name="_Toc225175950"/>
+      <w:bookmarkStart w:id="4" w:name="_Ref225408492"/>
+      <w:bookmarkStart w:id="5" w:name="_Toc225442829"/>
       <w:r>
         <w:rPr>
           <w:rFonts w:hint="eastAsia"/>
@@ -3621,6 +3622,7 @@
         <w:t>引言</w:t>
       </w:r>
       <w:bookmarkEnd w:id="4"/>
+      <w:bookmarkEnd w:id="5"/>
     </w:p>
     <w:p>
       <w:pPr>
@@ -3834,14 +3836,14 @@
         </w:rPr>
         <w:t>开源。</w:t>
       </w:r>
-      <w:bookmarkStart w:id="5" w:name="_Hlk218608800"/>
+      <w:bookmarkStart w:id="6" w:name="_Hlk218608800"/>
       <w:r>
         <w:rPr>
           <w:rFonts w:hint="eastAsia"/>
         </w:rPr>
         <w:t>yuan</w:t>
       </w:r>
-      <w:bookmarkEnd w:id="5"/>
+      <w:bookmarkEnd w:id="6"/>
       <w:r>
         <w:rPr>
           <w:rFonts w:hint="eastAsia"/>
@@ -4104,7 +4106,7 @@
           <w:rFonts w:hint="eastAsia"/>
         </w:rPr>
       </w:pPr>
-      <w:bookmarkStart w:id="6" w:name="_Toc225175951"/>
+      <w:bookmarkStart w:id="7" w:name="_Toc225442830"/>
       <w:r>
         <w:rPr>
           <w:rFonts w:hint="eastAsia"/>
@@ -4117,7 +4119,7 @@
         </w:rPr>
         <w:t>简介</w:t>
       </w:r>
-      <w:bookmarkEnd w:id="6"/>
+      <w:bookmarkEnd w:id="7"/>
     </w:p>
     <w:p>
       <w:pPr>
@@ -4134,12 +4136,15 @@
         <w:rPr>
           <w:rFonts w:hint="eastAsia"/>
         </w:rPr>
-        <w:instrText>REF _Ref218414874 \r \h</w:instrText>
+        <w:instrText>REF _Ref225408492 \r \h</w:instrText>
       </w:r>
       <w:r>
         <w:instrText xml:space="preserve"> </w:instrText>
       </w:r>
       <w:r>
+        <w:instrText xml:space="preserve"> \* MERGEFORMAT </w:instrText>
+      </w:r>
+      <w:r>
         <w:fldChar w:fldCharType="separate"/>
       </w:r>
       <w:r>
@@ -4152,7 +4157,7 @@
         <w:rPr>
           <w:rFonts w:hint="eastAsia"/>
         </w:rPr>
-        <w:t>2</w:t>
+        <w:t>1</w:t>
       </w:r>
       <w:r>
         <w:rPr>
@@ -4167,31 +4172,13 @@
         <w:rPr>
           <w:rFonts w:hint="eastAsia"/>
         </w:rPr>
-        <w:t>介绍了</w:t>
-      </w:r>
-      <w:r>
-        <w:rPr>
-          <w:rFonts w:hint="eastAsia"/>
-        </w:rPr>
-        <w:t>Y</w:t>
-      </w:r>
-      <w:r>
-        <w:rPr>
-          <w:rFonts w:hint="eastAsia"/>
-        </w:rPr>
-        <w:t>uan</w:t>
-      </w:r>
-      <w:r>
-        <w:rPr>
-          <w:rFonts w:hint="eastAsia"/>
-        </w:rPr>
-        <w:t>的环境配置</w:t>
-      </w:r>
-      <w:r>
-        <w:rPr>
-          <w:rFonts w:hint="eastAsia"/>
-        </w:rPr>
-        <w:t>。</w:t>
+        <w:t xml:space="preserve"> </w:t>
+      </w:r>
+      <w:r>
+        <w:rPr>
+          <w:rFonts w:hint="eastAsia"/>
+        </w:rPr>
+        <w:t>引言部分。</w:t>
       </w:r>
     </w:p>
     <w:p>
@@ -4209,12 +4196,15 @@
         <w:rPr>
           <w:rFonts w:hint="eastAsia"/>
         </w:rPr>
-        <w:instrText>REF _Ref218414883 \r \h</w:instrText>
+        <w:instrText>REF _Ref218414874 \r \h</w:instrText>
       </w:r>
       <w:r>
         <w:instrText xml:space="preserve"> </w:instrText>
       </w:r>
       <w:r>
+        <w:instrText xml:space="preserve"> \* MERGEFORMAT </w:instrText>
+      </w:r>
+      <w:r>
         <w:fldChar w:fldCharType="separate"/>
       </w:r>
       <w:r>
@@ -4227,7 +4217,7 @@
         <w:rPr>
           <w:rFonts w:hint="eastAsia"/>
         </w:rPr>
-        <w:t>3</w:t>
+        <w:t>2</w:t>
       </w:r>
       <w:r>
         <w:rPr>
@@ -4242,13 +4232,13 @@
         <w:rPr>
           <w:rFonts w:hint="eastAsia"/>
         </w:rPr>
-        <w:t>介绍</w:t>
-      </w:r>
-      <w:r>
-        <w:rPr>
-          <w:rFonts w:hint="eastAsia"/>
-        </w:rPr>
-        <w:t>了怎么快速入门使用</w:t>
+        <w:t xml:space="preserve"> </w:t>
+      </w:r>
+      <w:r>
+        <w:rPr>
+          <w:rFonts w:hint="eastAsia"/>
+        </w:rPr>
+        <w:t>介绍了</w:t>
       </w:r>
       <w:r>
         <w:rPr>
@@ -4257,70 +4247,232 @@
         <w:t>Y</w:t>
       </w:r>
       <w:r>
+        <w:rPr>
+          <w:rFonts w:hint="eastAsia"/>
+        </w:rPr>
         <w:t>uan</w:t>
       </w:r>
       <w:r>
         <w:rPr>
           <w:rFonts w:hint="eastAsia"/>
         </w:rPr>
-        <w:t>，并使用</w:t>
-      </w:r>
-      <w:r>
-        <w:rPr>
-          <w:rFonts w:hint="eastAsia"/>
-        </w:rPr>
-        <w:t>Y</w:t>
-      </w:r>
-      <w:r>
-        <w:t>uan</w:t>
-      </w:r>
-      <w:r>
-        <w:rPr>
-          <w:rFonts w:hint="eastAsia"/>
-        </w:rPr>
-        <w:t>安装了</w:t>
-      </w:r>
-      <w:r>
-        <w:rPr>
-          <w:rFonts w:hint="eastAsia"/>
-        </w:rPr>
-        <w:t>yuan-common</w:t>
-      </w:r>
-      <w:r>
-        <w:rPr>
-          <w:rFonts w:hint="eastAsia"/>
-        </w:rPr>
-        <w:t>到仓库，运行了</w:t>
-      </w:r>
-      <w:r>
-        <w:rPr>
-          <w:rFonts w:hint="eastAsia"/>
-        </w:rPr>
-        <w:t>yuan-platform</w:t>
-      </w:r>
-      <w:r>
-        <w:rPr>
-          <w:rFonts w:hint="eastAsia"/>
-        </w:rPr>
-        <w:t>源文件。</w:t>
+        <w:t>的环境配置</w:t>
+      </w:r>
+      <w:r>
+        <w:rPr>
+          <w:rFonts w:hint="eastAsia"/>
+        </w:rPr>
+        <w:t>。</w:t>
       </w:r>
     </w:p>
     <w:p>
       <w:pPr>
+        <w:pStyle w:val="23"/>
+        <w:ind w:firstLine="480"/>
+      </w:pPr>
+      <w:r>
+        <w:fldChar w:fldCharType="begin"/>
+      </w:r>
+      <w:r>
+        <w:instrText xml:space="preserve"> </w:instrText>
+      </w:r>
+      <w:r>
+        <w:rPr>
+          <w:rFonts w:hint="eastAsia"/>
+        </w:rPr>
+        <w:instrText>REF _Ref218414883 \r \h</w:instrText>
+      </w:r>
+      <w:r>
+        <w:instrText xml:space="preserve"> </w:instrText>
+      </w:r>
+      <w:r>
+        <w:instrText xml:space="preserve"> \* MERGEFORMAT </w:instrText>
+      </w:r>
+      <w:r>
+        <w:fldChar w:fldCharType="separate"/>
+      </w:r>
+      <w:r>
+        <w:rPr>
+          <w:rFonts w:hint="eastAsia"/>
+        </w:rPr>
+        <w:t>第</w:t>
+      </w:r>
+      <w:r>
+        <w:rPr>
+          <w:rFonts w:hint="eastAsia"/>
+        </w:rPr>
+        <w:t>3</w:t>
+      </w:r>
+      <w:r>
+        <w:rPr>
+          <w:rFonts w:hint="eastAsia"/>
+        </w:rPr>
+        <w:t>章</w:t>
+      </w:r>
+      <w:r>
+        <w:fldChar w:fldCharType="end"/>
+      </w:r>
+      <w:r>
+        <w:rPr>
+          <w:rFonts w:hint="eastAsia"/>
+        </w:rPr>
+        <w:t xml:space="preserve"> </w:t>
+      </w:r>
+      <w:r>
+        <w:rPr>
+          <w:rFonts w:hint="eastAsia"/>
+        </w:rPr>
+        <w:t>介绍</w:t>
+      </w:r>
+      <w:r>
+        <w:rPr>
+          <w:rFonts w:hint="eastAsia"/>
+        </w:rPr>
+        <w:t>了怎么快速入门使用</w:t>
+      </w:r>
+      <w:r>
+        <w:rPr>
+          <w:rFonts w:hint="eastAsia"/>
+        </w:rPr>
+        <w:t>Y</w:t>
+      </w:r>
+      <w:r>
+        <w:t>uan</w:t>
+      </w:r>
+      <w:r>
+        <w:rPr>
+          <w:rFonts w:hint="eastAsia"/>
+        </w:rPr>
+        <w:t>，并使用</w:t>
+      </w:r>
+      <w:r>
+        <w:rPr>
+          <w:rFonts w:hint="eastAsia"/>
+        </w:rPr>
+        <w:t>Y</w:t>
+      </w:r>
+      <w:r>
+        <w:t>uan</w:t>
+      </w:r>
+      <w:r>
+        <w:rPr>
+          <w:rFonts w:hint="eastAsia"/>
+        </w:rPr>
+        <w:t>安装了</w:t>
+      </w:r>
+      <w:r>
+        <w:rPr>
+          <w:rFonts w:hint="eastAsia"/>
+        </w:rPr>
+        <w:t>yuan-common</w:t>
+      </w:r>
+      <w:r>
+        <w:rPr>
+          <w:rFonts w:hint="eastAsia"/>
+        </w:rPr>
+        <w:t>到仓库，运行了</w:t>
+      </w:r>
+      <w:r>
+        <w:rPr>
+          <w:rFonts w:hint="eastAsia"/>
+        </w:rPr>
+        <w:t>yuan-platform</w:t>
+      </w:r>
+      <w:r>
+        <w:rPr>
+          <w:rFonts w:hint="eastAsia"/>
+        </w:rPr>
+        <w:t>源文件。</w:t>
+      </w:r>
+    </w:p>
+    <w:p>
+      <w:pPr>
+        <w:pStyle w:val="23"/>
+        <w:ind w:firstLine="480"/>
+      </w:pPr>
+      <w:r>
+        <w:fldChar w:fldCharType="begin"/>
+      </w:r>
+      <w:r>
+        <w:instrText xml:space="preserve"> </w:instrText>
+      </w:r>
+      <w:r>
+        <w:rPr>
+          <w:rFonts w:hint="eastAsia"/>
+        </w:rPr>
+        <w:instrText>REF _Ref225338772 \r \h</w:instrText>
+      </w:r>
+      <w:r>
+        <w:instrText xml:space="preserve"> </w:instrText>
+      </w:r>
+      <w:r>
+        <w:instrText xml:space="preserve"> \* MERGEFORMAT </w:instrText>
+      </w:r>
+      <w:r>
+        <w:fldChar w:fldCharType="separate"/>
+      </w:r>
+      <w:r>
+        <w:rPr>
+          <w:rFonts w:hint="eastAsia"/>
+        </w:rPr>
+        <w:t>第</w:t>
+      </w:r>
+      <w:r>
+        <w:rPr>
+          <w:rFonts w:hint="eastAsia"/>
+        </w:rPr>
+        <w:t>4</w:t>
+      </w:r>
+      <w:r>
+        <w:rPr>
+          <w:rFonts w:hint="eastAsia"/>
+        </w:rPr>
+        <w:t>章</w:t>
+      </w:r>
+      <w:r>
+        <w:fldChar w:fldCharType="end"/>
+      </w:r>
+      <w:r>
+        <w:rPr>
+          <w:rFonts w:hint="eastAsia"/>
+        </w:rPr>
+        <w:t xml:space="preserve"> </w:t>
+      </w:r>
+      <w:r>
+        <w:rPr>
+          <w:rFonts w:hint="eastAsia"/>
+        </w:rPr>
+        <w:t>介绍了</w:t>
+      </w:r>
+      <w:r>
+        <w:rPr>
+          <w:rFonts w:hint="eastAsia"/>
+        </w:rPr>
+        <w:t>Yuan</w:t>
+      </w:r>
+      <w:r>
+        <w:rPr>
+          <w:rFonts w:hint="eastAsia"/>
+        </w:rPr>
+        <w:t>如何添加自定义插件。</w:t>
+      </w:r>
+    </w:p>
+    <w:p>
+      <w:pPr>
         <w:pStyle w:val="2"/>
         <w:spacing w:before="120" w:after="120"/>
         <w:rPr>
           <w:rFonts w:hint="eastAsia"/>
         </w:rPr>
       </w:pPr>
-      <w:bookmarkStart w:id="7" w:name="_Toc225175952"/>
+      <w:bookmarkStart w:id="8" w:name="_Toc225442831"/>
       <w:r>
         <w:rPr>
           <w:rFonts w:hint="eastAsia"/>
         </w:rPr>
         <w:t>联系</w:t>
       </w:r>
-      <w:bookmarkEnd w:id="7"/>
+      <w:bookmarkEnd w:id="8"/>
     </w:p>
     <w:p>
       <w:pPr>
@@ -4473,32 +4625,6 @@
         <w:rPr>
           <w:rFonts w:hint="eastAsia"/>
         </w:rPr>
-        <w:t>平台的开源主页：</w:t>
-      </w:r>
-      <w:hyperlink r:id="rId11" w:history="1">
-        <w:r>
-          <w:rPr>
-            <w:rStyle w:val="aff4"/>
-          </w:rPr>
-          <w:t>https://github.com/YuanIdea/</w:t>
-        </w:r>
-        <w:r>
-          <w:rPr>
-            <w:rStyle w:val="aff4"/>
-          </w:rPr>
-          <w:t>yuan</w:t>
-        </w:r>
-      </w:hyperlink>
-    </w:p>
-    <w:p>
-      <w:pPr>
-        <w:pStyle w:val="23"/>
-        <w:ind w:firstLine="480"/>
-      </w:pPr>
-      <w:r>
-        <w:rPr>
-          <w:rFonts w:hint="eastAsia"/>
-        </w:rPr>
         <w:t>本文</w:t>
       </w:r>
       <w:r>
@@ -4575,8 +4701,8 @@
         <w:spacing w:before="288" w:after="240"/>
         <w:ind w:right="240"/>
       </w:pPr>
-      <w:bookmarkStart w:id="8" w:name="_Ref218414874"/>
-      <w:bookmarkStart w:id="9" w:name="_Toc225175953"/>
+      <w:bookmarkStart w:id="9" w:name="_Ref218414874"/>
+      <w:bookmarkStart w:id="10" w:name="_Toc225442832"/>
       <w:r>
         <w:rPr>
           <w:rFonts w:hint="eastAsia"/>
@@ -4584,8 +4710,8 @@
         <w:lastRenderedPageBreak/>
         <w:t>配置环境</w:t>
       </w:r>
-      <w:bookmarkEnd w:id="8"/>
       <w:bookmarkEnd w:id="9"/>
+      <w:bookmarkEnd w:id="10"/>
     </w:p>
     <w:p>
       <w:pPr>
@@ -4730,14 +4856,14 @@
         </w:rPr>
         <w:t>文件中没有提供内置的</w:t>
       </w:r>
-      <w:bookmarkStart w:id="10" w:name="_Hlk218414394"/>
+      <w:bookmarkStart w:id="11" w:name="_Hlk218414394"/>
       <w:r>
         <w:rPr>
           <w:rFonts w:hint="eastAsia"/>
         </w:rPr>
         <w:t>jdk-11</w:t>
       </w:r>
-      <w:bookmarkEnd w:id="10"/>
+      <w:bookmarkEnd w:id="11"/>
       <w:r>
         <w:rPr>
           <w:rFonts w:hint="eastAsia"/>
@@ -4795,18 +4921,18 @@
           <w:rFonts w:hint="eastAsia"/>
         </w:rPr>
       </w:pPr>
-      <w:bookmarkStart w:id="11" w:name="_Ref218414159"/>
-      <w:bookmarkStart w:id="12" w:name="_Ref218414476"/>
-      <w:bookmarkStart w:id="13" w:name="_Toc225175954"/>
+      <w:bookmarkStart w:id="12" w:name="_Ref218414159"/>
+      <w:bookmarkStart w:id="13" w:name="_Ref218414476"/>
+      <w:bookmarkStart w:id="14" w:name="_Toc225442833"/>
       <w:r>
         <w:rPr>
           <w:rFonts w:hint="eastAsia"/>
         </w:rPr>
         <w:t>检验是否安装</w:t>
       </w:r>
-      <w:bookmarkEnd w:id="11"/>
       <w:bookmarkEnd w:id="12"/>
       <w:bookmarkEnd w:id="13"/>
+      <w:bookmarkEnd w:id="14"/>
     </w:p>
     <w:p>
       <w:pPr>
@@ -4956,7 +5082,7 @@
                     </pic:cNvPicPr>
                   </pic:nvPicPr>
                   <pic:blipFill>
-                    <a:blip r:embed="rId12">
+                    <a:blip r:embed="rId11">
                       <a:extLst>
                         <a:ext uri="{28A0092B-C50C-407E-A947-70E740481C1C}">
                           <a14:useLocalDpi xmlns:a14="http://schemas.microsoft.com/office/drawing/2010/main" val="0"/>
@@ -4992,7 +5118,7 @@
       <w:pPr>
         <w:pStyle w:val="affc"/>
       </w:pPr>
-      <w:bookmarkStart w:id="14" w:name="_Ref218410705"/>
+      <w:bookmarkStart w:id="15" w:name="_Ref218410705"/>
       <w:r>
         <w:rPr>
           <w:rFonts w:hint="eastAsia"/>
@@ -5074,7 +5200,7 @@
       <w:r>
         <w:fldChar w:fldCharType="end"/>
       </w:r>
-      <w:bookmarkEnd w:id="14"/>
+      <w:bookmarkEnd w:id="15"/>
       <w:r>
         <w:rPr>
           <w:rFonts w:hint="eastAsia"/>
@@ -5205,8 +5331,8 @@
           <w:rFonts w:hint="eastAsia"/>
         </w:rPr>
       </w:pPr>
-      <w:bookmarkStart w:id="15" w:name="_Ref218411409"/>
-      <w:bookmarkStart w:id="16" w:name="_Toc225175955"/>
+      <w:bookmarkStart w:id="16" w:name="_Ref218411409"/>
+      <w:bookmarkStart w:id="17" w:name="_Toc225442834"/>
       <w:r>
         <w:rPr>
           <w:rFonts w:hint="eastAsia"/>
@@ -5216,45 +5342,7 @@
       <w:r>
         <w:t>jdk-11</w:t>
       </w:r>
-      <w:bookmarkEnd w:id="15"/>
       <w:bookmarkEnd w:id="16"/>
-    </w:p>
-    <w:p>
-      <w:pPr>
-        <w:pStyle w:val="23"/>
-        <w:ind w:firstLine="480"/>
-      </w:pPr>
-      <w:r>
-        <w:rPr>
-          <w:rFonts w:hint="eastAsia"/>
-        </w:rPr>
-        <w:t>本节基于</w:t>
-      </w:r>
-      <w:r>
-        <w:t>jdk-11</w:t>
-      </w:r>
-      <w:r>
-        <w:rPr>
-          <w:rFonts w:hint="eastAsia"/>
-        </w:rPr>
-        <w:t>，演示下载安装和配置过程。如果已经安装可以跳过本节。</w:t>
-      </w:r>
-    </w:p>
-    <w:p>
-      <w:pPr>
-        <w:pStyle w:val="3"/>
-        <w:spacing w:before="120" w:after="120"/>
-        <w:rPr>
-          <w:rFonts w:hint="eastAsia"/>
-        </w:rPr>
-      </w:pPr>
-      <w:bookmarkStart w:id="17" w:name="_Toc225175956"/>
-      <w:r>
-        <w:rPr>
-          <w:rFonts w:hint="eastAsia"/>
-        </w:rPr>
-        <w:t>下载</w:t>
-      </w:r>
       <w:bookmarkEnd w:id="17"/>
     </w:p>
     <w:p>
@@ -5262,6 +5350,44 @@
         <w:pStyle w:val="23"/>
         <w:ind w:firstLine="480"/>
       </w:pPr>
+      <w:r>
+        <w:rPr>
+          <w:rFonts w:hint="eastAsia"/>
+        </w:rPr>
+        <w:t>本节基于</w:t>
+      </w:r>
+      <w:r>
+        <w:t>jdk-11</w:t>
+      </w:r>
+      <w:r>
+        <w:rPr>
+          <w:rFonts w:hint="eastAsia"/>
+        </w:rPr>
+        <w:t>，演示下载安装和配置过程。如果已经安装可以跳过本节。</w:t>
+      </w:r>
+    </w:p>
+    <w:p>
+      <w:pPr>
+        <w:pStyle w:val="3"/>
+        <w:spacing w:before="120" w:after="120"/>
+        <w:rPr>
+          <w:rFonts w:hint="eastAsia"/>
+        </w:rPr>
+      </w:pPr>
+      <w:bookmarkStart w:id="18" w:name="_Toc225442835"/>
+      <w:r>
+        <w:rPr>
+          <w:rFonts w:hint="eastAsia"/>
+        </w:rPr>
+        <w:t>下载</w:t>
+      </w:r>
+      <w:bookmarkEnd w:id="18"/>
+    </w:p>
+    <w:p>
+      <w:pPr>
+        <w:pStyle w:val="23"/>
+        <w:ind w:firstLine="480"/>
+      </w:pPr>
       <w:proofErr w:type="gramStart"/>
       <w:r>
         <w:t>官网地址</w:t>
@@ -5273,7 +5399,7 @@
         </w:rPr>
         <w:t>[</w:t>
       </w:r>
-      <w:hyperlink r:id="rId13" w:history="1">
+      <w:hyperlink r:id="rId12" w:history="1">
         <w:r>
           <w:rPr>
             <w:rStyle w:val="aff4"/>
@@ -5472,7 +5598,7 @@
                     </pic:cNvPicPr>
                   </pic:nvPicPr>
                   <pic:blipFill>
-                    <a:blip r:embed="rId14" cstate="print">
+                    <a:blip r:embed="rId13" cstate="print">
                       <a:extLst>
                         <a:ext uri="{28A0092B-C50C-407E-A947-70E740481C1C}">
                           <a14:useLocalDpi xmlns:a14="http://schemas.microsoft.com/office/drawing/2010/main" val="0"/>
@@ -5508,7 +5634,7 @@
       <w:pPr>
         <w:pStyle w:val="affc"/>
       </w:pPr>
-      <w:bookmarkStart w:id="18" w:name="_Ref218411699"/>
+      <w:bookmarkStart w:id="19" w:name="_Ref218411699"/>
       <w:r>
         <w:rPr>
           <w:rFonts w:hint="eastAsia"/>
@@ -5590,7 +5716,7 @@
       <w:r>
         <w:fldChar w:fldCharType="end"/>
       </w:r>
-      <w:bookmarkEnd w:id="18"/>
+      <w:bookmarkEnd w:id="19"/>
       <w:r>
         <w:rPr>
           <w:rFonts w:hint="eastAsia"/>
@@ -5618,14 +5744,14 @@
           <w:rFonts w:hint="eastAsia"/>
         </w:rPr>
       </w:pPr>
-      <w:bookmarkStart w:id="19" w:name="_Toc225175957"/>
+      <w:bookmarkStart w:id="20" w:name="_Toc225442836"/>
       <w:r>
         <w:rPr>
           <w:rFonts w:hint="eastAsia"/>
         </w:rPr>
         <w:t>安装</w:t>
       </w:r>
-      <w:bookmarkEnd w:id="19"/>
+      <w:bookmarkEnd w:id="20"/>
     </w:p>
     <w:p>
       <w:pPr>
@@ -5719,7 +5845,7 @@
                     </pic:cNvPicPr>
                   </pic:nvPicPr>
                   <pic:blipFill>
-                    <a:blip r:embed="rId15">
+                    <a:blip r:embed="rId14">
                       <a:extLst>
                         <a:ext uri="{28A0092B-C50C-407E-A947-70E740481C1C}">
                           <a14:useLocalDpi xmlns:a14="http://schemas.microsoft.com/office/drawing/2010/main" val="0"/>
@@ -5755,7 +5881,7 @@
       <w:pPr>
         <w:pStyle w:val="affc"/>
       </w:pPr>
-      <w:bookmarkStart w:id="20" w:name="_Ref218412540"/>
+      <w:bookmarkStart w:id="21" w:name="_Ref218412540"/>
       <w:r>
         <w:rPr>
           <w:rFonts w:hint="eastAsia"/>
@@ -5837,7 +5963,7 @@
       <w:r>
         <w:fldChar w:fldCharType="end"/>
       </w:r>
-      <w:bookmarkEnd w:id="20"/>
+      <w:bookmarkEnd w:id="21"/>
       <w:r>
         <w:rPr>
           <w:rFonts w:hint="eastAsia"/>
@@ -5942,7 +6068,7 @@
                     </pic:cNvPicPr>
                   </pic:nvPicPr>
                   <pic:blipFill>
-                    <a:blip r:embed="rId16">
+                    <a:blip r:embed="rId15">
                       <a:extLst>
                         <a:ext uri="{28A0092B-C50C-407E-A947-70E740481C1C}">
                           <a14:useLocalDpi xmlns:a14="http://schemas.microsoft.com/office/drawing/2010/main" val="0"/>
@@ -5978,7 +6104,7 @@
       <w:pPr>
         <w:pStyle w:val="affc"/>
       </w:pPr>
-      <w:bookmarkStart w:id="21" w:name="_Ref218412595"/>
+      <w:bookmarkStart w:id="22" w:name="_Ref218412595"/>
       <w:r>
         <w:rPr>
           <w:rFonts w:hint="eastAsia"/>
@@ -6060,7 +6186,7 @@
       <w:r>
         <w:fldChar w:fldCharType="end"/>
       </w:r>
-      <w:bookmarkEnd w:id="21"/>
+      <w:bookmarkEnd w:id="22"/>
       <w:r>
         <w:rPr>
           <w:rFonts w:hint="eastAsia"/>
@@ -6082,7 +6208,7 @@
           <w:rFonts w:hint="eastAsia"/>
         </w:rPr>
       </w:pPr>
-      <w:bookmarkStart w:id="22" w:name="_Toc225175958"/>
+      <w:bookmarkStart w:id="23" w:name="_Toc225442837"/>
       <w:r>
         <w:rPr>
           <w:rFonts w:hint="eastAsia"/>
@@ -6095,7 +6221,7 @@
         </w:rPr>
         <w:t>环境变量</w:t>
       </w:r>
-      <w:bookmarkEnd w:id="22"/>
+      <w:bookmarkEnd w:id="23"/>
     </w:p>
     <w:p>
       <w:pPr>
@@ -6161,7 +6287,7 @@
                     </pic:cNvPicPr>
                   </pic:nvPicPr>
                   <pic:blipFill>
-                    <a:blip r:embed="rId17" cstate="print">
+                    <a:blip r:embed="rId16" cstate="print">
                       <a:extLst>
                         <a:ext uri="{28A0092B-C50C-407E-A947-70E740481C1C}">
                           <a14:useLocalDpi xmlns:a14="http://schemas.microsoft.com/office/drawing/2010/main" val="0"/>
@@ -6197,7 +6323,7 @@
       <w:pPr>
         <w:pStyle w:val="affc"/>
       </w:pPr>
-      <w:bookmarkStart w:id="23" w:name="_Ref218418013"/>
+      <w:bookmarkStart w:id="24" w:name="_Ref218418013"/>
       <w:r>
         <w:rPr>
           <w:rFonts w:hint="eastAsia"/>
@@ -6279,7 +6405,7 @@
       <w:r>
         <w:fldChar w:fldCharType="end"/>
       </w:r>
-      <w:bookmarkEnd w:id="23"/>
+      <w:bookmarkEnd w:id="24"/>
       <w:r>
         <w:rPr>
           <w:rFonts w:hint="eastAsia"/>
@@ -6423,7 +6549,7 @@
         </w:rPr>
         <w:lastRenderedPageBreak/>
         <w:drawing>
-          <wp:inline distT="0" distB="0" distL="0" distR="0" wp14:anchorId="0ED27ED1" wp14:editId="2F0F6B7E">
+          <wp:inline distT="0" distB="0" distL="0" distR="0" wp14:anchorId="0ED27ED1" wp14:editId="31A28273">
             <wp:extent cx="2070100" cy="1651479"/>
             <wp:effectExtent l="0" t="0" r="6350" b="6350"/>
             <wp:docPr id="123422222" name="图片 2"/>
@@ -6440,7 +6566,7 @@
                     </pic:cNvPicPr>
                   </pic:nvPicPr>
                   <pic:blipFill>
-                    <a:blip r:embed="rId18" cstate="print">
+                    <a:blip r:embed="rId17" cstate="print">
                       <a:extLst>
                         <a:ext uri="{28A0092B-C50C-407E-A947-70E740481C1C}">
                           <a14:useLocalDpi xmlns:a14="http://schemas.microsoft.com/office/drawing/2010/main" val="0"/>
@@ -6476,7 +6602,7 @@
       <w:pPr>
         <w:pStyle w:val="affc"/>
       </w:pPr>
-      <w:bookmarkStart w:id="24" w:name="_Ref218418029"/>
+      <w:bookmarkStart w:id="25" w:name="_Ref218418029"/>
       <w:r>
         <w:rPr>
           <w:rFonts w:hint="eastAsia"/>
@@ -6558,7 +6684,7 @@
       <w:r>
         <w:fldChar w:fldCharType="end"/>
       </w:r>
-      <w:bookmarkEnd w:id="24"/>
+      <w:bookmarkEnd w:id="25"/>
       <w:r>
         <w:rPr>
           <w:rFonts w:hint="eastAsia"/>
@@ -6664,7 +6790,7 @@
                     </pic:cNvPicPr>
                   </pic:nvPicPr>
                   <pic:blipFill>
-                    <a:blip r:embed="rId19" cstate="print">
+                    <a:blip r:embed="rId18" cstate="print">
                       <a:extLst>
                         <a:ext uri="{28A0092B-C50C-407E-A947-70E740481C1C}">
                           <a14:useLocalDpi xmlns:a14="http://schemas.microsoft.com/office/drawing/2010/main" val="0"/>
@@ -6700,7 +6826,7 @@
       <w:pPr>
         <w:pStyle w:val="affc"/>
       </w:pPr>
-      <w:bookmarkStart w:id="25" w:name="_Ref218418049"/>
+      <w:bookmarkStart w:id="26" w:name="_Ref218418049"/>
       <w:r>
         <w:rPr>
           <w:rFonts w:hint="eastAsia"/>
@@ -6782,7 +6908,7 @@
       <w:r>
         <w:fldChar w:fldCharType="end"/>
       </w:r>
-      <w:bookmarkEnd w:id="25"/>
+      <w:bookmarkEnd w:id="26"/>
       <w:r>
         <w:rPr>
           <w:rFonts w:hint="eastAsia"/>
@@ -6800,14 +6926,14 @@
       <w:pPr>
         <w:pStyle w:val="4"/>
       </w:pPr>
-      <w:bookmarkStart w:id="26" w:name="_Ref221197279"/>
+      <w:bookmarkStart w:id="27" w:name="_Ref221197279"/>
       <w:r>
         <w:rPr>
           <w:rFonts w:hint="eastAsia"/>
         </w:rPr>
         <w:t>添加JAVA_HOME</w:t>
       </w:r>
-      <w:bookmarkEnd w:id="26"/>
+      <w:bookmarkEnd w:id="27"/>
     </w:p>
     <w:p>
       <w:pPr>
@@ -6931,7 +7057,7 @@
           <w:noProof/>
         </w:rPr>
         <w:drawing>
-          <wp:inline distT="0" distB="0" distL="0" distR="0" wp14:anchorId="0840E60A" wp14:editId="40A5ADF5">
+          <wp:inline distT="0" distB="0" distL="0" distR="0" wp14:anchorId="0840E60A" wp14:editId="327445B2">
             <wp:extent cx="4668702" cy="1128542"/>
             <wp:effectExtent l="0" t="0" r="0" b="0"/>
             <wp:docPr id="5299923" name="图片 10"/>
@@ -6948,7 +7074,7 @@
                     </pic:cNvPicPr>
                   </pic:nvPicPr>
                   <pic:blipFill>
-                    <a:blip r:embed="rId20" cstate="print">
+                    <a:blip r:embed="rId19" cstate="print">
                       <a:extLst>
                         <a:ext uri="{28A0092B-C50C-407E-A947-70E740481C1C}">
                           <a14:useLocalDpi xmlns:a14="http://schemas.microsoft.com/office/drawing/2010/main" val="0"/>
@@ -6984,7 +7110,7 @@
       <w:pPr>
         <w:pStyle w:val="affc"/>
       </w:pPr>
-      <w:bookmarkStart w:id="27" w:name="_Ref218413125"/>
+      <w:bookmarkStart w:id="28" w:name="_Ref218413125"/>
       <w:r>
         <w:rPr>
           <w:rFonts w:hint="eastAsia"/>
@@ -7066,7 +7192,7 @@
       <w:r>
         <w:fldChar w:fldCharType="end"/>
       </w:r>
-      <w:bookmarkEnd w:id="27"/>
+      <w:bookmarkEnd w:id="28"/>
       <w:r>
         <w:rPr>
           <w:rFonts w:hint="eastAsia"/>
@@ -7096,14 +7222,14 @@
         </w:rPr>
         <w:t>配置</w:t>
       </w:r>
-      <w:bookmarkStart w:id="28" w:name="_Hlk218433639"/>
+      <w:bookmarkStart w:id="29" w:name="_Hlk218433639"/>
       <w:r>
         <w:rPr>
           <w:rFonts w:hint="eastAsia"/>
         </w:rPr>
         <w:t>Path</w:t>
       </w:r>
-      <w:bookmarkEnd w:id="28"/>
+      <w:bookmarkEnd w:id="29"/>
     </w:p>
     <w:p>
       <w:pPr>
@@ -7183,7 +7309,7 @@
           <w:noProof/>
         </w:rPr>
         <w:drawing>
-          <wp:inline distT="0" distB="0" distL="0" distR="0" wp14:anchorId="24EA3BD7" wp14:editId="6E0B4011">
+          <wp:inline distT="0" distB="0" distL="0" distR="0" wp14:anchorId="24EA3BD7" wp14:editId="5A636706">
             <wp:extent cx="3773515" cy="3559266"/>
             <wp:effectExtent l="0" t="0" r="0" b="3175"/>
             <wp:docPr id="1931158430" name="图片 1"/>
@@ -7200,7 +7326,7 @@
                     </pic:cNvPicPr>
                   </pic:nvPicPr>
                   <pic:blipFill>
-                    <a:blip r:embed="rId21" cstate="print">
+                    <a:blip r:embed="rId20" cstate="print">
                       <a:extLst>
                         <a:ext uri="{28A0092B-C50C-407E-A947-70E740481C1C}">
                           <a14:useLocalDpi xmlns:a14="http://schemas.microsoft.com/office/drawing/2010/main" val="0"/>
@@ -7236,8 +7362,8 @@
       <w:pPr>
         <w:pStyle w:val="affc"/>
       </w:pPr>
-      <w:bookmarkStart w:id="29" w:name="_Ref218433298"/>
-      <w:bookmarkStart w:id="30" w:name="_Ref218433263"/>
+      <w:bookmarkStart w:id="30" w:name="_Ref218433298"/>
+      <w:bookmarkStart w:id="31" w:name="_Ref218433263"/>
       <w:r>
         <w:rPr>
           <w:rFonts w:hint="eastAsia"/>
@@ -7319,7 +7445,7 @@
       <w:r>
         <w:fldChar w:fldCharType="end"/>
       </w:r>
-      <w:bookmarkEnd w:id="29"/>
+      <w:bookmarkEnd w:id="30"/>
       <w:r>
         <w:rPr>
           <w:rFonts w:hint="eastAsia"/>
@@ -7332,7 +7458,7 @@
         </w:rPr>
         <w:t>环境变量</w:t>
       </w:r>
-      <w:bookmarkEnd w:id="30"/>
+      <w:bookmarkEnd w:id="31"/>
     </w:p>
     <w:p>
       <w:pPr>
@@ -7519,7 +7645,7 @@
                     </pic:cNvPicPr>
                   </pic:nvPicPr>
                   <pic:blipFill>
-                    <a:blip r:embed="rId22">
+                    <a:blip r:embed="rId21">
                       <a:extLst>
                         <a:ext uri="{28A0092B-C50C-407E-A947-70E740481C1C}">
                           <a14:useLocalDpi xmlns:a14="http://schemas.microsoft.com/office/drawing/2010/main" val="0"/>
@@ -7555,7 +7681,7 @@
       <w:pPr>
         <w:pStyle w:val="affc"/>
       </w:pPr>
-      <w:bookmarkStart w:id="31" w:name="_Ref218410927"/>
+      <w:bookmarkStart w:id="32" w:name="_Ref218410927"/>
       <w:r>
         <w:rPr>
           <w:rFonts w:hint="eastAsia"/>
@@ -7637,7 +7763,7 @@
       <w:r>
         <w:fldChar w:fldCharType="end"/>
       </w:r>
-      <w:bookmarkEnd w:id="31"/>
+      <w:bookmarkEnd w:id="32"/>
       <w:r>
         <w:rPr>
           <w:rFonts w:hint="eastAsia"/>
@@ -7840,8 +7966,8 @@
         <w:spacing w:before="288" w:after="240"/>
         <w:ind w:right="240"/>
       </w:pPr>
-      <w:bookmarkStart w:id="32" w:name="_Ref218414883"/>
-      <w:bookmarkStart w:id="33" w:name="_Toc225175959"/>
+      <w:bookmarkStart w:id="33" w:name="_Ref218414883"/>
+      <w:bookmarkStart w:id="34" w:name="_Toc225442838"/>
       <w:bookmarkEnd w:id="3"/>
       <w:bookmarkEnd w:id="2"/>
       <w:bookmarkEnd w:id="1"/>
@@ -7853,8 +7979,8 @@
         <w:lastRenderedPageBreak/>
         <w:t>快速入门</w:t>
       </w:r>
-      <w:bookmarkEnd w:id="32"/>
       <w:bookmarkEnd w:id="33"/>
+      <w:bookmarkEnd w:id="34"/>
     </w:p>
     <w:p>
       <w:pPr>
@@ -8169,7 +8295,7 @@
                     </pic:cNvPicPr>
                   </pic:nvPicPr>
                   <pic:blipFill>
-                    <a:blip r:embed="rId23" cstate="print">
+                    <a:blip r:embed="rId22" cstate="print">
                       <a:extLst>
                         <a:ext uri="{28A0092B-C50C-407E-A947-70E740481C1C}">
                           <a14:useLocalDpi xmlns:a14="http://schemas.microsoft.com/office/drawing/2010/main" val="0"/>
@@ -8205,7 +8331,7 @@
       <w:pPr>
         <w:pStyle w:val="affc"/>
       </w:pPr>
-      <w:bookmarkStart w:id="34" w:name="_Ref218415989"/>
+      <w:bookmarkStart w:id="35" w:name="_Ref218415989"/>
       <w:r>
         <w:rPr>
           <w:rFonts w:hint="eastAsia"/>
@@ -8287,7 +8413,7 @@
       <w:r>
         <w:fldChar w:fldCharType="end"/>
       </w:r>
-      <w:bookmarkEnd w:id="34"/>
+      <w:bookmarkEnd w:id="35"/>
       <w:r>
         <w:rPr>
           <w:rFonts w:hint="eastAsia"/>
@@ -8309,7 +8435,7 @@
           <w:rFonts w:hint="eastAsia"/>
         </w:rPr>
       </w:pPr>
-      <w:bookmarkStart w:id="35" w:name="_Toc225175960"/>
+      <w:bookmarkStart w:id="36" w:name="_Toc225442839"/>
       <w:r>
         <w:rPr>
           <w:rFonts w:hint="eastAsia"/>
@@ -8322,7 +8448,7 @@
         </w:rPr>
         <w:t>平台</w:t>
       </w:r>
-      <w:bookmarkEnd w:id="35"/>
+      <w:bookmarkEnd w:id="36"/>
     </w:p>
     <w:p>
       <w:pPr>
@@ -8392,14 +8518,16 @@
           <w:rFonts w:hint="eastAsia"/>
         </w:rPr>
       </w:pPr>
-      <w:bookmarkStart w:id="36" w:name="_Toc225175961"/>
+      <w:bookmarkStart w:id="37" w:name="_Ref225403980"/>
+      <w:bookmarkStart w:id="38" w:name="_Toc225442840"/>
       <w:r>
         <w:rPr>
           <w:rFonts w:hint="eastAsia"/>
         </w:rPr>
         <w:t>安装yuan-common</w:t>
       </w:r>
-      <w:bookmarkEnd w:id="36"/>
+      <w:bookmarkEnd w:id="37"/>
+      <w:bookmarkEnd w:id="38"/>
     </w:p>
     <w:p>
       <w:pPr>
@@ -8590,7 +8718,7 @@
                     </pic:cNvPicPr>
                   </pic:nvPicPr>
                   <pic:blipFill>
-                    <a:blip r:embed="rId24" cstate="print">
+                    <a:blip r:embed="rId23" cstate="print">
                       <a:extLst>
                         <a:ext uri="{28A0092B-C50C-407E-A947-70E740481C1C}">
                           <a14:useLocalDpi xmlns:a14="http://schemas.microsoft.com/office/drawing/2010/main" val="0"/>
@@ -8626,7 +8754,7 @@
       <w:pPr>
         <w:pStyle w:val="affc"/>
       </w:pPr>
-      <w:bookmarkStart w:id="37" w:name="_Ref218416554"/>
+      <w:bookmarkStart w:id="39" w:name="_Ref218416554"/>
       <w:r>
         <w:rPr>
           <w:rFonts w:hint="eastAsia"/>
@@ -8708,7 +8836,7 @@
       <w:r>
         <w:fldChar w:fldCharType="end"/>
       </w:r>
-      <w:bookmarkEnd w:id="37"/>
+      <w:bookmarkEnd w:id="39"/>
       <w:r>
         <w:rPr>
           <w:rFonts w:hint="eastAsia"/>
@@ -8856,7 +8984,7 @@
                     </pic:cNvPicPr>
                   </pic:nvPicPr>
                   <pic:blipFill>
-                    <a:blip r:embed="rId25">
+                    <a:blip r:embed="rId24">
                       <a:extLst>
                         <a:ext uri="{28A0092B-C50C-407E-A947-70E740481C1C}">
                           <a14:useLocalDpi xmlns:a14="http://schemas.microsoft.com/office/drawing/2010/main" val="0"/>
@@ -8892,7 +9020,7 @@
       <w:pPr>
         <w:pStyle w:val="affc"/>
       </w:pPr>
-      <w:bookmarkStart w:id="38" w:name="_Ref218416817"/>
+      <w:bookmarkStart w:id="40" w:name="_Ref218416817"/>
       <w:r>
         <w:rPr>
           <w:rFonts w:hint="eastAsia"/>
@@ -8974,7 +9102,7 @@
       <w:r>
         <w:fldChar w:fldCharType="end"/>
       </w:r>
-      <w:bookmarkEnd w:id="38"/>
+      <w:bookmarkEnd w:id="40"/>
       <w:r>
         <w:rPr>
           <w:rFonts w:hint="eastAsia"/>
@@ -8996,22 +9124,22 @@
           <w:rFonts w:hint="eastAsia"/>
         </w:rPr>
       </w:pPr>
-      <w:bookmarkStart w:id="39" w:name="_Toc225175962"/>
+      <w:bookmarkStart w:id="41" w:name="_Toc225442841"/>
       <w:r>
         <w:rPr>
           <w:rFonts w:hint="eastAsia"/>
         </w:rPr>
         <w:t>运行</w:t>
       </w:r>
-      <w:bookmarkStart w:id="40" w:name="_Hlk218416952"/>
+      <w:bookmarkStart w:id="42" w:name="_Hlk218416952"/>
       <w:r>
         <w:rPr>
           <w:rFonts w:hint="eastAsia"/>
         </w:rPr>
         <w:t>yuan-platform</w:t>
       </w:r>
-      <w:bookmarkEnd w:id="39"/>
-      <w:bookmarkEnd w:id="40"/>
+      <w:bookmarkEnd w:id="41"/>
+      <w:bookmarkEnd w:id="42"/>
     </w:p>
     <w:p>
       <w:pPr>
@@ -9163,7 +9291,7 @@
                     </pic:cNvPicPr>
                   </pic:nvPicPr>
                   <pic:blipFill>
-                    <a:blip r:embed="rId26" cstate="print">
+                    <a:blip r:embed="rId25" cstate="print">
                       <a:extLst>
                         <a:ext uri="{28A0092B-C50C-407E-A947-70E740481C1C}">
                           <a14:useLocalDpi xmlns:a14="http://schemas.microsoft.com/office/drawing/2010/main" val="0"/>
@@ -9199,7 +9327,7 @@
       <w:pPr>
         <w:pStyle w:val="affc"/>
       </w:pPr>
-      <w:bookmarkStart w:id="41" w:name="_Ref218417268"/>
+      <w:bookmarkStart w:id="43" w:name="_Ref218417268"/>
       <w:r>
         <w:rPr>
           <w:rFonts w:hint="eastAsia"/>
@@ -9281,7 +9409,7 @@
       <w:r>
         <w:fldChar w:fldCharType="end"/>
       </w:r>
-      <w:bookmarkEnd w:id="41"/>
+      <w:bookmarkEnd w:id="43"/>
       <w:r>
         <w:rPr>
           <w:rFonts w:hint="eastAsia"/>
@@ -9309,16 +9437,16 @@
           <w:rFonts w:hint="eastAsia"/>
         </w:rPr>
       </w:pPr>
-      <w:bookmarkStart w:id="42" w:name="_Ref225089916"/>
-      <w:bookmarkStart w:id="43" w:name="_Toc225175963"/>
+      <w:bookmarkStart w:id="44" w:name="_Ref225089916"/>
+      <w:bookmarkStart w:id="45" w:name="_Toc225442842"/>
       <w:r>
         <w:rPr>
           <w:rFonts w:hint="eastAsia"/>
         </w:rPr>
         <w:t>打包yuan-platform</w:t>
       </w:r>
-      <w:bookmarkEnd w:id="42"/>
-      <w:bookmarkEnd w:id="43"/>
+      <w:bookmarkEnd w:id="44"/>
+      <w:bookmarkEnd w:id="45"/>
     </w:p>
     <w:p>
       <w:pPr>
@@ -9562,14 +9690,14 @@
           <w:rFonts w:hint="eastAsia"/>
         </w:rPr>
       </w:pPr>
-      <w:bookmarkStart w:id="44" w:name="_Toc225175964"/>
+      <w:bookmarkStart w:id="46" w:name="_Toc225442843"/>
       <w:r>
         <w:rPr>
           <w:rFonts w:hint="eastAsia"/>
         </w:rPr>
         <w:t>运行Maven项目</w:t>
       </w:r>
-      <w:bookmarkEnd w:id="44"/>
+      <w:bookmarkEnd w:id="46"/>
     </w:p>
     <w:p>
       <w:pPr>
@@ -9723,7 +9851,7 @@
               <w:keepNext/>
               <w:ind w:leftChars="0" w:left="0"/>
             </w:pPr>
-            <w:bookmarkStart w:id="45" w:name="_Ref208924315"/>
+            <w:bookmarkStart w:id="47" w:name="_Ref208924315"/>
             <w:r>
               <w:rPr>
                 <w:rFonts w:hint="eastAsia"/>
@@ -9805,7 +9933,7 @@
             <w:r>
               <w:fldChar w:fldCharType="end"/>
             </w:r>
-            <w:bookmarkEnd w:id="45"/>
+            <w:bookmarkEnd w:id="47"/>
             <w:r>
               <w:rPr>
                 <w:rFonts w:hint="eastAsia"/>
@@ -10306,7 +10434,7 @@
                     </pic:cNvPicPr>
                   </pic:nvPicPr>
                   <pic:blipFill>
-                    <a:blip r:embed="rId27" cstate="print">
+                    <a:blip r:embed="rId26" cstate="print">
                       <a:extLst>
                         <a:ext uri="{28A0092B-C50C-407E-A947-70E740481C1C}">
                           <a14:useLocalDpi xmlns:a14="http://schemas.microsoft.com/office/drawing/2010/main" val="0"/>
@@ -10342,7 +10470,7 @@
       <w:pPr>
         <w:pStyle w:val="affc"/>
       </w:pPr>
-      <w:bookmarkStart w:id="46" w:name="_Ref221197588"/>
+      <w:bookmarkStart w:id="48" w:name="_Ref221197588"/>
       <w:r>
         <w:rPr>
           <w:rFonts w:hint="eastAsia"/>
@@ -10424,7 +10552,7 @@
       <w:r>
         <w:fldChar w:fldCharType="end"/>
       </w:r>
-      <w:bookmarkEnd w:id="46"/>
+      <w:bookmarkEnd w:id="48"/>
       <w:r>
         <w:rPr>
           <w:rFonts w:hint="eastAsia"/>
@@ -10548,7 +10676,7 @@
           <w:rFonts w:hint="eastAsia"/>
         </w:rPr>
       </w:pPr>
-      <w:bookmarkStart w:id="47" w:name="_Toc225175965"/>
+      <w:bookmarkStart w:id="49" w:name="_Toc225442844"/>
       <w:r>
         <w:rPr>
           <w:rFonts w:hint="eastAsia"/>
@@ -10567,7 +10695,7 @@
         </w:rPr>
         <w:t>ython</w:t>
       </w:r>
-      <w:bookmarkEnd w:id="47"/>
+      <w:bookmarkEnd w:id="49"/>
     </w:p>
     <w:p>
       <w:pPr>
@@ -10793,7 +10921,7 @@
                     </pic:cNvPicPr>
                   </pic:nvPicPr>
                   <pic:blipFill>
-                    <a:blip r:embed="rId28">
+                    <a:blip r:embed="rId27">
                       <a:extLst>
                         <a:ext uri="{28A0092B-C50C-407E-A947-70E740481C1C}">
                           <a14:useLocalDpi xmlns:a14="http://schemas.microsoft.com/office/drawing/2010/main" val="0"/>
@@ -10829,7 +10957,7 @@
       <w:pPr>
         <w:pStyle w:val="affc"/>
       </w:pPr>
-      <w:bookmarkStart w:id="48" w:name="_Ref221202022"/>
+      <w:bookmarkStart w:id="50" w:name="_Ref221202022"/>
       <w:r>
         <w:rPr>
           <w:rFonts w:hint="eastAsia"/>
@@ -10911,7 +11039,7 @@
       <w:r>
         <w:fldChar w:fldCharType="end"/>
       </w:r>
-      <w:bookmarkEnd w:id="48"/>
+      <w:bookmarkEnd w:id="50"/>
       <w:r>
         <w:rPr>
           <w:rFonts w:hint="eastAsia"/>
@@ -11047,7 +11175,7 @@
               <w:keepNext/>
               <w:ind w:leftChars="0" w:left="0"/>
             </w:pPr>
-            <w:bookmarkStart w:id="49" w:name="_Ref221202525"/>
+            <w:bookmarkStart w:id="51" w:name="_Ref221202525"/>
             <w:r>
               <w:rPr>
                 <w:rFonts w:hint="eastAsia"/>
@@ -11129,7 +11257,7 @@
             <w:r>
               <w:fldChar w:fldCharType="end"/>
             </w:r>
-            <w:bookmarkEnd w:id="49"/>
+            <w:bookmarkEnd w:id="51"/>
             <w:r>
               <w:rPr>
                 <w:rFonts w:hint="eastAsia"/>
@@ -11462,7 +11590,7 @@
                     </pic:cNvPicPr>
                   </pic:nvPicPr>
                   <pic:blipFill>
-                    <a:blip r:embed="rId29"/>
+                    <a:blip r:embed="rId28"/>
                     <a:stretch>
                       <a:fillRect/>
                     </a:stretch>
@@ -11487,7 +11615,7 @@
       <w:pPr>
         <w:pStyle w:val="affc"/>
       </w:pPr>
-      <w:bookmarkStart w:id="50" w:name="_Ref221202964"/>
+      <w:bookmarkStart w:id="52" w:name="_Ref221202964"/>
       <w:r>
         <w:rPr>
           <w:rFonts w:hint="eastAsia"/>
@@ -11569,7 +11697,7 @@
       <w:r>
         <w:fldChar w:fldCharType="end"/>
       </w:r>
-      <w:bookmarkEnd w:id="50"/>
+      <w:bookmarkEnd w:id="52"/>
       <w:r>
         <w:rPr>
           <w:rFonts w:hint="eastAsia"/>
@@ -11693,7 +11821,7 @@
           <w:rFonts w:hint="eastAsia"/>
         </w:rPr>
       </w:pPr>
-      <w:bookmarkStart w:id="51" w:name="_Toc225175966"/>
+      <w:bookmarkStart w:id="53" w:name="_Toc225442845"/>
       <w:r>
         <w:rPr>
           <w:rFonts w:hint="eastAsia"/>
@@ -11712,7 +11840,7 @@
         </w:rPr>
         <w:t>EXE</w:t>
       </w:r>
-      <w:bookmarkEnd w:id="51"/>
+      <w:bookmarkEnd w:id="53"/>
     </w:p>
     <w:p>
       <w:pPr>
@@ -11803,14 +11931,14 @@
           <w:rFonts w:hint="eastAsia"/>
         </w:rPr>
       </w:pPr>
-      <w:bookmarkStart w:id="52" w:name="_Toc225175967"/>
+      <w:bookmarkStart w:id="54" w:name="_Toc225442846"/>
       <w:r>
         <w:rPr>
           <w:rFonts w:hint="eastAsia"/>
         </w:rPr>
         <w:t>Launch4j简介</w:t>
       </w:r>
-      <w:bookmarkEnd w:id="52"/>
+      <w:bookmarkEnd w:id="54"/>
     </w:p>
     <w:p>
       <w:pPr>
@@ -11944,14 +12072,14 @@
           <w:rFonts w:hint="eastAsia"/>
         </w:rPr>
       </w:pPr>
-      <w:bookmarkStart w:id="53" w:name="_Toc225175968"/>
+      <w:bookmarkStart w:id="55" w:name="_Toc225442847"/>
       <w:r>
         <w:rPr>
           <w:rFonts w:hint="eastAsia"/>
         </w:rPr>
         <w:t>环境准备</w:t>
       </w:r>
-      <w:bookmarkEnd w:id="53"/>
+      <w:bookmarkEnd w:id="55"/>
     </w:p>
     <w:p>
       <w:pPr>
@@ -12095,14 +12223,14 @@
           <w:rFonts w:hint="eastAsia"/>
         </w:rPr>
       </w:pPr>
-      <w:bookmarkStart w:id="54" w:name="_Toc225175969"/>
+      <w:bookmarkStart w:id="56" w:name="_Toc225442848"/>
       <w:r>
         <w:rPr>
           <w:rFonts w:hint="eastAsia"/>
         </w:rPr>
         <w:t>详细打包步骤</w:t>
       </w:r>
-      <w:bookmarkEnd w:id="54"/>
+      <w:bookmarkEnd w:id="56"/>
     </w:p>
     <w:p>
       <w:pPr>
@@ -12239,7 +12367,7 @@
           <w:noProof/>
         </w:rPr>
         <w:drawing>
-          <wp:inline distT="0" distB="0" distL="0" distR="0" wp14:anchorId="1AEE81EF" wp14:editId="10EFDEB7">
+          <wp:inline distT="0" distB="0" distL="0" distR="0" wp14:anchorId="1AEE81EF" wp14:editId="08345311">
             <wp:extent cx="4106538" cy="4002858"/>
             <wp:effectExtent l="0" t="0" r="8890" b="0"/>
             <wp:docPr id="775837512" name="图片 5"/>
@@ -12256,7 +12384,7 @@
                     </pic:cNvPicPr>
                   </pic:nvPicPr>
                   <pic:blipFill>
-                    <a:blip r:embed="rId30" cstate="print">
+                    <a:blip r:embed="rId29" cstate="print">
                       <a:extLst>
                         <a:ext uri="{28A0092B-C50C-407E-A947-70E740481C1C}">
                           <a14:useLocalDpi xmlns:a14="http://schemas.microsoft.com/office/drawing/2010/main" val="0"/>
@@ -12292,7 +12420,7 @@
       <w:pPr>
         <w:pStyle w:val="affc"/>
       </w:pPr>
-      <w:bookmarkStart w:id="55" w:name="_Ref225091624"/>
+      <w:bookmarkStart w:id="57" w:name="_Ref225091624"/>
       <w:r>
         <w:rPr>
           <w:rFonts w:hint="eastAsia"/>
@@ -12374,7 +12502,7 @@
       <w:r>
         <w:fldChar w:fldCharType="end"/>
       </w:r>
-      <w:bookmarkEnd w:id="55"/>
+      <w:bookmarkEnd w:id="57"/>
       <w:r>
         <w:rPr>
           <w:rFonts w:hint="eastAsia"/>
@@ -12605,7 +12733,7 @@
         </w:rPr>
         <w:lastRenderedPageBreak/>
         <w:drawing>
-          <wp:inline distT="0" distB="0" distL="0" distR="0" wp14:anchorId="4EA5D2CE" wp14:editId="2712A27A">
+          <wp:inline distT="0" distB="0" distL="0" distR="0" wp14:anchorId="4EA5D2CE" wp14:editId="393382F9">
             <wp:extent cx="4492964" cy="4419691"/>
             <wp:effectExtent l="0" t="0" r="3175" b="0"/>
             <wp:docPr id="432655210" name="图片 6"/>
@@ -12622,7 +12750,7 @@
                     </pic:cNvPicPr>
                   </pic:nvPicPr>
                   <pic:blipFill>
-                    <a:blip r:embed="rId31" cstate="print">
+                    <a:blip r:embed="rId30" cstate="print">
                       <a:extLst>
                         <a:ext uri="{28A0092B-C50C-407E-A947-70E740481C1C}">
                           <a14:useLocalDpi xmlns:a14="http://schemas.microsoft.com/office/drawing/2010/main" val="0"/>
@@ -12658,7 +12786,7 @@
       <w:pPr>
         <w:pStyle w:val="affc"/>
       </w:pPr>
-      <w:bookmarkStart w:id="56" w:name="_Ref225092893"/>
+      <w:bookmarkStart w:id="58" w:name="_Ref225092893"/>
       <w:r>
         <w:rPr>
           <w:rFonts w:hint="eastAsia"/>
@@ -12740,7 +12868,7 @@
       <w:r>
         <w:fldChar w:fldCharType="end"/>
       </w:r>
-      <w:bookmarkEnd w:id="56"/>
+      <w:bookmarkEnd w:id="58"/>
       <w:r>
         <w:rPr>
           <w:rFonts w:hint="eastAsia"/>
@@ -12884,14 +13012,14 @@
           <w:rFonts w:hint="eastAsia"/>
         </w:rPr>
       </w:pPr>
-      <w:bookmarkStart w:id="57" w:name="_Toc225175970"/>
+      <w:bookmarkStart w:id="59" w:name="_Toc225442849"/>
       <w:r>
         <w:rPr>
           <w:rFonts w:hint="eastAsia"/>
         </w:rPr>
         <w:t>小结</w:t>
       </w:r>
-      <w:bookmarkEnd w:id="57"/>
+      <w:bookmarkEnd w:id="59"/>
     </w:p>
     <w:p>
       <w:pPr>
@@ -13103,7 +13231,8 @@
         <w:spacing w:before="288" w:after="240"/>
         <w:ind w:right="240"/>
       </w:pPr>
-      <w:bookmarkStart w:id="58" w:name="_Toc225175971"/>
+      <w:bookmarkStart w:id="60" w:name="_Ref225338772"/>
+      <w:bookmarkStart w:id="61" w:name="_Toc225442850"/>
       <w:r>
         <w:rPr>
           <w:rFonts w:hint="eastAsia"/>
@@ -13111,7 +13240,8 @@
         <w:lastRenderedPageBreak/>
         <w:t>添加插件</w:t>
       </w:r>
-      <w:bookmarkEnd w:id="58"/>
+      <w:bookmarkEnd w:id="60"/>
+      <w:bookmarkEnd w:id="61"/>
     </w:p>
     <w:p>
       <w:pPr>
@@ -13119,218 +13249,356 @@
         <w:ind w:firstLine="480"/>
       </w:pPr>
       <w:r>
-        <w:t>Y</w:t>
-      </w:r>
-      <w:r>
-        <w:rPr>
-          <w:rFonts w:hint="eastAsia"/>
-        </w:rPr>
-        <w:t>uan</w:t>
-      </w:r>
-      <w:r>
-        <w:rPr>
-          <w:rFonts w:hint="eastAsia"/>
-        </w:rPr>
-        <w:t>平台中已经自带了一个绘图插件可以直接使用，其存放目录为“</w:t>
-      </w:r>
-      <w:r>
-        <w:t>D:\WorkSpace\github\yuan\yuan-platform\target\artifacts\yuan\plugins</w:t>
-      </w:r>
-      <w:r>
-        <w:rPr>
-          <w:rFonts w:hint="eastAsia"/>
-        </w:rPr>
-        <w:t>\</w:t>
-      </w:r>
-      <w:r>
-        <w:rPr>
-          <w:rFonts w:hint="eastAsia"/>
-        </w:rPr>
-        <w:t>”。</w:t>
-      </w:r>
-      <w:r>
-        <w:rPr>
-          <w:rFonts w:hint="eastAsia"/>
-        </w:rPr>
-        <w:t>平台启动时，在“输出</w:t>
-      </w:r>
-      <w:r>
-        <w:rPr>
-          <w:rFonts w:hint="eastAsia"/>
-        </w:rPr>
-        <w:t>”</w:t>
-      </w:r>
-      <w:r>
-        <w:rPr>
-          <w:rFonts w:hint="eastAsia"/>
-        </w:rPr>
-        <w:t>面板中如果出现了“</w:t>
-      </w:r>
-      <w:r>
-        <w:rPr>
-          <w:rFonts w:ascii="Segoe UI Emoji" w:hAnsi="Segoe UI Emoji" w:cs="Segoe UI Emoji"/>
-        </w:rPr>
-        <w:t>✅</w:t>
-      </w:r>
-      <w:r>
-        <w:t xml:space="preserve"> Plugin loaded </w:t>
-      </w:r>
-      <w:proofErr w:type="spellStart"/>
-      <w:r>
-        <w:t>successfully:com.gly.Chart</w:t>
-      </w:r>
-      <w:proofErr w:type="spellEnd"/>
-      <w:r>
-        <w:cr/>
-      </w:r>
-      <w:r>
-        <w:rPr>
-          <w:rFonts w:hint="eastAsia"/>
-        </w:rPr>
-        <w:t>”，则说明插件可以直接使用。</w:t>
+        <w:rPr>
+          <w:rFonts w:hint="eastAsia"/>
+        </w:rPr>
+        <w:t>在添加插件前，</w:t>
+      </w:r>
+      <w:r>
+        <w:rPr>
+          <w:rFonts w:hint="eastAsia"/>
+        </w:rPr>
+        <w:t>首先，参考</w:t>
+      </w:r>
+      <w:r>
+        <w:fldChar w:fldCharType="begin"/>
+      </w:r>
+      <w:r>
+        <w:instrText xml:space="preserve"> </w:instrText>
+      </w:r>
+      <w:r>
+        <w:rPr>
+          <w:rFonts w:hint="eastAsia"/>
+        </w:rPr>
+        <w:instrText>REF _Ref218414874 \r \h</w:instrText>
+      </w:r>
+      <w:r>
+        <w:instrText xml:space="preserve"> </w:instrText>
+      </w:r>
+      <w:r>
+        <w:fldChar w:fldCharType="separate"/>
+      </w:r>
+      <w:r>
+        <w:rPr>
+          <w:rFonts w:hint="eastAsia"/>
+        </w:rPr>
+        <w:t>第</w:t>
+      </w:r>
+      <w:r>
+        <w:rPr>
+          <w:rFonts w:hint="eastAsia"/>
+        </w:rPr>
+        <w:t>2</w:t>
+      </w:r>
+      <w:r>
+        <w:rPr>
+          <w:rFonts w:hint="eastAsia"/>
+        </w:rPr>
+        <w:t>章</w:t>
+      </w:r>
+      <w:r>
+        <w:fldChar w:fldCharType="end"/>
+      </w:r>
+      <w:r>
+        <w:rPr>
+          <w:rFonts w:hint="eastAsia"/>
+        </w:rPr>
+        <w:t>配置平台运行时必要的环境。</w:t>
+      </w:r>
+      <w:r>
+        <w:rPr>
+          <w:rFonts w:hint="eastAsia"/>
+        </w:rPr>
+        <w:t>然后，参考</w:t>
+      </w:r>
+      <w:r>
+        <w:fldChar w:fldCharType="begin"/>
+      </w:r>
+      <w:r>
+        <w:instrText xml:space="preserve"> </w:instrText>
+      </w:r>
+      <w:r>
+        <w:rPr>
+          <w:rFonts w:hint="eastAsia"/>
+        </w:rPr>
+        <w:instrText>REF _Ref218414883 \r \h</w:instrText>
+      </w:r>
+      <w:r>
+        <w:instrText xml:space="preserve"> </w:instrText>
+      </w:r>
+      <w:r>
+        <w:fldChar w:fldCharType="separate"/>
+      </w:r>
+      <w:r>
+        <w:rPr>
+          <w:rFonts w:hint="eastAsia"/>
+        </w:rPr>
+        <w:t>第</w:t>
+      </w:r>
+      <w:r>
+        <w:rPr>
+          <w:rFonts w:hint="eastAsia"/>
+        </w:rPr>
+        <w:t>3</w:t>
+      </w:r>
+      <w:r>
+        <w:rPr>
+          <w:rFonts w:hint="eastAsia"/>
+        </w:rPr>
+        <w:t>章</w:t>
+      </w:r>
+      <w:r>
+        <w:fldChar w:fldCharType="end"/>
+      </w:r>
+      <w:r>
+        <w:rPr>
+          <w:rFonts w:hint="eastAsia"/>
+        </w:rPr>
+        <w:t>的</w:t>
+      </w:r>
+      <w:r>
+        <w:fldChar w:fldCharType="begin"/>
+      </w:r>
+      <w:r>
+        <w:instrText xml:space="preserve"> </w:instrText>
+      </w:r>
+      <w:r>
+        <w:rPr>
+          <w:rFonts w:hint="eastAsia"/>
+        </w:rPr>
+        <w:instrText>REF _Ref225403980 \r \h</w:instrText>
+      </w:r>
+      <w:r>
+        <w:instrText xml:space="preserve"> </w:instrText>
+      </w:r>
+      <w:r>
+        <w:fldChar w:fldCharType="separate"/>
+      </w:r>
+      <w:r>
+        <w:t xml:space="preserve">3.1.1 </w:t>
+      </w:r>
+      <w:r>
+        <w:fldChar w:fldCharType="end"/>
+      </w:r>
+      <w:r>
+        <w:rPr>
+          <w:rFonts w:hint="eastAsia"/>
+        </w:rPr>
+        <w:t>节安装插件依赖的</w:t>
+      </w:r>
+      <w:r>
+        <w:rPr>
+          <w:rFonts w:hint="eastAsia"/>
+        </w:rPr>
+        <w:t>yuan-common</w:t>
+      </w:r>
+      <w:r>
+        <w:rPr>
+          <w:rFonts w:hint="eastAsia"/>
+        </w:rPr>
+        <w:t>。</w:t>
       </w:r>
     </w:p>
     <w:p>
       <w:pPr>
         <w:pStyle w:val="2"/>
         <w:spacing w:before="120" w:after="120"/>
-      </w:pPr>
-      <w:bookmarkStart w:id="59" w:name="_Toc225175972"/>
-      <w:r>
-        <w:rPr>
-          <w:rFonts w:hint="eastAsia"/>
-        </w:rPr>
-        <w:t>使用插件</w:t>
-      </w:r>
-      <w:bookmarkEnd w:id="59"/>
+        <w:rPr>
+          <w:rFonts w:hint="eastAsia"/>
+        </w:rPr>
+      </w:pPr>
+      <w:bookmarkStart w:id="62" w:name="_Toc225442851"/>
+      <w:r>
+        <w:rPr>
+          <w:rFonts w:hint="eastAsia"/>
+        </w:rPr>
+        <w:t>快速使用插件</w:t>
+      </w:r>
+      <w:bookmarkEnd w:id="62"/>
     </w:p>
     <w:p>
       <w:pPr>
         <w:pStyle w:val="23"/>
         <w:ind w:firstLine="480"/>
-        <w:rPr>
-          <w:rFonts w:hint="eastAsia"/>
-        </w:rPr>
-      </w:pPr>
-      <w:r>
-        <w:rPr>
-          <w:rFonts w:hint="eastAsia"/>
-        </w:rPr>
-        <w:t>Yuan</w:t>
-      </w:r>
-      <w:r>
-        <w:rPr>
-          <w:rFonts w:hint="eastAsia"/>
-        </w:rPr>
-        <w:t>平台中也提供了一个默认的</w:t>
-      </w:r>
-      <w:r>
-        <w:t>yuan-chart</w:t>
-      </w:r>
-      <w:r>
-        <w:rPr>
-          <w:rFonts w:hint="eastAsia"/>
-        </w:rPr>
-        <w:t>插件测试项目。</w:t>
-      </w:r>
-      <w:r>
-        <w:rPr>
-          <w:rFonts w:hint="eastAsia"/>
-        </w:rPr>
-        <w:t>使用元智能平台打开</w:t>
-      </w:r>
-      <w:r>
-        <w:t>\yuan\yuan-demo\quick</w:t>
-      </w:r>
-      <w:r>
-        <w:rPr>
-          <w:rFonts w:hint="eastAsia"/>
-        </w:rPr>
-        <w:t>项目，打开“</w:t>
+      </w:pPr>
+      <w:r>
+        <w:t>Y</w:t>
+      </w:r>
+      <w:r>
+        <w:rPr>
+          <w:rFonts w:hint="eastAsia"/>
+        </w:rPr>
+        <w:t>uan</w:t>
+      </w:r>
+      <w:r>
+        <w:rPr>
+          <w:rFonts w:hint="eastAsia"/>
+        </w:rPr>
+        <w:t>平台中已经自带了一个绘图插件可以直接使用，其存放目录为“</w:t>
+      </w:r>
+      <w:r>
+        <w:t>D:\WorkSpace\github\yuan\yuan-platform\target\artifacts\yuan\plugins</w:t>
+      </w:r>
+      <w:r>
+        <w:rPr>
+          <w:rFonts w:hint="eastAsia"/>
+        </w:rPr>
+        <w:t>\</w:t>
+      </w:r>
+      <w:r>
+        <w:rPr>
+          <w:rFonts w:hint="eastAsia"/>
+        </w:rPr>
+        <w:t>”。平台启动时，在“输出”面板中如果出现了“</w:t>
+      </w:r>
+      <w:r>
+        <w:rPr>
+          <w:rFonts w:ascii="Segoe UI Emoji" w:hAnsi="Segoe UI Emoji" w:cs="Segoe UI Emoji"/>
+        </w:rPr>
+        <w:t>✅</w:t>
+      </w:r>
+      <w:r>
+        <w:t xml:space="preserve"> Plugin loaded </w:t>
       </w:r>
       <w:proofErr w:type="spellStart"/>
       <w:r>
-        <w:rPr>
-          <w:rFonts w:hint="eastAsia"/>
-        </w:rPr>
-        <w:t>chart.json</w:t>
+        <w:t>successfully:com.gly.Chart</w:t>
       </w:r>
       <w:proofErr w:type="spellEnd"/>
       <w:r>
-        <w:rPr>
-          <w:rFonts w:hint="eastAsia"/>
-        </w:rPr>
-        <w:t>”文件。点击工具栏中的三角形的运行按钮，</w:t>
-      </w:r>
-      <w:r>
-        <w:rPr>
-          <w:rFonts w:hint="eastAsia"/>
-        </w:rPr>
-        <w:t>运行效果</w:t>
-      </w:r>
-      <w:r>
-        <w:rPr>
-          <w:rFonts w:hint="eastAsia"/>
-        </w:rPr>
-        <w:t>如</w:t>
-      </w:r>
-      <w:r>
-        <w:fldChar w:fldCharType="begin"/>
-      </w:r>
-      <w:r>
-        <w:instrText xml:space="preserve"> </w:instrText>
-      </w:r>
-      <w:r>
-        <w:rPr>
-          <w:rFonts w:hint="eastAsia"/>
-        </w:rPr>
-        <w:instrText>REF _Ref225164289 \h</w:instrText>
-      </w:r>
-      <w:r>
-        <w:instrText xml:space="preserve"> </w:instrText>
-      </w:r>
-      <w:r>
-        <w:fldChar w:fldCharType="separate"/>
-      </w:r>
-      <w:r>
-        <w:rPr>
-          <w:rFonts w:hint="eastAsia"/>
-        </w:rPr>
-        <w:t>图</w:t>
-      </w:r>
-      <w:r>
-        <w:rPr>
-          <w:rFonts w:hint="eastAsia"/>
-        </w:rPr>
-        <w:t xml:space="preserve"> </w:t>
-      </w:r>
-      <w:r>
-        <w:rPr>
-          <w:noProof/>
-        </w:rPr>
-        <w:t>4</w:t>
-      </w:r>
-      <w:r>
-        <w:noBreakHyphen/>
-      </w:r>
-      <w:r>
-        <w:rPr>
-          <w:noProof/>
-        </w:rPr>
-        <w:t>1</w:t>
-      </w:r>
-      <w:r>
-        <w:fldChar w:fldCharType="end"/>
-      </w:r>
-      <w:r>
-        <w:rPr>
-          <w:rFonts w:hint="eastAsia"/>
-        </w:rPr>
-        <w:t>所示。</w:t>
+        <w:cr/>
+      </w:r>
+      <w:r>
+        <w:rPr>
+          <w:rFonts w:hint="eastAsia"/>
+        </w:rPr>
+        <w:t>”，则说明插件可以直接使用。</w:t>
       </w:r>
     </w:p>
     <w:p>
       <w:pPr>
+        <w:pStyle w:val="23"/>
+        <w:ind w:firstLine="480"/>
+      </w:pPr>
+      <w:r>
+        <w:rPr>
+          <w:rFonts w:hint="eastAsia"/>
+        </w:rPr>
+        <w:t>Yuan</w:t>
+      </w:r>
+      <w:r>
+        <w:rPr>
+          <w:rFonts w:hint="eastAsia"/>
+        </w:rPr>
+        <w:t>平台中也提供了一个默认的</w:t>
+      </w:r>
+      <w:r>
+        <w:t>yuan-chart</w:t>
+      </w:r>
+      <w:r>
+        <w:rPr>
+          <w:rFonts w:hint="eastAsia"/>
+        </w:rPr>
+        <w:t>插件测试项目。</w:t>
+      </w:r>
+      <w:r>
+        <w:rPr>
+          <w:rFonts w:hint="eastAsia"/>
+        </w:rPr>
+        <w:t>使用元智能平台打开</w:t>
+      </w:r>
+      <w:r>
+        <w:t>\yuan\yuan-demo\quick</w:t>
+      </w:r>
+      <w:r>
+        <w:rPr>
+          <w:rFonts w:hint="eastAsia"/>
+        </w:rPr>
+        <w:t>项目，打开“</w:t>
+      </w:r>
+      <w:proofErr w:type="spellStart"/>
+      <w:r>
+        <w:rPr>
+          <w:rFonts w:hint="eastAsia"/>
+        </w:rPr>
+        <w:t>chart.json</w:t>
+      </w:r>
+      <w:proofErr w:type="spellEnd"/>
+      <w:r>
+        <w:rPr>
+          <w:rFonts w:hint="eastAsia"/>
+        </w:rPr>
+        <w:t>”文件。点击工具栏中的三角形的运行按钮，</w:t>
+      </w:r>
+      <w:r>
+        <w:rPr>
+          <w:rFonts w:hint="eastAsia"/>
+        </w:rPr>
+        <w:t>运行效果</w:t>
+      </w:r>
+      <w:r>
+        <w:rPr>
+          <w:rFonts w:hint="eastAsia"/>
+        </w:rPr>
+        <w:t>如</w:t>
+      </w:r>
+      <w:r>
+        <w:fldChar w:fldCharType="begin"/>
+      </w:r>
+      <w:r>
+        <w:instrText xml:space="preserve"> </w:instrText>
+      </w:r>
+      <w:r>
+        <w:rPr>
+          <w:rFonts w:hint="eastAsia"/>
+        </w:rPr>
+        <w:instrText>REF _Ref225164289 \h</w:instrText>
+      </w:r>
+      <w:r>
+        <w:instrText xml:space="preserve"> </w:instrText>
+      </w:r>
+      <w:r>
+        <w:fldChar w:fldCharType="separate"/>
+      </w:r>
+      <w:r>
+        <w:rPr>
+          <w:rFonts w:hint="eastAsia"/>
+        </w:rPr>
+        <w:t>图</w:t>
+      </w:r>
+      <w:r>
+        <w:rPr>
+          <w:rFonts w:hint="eastAsia"/>
+        </w:rPr>
+        <w:t xml:space="preserve"> </w:t>
+      </w:r>
+      <w:r>
+        <w:rPr>
+          <w:noProof/>
+        </w:rPr>
+        <w:t>4</w:t>
+      </w:r>
+      <w:r>
+        <w:noBreakHyphen/>
+      </w:r>
+      <w:r>
+        <w:rPr>
+          <w:noProof/>
+        </w:rPr>
+        <w:t>1</w:t>
+      </w:r>
+      <w:r>
+        <w:fldChar w:fldCharType="end"/>
+      </w:r>
+      <w:r>
+        <w:rPr>
+          <w:rFonts w:hint="eastAsia"/>
+        </w:rPr>
+        <w:t>所示。</w:t>
+      </w:r>
+    </w:p>
+    <w:p>
+      <w:pPr>
         <w:pStyle w:val="affc"/>
       </w:pPr>
       <w:r>
@@ -13338,7 +13606,7 @@
           <w:noProof/>
         </w:rPr>
         <w:drawing>
-          <wp:inline distT="0" distB="0" distL="0" distR="0" wp14:anchorId="2D3EEAF0" wp14:editId="220C5AA4">
+          <wp:inline distT="0" distB="0" distL="0" distR="0" wp14:anchorId="2D3EEAF0" wp14:editId="49115696">
             <wp:extent cx="3444033" cy="3216456"/>
             <wp:effectExtent l="0" t="0" r="4445" b="3175"/>
             <wp:docPr id="1998672954" name="图片 2"/>
@@ -13355,7 +13623,7 @@
                     </pic:cNvPicPr>
                   </pic:nvPicPr>
                   <pic:blipFill>
-                    <a:blip r:embed="rId32" cstate="print">
+                    <a:blip r:embed="rId31" cstate="print">
                       <a:extLst>
                         <a:ext uri="{28A0092B-C50C-407E-A947-70E740481C1C}">
                           <a14:useLocalDpi xmlns:a14="http://schemas.microsoft.com/office/drawing/2010/main" val="0"/>
@@ -13391,7 +13659,7 @@
       <w:pPr>
         <w:pStyle w:val="affc"/>
       </w:pPr>
-      <w:bookmarkStart w:id="60" w:name="_Ref225164289"/>
+      <w:bookmarkStart w:id="63" w:name="_Ref225164289"/>
       <w:r>
         <w:rPr>
           <w:rFonts w:hint="eastAsia"/>
@@ -13473,7 +13741,7 @@
       <w:r>
         <w:fldChar w:fldCharType="end"/>
       </w:r>
-      <w:bookmarkEnd w:id="60"/>
+      <w:bookmarkEnd w:id="63"/>
       <w:r>
         <w:rPr>
           <w:rFonts w:hint="eastAsia"/>
@@ -13491,9 +13759,6 @@
       <w:pPr>
         <w:pStyle w:val="23"/>
         <w:ind w:firstLine="480"/>
-        <w:rPr>
-          <w:rFonts w:hint="eastAsia"/>
-        </w:rPr>
       </w:pPr>
       <w:r>
         <w:rPr>
@@ -13532,10 +13797,7 @@
         <w:instrText>REF _Ref225164699 \h</w:instrText>
       </w:r>
       <w:r>
-        <w:instrText xml:space="preserve"> </w:instrText>
-      </w:r>
-      <w:r>
-        <w:instrText xml:space="preserve"> \* MERGEFORMAT </w:instrText>
+        <w:instrText xml:space="preserve">  \* MERGEFORMAT </w:instrText>
       </w:r>
       <w:r>
         <w:fldChar w:fldCharType="separate"/>
@@ -13604,7 +13866,7 @@
               <w:keepNext/>
               <w:ind w:leftChars="0" w:left="0"/>
             </w:pPr>
-            <w:bookmarkStart w:id="61" w:name="_Ref225164699"/>
+            <w:bookmarkStart w:id="64" w:name="_Ref225164699"/>
             <w:r>
               <w:rPr>
                 <w:rFonts w:hint="eastAsia"/>
@@ -13686,7 +13948,7 @@
             <w:r>
               <w:fldChar w:fldCharType="end"/>
             </w:r>
-            <w:bookmarkEnd w:id="61"/>
+            <w:bookmarkEnd w:id="64"/>
             <w:r>
               <w:rPr>
                 <w:rFonts w:hint="eastAsia"/>
@@ -13788,6 +14050,7 @@
                 <w:rFonts w:ascii="Courier New" w:hAnsi="Courier New" w:cs="Courier New"/>
                 <w:color w:val="000000"/>
               </w:rPr>
+              <w:lastRenderedPageBreak/>
               <w:t>&lt;/project&gt;</w:t>
             </w:r>
           </w:p>
@@ -13798,440 +14061,27 @@
       <w:pPr>
         <w:pStyle w:val="2"/>
         <w:spacing w:before="120" w:after="120"/>
-      </w:pPr>
-      <w:bookmarkStart w:id="62" w:name="_Ref225175924"/>
-      <w:bookmarkStart w:id="63" w:name="_Toc225175973"/>
-      <w:r>
-        <w:rPr>
-          <w:rFonts w:hint="eastAsia"/>
-        </w:rPr>
-        <w:t>编译</w:t>
-      </w:r>
-      <w:r>
-        <w:rPr>
-          <w:rFonts w:hint="eastAsia"/>
-        </w:rPr>
-        <w:t>和</w:t>
-      </w:r>
-      <w:r>
-        <w:rPr>
-          <w:rFonts w:hint="eastAsia"/>
-        </w:rPr>
-        <w:t>添加</w:t>
-      </w:r>
-      <w:r>
-        <w:rPr>
-          <w:rFonts w:hint="eastAsia"/>
-        </w:rPr>
-        <w:t>插件</w:t>
-      </w:r>
-      <w:bookmarkEnd w:id="62"/>
-      <w:bookmarkEnd w:id="63"/>
+        <w:rPr>
+          <w:rFonts w:hint="eastAsia"/>
+        </w:rPr>
+      </w:pPr>
+      <w:bookmarkStart w:id="65" w:name="_Ref225175925"/>
+      <w:bookmarkStart w:id="66" w:name="_Ref225175924"/>
+      <w:bookmarkStart w:id="67" w:name="_Toc225442852"/>
+      <w:r>
+        <w:rPr>
+          <w:rFonts w:hint="eastAsia"/>
+        </w:rPr>
+        <w:lastRenderedPageBreak/>
+        <w:t>创建插件</w:t>
+      </w:r>
+      <w:bookmarkEnd w:id="65"/>
+      <w:bookmarkEnd w:id="67"/>
     </w:p>
     <w:p>
       <w:pPr>
         <w:pStyle w:val="23"/>
         <w:ind w:firstLine="480"/>
-        <w:rPr>
-          <w:rFonts w:hint="eastAsia"/>
-        </w:rPr>
-      </w:pPr>
-      <w:r>
-        <w:rPr>
-          <w:rFonts w:hint="eastAsia"/>
-        </w:rPr>
-        <w:lastRenderedPageBreak/>
-        <w:t>使用</w:t>
-      </w:r>
-      <w:r>
-        <w:rPr>
-          <w:rFonts w:hint="eastAsia"/>
-        </w:rPr>
-        <w:t>Yuan</w:t>
-      </w:r>
-      <w:r>
-        <w:rPr>
-          <w:rFonts w:hint="eastAsia"/>
-        </w:rPr>
-        <w:t>打开</w:t>
-      </w:r>
-      <w:r>
-        <w:t>yuan\plugins\yuan-chart</w:t>
-      </w:r>
-      <w:r>
-        <w:rPr>
-          <w:rFonts w:hint="eastAsia"/>
-        </w:rPr>
-        <w:t>项目，</w:t>
-      </w:r>
-      <w:r>
-        <w:rPr>
-          <w:rFonts w:hint="eastAsia"/>
-        </w:rPr>
-        <w:t>选择</w:t>
-      </w:r>
-      <w:r>
-        <w:rPr>
-          <w:rFonts w:hint="eastAsia"/>
-        </w:rPr>
-        <w:t>Maven</w:t>
-      </w:r>
-      <w:r>
-        <w:rPr>
-          <w:rFonts w:hint="eastAsia"/>
-        </w:rPr>
-        <w:t>面板中的</w:t>
-      </w:r>
-      <w:r>
-        <w:rPr>
-          <w:rFonts w:hint="eastAsia"/>
-        </w:rPr>
-        <w:t>Package</w:t>
-      </w:r>
-      <w:r>
-        <w:rPr>
-          <w:rFonts w:hint="eastAsia"/>
-        </w:rPr>
-        <w:t>命令，如</w:t>
-      </w:r>
-      <w:r>
-        <w:fldChar w:fldCharType="begin"/>
-      </w:r>
-      <w:r>
-        <w:instrText xml:space="preserve"> </w:instrText>
-      </w:r>
-      <w:r>
-        <w:rPr>
-          <w:rFonts w:hint="eastAsia"/>
-        </w:rPr>
-        <w:instrText>REF _Ref225169142 \h</w:instrText>
-      </w:r>
-      <w:r>
-        <w:instrText xml:space="preserve"> </w:instrText>
-      </w:r>
-      <w:r>
-        <w:fldChar w:fldCharType="separate"/>
-      </w:r>
-      <w:r>
-        <w:rPr>
-          <w:rFonts w:hint="eastAsia"/>
-        </w:rPr>
-        <w:t>图</w:t>
-      </w:r>
-      <w:r>
-        <w:rPr>
-          <w:rFonts w:hint="eastAsia"/>
-        </w:rPr>
-        <w:t xml:space="preserve"> </w:t>
-      </w:r>
-      <w:r>
-        <w:rPr>
-          <w:noProof/>
-        </w:rPr>
-        <w:t>4</w:t>
-      </w:r>
-      <w:r>
-        <w:noBreakHyphen/>
-      </w:r>
-      <w:r>
-        <w:rPr>
-          <w:noProof/>
-        </w:rPr>
-        <w:t>2</w:t>
-      </w:r>
-      <w:r>
-        <w:fldChar w:fldCharType="end"/>
-      </w:r>
-      <w:r>
-        <w:rPr>
-          <w:rFonts w:hint="eastAsia"/>
-        </w:rPr>
-        <w:t>所示，运行成功后在</w:t>
-      </w:r>
-      <w:r>
-        <w:t>yuan\plugins\yuan-chart\target</w:t>
-      </w:r>
-      <w:r>
-        <w:rPr>
-          <w:rFonts w:hint="eastAsia"/>
-        </w:rPr>
-        <w:t>目录下就会生成一个</w:t>
-      </w:r>
-      <w:r>
-        <w:t>plot-chart-1.0.0.jar</w:t>
-      </w:r>
-      <w:r>
-        <w:rPr>
-          <w:rFonts w:hint="eastAsia"/>
-        </w:rPr>
-        <w:t>文件。</w:t>
-      </w:r>
-    </w:p>
-    <w:p>
-      <w:pPr>
-        <w:pStyle w:val="affc"/>
-      </w:pPr>
-      <w:r>
-        <w:rPr>
-          <w:noProof/>
-        </w:rPr>
-        <w:drawing>
-          <wp:inline distT="0" distB="0" distL="0" distR="0" wp14:anchorId="32BD5CAC" wp14:editId="62D9A8BF">
-            <wp:extent cx="4729151" cy="2586808"/>
-            <wp:effectExtent l="0" t="0" r="0" b="4445"/>
-            <wp:docPr id="34792203" name="图片 3"/>
-            <wp:cNvGraphicFramePr>
-              <a:graphicFrameLocks xmlns:a="http://schemas.openxmlformats.org/drawingml/2006/main" noChangeAspect="1"/>
-            </wp:cNvGraphicFramePr>
-            <a:graphic xmlns:a="http://schemas.openxmlformats.org/drawingml/2006/main">
-              <a:graphicData uri="http://schemas.openxmlformats.org/drawingml/2006/picture">
-                <pic:pic xmlns:pic="http://schemas.openxmlformats.org/drawingml/2006/picture">
-                  <pic:nvPicPr>
-                    <pic:cNvPr id="0" name="Picture 4"/>
-                    <pic:cNvPicPr>
-                      <a:picLocks noChangeAspect="1" noChangeArrowheads="1"/>
-                    </pic:cNvPicPr>
-                  </pic:nvPicPr>
-                  <pic:blipFill>
-                    <a:blip r:embed="rId33" cstate="print">
-                      <a:extLst>
-                        <a:ext uri="{28A0092B-C50C-407E-A947-70E740481C1C}">
-                          <a14:useLocalDpi xmlns:a14="http://schemas.microsoft.com/office/drawing/2010/main" val="0"/>
-                        </a:ext>
-                      </a:extLst>
-                    </a:blip>
-                    <a:srcRect/>
-                    <a:stretch>
-                      <a:fillRect/>
-                    </a:stretch>
-                  </pic:blipFill>
-                  <pic:spPr bwMode="auto">
-                    <a:xfrm>
-                      <a:off x="0" y="0"/>
-                      <a:ext cx="4735631" cy="2590353"/>
-                    </a:xfrm>
-                    <a:prstGeom prst="rect">
-                      <a:avLst/>
-                    </a:prstGeom>
-                    <a:noFill/>
-                    <a:ln>
-                      <a:noFill/>
-                    </a:ln>
-                  </pic:spPr>
-                </pic:pic>
-              </a:graphicData>
-            </a:graphic>
-          </wp:inline>
-        </w:drawing>
-      </w:r>
-    </w:p>
-    <w:p>
-      <w:pPr>
-        <w:pStyle w:val="affc"/>
-      </w:pPr>
-      <w:bookmarkStart w:id="64" w:name="_Ref225169142"/>
-      <w:r>
-        <w:rPr>
-          <w:rFonts w:hint="eastAsia"/>
-        </w:rPr>
-        <w:t>图</w:t>
-      </w:r>
-      <w:r>
-        <w:rPr>
-          <w:rFonts w:hint="eastAsia"/>
-        </w:rPr>
-        <w:t xml:space="preserve"> </w:t>
-      </w:r>
-      <w:r>
-        <w:fldChar w:fldCharType="begin"/>
-      </w:r>
-      <w:r>
-        <w:instrText xml:space="preserve"> </w:instrText>
-      </w:r>
-      <w:r>
-        <w:rPr>
-          <w:rFonts w:hint="eastAsia"/>
-        </w:rPr>
-        <w:instrText>STYLEREF 1 \s</w:instrText>
-      </w:r>
-      <w:r>
-        <w:instrText xml:space="preserve"> </w:instrText>
-      </w:r>
-      <w:r>
-        <w:fldChar w:fldCharType="separate"/>
-      </w:r>
-      <w:r>
-        <w:rPr>
-          <w:noProof/>
-        </w:rPr>
-        <w:t>4</w:t>
-      </w:r>
-      <w:r>
-        <w:fldChar w:fldCharType="end"/>
-      </w:r>
-      <w:r>
-        <w:noBreakHyphen/>
-      </w:r>
-      <w:r>
-        <w:fldChar w:fldCharType="begin"/>
-      </w:r>
-      <w:r>
-        <w:instrText xml:space="preserve"> </w:instrText>
-      </w:r>
-      <w:r>
-        <w:rPr>
-          <w:rFonts w:hint="eastAsia"/>
-        </w:rPr>
-        <w:instrText xml:space="preserve">SEQ </w:instrText>
-      </w:r>
-      <w:r>
-        <w:rPr>
-          <w:rFonts w:hint="eastAsia"/>
-        </w:rPr>
-        <w:instrText>图</w:instrText>
-      </w:r>
-      <w:r>
-        <w:rPr>
-          <w:rFonts w:hint="eastAsia"/>
-        </w:rPr>
-        <w:instrText xml:space="preserve"> \* ARABIC \s 1</w:instrText>
-      </w:r>
-      <w:r>
-        <w:instrText xml:space="preserve"> </w:instrText>
-      </w:r>
-      <w:r>
-        <w:fldChar w:fldCharType="separate"/>
-      </w:r>
-      <w:r>
-        <w:rPr>
-          <w:noProof/>
-        </w:rPr>
-        <w:t>2</w:t>
-      </w:r>
-      <w:r>
-        <w:fldChar w:fldCharType="end"/>
-      </w:r>
-      <w:bookmarkEnd w:id="64"/>
-      <w:r>
-        <w:rPr>
-          <w:rFonts w:hint="eastAsia"/>
-        </w:rPr>
-        <w:t xml:space="preserve"> </w:t>
-      </w:r>
-      <w:r>
-        <w:t>yuan-chart</w:t>
-      </w:r>
-      <w:r>
-        <w:rPr>
-          <w:rFonts w:hint="eastAsia"/>
-        </w:rPr>
-        <w:t>生成</w:t>
-      </w:r>
-      <w:r>
-        <w:rPr>
-          <w:rFonts w:hint="eastAsia"/>
-        </w:rPr>
-        <w:t>jar</w:t>
-      </w:r>
-    </w:p>
-    <w:p>
-      <w:pPr>
-        <w:pStyle w:val="23"/>
-        <w:ind w:firstLine="480"/>
-      </w:pPr>
-      <w:r>
-        <w:t>yuan\yuan-platform\target\artifacts\yuan\plugins\plot-chart\lib</w:t>
-      </w:r>
-      <w:r>
-        <w:t>将</w:t>
-      </w:r>
-      <w:r>
-        <w:rPr>
-          <w:rFonts w:hint="eastAsia"/>
-        </w:rPr>
-        <w:t>生成的</w:t>
-      </w:r>
-      <w:r>
-        <w:t>plot-chart-1.0.0.jar</w:t>
-      </w:r>
-      <w:r>
-        <w:t>拷贝到</w:t>
-      </w:r>
-      <w:r>
-        <w:rPr>
-          <w:rFonts w:hint="eastAsia"/>
-        </w:rPr>
-        <w:t>前</w:t>
-      </w:r>
-      <w:r>
-        <w:rPr>
-          <w:rFonts w:hint="eastAsia"/>
-        </w:rPr>
-        <w:t>面的目录</w:t>
-      </w:r>
-      <w:r>
-        <w:rPr>
-          <w:rFonts w:hint="eastAsia"/>
-        </w:rPr>
-        <w:t>后，</w:t>
-      </w:r>
-      <w:r>
-        <w:t>重新启动</w:t>
-      </w:r>
-      <w:r>
-        <w:rPr>
-          <w:rFonts w:hint="eastAsia"/>
-        </w:rPr>
-        <w:t>Yuan</w:t>
-      </w:r>
-      <w:r>
-        <w:rPr>
-          <w:rFonts w:hint="eastAsia"/>
-        </w:rPr>
-        <w:t>平台，插件就添加完成</w:t>
-      </w:r>
-      <w:r>
-        <w:rPr>
-          <w:rFonts w:hint="eastAsia"/>
-        </w:rPr>
-        <w:t>。如果想将插件去掉，只需要将</w:t>
-      </w:r>
-      <w:r>
-        <w:t>plot-char</w:t>
-      </w:r>
-      <w:r>
-        <w:t>文件夹整体删除就可以了</w:t>
-      </w:r>
-      <w:r>
-        <w:rPr>
-          <w:rFonts w:hint="eastAsia"/>
-        </w:rPr>
-        <w:t>。</w:t>
-      </w:r>
-    </w:p>
-    <w:p>
-      <w:pPr>
-        <w:pStyle w:val="2"/>
-        <w:spacing w:before="120" w:after="120"/>
-      </w:pPr>
-      <w:bookmarkStart w:id="65" w:name="_Ref225175925"/>
-      <w:bookmarkStart w:id="66" w:name="_Toc225175974"/>
-      <w:r>
-        <w:rPr>
-          <w:rFonts w:hint="eastAsia"/>
-        </w:rPr>
-        <w:t>创建插件</w:t>
-      </w:r>
-      <w:bookmarkEnd w:id="65"/>
-      <w:bookmarkEnd w:id="66"/>
-    </w:p>
-    <w:p>
-      <w:pPr>
-        <w:pStyle w:val="23"/>
-        <w:ind w:firstLine="480"/>
-        <w:rPr>
-          <w:rFonts w:hint="eastAsia"/>
-        </w:rPr>
       </w:pPr>
       <w:r>
         <w:rPr>
@@ -14270,7 +14120,19 @@
         <w:rPr>
           <w:rFonts w:hint="eastAsia"/>
         </w:rPr>
-        <w:t>都必须包含</w:t>
+        <w:t>中</w:t>
+      </w:r>
+      <w:r>
+        <w:rPr>
+          <w:rFonts w:hint="eastAsia"/>
+        </w:rPr>
+        <w:t>只</w:t>
+      </w:r>
+      <w:r>
+        <w:rPr>
+          <w:rFonts w:hint="eastAsia"/>
+        </w:rPr>
+        <w:t>显示了必须包含</w:t>
       </w:r>
       <w:r>
         <w:t>yuan-common</w:t>
@@ -14291,13 +14153,7 @@
         <w:rPr>
           <w:rFonts w:hint="eastAsia"/>
         </w:rPr>
-        <w:t>平台</w:t>
-      </w:r>
-      <w:r>
-        <w:rPr>
-          <w:rFonts w:hint="eastAsia"/>
-        </w:rPr>
-        <w:t>规定的插件接口。</w:t>
+        <w:t>平台规定的插件接口。</w:t>
       </w:r>
       <w:r>
         <w:fldChar w:fldCharType="begin"/>
@@ -14413,7 +14269,7 @@
               <w:keepNext/>
               <w:ind w:leftChars="0" w:left="0"/>
             </w:pPr>
-            <w:bookmarkStart w:id="67" w:name="_Ref225175111"/>
+            <w:bookmarkStart w:id="68" w:name="_Ref225175111"/>
             <w:r>
               <w:rPr>
                 <w:rFonts w:hint="eastAsia"/>
@@ -14495,7 +14351,7 @@
             <w:r>
               <w:fldChar w:fldCharType="end"/>
             </w:r>
-            <w:bookmarkEnd w:id="67"/>
+            <w:bookmarkEnd w:id="68"/>
             <w:r>
               <w:rPr>
                 <w:rFonts w:hint="eastAsia"/>
@@ -14829,7 +14685,6 @@
         <w:rPr>
           <w:rFonts w:hint="eastAsia"/>
         </w:rPr>
-        <w:lastRenderedPageBreak/>
         <w:t>插件的入口类必须实现</w:t>
       </w:r>
       <w:r>
@@ -14859,13 +14714,7 @@
         <w:rPr>
           <w:rFonts w:hint="eastAsia"/>
         </w:rPr>
-        <w:t>插件</w:t>
-      </w:r>
-      <w:r>
-        <w:rPr>
-          <w:rFonts w:hint="eastAsia"/>
-        </w:rPr>
-        <w:t>的入口类</w:t>
+        <w:t>插件的入口类</w:t>
       </w:r>
       <w:r>
         <w:rPr>
@@ -14892,13 +14741,7 @@
         <w:rPr>
           <w:rFonts w:hint="eastAsia"/>
         </w:rPr>
-        <w:t>中</w:t>
-      </w:r>
-      <w:r>
-        <w:rPr>
-          <w:rFonts w:hint="eastAsia"/>
-        </w:rPr>
-        <w:t>的抽象类</w:t>
+        <w:t>中的抽象类</w:t>
       </w:r>
       <w:proofErr w:type="spellStart"/>
       <w:r>
@@ -14938,9 +14781,6 @@
       <w:pPr>
         <w:pStyle w:val="23"/>
         <w:ind w:firstLine="480"/>
-        <w:rPr>
-          <w:rFonts w:hint="eastAsia"/>
-        </w:rPr>
       </w:pPr>
       <w:r>
         <w:rPr>
@@ -14966,16 +14806,7 @@
         <w:fldChar w:fldCharType="begin"/>
       </w:r>
       <w:r>
-        <w:instrText xml:space="preserve"> </w:instrText>
-      </w:r>
-      <w:r>
-        <w:rPr>
-          <w:rFonts w:hint="eastAsia"/>
-        </w:rPr>
-        <w:instrText>REF _Ref225175924 \r \h</w:instrText>
-      </w:r>
-      <w:r>
-        <w:instrText xml:space="preserve"> </w:instrText>
+        <w:instrText xml:space="preserve"> REF _Ref225175925 \r \h </w:instrText>
       </w:r>
       <w:r>
         <w:fldChar w:fldCharType="separate"/>
@@ -14986,45 +14817,422 @@
       <w:r>
         <w:fldChar w:fldCharType="end"/>
       </w:r>
-      <w:r>
-        <w:rPr>
-          <w:rFonts w:hint="eastAsia"/>
-        </w:rPr>
-        <w:t>和</w:t>
-      </w:r>
-      <w:r>
-        <w:fldChar w:fldCharType="begin"/>
-      </w:r>
-      <w:r>
-        <w:instrText xml:space="preserve"> REF _Ref225175925 \r \h </w:instrText>
-      </w:r>
-      <w:r>
-        <w:fldChar w:fldCharType="separate"/>
-      </w:r>
-      <w:r>
-        <w:t xml:space="preserve">4.3 </w:t>
-      </w:r>
-      <w:r>
-        <w:fldChar w:fldCharType="end"/>
-      </w:r>
-      <w:r>
-        <w:rPr>
-          <w:rFonts w:hint="eastAsia"/>
-        </w:rPr>
-        <w:t>添加自己实现的插件了。</w:t>
+      <w:proofErr w:type="gramStart"/>
+      <w:r>
+        <w:t>节介绍</w:t>
+      </w:r>
+      <w:proofErr w:type="gramEnd"/>
+      <w:r>
+        <w:t>的方法添加自己实现的插件了</w:t>
+      </w:r>
+      <w:r>
+        <w:rPr>
+          <w:rFonts w:hint="eastAsia"/>
+        </w:rPr>
+        <w:t>。</w:t>
       </w:r>
     </w:p>
     <w:p>
       <w:pPr>
+        <w:pStyle w:val="2"/>
+        <w:spacing w:before="120" w:after="120"/>
+        <w:rPr>
+          <w:rFonts w:hint="eastAsia"/>
+        </w:rPr>
+      </w:pPr>
+      <w:bookmarkStart w:id="69" w:name="_Toc225442853"/>
+      <w:r>
+        <w:rPr>
+          <w:rFonts w:hint="eastAsia"/>
+        </w:rPr>
+        <w:t>编译</w:t>
+      </w:r>
+      <w:r>
+        <w:rPr>
+          <w:rFonts w:hint="eastAsia"/>
+        </w:rPr>
+        <w:t>和</w:t>
+      </w:r>
+      <w:r>
+        <w:rPr>
+          <w:rFonts w:hint="eastAsia"/>
+        </w:rPr>
+        <w:t>发布</w:t>
+      </w:r>
+      <w:r>
+        <w:rPr>
+          <w:rFonts w:hint="eastAsia"/>
+        </w:rPr>
+        <w:t>插件</w:t>
+      </w:r>
+      <w:bookmarkEnd w:id="66"/>
+      <w:bookmarkEnd w:id="69"/>
+    </w:p>
+    <w:p>
+      <w:pPr>
         <w:pStyle w:val="23"/>
         <w:ind w:firstLine="480"/>
-        <w:rPr>
-          <w:rFonts w:hint="eastAsia"/>
-        </w:rPr>
-      </w:pPr>
+      </w:pPr>
+      <w:r>
+        <w:rPr>
+          <w:rFonts w:hint="eastAsia"/>
+        </w:rPr>
+        <w:t>使用</w:t>
+      </w:r>
+      <w:r>
+        <w:rPr>
+          <w:rFonts w:hint="eastAsia"/>
+        </w:rPr>
+        <w:t>Yuan</w:t>
+      </w:r>
+      <w:r>
+        <w:rPr>
+          <w:rFonts w:hint="eastAsia"/>
+        </w:rPr>
+        <w:t>打开</w:t>
+      </w:r>
+      <w:r>
+        <w:t>yuan\plugins\yuan-chart</w:t>
+      </w:r>
+      <w:r>
+        <w:rPr>
+          <w:rFonts w:hint="eastAsia"/>
+        </w:rPr>
+        <w:t>项目，</w:t>
+      </w:r>
+      <w:r>
+        <w:rPr>
+          <w:rFonts w:hint="eastAsia"/>
+        </w:rPr>
+        <w:t>选择</w:t>
+      </w:r>
+      <w:r>
+        <w:rPr>
+          <w:rFonts w:hint="eastAsia"/>
+        </w:rPr>
+        <w:t>Maven</w:t>
+      </w:r>
+      <w:r>
+        <w:rPr>
+          <w:rFonts w:hint="eastAsia"/>
+        </w:rPr>
+        <w:t>面板中的</w:t>
+      </w:r>
+      <w:r>
+        <w:rPr>
+          <w:rFonts w:hint="eastAsia"/>
+        </w:rPr>
+        <w:t>Package</w:t>
+      </w:r>
+      <w:r>
+        <w:rPr>
+          <w:rFonts w:hint="eastAsia"/>
+        </w:rPr>
+        <w:t>命令，如</w:t>
+      </w:r>
+      <w:r>
+        <w:fldChar w:fldCharType="begin"/>
+      </w:r>
+      <w:r>
+        <w:instrText xml:space="preserve"> </w:instrText>
+      </w:r>
+      <w:r>
+        <w:rPr>
+          <w:rFonts w:hint="eastAsia"/>
+        </w:rPr>
+        <w:instrText>REF _Ref225169142 \h</w:instrText>
+      </w:r>
+      <w:r>
+        <w:instrText xml:space="preserve"> </w:instrText>
+      </w:r>
+      <w:r>
+        <w:fldChar w:fldCharType="separate"/>
+      </w:r>
+      <w:r>
+        <w:rPr>
+          <w:rFonts w:hint="eastAsia"/>
+        </w:rPr>
+        <w:t>图</w:t>
+      </w:r>
+      <w:r>
+        <w:rPr>
+          <w:rFonts w:hint="eastAsia"/>
+        </w:rPr>
+        <w:t xml:space="preserve"> </w:t>
+      </w:r>
+      <w:r>
+        <w:rPr>
+          <w:noProof/>
+        </w:rPr>
+        <w:t>4</w:t>
+      </w:r>
+      <w:r>
+        <w:noBreakHyphen/>
+      </w:r>
+      <w:r>
+        <w:rPr>
+          <w:noProof/>
+        </w:rPr>
+        <w:t>2</w:t>
+      </w:r>
+      <w:r>
+        <w:fldChar w:fldCharType="end"/>
+      </w:r>
+      <w:r>
+        <w:rPr>
+          <w:rFonts w:hint="eastAsia"/>
+        </w:rPr>
+        <w:t>所示，运行成功后在</w:t>
+      </w:r>
+      <w:r>
+        <w:t>yuan\plugins\yuan-chart\target</w:t>
+      </w:r>
+      <w:r>
+        <w:rPr>
+          <w:rFonts w:hint="eastAsia"/>
+        </w:rPr>
+        <w:t>目录下就会生成一个</w:t>
+      </w:r>
+      <w:r>
+        <w:t>plot-chart-1.0.0.jar</w:t>
+      </w:r>
+      <w:r>
+        <w:rPr>
+          <w:rFonts w:hint="eastAsia"/>
+        </w:rPr>
+        <w:t>文件。</w:t>
+      </w:r>
+    </w:p>
+    <w:p>
+      <w:pPr>
+        <w:pStyle w:val="affc"/>
+      </w:pPr>
+      <w:r>
+        <w:rPr>
+          <w:noProof/>
+        </w:rPr>
+        <w:lastRenderedPageBreak/>
+        <w:drawing>
+          <wp:inline distT="0" distB="0" distL="0" distR="0" wp14:anchorId="32BD5CAC" wp14:editId="62D9A8BF">
+            <wp:extent cx="4729151" cy="2586808"/>
+            <wp:effectExtent l="0" t="0" r="0" b="4445"/>
+            <wp:docPr id="34792203" name="图片 3"/>
+            <wp:cNvGraphicFramePr>
+              <a:graphicFrameLocks xmlns:a="http://schemas.openxmlformats.org/drawingml/2006/main" noChangeAspect="1"/>
+            </wp:cNvGraphicFramePr>
+            <a:graphic xmlns:a="http://schemas.openxmlformats.org/drawingml/2006/main">
+              <a:graphicData uri="http://schemas.openxmlformats.org/drawingml/2006/picture">
+                <pic:pic xmlns:pic="http://schemas.openxmlformats.org/drawingml/2006/picture">
+                  <pic:nvPicPr>
+                    <pic:cNvPr id="0" name="Picture 4"/>
+                    <pic:cNvPicPr>
+                      <a:picLocks noChangeAspect="1" noChangeArrowheads="1"/>
+                    </pic:cNvPicPr>
+                  </pic:nvPicPr>
+                  <pic:blipFill>
+                    <a:blip r:embed="rId32" cstate="print">
+                      <a:extLst>
+                        <a:ext uri="{28A0092B-C50C-407E-A947-70E740481C1C}">
+                          <a14:useLocalDpi xmlns:a14="http://schemas.microsoft.com/office/drawing/2010/main" val="0"/>
+                        </a:ext>
+                      </a:extLst>
+                    </a:blip>
+                    <a:srcRect/>
+                    <a:stretch>
+                      <a:fillRect/>
+                    </a:stretch>
+                  </pic:blipFill>
+                  <pic:spPr bwMode="auto">
+                    <a:xfrm>
+                      <a:off x="0" y="0"/>
+                      <a:ext cx="4735631" cy="2590353"/>
+                    </a:xfrm>
+                    <a:prstGeom prst="rect">
+                      <a:avLst/>
+                    </a:prstGeom>
+                    <a:noFill/>
+                    <a:ln>
+                      <a:noFill/>
+                    </a:ln>
+                  </pic:spPr>
+                </pic:pic>
+              </a:graphicData>
+            </a:graphic>
+          </wp:inline>
+        </w:drawing>
+      </w:r>
+    </w:p>
+    <w:p>
+      <w:pPr>
+        <w:pStyle w:val="affc"/>
+      </w:pPr>
+      <w:bookmarkStart w:id="70" w:name="_Ref225169142"/>
+      <w:r>
+        <w:rPr>
+          <w:rFonts w:hint="eastAsia"/>
+        </w:rPr>
+        <w:t>图</w:t>
+      </w:r>
+      <w:r>
+        <w:rPr>
+          <w:rFonts w:hint="eastAsia"/>
+        </w:rPr>
+        <w:t xml:space="preserve"> </w:t>
+      </w:r>
+      <w:r>
+        <w:fldChar w:fldCharType="begin"/>
+      </w:r>
+      <w:r>
+        <w:instrText xml:space="preserve"> </w:instrText>
+      </w:r>
+      <w:r>
+        <w:rPr>
+          <w:rFonts w:hint="eastAsia"/>
+        </w:rPr>
+        <w:instrText>STYLEREF 1 \s</w:instrText>
+      </w:r>
+      <w:r>
+        <w:instrText xml:space="preserve"> </w:instrText>
+      </w:r>
+      <w:r>
+        <w:fldChar w:fldCharType="separate"/>
+      </w:r>
+      <w:r>
+        <w:rPr>
+          <w:noProof/>
+        </w:rPr>
+        <w:t>4</w:t>
+      </w:r>
+      <w:r>
+        <w:fldChar w:fldCharType="end"/>
+      </w:r>
+      <w:r>
+        <w:noBreakHyphen/>
+      </w:r>
+      <w:r>
+        <w:fldChar w:fldCharType="begin"/>
+      </w:r>
+      <w:r>
+        <w:instrText xml:space="preserve"> </w:instrText>
+      </w:r>
+      <w:r>
+        <w:rPr>
+          <w:rFonts w:hint="eastAsia"/>
+        </w:rPr>
+        <w:instrText xml:space="preserve">SEQ </w:instrText>
+      </w:r>
+      <w:r>
+        <w:rPr>
+          <w:rFonts w:hint="eastAsia"/>
+        </w:rPr>
+        <w:instrText>图</w:instrText>
+      </w:r>
+      <w:r>
+        <w:rPr>
+          <w:rFonts w:hint="eastAsia"/>
+        </w:rPr>
+        <w:instrText xml:space="preserve"> \* ARABIC \s 1</w:instrText>
+      </w:r>
+      <w:r>
+        <w:instrText xml:space="preserve"> </w:instrText>
+      </w:r>
+      <w:r>
+        <w:fldChar w:fldCharType="separate"/>
+      </w:r>
+      <w:r>
+        <w:rPr>
+          <w:noProof/>
+        </w:rPr>
+        <w:t>2</w:t>
+      </w:r>
+      <w:r>
+        <w:fldChar w:fldCharType="end"/>
+      </w:r>
+      <w:bookmarkEnd w:id="70"/>
+      <w:r>
+        <w:rPr>
+          <w:rFonts w:hint="eastAsia"/>
+        </w:rPr>
+        <w:t xml:space="preserve"> </w:t>
+      </w:r>
+      <w:r>
+        <w:t>yuan-chart</w:t>
+      </w:r>
+      <w:r>
+        <w:rPr>
+          <w:rFonts w:hint="eastAsia"/>
+        </w:rPr>
+        <w:t>生成</w:t>
+      </w:r>
+      <w:r>
+        <w:rPr>
+          <w:rFonts w:hint="eastAsia"/>
+        </w:rPr>
+        <w:t>jar</w:t>
+      </w:r>
+    </w:p>
+    <w:p>
+      <w:pPr>
+        <w:pStyle w:val="23"/>
+        <w:ind w:firstLine="480"/>
+      </w:pPr>
+      <w:r>
+        <w:t>yuan\yuan-platform\target\artifacts\yuan\plugins\plot-chart\lib</w:t>
+      </w:r>
+      <w:r>
+        <w:t>将</w:t>
+      </w:r>
+      <w:r>
+        <w:rPr>
+          <w:rFonts w:hint="eastAsia"/>
+        </w:rPr>
+        <w:t>生成的</w:t>
+      </w:r>
+      <w:r>
+        <w:t>plot-chart-1.0.0.jar</w:t>
+      </w:r>
+      <w:r>
+        <w:t>拷贝到</w:t>
+      </w:r>
+      <w:r>
+        <w:t>yuan\yuan-platform\target\artifacts\yuan\plugins\plot-chart\lib</w:t>
+      </w:r>
+      <w:r>
+        <w:rPr>
+          <w:rFonts w:hint="eastAsia"/>
+        </w:rPr>
+        <w:t>目录后，</w:t>
+      </w:r>
+      <w:r>
+        <w:t>重新启动</w:t>
+      </w:r>
+      <w:r>
+        <w:rPr>
+          <w:rFonts w:hint="eastAsia"/>
+        </w:rPr>
+        <w:t>Yuan</w:t>
+      </w:r>
+      <w:r>
+        <w:rPr>
+          <w:rFonts w:hint="eastAsia"/>
+        </w:rPr>
+        <w:t>平台，插件就添加完成。如果想将插件去掉，只需要将</w:t>
+      </w:r>
+      <w:r>
+        <w:t>plot-char</w:t>
+      </w:r>
+      <w:r>
+        <w:t>文件夹整体删除就可以了</w:t>
+      </w:r>
+      <w:r>
+        <w:rPr>
+          <w:rFonts w:hint="eastAsia"/>
+        </w:rPr>
+        <w:t>。</w:t>
+      </w:r>
     </w:p>
     <w:sectPr>
-      <w:headerReference w:type="default" r:id="rId34"/>
+      <w:headerReference w:type="default" r:id="rId33"/>
       <w:endnotePr>
         <w:numFmt w:val="decimal"/>
       </w:endnotePr>
@@ -17102,7 +17310,7 @@
       <w:lvlText w:val="第%1章"/>
       <w:lvlJc w:val="left"/>
       <w:pPr>
-        <w:ind w:left="5523" w:hanging="420"/>
+        <w:ind w:left="5381" w:hanging="420"/>
       </w:pPr>
       <w:rPr>
         <w:rFonts w:hint="eastAsia"/>
@@ -18831,6 +19039,7 @@
   <w:style w:type="character" w:default="1" w:styleId="a1">
     <w:name w:val="Default Paragraph Font"/>
     <w:uiPriority w:val="1"/>
+    <w:semiHidden/>
     <w:unhideWhenUsed/>
   </w:style>
   <w:style w:type="table" w:default="1" w:styleId="a2">

</xml_diff>